<commit_message>
Merge Content Engine into the Body Recode consumer strategy (one doc, v2.0)
Folds the content engine into the consumer strategy as one document:
Part I strategy (positioning, doctrine, funnel), Part II the content
engine (stop teaching/start reading, pillars x formats, weekly rhythm,
comment-to-DM reads, first plays), Part III standards + measurement.
Dashboard Strategy Docs collapses back to one Body Recode doc; standalone
Content Engine files removed.

Co-Authored-By: Claude Opus 4.8 (1M context) <noreply@anthropic.com>
</commit_message>
<xml_diff>
--- a/public/docs/strategy/body-recode/body-recode-consumer-marketing-strategy-v1.docx
+++ b/public/docs/strategy/body-recode/body-recode-consumer-marketing-strategy-v1.docx
@@ -2,7 +2,7 @@
 <file path=word/document.xml><?xml version="1.0" encoding="utf-8"?>
 <w:document xmlns:w="http://schemas.openxmlformats.org/wordprocessingml/2006/main" xmlns:m="http://schemas.openxmlformats.org/officeDocument/2006/math" xmlns:r="http://schemas.openxmlformats.org/officeDocument/2006/relationships" xmlns:o="urn:schemas-microsoft-com:office:office" xmlns:v="urn:schemas-microsoft-com:vml" xmlns:w10="urn:schemas-microsoft-com:office:word" xmlns:a="http://schemas.openxmlformats.org/drawingml/2006/main" xmlns:pic="http://schemas.openxmlformats.org/drawingml/2006/picture" xmlns:wp="http://schemas.openxmlformats.org/drawingml/2006/wordprocessingDrawing">
   <w:body>
-    <w:bookmarkStart w:id="19" w:name="Xa7843f95b243482ecb74b39e2024ec8d29c7d9a"/>
+    <w:bookmarkStart w:id="9" w:name="Xa7843f95b243482ecb74b39e2024ec8d29c7d9a"/>
     <w:p>
       <w:pPr>
         <w:pStyle w:val="Heading1"/>
@@ -26,7 +26,7 @@
         <w:t xml:space="preserve"> </w:t>
       </w:r>
       <w:r>
-        <w:t xml:space="preserve">v1.0 - 2026-07-19. Consolidated from the locked strategy, the live funnel, and the positioning bank.</w:t>
+        <w:t xml:space="preserve">v2.0 - 2026-07-19. One document: the strategy (what and why) and the content engine (how) in one place.</w:t>
       </w:r>
       <w:r>
         <w:t xml:space="preserve"> </w:t>
@@ -70,39 +70,7 @@
         <w:t xml:space="preserve">@body_recode_</w:t>
       </w:r>
       <w:r>
-        <w:t xml:space="preserve">, bodyrecode.au marketing, and the scorecard -&gt; Challenge -&gt; Blueprint -&gt; coaching/membership funnel. This is Body Recode’s</w:t>
-      </w:r>
-      <w:r>
-        <w:t xml:space="preserve"> </w:t>
-      </w:r>
-      <w:r>
-        <w:rPr>
-          <w:i/>
-          <w:iCs/>
-        </w:rPr>
-        <w:t xml:space="preserve">consumer</w:t>
-      </w:r>
-      <w:r>
-        <w:t xml:space="preserve"> </w:t>
-      </w:r>
-      <w:r>
-        <w:t xml:space="preserve">face. It does</w:t>
-      </w:r>
-      <w:r>
-        <w:t xml:space="preserve"> </w:t>
-      </w:r>
-      <w:r>
-        <w:rPr>
-          <w:b/>
-          <w:bCs/>
-        </w:rPr>
-        <w:t xml:space="preserve">not</w:t>
-      </w:r>
-      <w:r>
-        <w:t xml:space="preserve"> </w:t>
-      </w:r>
-      <w:r>
-        <w:t xml:space="preserve">cover the licensing engine (see the Collective strategy) or the internal coaching delivery (Performance Coaching).</w:t>
+        <w:t xml:space="preserve">, bodyrecode.au marketing, and the scorecard -&gt; Challenge -&gt; Blueprint -&gt; coaching/membership funnel. Not the licensing engine (see the Collective strategy) or the internal coaching delivery (Performance Coaching).</w:t>
       </w:r>
     </w:p>
     <w:p>
@@ -112,7 +80,17 @@
         </w:pict>
       </w:r>
     </w:p>
-    <w:bookmarkStart w:id="9" w:name="the-one-idea"/>
+    <w:bookmarkEnd w:id="9"/>
+    <w:bookmarkStart w:id="15" w:name="part-i---the-strategy-what-why"/>
+    <w:p>
+      <w:pPr>
+        <w:pStyle w:val="Heading1"/>
+      </w:pPr>
+      <w:r>
+        <w:t xml:space="preserve">PART I - THE STRATEGY (what &amp; why)</w:t>
+      </w:r>
+    </w:p>
+    <w:bookmarkStart w:id="10" w:name="the-one-idea"/>
     <w:p>
       <w:pPr>
         <w:pStyle w:val="Heading2"/>
@@ -152,7 +130,7 @@
         <w:t xml:space="preserve"> </w:t>
       </w:r>
       <w:r>
-        <w:t xml:space="preserve">it is operating in - and only then prescribes. Every piece of content, every ad, every funnel step bends back to that one idea.</w:t>
+        <w:t xml:space="preserve">it is operating in - and only then prescribes. Every ad, post and funnel step bends back to that one idea.</w:t>
       </w:r>
     </w:p>
     <w:p>
@@ -170,18 +148,11 @@
           <w:i/>
           <w:iCs/>
         </w:rPr>
-        <w:t xml:space="preserve">“You are doing the work and getting nothing back. That is not a discipline problem. It is a body-state problem - and it is readable.”</w:t>
-      </w:r>
-    </w:p>
-    <w:p>
-      <w:r>
-        <w:pict>
-          <v:rect style="width:0;height:1.5pt" o:hralign="center" o:hrstd="t" o:hr="t"/>
-        </w:pict>
-      </w:r>
-    </w:p>
-    <w:bookmarkEnd w:id="9"/>
-    <w:bookmarkStart w:id="10" w:name="who-we-talk-to"/>
+        <w:t xml:space="preserve">“You are doing the work and getting nothing back. That is not a discipline problem. It is a body-state problem, and it is readable.”</w:t>
+      </w:r>
+    </w:p>
+    <w:bookmarkEnd w:id="10"/>
+    <w:bookmarkStart w:id="11" w:name="who-we-talk-to"/>
     <w:p>
       <w:pPr>
         <w:pStyle w:val="Heading2"/>
@@ -195,17 +166,17 @@
         <w:pStyle w:val="FirstParagraph"/>
       </w:pPr>
       <w:r>
-        <w:t xml:space="preserve">High-functioning adults whose bodies have stopped responding to effort - training hard, eating well, consistent, and getting nothing back. Four archetypes,</w:t>
-      </w:r>
-      <w:r>
-        <w:t xml:space="preserve"> </w:t>
-      </w:r>
-      <w:r>
-        <w:rPr>
-          <w:b/>
-          <w:bCs/>
-        </w:rPr>
-        <w:t xml:space="preserve">skewed toward the Depleted</w:t>
+        <w:t xml:space="preserve">High-functioning adults whose bodies have stopped responding to effort - training hard, eating well, consistent, and getting nothing back. Four archetypes, skewed toward the</w:t>
+      </w:r>
+      <w:r>
+        <w:t xml:space="preserve"> </w:t>
+      </w:r>
+      <w:r>
+        <w:rPr>
+          <w:b/>
+          <w:bCs/>
+        </w:rPr>
+        <w:t xml:space="preserve">Depleted</w:t>
       </w:r>
       <w:r>
         <w:t xml:space="preserve"> </w:t>
@@ -219,7 +190,7 @@
         <w:pStyle w:val="BodyText"/>
       </w:pPr>
       <w:r>
-        <w:t xml:space="preserve">The emotional truth we lead with (cold audience):</w:t>
+        <w:t xml:space="preserve">Lead with the feeling, not the vocabulary:</w:t>
       </w:r>
       <w:r>
         <w:t xml:space="preserve"> </w:t>
@@ -235,24 +206,17 @@
         <w:t xml:space="preserve"> </w:t>
       </w:r>
       <w:r>
-        <w:t xml:space="preserve">Name the feeling before any brand vocabulary. Never open cold content with doctrine words - lead with what they feel, then reveal the read underneath it.</w:t>
-      </w:r>
-    </w:p>
-    <w:p>
-      <w:r>
-        <w:pict>
-          <v:rect style="width:0;height:1.5pt" o:hralign="center" o:hrstd="t" o:hr="t"/>
-        </w:pict>
-      </w:r>
-    </w:p>
-    <w:bookmarkEnd w:id="10"/>
-    <w:bookmarkStart w:id="11" w:name="Xa04ff19c5fcf471cd8020842b36284f35afe080"/>
+        <w:t xml:space="preserve">Name what they feel first, then reveal the read underneath it.</w:t>
+      </w:r>
+    </w:p>
+    <w:bookmarkEnd w:id="11"/>
+    <w:bookmarkStart w:id="12" w:name="the-body-state-doctrine-the-spine"/>
     <w:p>
       <w:pPr>
         <w:pStyle w:val="Heading2"/>
       </w:pPr>
       <w:r>
-        <w:t xml:space="preserve">3. The body-state doctrine (the spine of everything)</w:t>
+        <w:t xml:space="preserve">3. The body-state doctrine (the spine)</w:t>
       </w:r>
     </w:p>
     <w:p>
@@ -260,7 +224,7 @@
         <w:pStyle w:val="FirstParagraph"/>
       </w:pPr>
       <w:r>
-        <w:t xml:space="preserve">The body operates in one of three states, and each needs a different approach - the same program that works in one state makes things worse in another:</w:t>
+        <w:t xml:space="preserve">The body operates in one of three states, and each needs a different approach - the same program that works in one makes things worse in another:</w:t>
       </w:r>
     </w:p>
     <w:p>
@@ -334,7 +298,7 @@
         <w:pStyle w:val="FirstParagraph"/>
       </w:pPr>
       <w:r>
-        <w:t xml:space="preserve">Supporting assets that carry this: the</w:t>
+        <w:t xml:space="preserve">Supporting assets: the</w:t>
       </w:r>
       <w:r>
         <w:t xml:space="preserve"> </w:t>
@@ -376,7 +340,7 @@
         <w:t xml:space="preserve">Six Pillars</w:t>
       </w:r>
       <w:r>
-        <w:t xml:space="preserve">, and the canonical patterns (Stress-Stored / Insulin-Drift / Estrogen-Shift / Androgen-Decline). The arc verbs are</w:t>
+        <w:t xml:space="preserve">, the canonical patterns (Stress-Stored / Insulin-Drift / Estrogen-Shift / Androgen-Decline). Arc verbs:</w:t>
       </w:r>
       <w:r>
         <w:t xml:space="preserve"> </w:t>
@@ -392,18 +356,11 @@
         <w:t xml:space="preserve"> </w:t>
       </w:r>
       <w:r>
-        <w:t xml:space="preserve">(baked into the product names; never invent alternates).</w:t>
-      </w:r>
-    </w:p>
-    <w:p>
-      <w:r>
-        <w:pict>
-          <v:rect style="width:0;height:1.5pt" o:hralign="center" o:hrstd="t" o:hr="t"/>
-        </w:pict>
-      </w:r>
-    </w:p>
-    <w:bookmarkEnd w:id="11"/>
-    <w:bookmarkStart w:id="12" w:name="the-funnel-scorecard-first"/>
+        <w:t xml:space="preserve">(baked into product names; never invent alternates).</w:t>
+      </w:r>
+    </w:p>
+    <w:bookmarkEnd w:id="12"/>
+    <w:bookmarkStart w:id="13" w:name="the-funnel-scorecard-first"/>
     <w:p>
       <w:pPr>
         <w:pStyle w:val="Heading2"/>
@@ -433,7 +390,7 @@
         <w:t xml:space="preserve"> </w:t>
       </w:r>
       <w:r>
-        <w:t xml:space="preserve">first - it is the free, no-email-until-result diagnostic that turns a stranger into a named, segmented lead. The ladder from there:</w:t>
+        <w:t xml:space="preserve">first - the free, no-email-until-result diagnostic that turns a stranger into a named, segmented lead. The ladder from there:</w:t>
       </w:r>
     </w:p>
     <w:tbl>
@@ -548,7 +505,7 @@
               <w:pStyle w:val="Compact"/>
             </w:pPr>
             <w:r>
-              <w:t xml:space="preserve">Free 14-day challenge (Funnel B). Day-0 intake, in-portal experience, Day-14 reveal. Proof that the read works.</w:t>
+              <w:t xml:space="preserve">Free 14-day challenge (Funnel B). Day-0 intake, in-portal experience, Day-14 reveal.</w:t>
             </w:r>
           </w:p>
         </w:tc>
@@ -658,13 +615,13 @@
           <w:b/>
           <w:bCs/>
         </w:rPr>
-        <w:t xml:space="preserve">cold traffic -&gt; Scorecard</w:t>
-      </w:r>
-      <w:r>
-        <w:t xml:space="preserve"> </w:t>
-      </w:r>
-      <w:r>
-        <w:t xml:space="preserve">(diagnosis-led), and</w:t>
+        <w:t xml:space="preserve">cold -&gt; Scorecard</w:t>
+      </w:r>
+      <w:r>
+        <w:t xml:space="preserve"> </w:t>
+      </w:r>
+      <w:r>
+        <w:t xml:space="preserve">(diagnosis-led) and</w:t>
       </w:r>
       <w:r>
         <w:t xml:space="preserve"> </w:t>
@@ -689,42 +646,17 @@
         <w:t xml:space="preserve">/scorecard?intent=challenge</w:t>
       </w:r>
       <w:r>
-        <w:t xml:space="preserve">, never straight to a sales page.</w:t>
-      </w:r>
-    </w:p>
-    <w:p>
-      <w:pPr>
-        <w:pStyle w:val="BodyText"/>
-      </w:pPr>
-      <w:r>
-        <w:rPr>
-          <w:b/>
-          <w:bCs/>
-        </w:rPr>
-        <w:t xml:space="preserve">Rule:</w:t>
-      </w:r>
-      <w:r>
-        <w:t xml:space="preserve"> </w:t>
-      </w:r>
-      <w:r>
-        <w:t xml:space="preserve">the scorecard is the hub. Reach is upstream of conversion - before blaming a caption or CTA, find which gate the post failed at and fix the earliest broken step.</w:t>
-      </w:r>
-    </w:p>
-    <w:p>
-      <w:r>
-        <w:pict>
-          <v:rect style="width:0;height:1.5pt" o:hralign="center" o:hrstd="t" o:hr="t"/>
-        </w:pict>
-      </w:r>
-    </w:p>
-    <w:bookmarkEnd w:id="12"/>
-    <w:bookmarkStart w:id="13" w:name="channels-cadence"/>
+        <w:t xml:space="preserve">, never straight to a sales page. Reach is upstream of conversion - fix the earliest broken gate before blaming a caption.</w:t>
+      </w:r>
+    </w:p>
+    <w:bookmarkEnd w:id="13"/>
+    <w:bookmarkStart w:id="14" w:name="how-this-brand-relates-to-the-others"/>
     <w:p>
       <w:pPr>
         <w:pStyle w:val="Heading2"/>
       </w:pPr>
       <w:r>
-        <w:t xml:space="preserve">5. Channels &amp; cadence</w:t>
+        <w:t xml:space="preserve">5. How this brand relates to the others</w:t>
       </w:r>
     </w:p>
     <w:p>
@@ -740,42 +672,13 @@
           <w:b/>
           <w:bCs/>
         </w:rPr>
-        <w:t xml:space="preserve">Instagram</w:t>
-      </w:r>
-      <w:r>
-        <w:rPr>
-          <w:b/>
-          <w:bCs/>
-        </w:rPr>
-        <w:t xml:space="preserve"> </w:t>
-      </w:r>
-      <w:r>
-        <w:rPr>
-          <w:rStyle w:val="VerbatimChar"/>
-          <w:b/>
-          <w:bCs/>
-        </w:rPr>
-        <w:t xml:space="preserve">@body_recode_</w:t>
-      </w:r>
-      <w:r>
-        <w:rPr>
-          <w:b/>
-          <w:bCs/>
-        </w:rPr>
-        <w:t xml:space="preserve"> </w:t>
-      </w:r>
-      <w:r>
-        <w:rPr>
-          <w:b/>
-          <w:bCs/>
-        </w:rPr>
-        <w:t xml:space="preserve">- primary.</w:t>
-      </w:r>
-      <w:r>
-        <w:t xml:space="preserve"> </w:t>
-      </w:r>
-      <w:r>
-        <w:t xml:space="preserve">~5x per week. Feed posts (authority, pattern, contrarian, coach, diagnostic), carousels for frameworks, and Stories. This is the demand engine.</w:t>
+        <w:t xml:space="preserve">Body Recode (this doc)</w:t>
+      </w:r>
+      <w:r>
+        <w:t xml:space="preserve"> </w:t>
+      </w:r>
+      <w:r>
+        <w:t xml:space="preserve">= consumer demand. Fills the funnel and feeds coaching.</w:t>
       </w:r>
     </w:p>
     <w:p>
@@ -791,28 +694,13 @@
           <w:b/>
           <w:bCs/>
         </w:rPr>
-        <w:t xml:space="preserve">Paid (Meta) - cold statics -&gt; Scorecard.</w:t>
-      </w:r>
-      <w:r>
-        <w:t xml:space="preserve"> </w:t>
-      </w:r>
-      <w:r>
-        <w:t xml:space="preserve">Cold ad sets are statics only (no reels/video), optimised for the</w:t>
-      </w:r>
-      <w:r>
-        <w:t xml:space="preserve"> </w:t>
-      </w:r>
-      <w:r>
-        <w:rPr>
-          <w:rStyle w:val="VerbatimChar"/>
-        </w:rPr>
-        <w:t xml:space="preserve">Lead</w:t>
-      </w:r>
-      <w:r>
-        <w:t xml:space="preserve"> </w:t>
-      </w:r>
-      <w:r>
-        <w:t xml:space="preserve">event. Budget ramps deliberately (see the Meta budget plan) - never scale before the funnel converts.</w:t>
+        <w:t xml:space="preserve">Performance Coaching</w:t>
+      </w:r>
+      <w:r>
+        <w:t xml:space="preserve"> </w:t>
+      </w:r>
+      <w:r>
+        <w:t xml:space="preserve">= the delivery arm the funnel feeds (not separately marketed).</w:t>
       </w:r>
     </w:p>
     <w:p>
@@ -828,13 +716,19 @@
           <w:b/>
           <w:bCs/>
         </w:rPr>
-        <w:t xml:space="preserve">Bio / links -&gt; Scorecard.</w:t>
-      </w:r>
-      <w:r>
-        <w:t xml:space="preserve"> </w:t>
-      </w:r>
-      <w:r>
-        <w:t xml:space="preserve">bodyrecode.au/links is the IG-bio target; every path leads to the diagnostic.</w:t>
+        <w:t xml:space="preserve">The Collective</w:t>
+      </w:r>
+      <w:r>
+        <w:t xml:space="preserve"> </w:t>
+      </w:r>
+      <w:r>
+        <w:t xml:space="preserve">= the B2B licensing engine (</w:t>
+      </w:r>
+      <w:r>
+        <w:t xml:space="preserve">“Powered by Body Recode”</w:t>
+      </w:r>
+      <w:r>
+        <w:t xml:space="preserve">). Different audience (coaches), different channel (LinkedIn). Never mixed into consumer content.</w:t>
       </w:r>
     </w:p>
     <w:p>
@@ -850,21 +744,28 @@
           <w:b/>
           <w:bCs/>
         </w:rPr>
-        <w:t xml:space="preserve">Email</w:t>
-      </w:r>
-      <w:r>
-        <w:t xml:space="preserve"> </w:t>
-      </w:r>
-      <w:r>
-        <w:t xml:space="preserve">- post-scorecard nurture, Challenge sequence, Blueprint CTA, weekly check-ins.</w:t>
-      </w:r>
-    </w:p>
-    <w:p>
-      <w:pPr>
-        <w:pStyle w:val="FirstParagraph"/>
-      </w:pPr>
-      <w:r>
-        <w:t xml:space="preserve">Consumer content is state-first: reels, captions, ads, emails, landing pages, even error states all bend back to state-first language.</w:t>
+        <w:t xml:space="preserve">Personal brand (</w:t>
+      </w:r>
+      <w:r>
+        <w:rPr>
+          <w:rStyle w:val="VerbatimChar"/>
+          <w:b/>
+          <w:bCs/>
+        </w:rPr>
+        <w:t xml:space="preserve">@kade_dunstone_</w:t>
+      </w:r>
+      <w:r>
+        <w:rPr>
+          <w:b/>
+          <w:bCs/>
+        </w:rPr>
+        <w:t xml:space="preserve">)</w:t>
+      </w:r>
+      <w:r>
+        <w:t xml:space="preserve"> </w:t>
+      </w:r>
+      <w:r>
+        <w:t xml:space="preserve">= Kade’s first-person voice; sends warm audience toward Body Recode but keeps its own pillars.</w:t>
       </w:r>
     </w:p>
     <w:p>
@@ -874,14 +775,24 @@
         </w:pict>
       </w:r>
     </w:p>
-    <w:bookmarkEnd w:id="13"/>
-    <w:bookmarkStart w:id="14" w:name="content-pillars-consumer"/>
+    <w:bookmarkEnd w:id="14"/>
+    <w:bookmarkEnd w:id="15"/>
+    <w:bookmarkStart w:id="26" w:name="part-ii---the-content-engine-how"/>
+    <w:p>
+      <w:pPr>
+        <w:pStyle w:val="Heading1"/>
+      </w:pPr>
+      <w:r>
+        <w:t xml:space="preserve">PART II - THE CONTENT ENGINE (how)</w:t>
+      </w:r>
+    </w:p>
+    <w:bookmarkStart w:id="16" w:name="the-one-shift"/>
     <w:p>
       <w:pPr>
         <w:pStyle w:val="Heading2"/>
       </w:pPr>
       <w:r>
-        <w:t xml:space="preserve">6. Content pillars (consumer)</w:t>
+        <w:t xml:space="preserve">6. The one shift</w:t>
       </w:r>
     </w:p>
     <w:p>
@@ -889,7 +800,78 @@
         <w:pStyle w:val="FirstParagraph"/>
       </w:pPr>
       <w:r>
-        <w:t xml:space="preserve">Five recurring themes; every consumer post is one of these:</w:t>
+        <w:rPr>
+          <w:b/>
+          <w:bCs/>
+        </w:rPr>
+        <w:t xml:space="preserve">Stop teaching. Start reading.</w:t>
+      </w:r>
+      <w:r>
+        <w:t xml:space="preserve"> </w:t>
+      </w:r>
+      <w:r>
+        <w:t xml:space="preserve">Engagement was low because the content taught, and teaching earns respect and gets scrolled past. Information travels in the head; self-recognition travels in the gut, and the gut taps the comment button. Every post does one of three things: makes someone</w:t>
+      </w:r>
+      <w:r>
+        <w:t xml:space="preserve"> </w:t>
+      </w:r>
+      <w:r>
+        <w:rPr>
+          <w:i/>
+          <w:iCs/>
+        </w:rPr>
+        <w:t xml:space="preserve">feel seen</w:t>
+      </w:r>
+      <w:r>
+        <w:t xml:space="preserve">, proves</w:t>
+      </w:r>
+      <w:r>
+        <w:t xml:space="preserve"> </w:t>
+      </w:r>
+      <w:r>
+        <w:rPr>
+          <w:i/>
+          <w:iCs/>
+        </w:rPr>
+        <w:t xml:space="preserve">you can read them</w:t>
+      </w:r>
+      <w:r>
+        <w:t xml:space="preserve">, or gives them a</w:t>
+      </w:r>
+      <w:r>
+        <w:t xml:space="preserve"> </w:t>
+      </w:r>
+      <w:r>
+        <w:rPr>
+          <w:i/>
+          <w:iCs/>
+        </w:rPr>
+        <w:t xml:space="preserve">result about themselves</w:t>
+      </w:r>
+      <w:r>
+        <w:t xml:space="preserve">. If a post only explains a concept, it doesn’t ship. This is the same</w:t>
+      </w:r>
+      <w:r>
+        <w:t xml:space="preserve"> </w:t>
+      </w:r>
+      <w:r>
+        <w:t xml:space="preserve">“interpretation before prescription”</w:t>
+      </w:r>
+      <w:r>
+        <w:t xml:space="preserve"> </w:t>
+      </w:r>
+      <w:r>
+        <w:t xml:space="preserve">idea from section 1, turned into content.</w:t>
+      </w:r>
+    </w:p>
+    <w:bookmarkEnd w:id="16"/>
+    <w:bookmarkStart w:id="17" w:name="three-writing-rules-non-negotiable"/>
+    <w:p>
+      <w:pPr>
+        <w:pStyle w:val="Heading2"/>
+      </w:pPr>
+      <w:r>
+        <w:t xml:space="preserve">7. Three writing rules (non-negotiable)</w:t>
       </w:r>
     </w:p>
     <w:p>
@@ -905,13 +887,37 @@
           <w:b/>
           <w:bCs/>
         </w:rPr>
-        <w:t xml:space="preserve">Name the Feeling</w:t>
-      </w:r>
-      <w:r>
-        <w:t xml:space="preserve"> </w:t>
-      </w:r>
-      <w:r>
-        <w:t xml:space="preserve">- the stuck experience (doing everything, nothing moving). Cold-open empathy before doctrine.</w:t>
+        <w:t xml:space="preserve">Scenarios over concepts.</w:t>
+      </w:r>
+      <w:r>
+        <w:t xml:space="preserve"> </w:t>
+      </w:r>
+      <w:r>
+        <w:t xml:space="preserve">A specific person in a specific moment.</w:t>
+      </w:r>
+      <w:r>
+        <w:t xml:space="preserve"> </w:t>
+      </w:r>
+      <w:r>
+        <w:t xml:space="preserve">“You’re 42, training five mornings, cut the wine, scale hasn’t moved in eight months”</w:t>
+      </w:r>
+      <w:r>
+        <w:t xml:space="preserve"> </w:t>
+      </w:r>
+      <w:r>
+        <w:t xml:space="preserve">beats</w:t>
+      </w:r>
+      <w:r>
+        <w:t xml:space="preserve"> </w:t>
+      </w:r>
+      <w:r>
+        <w:t xml:space="preserve">“your body may be depleted”</w:t>
+      </w:r>
+      <w:r>
+        <w:t xml:space="preserve"> </w:t>
+      </w:r>
+      <w:r>
+        <w:t xml:space="preserve">every time.</w:t>
       </w:r>
     </w:p>
     <w:p>
@@ -927,13 +933,13 @@
           <w:b/>
           <w:bCs/>
         </w:rPr>
-        <w:t xml:space="preserve">Read Before Rx</w:t>
-      </w:r>
-      <w:r>
-        <w:t xml:space="preserve"> </w:t>
-      </w:r>
-      <w:r>
-        <w:t xml:space="preserve">- interpretation before prescription; why generic programs fail because they skip the read.</w:t>
+        <w:t xml:space="preserve">Their words, not ours.</w:t>
+      </w:r>
+      <w:r>
+        <w:t xml:space="preserve"> </w:t>
+      </w:r>
+      <w:r>
+        <w:t xml:space="preserve">Open with the exact phrases people write in their scorecard answers and DMs. Sound like the voice already in their head. Keep a swipe file of real lines and pull from it.</w:t>
       </w:r>
     </w:p>
     <w:p>
@@ -949,74 +955,852 @@
           <w:b/>
           <w:bCs/>
         </w:rPr>
-        <w:t xml:space="preserve">The Three States</w:t>
-      </w:r>
-      <w:r>
-        <w:t xml:space="preserve"> </w:t>
-      </w:r>
-      <w:r>
-        <w:t xml:space="preserve">- Depleted / Transitioning / Ready; why the same effort produces opposite results.</w:t>
-      </w:r>
-    </w:p>
-    <w:p>
-      <w:pPr>
-        <w:pStyle w:val="Compact"/>
-        <w:numPr>
-          <w:ilvl w:val="0"/>
-          <w:numId w:val="1003"/>
-        </w:numPr>
-      </w:pPr>
-      <w:r>
-        <w:rPr>
-          <w:b/>
-          <w:bCs/>
-        </w:rPr>
-        <w:t xml:space="preserve">Proof &amp; Pattern</w:t>
-      </w:r>
-      <w:r>
-        <w:t xml:space="preserve"> </w:t>
-      </w:r>
-      <w:r>
-        <w:t xml:space="preserve">- client trajectories, the named patterns, scorecard results, the Challenge in action.</w:t>
-      </w:r>
-    </w:p>
-    <w:p>
-      <w:pPr>
-        <w:pStyle w:val="Compact"/>
-        <w:numPr>
-          <w:ilvl w:val="0"/>
-          <w:numId w:val="1003"/>
-        </w:numPr>
-      </w:pPr>
-      <w:r>
-        <w:rPr>
-          <w:b/>
-          <w:bCs/>
-        </w:rPr>
-        <w:t xml:space="preserve">Take the Scorecard</w:t>
-      </w:r>
-      <w:r>
-        <w:t xml:space="preserve"> </w:t>
-      </w:r>
-      <w:r>
-        <w:t xml:space="preserve">- the diagnostic CTA. Two minutes, no email until the result. Every one of these ends at the Scorecard.</w:t>
-      </w:r>
-    </w:p>
-    <w:p>
-      <w:r>
-        <w:pict>
-          <v:rect style="width:0;height:1.5pt" o:hralign="center" o:hrstd="t" o:hr="t"/>
-        </w:pict>
-      </w:r>
-    </w:p>
-    <w:bookmarkEnd w:id="14"/>
-    <w:bookmarkStart w:id="15" w:name="voice-design-rules"/>
+        <w:t xml:space="preserve">Split the job.</w:t>
+      </w:r>
+      <w:r>
+        <w:t xml:space="preserve"> </w:t>
+      </w:r>
+      <w:r>
+        <w:t xml:space="preserve">Some posts earn comments and saves (pure value, end on a question, no link). Others drive the click (scorecard). Never ask one post to do both - that’s why they currently land neither.</w:t>
+      </w:r>
+    </w:p>
+    <w:bookmarkEnd w:id="17"/>
+    <w:bookmarkStart w:id="18" w:name="pillars-x-formats-themes-meet-shows"/>
     <w:p>
       <w:pPr>
         <w:pStyle w:val="Heading2"/>
       </w:pPr>
       <w:r>
-        <w:t xml:space="preserve">7. Voice &amp; design rules</w:t>
+        <w:t xml:space="preserve">8. Pillars x formats (themes meet shows)</w:t>
+      </w:r>
+    </w:p>
+    <w:p>
+      <w:pPr>
+        <w:pStyle w:val="FirstParagraph"/>
+      </w:pPr>
+      <w:r>
+        <w:t xml:space="preserve">The</w:t>
+      </w:r>
+      <w:r>
+        <w:t xml:space="preserve"> </w:t>
+      </w:r>
+      <w:r>
+        <w:rPr>
+          <w:b/>
+          <w:bCs/>
+        </w:rPr>
+        <w:t xml:space="preserve">pillars</w:t>
+      </w:r>
+      <w:r>
+        <w:t xml:space="preserve"> </w:t>
+      </w:r>
+      <w:r>
+        <w:t xml:space="preserve">are the themes; the</w:t>
+      </w:r>
+      <w:r>
+        <w:t xml:space="preserve"> </w:t>
+      </w:r>
+      <w:r>
+        <w:rPr>
+          <w:b/>
+          <w:bCs/>
+        </w:rPr>
+        <w:t xml:space="preserve">signature formats</w:t>
+      </w:r>
+      <w:r>
+        <w:t xml:space="preserve"> </w:t>
+      </w:r>
+      <w:r>
+        <w:t xml:space="preserve">are the repeatable shows that deliver them. Run the formats until the audience knows them on sight.</w:t>
+      </w:r>
+    </w:p>
+    <w:tbl>
+      <w:tblPr>
+        <w:tblStyle w:val="Table"/>
+        <w:tblW w:type="pct" w:w="5000"/>
+        <w:tblLayout w:type="fixed"/>
+        <w:tblLook w:firstRow="1" w:lastRow="0" w:firstColumn="0" w:lastColumn="0" w:noHBand="0" w:noVBand="0" w:val="0020"/>
+      </w:tblPr>
+      <w:tblGrid>
+        <w:gridCol w:w="3960"/>
+        <w:gridCol w:w="3960"/>
+      </w:tblGrid>
+      <w:tr>
+        <w:trPr>
+          <w:tblHeader w:val="on"/>
+        </w:trPr>
+        <w:tc>
+          <w:tcPr/>
+          <w:p>
+            <w:pPr>
+              <w:pStyle w:val="Compact"/>
+            </w:pPr>
+            <w:r>
+              <w:t xml:space="preserve">Pillar (theme)</w:t>
+            </w:r>
+          </w:p>
+        </w:tc>
+        <w:tc>
+          <w:tcPr/>
+          <w:p>
+            <w:pPr>
+              <w:pStyle w:val="Compact"/>
+            </w:pPr>
+            <w:r>
+              <w:t xml:space="preserve">Delivered by these formats</w:t>
+            </w:r>
+          </w:p>
+        </w:tc>
+      </w:tr>
+      <w:tr>
+        <w:tc>
+          <w:tcPr/>
+          <w:p>
+            <w:pPr>
+              <w:pStyle w:val="Compact"/>
+            </w:pPr>
+            <w:r>
+              <w:rPr>
+                <w:b/>
+                <w:bCs/>
+              </w:rPr>
+              <w:t xml:space="preserve">Name the Feeling</w:t>
+            </w:r>
+            <w:r>
+              <w:t xml:space="preserve"> </w:t>
+            </w:r>
+            <w:r>
+              <w:t xml:space="preserve">(the stuck experience)</w:t>
+            </w:r>
+          </w:p>
+        </w:tc>
+        <w:tc>
+          <w:tcPr/>
+          <w:p>
+            <w:pPr>
+              <w:pStyle w:val="Compact"/>
+            </w:pPr>
+            <w:r>
+              <w:t xml:space="preserve">The Scenario · The Prediction Flex</w:t>
+            </w:r>
+          </w:p>
+        </w:tc>
+      </w:tr>
+      <w:tr>
+        <w:tc>
+          <w:tcPr/>
+          <w:p>
+            <w:pPr>
+              <w:pStyle w:val="Compact"/>
+            </w:pPr>
+            <w:r>
+              <w:rPr>
+                <w:b/>
+                <w:bCs/>
+              </w:rPr>
+              <w:t xml:space="preserve">Read Before Rx</w:t>
+            </w:r>
+            <w:r>
+              <w:t xml:space="preserve"> </w:t>
+            </w:r>
+            <w:r>
+              <w:t xml:space="preserve">(interpretation over generic plans)</w:t>
+            </w:r>
+          </w:p>
+        </w:tc>
+        <w:tc>
+          <w:tcPr/>
+          <w:p>
+            <w:pPr>
+              <w:pStyle w:val="Compact"/>
+            </w:pPr>
+            <w:r>
+              <w:t xml:space="preserve">The Read · The Autopsy</w:t>
+            </w:r>
+          </w:p>
+        </w:tc>
+      </w:tr>
+      <w:tr>
+        <w:tc>
+          <w:tcPr/>
+          <w:p>
+            <w:pPr>
+              <w:pStyle w:val="Compact"/>
+            </w:pPr>
+            <w:r>
+              <w:rPr>
+                <w:b/>
+                <w:bCs/>
+              </w:rPr>
+              <w:t xml:space="preserve">The Three States</w:t>
+            </w:r>
+            <w:r>
+              <w:t xml:space="preserve"> </w:t>
+            </w:r>
+            <w:r>
+              <w:t xml:space="preserve">(Depleted / Transitioning / Ready)</w:t>
+            </w:r>
+          </w:p>
+        </w:tc>
+        <w:tc>
+          <w:tcPr/>
+          <w:p>
+            <w:pPr>
+              <w:pStyle w:val="Compact"/>
+            </w:pPr>
+            <w:r>
+              <w:t xml:space="preserve">The Read · What Your ___ Says</w:t>
+            </w:r>
+          </w:p>
+        </w:tc>
+      </w:tr>
+      <w:tr>
+        <w:tc>
+          <w:tcPr/>
+          <w:p>
+            <w:pPr>
+              <w:pStyle w:val="Compact"/>
+            </w:pPr>
+            <w:r>
+              <w:rPr>
+                <w:b/>
+                <w:bCs/>
+              </w:rPr>
+              <w:t xml:space="preserve">Proof &amp; Pattern</w:t>
+            </w:r>
+            <w:r>
+              <w:t xml:space="preserve"> </w:t>
+            </w:r>
+            <w:r>
+              <w:t xml:space="preserve">(it works, here’s the evidence)</w:t>
+            </w:r>
+          </w:p>
+        </w:tc>
+        <w:tc>
+          <w:tcPr/>
+          <w:p>
+            <w:pPr>
+              <w:pStyle w:val="Compact"/>
+            </w:pPr>
+            <w:r>
+              <w:t xml:space="preserve">Receipts of the Read · State of the Data · React to DMs</w:t>
+            </w:r>
+          </w:p>
+        </w:tc>
+      </w:tr>
+      <w:tr>
+        <w:tc>
+          <w:tcPr/>
+          <w:p>
+            <w:pPr>
+              <w:pStyle w:val="Compact"/>
+            </w:pPr>
+            <w:r>
+              <w:rPr>
+                <w:b/>
+                <w:bCs/>
+              </w:rPr>
+              <w:t xml:space="preserve">Take the Scorecard</w:t>
+            </w:r>
+            <w:r>
+              <w:t xml:space="preserve"> </w:t>
+            </w:r>
+            <w:r>
+              <w:t xml:space="preserve">(the CTA)</w:t>
+            </w:r>
+          </w:p>
+        </w:tc>
+        <w:tc>
+          <w:tcPr/>
+          <w:p>
+            <w:pPr>
+              <w:pStyle w:val="Compact"/>
+            </w:pPr>
+            <w:r>
+              <w:t xml:space="preserve">Comment-to-DM personalised read</w:t>
+            </w:r>
+          </w:p>
+        </w:tc>
+      </w:tr>
+    </w:tbl>
+    <w:p>
+      <w:pPr>
+        <w:pStyle w:val="BodyText"/>
+      </w:pPr>
+      <w:r>
+        <w:rPr>
+          <w:b/>
+          <w:bCs/>
+        </w:rPr>
+        <w:t xml:space="preserve">The formats:</w:t>
+      </w:r>
+    </w:p>
+    <w:tbl>
+      <w:tblPr>
+        <w:tblStyle w:val="Table"/>
+        <w:tblW w:type="pct" w:w="5000"/>
+        <w:tblLayout w:type="fixed"/>
+        <w:tblLook w:firstRow="1" w:lastRow="0" w:firstColumn="0" w:lastColumn="0" w:noHBand="0" w:noVBand="0" w:val="0020"/>
+      </w:tblPr>
+      <w:tblGrid>
+        <w:gridCol w:w="1980"/>
+        <w:gridCol w:w="1980"/>
+        <w:gridCol w:w="1980"/>
+        <w:gridCol w:w="1980"/>
+      </w:tblGrid>
+      <w:tr>
+        <w:trPr>
+          <w:tblHeader w:val="on"/>
+        </w:trPr>
+        <w:tc>
+          <w:tcPr/>
+          <w:p>
+            <w:pPr>
+              <w:pStyle w:val="Compact"/>
+            </w:pPr>
+            <w:r>
+              <w:t xml:space="preserve">Format</w:t>
+            </w:r>
+          </w:p>
+        </w:tc>
+        <w:tc>
+          <w:tcPr/>
+          <w:p>
+            <w:pPr>
+              <w:pStyle w:val="Compact"/>
+            </w:pPr>
+            <w:r>
+              <w:t xml:space="preserve">What it is</w:t>
+            </w:r>
+          </w:p>
+        </w:tc>
+        <w:tc>
+          <w:tcPr/>
+          <w:p>
+            <w:pPr>
+              <w:pStyle w:val="Compact"/>
+            </w:pPr>
+            <w:r>
+              <w:t xml:space="preserve">Job</w:t>
+            </w:r>
+          </w:p>
+        </w:tc>
+        <w:tc>
+          <w:tcPr/>
+          <w:p>
+            <w:pPr>
+              <w:pStyle w:val="Compact"/>
+            </w:pPr>
+            <w:r>
+              <w:t xml:space="preserve">Medium</w:t>
+            </w:r>
+          </w:p>
+        </w:tc>
+      </w:tr>
+      <w:tr>
+        <w:tc>
+          <w:tcPr/>
+          <w:p>
+            <w:pPr>
+              <w:pStyle w:val="Compact"/>
+            </w:pPr>
+            <w:r>
+              <w:rPr>
+                <w:b/>
+                <w:bCs/>
+              </w:rPr>
+              <w:t xml:space="preserve">The Read</w:t>
+            </w:r>
+          </w:p>
+        </w:tc>
+        <w:tc>
+          <w:tcPr/>
+          <w:p>
+            <w:pPr>
+              <w:pStyle w:val="Compact"/>
+            </w:pPr>
+            <w:r>
+              <w:t xml:space="preserve">Public live diagnosis:</w:t>
+            </w:r>
+            <w:r>
+              <w:t xml:space="preserve"> </w:t>
+            </w:r>
+            <w:r>
+              <w:t xml:space="preserve">“Drop your 3 symptoms, I’ll name your state.”</w:t>
+            </w:r>
+          </w:p>
+        </w:tc>
+        <w:tc>
+          <w:tcPr/>
+          <w:p>
+            <w:pPr>
+              <w:pStyle w:val="Compact"/>
+            </w:pPr>
+            <w:r>
+              <w:t xml:space="preserve">Engagement + demo</w:t>
+            </w:r>
+          </w:p>
+        </w:tc>
+        <w:tc>
+          <w:tcPr/>
+          <w:p>
+            <w:pPr>
+              <w:pStyle w:val="Compact"/>
+            </w:pPr>
+            <w:r>
+              <w:t xml:space="preserve">Reel / carousel</w:t>
+            </w:r>
+          </w:p>
+        </w:tc>
+      </w:tr>
+      <w:tr>
+        <w:tc>
+          <w:tcPr/>
+          <w:p>
+            <w:pPr>
+              <w:pStyle w:val="Compact"/>
+            </w:pPr>
+            <w:r>
+              <w:rPr>
+                <w:b/>
+                <w:bCs/>
+              </w:rPr>
+              <w:t xml:space="preserve">What Your ___ Says</w:t>
+            </w:r>
+          </w:p>
+        </w:tc>
+        <w:tc>
+          <w:tcPr/>
+          <w:p>
+            <w:pPr>
+              <w:pStyle w:val="Compact"/>
+            </w:pPr>
+            <w:r>
+              <w:t xml:space="preserve">Bite-size diagnostic: cravings, 3pm crash, Sunday mood, training response</w:t>
+            </w:r>
+          </w:p>
+        </w:tc>
+        <w:tc>
+          <w:tcPr/>
+          <w:p>
+            <w:pPr>
+              <w:pStyle w:val="Compact"/>
+            </w:pPr>
+            <w:r>
+              <w:t xml:space="preserve">Reach + framework</w:t>
+            </w:r>
+          </w:p>
+        </w:tc>
+        <w:tc>
+          <w:tcPr/>
+          <w:p>
+            <w:pPr>
+              <w:pStyle w:val="Compact"/>
+            </w:pPr>
+            <w:r>
+              <w:t xml:space="preserve">Carousel</w:t>
+            </w:r>
+          </w:p>
+        </w:tc>
+      </w:tr>
+      <w:tr>
+        <w:tc>
+          <w:tcPr/>
+          <w:p>
+            <w:pPr>
+              <w:pStyle w:val="Compact"/>
+            </w:pPr>
+            <w:r>
+              <w:rPr>
+                <w:b/>
+                <w:bCs/>
+              </w:rPr>
+              <w:t xml:space="preserve">The Prediction Flex</w:t>
+            </w:r>
+          </w:p>
+        </w:tc>
+        <w:tc>
+          <w:tcPr/>
+          <w:p>
+            <w:pPr>
+              <w:pStyle w:val="Compact"/>
+            </w:pPr>
+            <w:r>
+              <w:t xml:space="preserve">Nail someone from almost nothing</w:t>
+            </w:r>
+          </w:p>
+        </w:tc>
+        <w:tc>
+          <w:tcPr/>
+          <w:p>
+            <w:pPr>
+              <w:pStyle w:val="Compact"/>
+            </w:pPr>
+            <w:r>
+              <w:t xml:space="preserve">Shares (uncanny)</w:t>
+            </w:r>
+          </w:p>
+        </w:tc>
+        <w:tc>
+          <w:tcPr/>
+          <w:p>
+            <w:pPr>
+              <w:pStyle w:val="Compact"/>
+            </w:pPr>
+            <w:r>
+              <w:t xml:space="preserve">Reel</w:t>
+            </w:r>
+          </w:p>
+        </w:tc>
+      </w:tr>
+      <w:tr>
+        <w:tc>
+          <w:tcPr/>
+          <w:p>
+            <w:pPr>
+              <w:pStyle w:val="Compact"/>
+            </w:pPr>
+            <w:r>
+              <w:rPr>
+                <w:b/>
+                <w:bCs/>
+              </w:rPr>
+              <w:t xml:space="preserve">Receipts of the Read</w:t>
+            </w:r>
+          </w:p>
+        </w:tc>
+        <w:tc>
+          <w:tcPr/>
+          <w:p>
+            <w:pPr>
+              <w:pStyle w:val="Compact"/>
+            </w:pPr>
+            <w:r>
+              <w:t xml:space="preserve">Screenshots of</w:t>
+            </w:r>
+            <w:r>
+              <w:t xml:space="preserve"> </w:t>
+            </w:r>
+            <w:r>
+              <w:t xml:space="preserve">“that’s exactly what’s happening”</w:t>
+            </w:r>
+            <w:r>
+              <w:t xml:space="preserve">, not before/afters</w:t>
+            </w:r>
+          </w:p>
+        </w:tc>
+        <w:tc>
+          <w:tcPr/>
+          <w:p>
+            <w:pPr>
+              <w:pStyle w:val="Compact"/>
+            </w:pPr>
+            <w:r>
+              <w:t xml:space="preserve">Proof of interpretation</w:t>
+            </w:r>
+          </w:p>
+        </w:tc>
+        <w:tc>
+          <w:tcPr/>
+          <w:p>
+            <w:pPr>
+              <w:pStyle w:val="Compact"/>
+            </w:pPr>
+            <w:r>
+              <w:t xml:space="preserve">Static / carousel</w:t>
+            </w:r>
+          </w:p>
+        </w:tc>
+      </w:tr>
+      <w:tr>
+        <w:tc>
+          <w:tcPr/>
+          <w:p>
+            <w:pPr>
+              <w:pStyle w:val="Compact"/>
+            </w:pPr>
+            <w:r>
+              <w:rPr>
+                <w:b/>
+                <w:bCs/>
+              </w:rPr>
+              <w:t xml:space="preserve">React to DMs</w:t>
+            </w:r>
+          </w:p>
+        </w:tc>
+        <w:tc>
+          <w:tcPr/>
+          <w:p>
+            <w:pPr>
+              <w:pStyle w:val="Compact"/>
+            </w:pPr>
+            <w:r>
+              <w:t xml:space="preserve">Face-to-camera read of an anonymised message</w:t>
+            </w:r>
+          </w:p>
+        </w:tc>
+        <w:tc>
+          <w:tcPr/>
+          <w:p>
+            <w:pPr>
+              <w:pStyle w:val="Compact"/>
+            </w:pPr>
+            <w:r>
+              <w:t xml:space="preserve">Trust</w:t>
+            </w:r>
+          </w:p>
+        </w:tc>
+        <w:tc>
+          <w:tcPr/>
+          <w:p>
+            <w:pPr>
+              <w:pStyle w:val="Compact"/>
+            </w:pPr>
+            <w:r>
+              <w:t xml:space="preserve">Reel</w:t>
+            </w:r>
+          </w:p>
+        </w:tc>
+      </w:tr>
+      <w:tr>
+        <w:tc>
+          <w:tcPr/>
+          <w:p>
+            <w:pPr>
+              <w:pStyle w:val="Compact"/>
+            </w:pPr>
+            <w:r>
+              <w:rPr>
+                <w:b/>
+                <w:bCs/>
+              </w:rPr>
+              <w:t xml:space="preserve">The Autopsy</w:t>
+            </w:r>
+          </w:p>
+        </w:tc>
+        <w:tc>
+          <w:tcPr/>
+          <w:p>
+            <w:pPr>
+              <w:pStyle w:val="Compact"/>
+            </w:pPr>
+            <w:r>
+              <w:t xml:space="preserve">Calmly dismantle a viral piece of wrong advice for a depleted body</w:t>
+            </w:r>
+          </w:p>
+        </w:tc>
+        <w:tc>
+          <w:tcPr/>
+          <w:p>
+            <w:pPr>
+              <w:pStyle w:val="Compact"/>
+            </w:pPr>
+            <w:r>
+              <w:t xml:space="preserve">Borrowed reach + authority</w:t>
+            </w:r>
+          </w:p>
+        </w:tc>
+        <w:tc>
+          <w:tcPr/>
+          <w:p>
+            <w:pPr>
+              <w:pStyle w:val="Compact"/>
+            </w:pPr>
+            <w:r>
+              <w:t xml:space="preserve">Reel</w:t>
+            </w:r>
+          </w:p>
+        </w:tc>
+      </w:tr>
+      <w:tr>
+        <w:tc>
+          <w:tcPr/>
+          <w:p>
+            <w:pPr>
+              <w:pStyle w:val="Compact"/>
+            </w:pPr>
+            <w:r>
+              <w:rPr>
+                <w:b/>
+                <w:bCs/>
+              </w:rPr>
+              <w:t xml:space="preserve">State of the Data</w:t>
+            </w:r>
+          </w:p>
+        </w:tc>
+        <w:tc>
+          <w:tcPr/>
+          <w:p>
+            <w:pPr>
+              <w:pStyle w:val="Compact"/>
+            </w:pPr>
+            <w:r>
+              <w:t xml:space="preserve">Aggregate scorecard patterns nobody else has</w:t>
+            </w:r>
+          </w:p>
+        </w:tc>
+        <w:tc>
+          <w:tcPr/>
+          <w:p>
+            <w:pPr>
+              <w:pStyle w:val="Compact"/>
+            </w:pPr>
+            <w:r>
+              <w:t xml:space="preserve">Authority + un-copyable</w:t>
+            </w:r>
+          </w:p>
+        </w:tc>
+        <w:tc>
+          <w:tcPr/>
+          <w:p>
+            <w:pPr>
+              <w:pStyle w:val="Compact"/>
+            </w:pPr>
+            <w:r>
+              <w:t xml:space="preserve">Carousel</w:t>
+            </w:r>
+          </w:p>
+        </w:tc>
+      </w:tr>
+      <w:tr>
+        <w:tc>
+          <w:tcPr/>
+          <w:p>
+            <w:pPr>
+              <w:pStyle w:val="Compact"/>
+            </w:pPr>
+            <w:r>
+              <w:rPr>
+                <w:b/>
+                <w:bCs/>
+              </w:rPr>
+              <w:t xml:space="preserve">The Scenario</w:t>
+            </w:r>
+          </w:p>
+        </w:tc>
+        <w:tc>
+          <w:tcPr/>
+          <w:p>
+            <w:pPr>
+              <w:pStyle w:val="Compact"/>
+            </w:pPr>
+            <w:r>
+              <w:t xml:space="preserve">Named-character self-recognition post</w:t>
+            </w:r>
+          </w:p>
+        </w:tc>
+        <w:tc>
+          <w:tcPr/>
+          <w:p>
+            <w:pPr>
+              <w:pStyle w:val="Compact"/>
+            </w:pPr>
+            <w:r>
+              <w:t xml:space="preserve">Engagement</w:t>
+            </w:r>
+          </w:p>
+        </w:tc>
+        <w:tc>
+          <w:tcPr/>
+          <w:p>
+            <w:pPr>
+              <w:pStyle w:val="Compact"/>
+            </w:pPr>
+            <w:r>
+              <w:t xml:space="preserve">Static / carousel</w:t>
+            </w:r>
+          </w:p>
+        </w:tc>
+      </w:tr>
+    </w:tbl>
+    <w:bookmarkEnd w:id="18"/>
+    <w:bookmarkStart w:id="19" w:name="the-enemy"/>
+    <w:p>
+      <w:pPr>
+        <w:pStyle w:val="Heading2"/>
+      </w:pPr>
+      <w:r>
+        <w:t xml:space="preserve">9. The enemy</w:t>
+      </w:r>
+    </w:p>
+    <w:p>
+      <w:pPr>
+        <w:pStyle w:val="FirstParagraph"/>
+      </w:pPr>
+      <w:r>
+        <w:t xml:space="preserve">Give people something to be against: the</w:t>
+      </w:r>
+      <w:r>
+        <w:t xml:space="preserve"> </w:t>
+      </w:r>
+      <w:r>
+        <w:rPr>
+          <w:b/>
+          <w:bCs/>
+        </w:rPr>
+        <w:t xml:space="preserve">eat-less-move-more machine.</w:t>
+      </w:r>
+      <w:r>
+        <w:t xml:space="preserve"> </w:t>
+      </w:r>
+      <w:r>
+        <w:t xml:space="preserve">Protocol without interpretation. A brand with an enemy builds a movement, not an audience - people share what they’re angry about, and being the calm expert who defends them is a magnetic position.</w:t>
+      </w:r>
+    </w:p>
+    <w:bookmarkEnd w:id="19"/>
+    <w:bookmarkStart w:id="20" w:name="the-lead-mechanic-comment-to-dm-upgraded"/>
+    <w:p>
+      <w:pPr>
+        <w:pStyle w:val="Heading2"/>
+      </w:pPr>
+      <w:r>
+        <w:t xml:space="preserve">10. The lead mechanic (comment-to-DM, upgraded)</w:t>
+      </w:r>
+    </w:p>
+    <w:p>
+      <w:pPr>
+        <w:pStyle w:val="FirstParagraph"/>
+      </w:pPr>
+      <w:r>
+        <w:t xml:space="preserve">The giveaway is</w:t>
+      </w:r>
+      <w:r>
+        <w:t xml:space="preserve"> </w:t>
+      </w:r>
+      <w:r>
+        <w:rPr>
+          <w:b/>
+          <w:bCs/>
+        </w:rPr>
+        <w:t xml:space="preserve">a personalised micro-read, not a PDF.</w:t>
+      </w:r>
+      <w:r>
+        <w:t xml:space="preserve"> </w:t>
+      </w:r>
+      <w:r>
+        <w:t xml:space="preserve">Comment the keyword -&gt; the DM asks 2-3 quick questions -&gt; it hands back their likely pattern, the one reason it’s happening, and the single thing to change first, then invites them to the scorecard for the full read. ManyChat delivers it (it has Meta’s approved messaging access, so it sidesteps the app-review wall). The branded PDF becomes the tailored leave-behind. Keyword + copy spec:</w:t>
+      </w:r>
+      <w:r>
+        <w:t xml:space="preserve"> </w:t>
+      </w:r>
+      <w:r>
+        <w:rPr>
+          <w:rStyle w:val="VerbatimChar"/>
+        </w:rPr>
+        <w:t xml:space="preserve">comment-to-dm-asset-map-v1.md</w:t>
+      </w:r>
+      <w:r>
+        <w:t xml:space="preserve">. Cap at 1-2 comment-to-DM posts a week, always on a scenario hook.</w:t>
+      </w:r>
+    </w:p>
+    <w:bookmarkEnd w:id="20"/>
+    <w:bookmarkStart w:id="21" w:name="channels-cadence-weekly-rhythm"/>
+    <w:p>
+      <w:pPr>
+        <w:pStyle w:val="Heading2"/>
+      </w:pPr>
+      <w:r>
+        <w:t xml:space="preserve">11. Channels, cadence &amp; weekly rhythm</w:t>
       </w:r>
     </w:p>
     <w:p>
@@ -1032,136 +1816,498 @@
           <w:b/>
           <w:bCs/>
         </w:rPr>
-        <w:t xml:space="preserve">Voice:</w:t>
-      </w:r>
-      <w:r>
-        <w:t xml:space="preserve"> </w:t>
-      </w:r>
-      <w:r>
-        <w:t xml:space="preserve">interpretation-led, calm authority, no hype. Contractions, varied rhythm, read-aloud test. Fat-loss-explicit framing. No</w:t>
-      </w:r>
-      <w:r>
-        <w:t xml:space="preserve"> </w:t>
-      </w:r>
-      <w:r>
-        <w:t xml:space="preserve">“tips”</w:t>
-      </w:r>
-      <w:r>
-        <w:t xml:space="preserve"> </w:t>
-      </w:r>
-      <w:r>
-        <w:t xml:space="preserve">content - always the read underneath.</w:t>
-      </w:r>
-    </w:p>
-    <w:p>
-      <w:pPr>
-        <w:pStyle w:val="Compact"/>
-        <w:numPr>
-          <w:ilvl w:val="0"/>
-          <w:numId w:val="1004"/>
-        </w:numPr>
-      </w:pPr>
-      <w:r>
-        <w:rPr>
-          <w:b/>
-          <w:bCs/>
-        </w:rPr>
-        <w:t xml:space="preserve">No em dashes</w:t>
-      </w:r>
-      <w:r>
-        <w:t xml:space="preserve"> </w:t>
-      </w:r>
-      <w:r>
-        <w:t xml:space="preserve">(house style) - hyphens or rewrites.</w:t>
-      </w:r>
-    </w:p>
-    <w:p>
-      <w:pPr>
-        <w:pStyle w:val="Compact"/>
-        <w:numPr>
-          <w:ilvl w:val="0"/>
-          <w:numId w:val="1004"/>
-        </w:numPr>
-      </w:pPr>
-      <w:r>
-        <w:rPr>
-          <w:b/>
-          <w:bCs/>
-        </w:rPr>
-        <w:t xml:space="preserve">Design language:</w:t>
-      </w:r>
-      <w:r>
-        <w:t xml:space="preserve"> </w:t>
-      </w:r>
-      <w:r>
-        <w:t xml:space="preserve">Pure White / Graphite / Signal Blue (#1B6DFC). Social assets 1080x1350 (4:5); reels 9:16; 96px safe margins. All photos of Kade in Body Recode graphics render</w:t>
-      </w:r>
-      <w:r>
-        <w:t xml:space="preserve"> </w:t>
-      </w:r>
-      <w:r>
-        <w:rPr>
-          <w:b/>
-          <w:bCs/>
-        </w:rPr>
-        <w:t xml:space="preserve">greyscale</w:t>
-      </w:r>
-      <w:r>
-        <w:t xml:space="preserve">, never colour.</w:t>
-      </w:r>
-    </w:p>
-    <w:p>
-      <w:pPr>
-        <w:pStyle w:val="Compact"/>
-        <w:numPr>
-          <w:ilvl w:val="0"/>
-          <w:numId w:val="1004"/>
-        </w:numPr>
-      </w:pPr>
-      <w:r>
-        <w:t xml:space="preserve">Kade’s public title in bylines:</w:t>
-      </w:r>
-      <w:r>
-        <w:t xml:space="preserve"> </w:t>
-      </w:r>
-      <w:r>
-        <w:rPr>
-          <w:b/>
-          <w:bCs/>
-        </w:rPr>
-        <w:t xml:space="preserve">“Sports Scientist”</w:t>
-      </w:r>
-      <w:r>
-        <w:t xml:space="preserve"> </w:t>
-      </w:r>
-      <w:r>
-        <w:t xml:space="preserve">(not</w:t>
-      </w:r>
-      <w:r>
-        <w:t xml:space="preserve"> </w:t>
-      </w:r>
-      <w:r>
-        <w:t xml:space="preserve">“Exercise Scientist”</w:t>
-      </w:r>
-      <w:r>
-        <w:t xml:space="preserve">).</w:t>
-      </w:r>
-    </w:p>
-    <w:p>
-      <w:r>
-        <w:pict>
-          <v:rect style="width:0;height:1.5pt" o:hralign="center" o:hrstd="t" o:hr="t"/>
-        </w:pict>
-      </w:r>
-    </w:p>
-    <w:bookmarkEnd w:id="15"/>
-    <w:bookmarkStart w:id="16" w:name="messaging-rules-do-dont"/>
+        <w:t xml:space="preserve">Instagram</w:t>
+      </w:r>
+      <w:r>
+        <w:rPr>
+          <w:b/>
+          <w:bCs/>
+        </w:rPr>
+        <w:t xml:space="preserve"> </w:t>
+      </w:r>
+      <w:r>
+        <w:rPr>
+          <w:rStyle w:val="VerbatimChar"/>
+          <w:b/>
+          <w:bCs/>
+        </w:rPr>
+        <w:t xml:space="preserve">@body_recode_</w:t>
+      </w:r>
+      <w:r>
+        <w:rPr>
+          <w:b/>
+          <w:bCs/>
+        </w:rPr>
+        <w:t xml:space="preserve"> </w:t>
+      </w:r>
+      <w:r>
+        <w:rPr>
+          <w:b/>
+          <w:bCs/>
+        </w:rPr>
+        <w:t xml:space="preserve">- primary.</w:t>
+      </w:r>
+      <w:r>
+        <w:t xml:space="preserve"> </w:t>
+      </w:r>
+      <w:r>
+        <w:t xml:space="preserve">5x/week.</w:t>
+      </w:r>
+      <w:r>
+        <w:t xml:space="preserve"> </w:t>
+      </w:r>
+      <w:r>
+        <w:rPr>
+          <w:b/>
+          <w:bCs/>
+        </w:rPr>
+        <w:t xml:space="preserve">Cold-paid (Meta):</w:t>
+      </w:r>
+      <w:r>
+        <w:t xml:space="preserve"> </w:t>
+      </w:r>
+      <w:r>
+        <w:t xml:space="preserve">statics only (no reels/video), optimised for the</w:t>
+      </w:r>
+      <w:r>
+        <w:t xml:space="preserve"> </w:t>
+      </w:r>
+      <w:r>
+        <w:rPr>
+          <w:rStyle w:val="VerbatimChar"/>
+        </w:rPr>
+        <w:t xml:space="preserve">Lead</w:t>
+      </w:r>
+      <w:r>
+        <w:t xml:space="preserve"> </w:t>
+      </w:r>
+      <w:r>
+        <w:t xml:space="preserve">event, budget ramps deliberately.</w:t>
+      </w:r>
+      <w:r>
+        <w:t xml:space="preserve"> </w:t>
+      </w:r>
+      <w:r>
+        <w:rPr>
+          <w:b/>
+          <w:bCs/>
+        </w:rPr>
+        <w:t xml:space="preserve">Bio/links -&gt; Scorecard.</w:t>
+      </w:r>
+      <w:r>
+        <w:t xml:space="preserve"> </w:t>
+      </w:r>
+      <w:r>
+        <w:rPr>
+          <w:b/>
+          <w:bCs/>
+        </w:rPr>
+        <w:t xml:space="preserve">Email:</w:t>
+      </w:r>
+      <w:r>
+        <w:t xml:space="preserve"> </w:t>
+      </w:r>
+      <w:r>
+        <w:t xml:space="preserve">post-scorecard nurture, Challenge sequence, Blueprint CTA, weekly check-ins.</w:t>
+      </w:r>
+    </w:p>
+    <w:p>
+      <w:pPr>
+        <w:pStyle w:val="FirstParagraph"/>
+      </w:pPr>
+      <w:r>
+        <w:t xml:space="preserve">Starting weekly grid (E = engagement-first, no link; C = click/lead):</w:t>
+      </w:r>
+    </w:p>
+    <w:tbl>
+      <w:tblPr>
+        <w:tblStyle w:val="Table"/>
+        <w:tblW w:type="pct" w:w="5000"/>
+        <w:tblLayout w:type="fixed"/>
+        <w:tblLook w:firstRow="1" w:lastRow="0" w:firstColumn="0" w:lastColumn="0" w:noHBand="0" w:noVBand="0" w:val="0020"/>
+      </w:tblPr>
+      <w:tblGrid>
+        <w:gridCol w:w="1980"/>
+        <w:gridCol w:w="1980"/>
+        <w:gridCol w:w="1980"/>
+        <w:gridCol w:w="1980"/>
+      </w:tblGrid>
+      <w:tr>
+        <w:trPr>
+          <w:tblHeader w:val="on"/>
+        </w:trPr>
+        <w:tc>
+          <w:tcPr/>
+          <w:p>
+            <w:pPr>
+              <w:pStyle w:val="Compact"/>
+            </w:pPr>
+            <w:r>
+              <w:t xml:space="preserve">Day</w:t>
+            </w:r>
+          </w:p>
+        </w:tc>
+        <w:tc>
+          <w:tcPr/>
+          <w:p>
+            <w:pPr>
+              <w:pStyle w:val="Compact"/>
+            </w:pPr>
+            <w:r>
+              <w:t xml:space="preserve">Format</w:t>
+            </w:r>
+          </w:p>
+        </w:tc>
+        <w:tc>
+          <w:tcPr/>
+          <w:p>
+            <w:pPr>
+              <w:pStyle w:val="Compact"/>
+            </w:pPr>
+            <w:r>
+              <w:t xml:space="preserve">Job</w:t>
+            </w:r>
+          </w:p>
+        </w:tc>
+        <w:tc>
+          <w:tcPr/>
+          <w:p>
+            <w:pPr>
+              <w:pStyle w:val="Compact"/>
+            </w:pPr>
+            <w:r>
+              <w:t xml:space="preserve">Medium</w:t>
+            </w:r>
+          </w:p>
+        </w:tc>
+      </w:tr>
+      <w:tr>
+        <w:tc>
+          <w:tcPr/>
+          <w:p>
+            <w:pPr>
+              <w:pStyle w:val="Compact"/>
+            </w:pPr>
+            <w:r>
+              <w:t xml:space="preserve">Mon</w:t>
+            </w:r>
+          </w:p>
+        </w:tc>
+        <w:tc>
+          <w:tcPr/>
+          <w:p>
+            <w:pPr>
+              <w:pStyle w:val="Compact"/>
+            </w:pPr>
+            <w:r>
+              <w:rPr>
+                <w:b/>
+                <w:bCs/>
+              </w:rPr>
+              <w:t xml:space="preserve">The Read</w:t>
+            </w:r>
+          </w:p>
+        </w:tc>
+        <w:tc>
+          <w:tcPr/>
+          <w:p>
+            <w:pPr>
+              <w:pStyle w:val="Compact"/>
+            </w:pPr>
+            <w:r>
+              <w:t xml:space="preserve">E</w:t>
+            </w:r>
+          </w:p>
+        </w:tc>
+        <w:tc>
+          <w:tcPr/>
+          <w:p>
+            <w:pPr>
+              <w:pStyle w:val="Compact"/>
+            </w:pPr>
+            <w:r>
+              <w:t xml:space="preserve">Reel / carousel</w:t>
+            </w:r>
+          </w:p>
+        </w:tc>
+      </w:tr>
+      <w:tr>
+        <w:tc>
+          <w:tcPr/>
+          <w:p>
+            <w:pPr>
+              <w:pStyle w:val="Compact"/>
+            </w:pPr>
+            <w:r>
+              <w:t xml:space="preserve">Tue</w:t>
+            </w:r>
+          </w:p>
+        </w:tc>
+        <w:tc>
+          <w:tcPr/>
+          <w:p>
+            <w:pPr>
+              <w:pStyle w:val="Compact"/>
+            </w:pPr>
+            <w:r>
+              <w:rPr>
+                <w:b/>
+                <w:bCs/>
+              </w:rPr>
+              <w:t xml:space="preserve">What Your ___ Says</w:t>
+            </w:r>
+          </w:p>
+        </w:tc>
+        <w:tc>
+          <w:tcPr/>
+          <w:p>
+            <w:pPr>
+              <w:pStyle w:val="Compact"/>
+            </w:pPr>
+            <w:r>
+              <w:t xml:space="preserve">E</w:t>
+            </w:r>
+          </w:p>
+        </w:tc>
+        <w:tc>
+          <w:tcPr/>
+          <w:p>
+            <w:pPr>
+              <w:pStyle w:val="Compact"/>
+            </w:pPr>
+            <w:r>
+              <w:t xml:space="preserve">Carousel</w:t>
+            </w:r>
+          </w:p>
+        </w:tc>
+      </w:tr>
+      <w:tr>
+        <w:tc>
+          <w:tcPr/>
+          <w:p>
+            <w:pPr>
+              <w:pStyle w:val="Compact"/>
+            </w:pPr>
+            <w:r>
+              <w:t xml:space="preserve">Wed</w:t>
+            </w:r>
+          </w:p>
+        </w:tc>
+        <w:tc>
+          <w:tcPr/>
+          <w:p>
+            <w:pPr>
+              <w:pStyle w:val="Compact"/>
+            </w:pPr>
+            <w:r>
+              <w:rPr>
+                <w:b/>
+                <w:bCs/>
+              </w:rPr>
+              <w:t xml:space="preserve">The Scenario</w:t>
+            </w:r>
+            <w:r>
+              <w:t xml:space="preserve"> </w:t>
+            </w:r>
+            <w:r>
+              <w:t xml:space="preserve">or</w:t>
+            </w:r>
+            <w:r>
+              <w:t xml:space="preserve"> </w:t>
+            </w:r>
+            <w:r>
+              <w:rPr>
+                <w:b/>
+                <w:bCs/>
+              </w:rPr>
+              <w:t xml:space="preserve">The Autopsy</w:t>
+            </w:r>
+          </w:p>
+        </w:tc>
+        <w:tc>
+          <w:tcPr/>
+          <w:p>
+            <w:pPr>
+              <w:pStyle w:val="Compact"/>
+            </w:pPr>
+            <w:r>
+              <w:t xml:space="preserve">E</w:t>
+            </w:r>
+          </w:p>
+        </w:tc>
+        <w:tc>
+          <w:tcPr/>
+          <w:p>
+            <w:pPr>
+              <w:pStyle w:val="Compact"/>
+            </w:pPr>
+            <w:r>
+              <w:t xml:space="preserve">Static / reel</w:t>
+            </w:r>
+          </w:p>
+        </w:tc>
+      </w:tr>
+      <w:tr>
+        <w:tc>
+          <w:tcPr/>
+          <w:p>
+            <w:pPr>
+              <w:pStyle w:val="Compact"/>
+            </w:pPr>
+            <w:r>
+              <w:t xml:space="preserve">Thu</w:t>
+            </w:r>
+          </w:p>
+        </w:tc>
+        <w:tc>
+          <w:tcPr/>
+          <w:p>
+            <w:pPr>
+              <w:pStyle w:val="Compact"/>
+            </w:pPr>
+            <w:r>
+              <w:rPr>
+                <w:b/>
+                <w:bCs/>
+              </w:rPr>
+              <w:t xml:space="preserve">Receipts</w:t>
+            </w:r>
+            <w:r>
+              <w:t xml:space="preserve"> </w:t>
+            </w:r>
+            <w:r>
+              <w:t xml:space="preserve">or</w:t>
+            </w:r>
+            <w:r>
+              <w:t xml:space="preserve"> </w:t>
+            </w:r>
+            <w:r>
+              <w:rPr>
+                <w:b/>
+                <w:bCs/>
+              </w:rPr>
+              <w:t xml:space="preserve">React to DMs</w:t>
+            </w:r>
+          </w:p>
+        </w:tc>
+        <w:tc>
+          <w:tcPr/>
+          <w:p>
+            <w:pPr>
+              <w:pStyle w:val="Compact"/>
+            </w:pPr>
+            <w:r>
+              <w:t xml:space="preserve">E (proof)</w:t>
+            </w:r>
+          </w:p>
+        </w:tc>
+        <w:tc>
+          <w:tcPr/>
+          <w:p>
+            <w:pPr>
+              <w:pStyle w:val="Compact"/>
+            </w:pPr>
+            <w:r>
+              <w:t xml:space="preserve">Reel</w:t>
+            </w:r>
+          </w:p>
+        </w:tc>
+      </w:tr>
+      <w:tr>
+        <w:tc>
+          <w:tcPr/>
+          <w:p>
+            <w:pPr>
+              <w:pStyle w:val="Compact"/>
+            </w:pPr>
+            <w:r>
+              <w:t xml:space="preserve">Fri</w:t>
+            </w:r>
+          </w:p>
+        </w:tc>
+        <w:tc>
+          <w:tcPr/>
+          <w:p>
+            <w:pPr>
+              <w:pStyle w:val="Compact"/>
+            </w:pPr>
+            <w:r>
+              <w:rPr>
+                <w:b/>
+                <w:bCs/>
+              </w:rPr>
+              <w:t xml:space="preserve">Comment-to-DM read</w:t>
+            </w:r>
+            <w:r>
+              <w:t xml:space="preserve"> </w:t>
+            </w:r>
+            <w:r>
+              <w:t xml:space="preserve">or</w:t>
+            </w:r>
+            <w:r>
+              <w:t xml:space="preserve"> </w:t>
+            </w:r>
+            <w:r>
+              <w:rPr>
+                <w:b/>
+                <w:bCs/>
+              </w:rPr>
+              <w:t xml:space="preserve">State of the Data</w:t>
+            </w:r>
+          </w:p>
+        </w:tc>
+        <w:tc>
+          <w:tcPr/>
+          <w:p>
+            <w:pPr>
+              <w:pStyle w:val="Compact"/>
+            </w:pPr>
+            <w:r>
+              <w:t xml:space="preserve">C</w:t>
+            </w:r>
+          </w:p>
+        </w:tc>
+        <w:tc>
+          <w:tcPr/>
+          <w:p>
+            <w:pPr>
+              <w:pStyle w:val="Compact"/>
+            </w:pPr>
+            <w:r>
+              <w:t xml:space="preserve">Static + DM</w:t>
+            </w:r>
+          </w:p>
+        </w:tc>
+      </w:tr>
+    </w:tbl>
+    <w:p>
+      <w:pPr>
+        <w:pStyle w:val="BodyText"/>
+      </w:pPr>
+      <w:r>
+        <w:t xml:space="preserve">Stories run alongside daily: the</w:t>
+      </w:r>
+      <w:r>
+        <w:t xml:space="preserve"> </w:t>
+      </w:r>
+      <w:r>
+        <w:t xml:space="preserve">“which state are you”</w:t>
+      </w:r>
+      <w:r>
+        <w:t xml:space="preserve"> </w:t>
+      </w:r>
+      <w:r>
+        <w:t xml:space="preserve">mini-quiz, polls, behind-the-scenes reads. Appointment content: The Read is always Monday, so the audience learns to show up.</w:t>
+      </w:r>
+    </w:p>
+    <w:bookmarkEnd w:id="21"/>
+    <w:bookmarkStart w:id="22" w:name="atomisation-volume-without-more-thinking"/>
     <w:p>
       <w:pPr>
         <w:pStyle w:val="Heading2"/>
       </w:pPr>
       <w:r>
-        <w:t xml:space="preserve">8. Messaging rules (do / don’t)</w:t>
+        <w:t xml:space="preserve">12. Atomisation (volume without more thinking)</w:t>
       </w:r>
     </w:p>
     <w:p>
@@ -1169,52 +2315,202 @@
         <w:pStyle w:val="FirstParagraph"/>
       </w:pPr>
       <w:r>
-        <w:rPr>
-          <w:b/>
-          <w:bCs/>
-        </w:rPr>
-        <w:t xml:space="preserve">Do:</w:t>
-      </w:r>
-      <w:r>
-        <w:t xml:space="preserve"> </w:t>
-      </w:r>
-      <w:r>
-        <w:t xml:space="preserve">lead with the stuck feeling; name the state; make the Scorecard the destination; use proof (real trajectories, with consent); keep the read ahead of the prescription.</w:t>
-      </w:r>
-    </w:p>
-    <w:p>
-      <w:pPr>
-        <w:pStyle w:val="BodyText"/>
-      </w:pPr>
-      <w:r>
-        <w:rPr>
-          <w:b/>
-          <w:bCs/>
-        </w:rPr>
-        <w:t xml:space="preserve">Don’t:</w:t>
-      </w:r>
-      <w:r>
-        <w:t xml:space="preserve"> </w:t>
-      </w:r>
-      <w:r>
-        <w:t xml:space="preserve">open cold with doctrine vocabulary; sell the Blueprint or coaching before the Scorecard; run reels/video in cold-paid ad sets; use colour photos of Kade in BR graphics; promise outcomes without the state read behind them; blur into the coach-licensing (Collective) or B2B audience - this brand talks to end-clients only.</w:t>
-      </w:r>
-    </w:p>
-    <w:p>
-      <w:r>
-        <w:pict>
-          <v:rect style="width:0;height:1.5pt" o:hralign="center" o:hrstd="t" o:hr="t"/>
-        </w:pict>
-      </w:r>
-    </w:p>
-    <w:bookmarkEnd w:id="16"/>
-    <w:bookmarkStart w:id="17" w:name="what-we-measure"/>
+        <w:t xml:space="preserve">One idea -&gt; a</w:t>
+      </w:r>
+      <w:r>
+        <w:t xml:space="preserve"> </w:t>
+      </w:r>
+      <w:r>
+        <w:rPr>
+          <w:b/>
+          <w:bCs/>
+        </w:rPr>
+        <w:t xml:space="preserve">reel</w:t>
+      </w:r>
+      <w:r>
+        <w:t xml:space="preserve"> </w:t>
+      </w:r>
+      <w:r>
+        <w:t xml:space="preserve">(face to camera) + a</w:t>
+      </w:r>
+      <w:r>
+        <w:t xml:space="preserve"> </w:t>
+      </w:r>
+      <w:r>
+        <w:rPr>
+          <w:b/>
+          <w:bCs/>
+        </w:rPr>
+        <w:t xml:space="preserve">carousel</w:t>
+      </w:r>
+      <w:r>
+        <w:t xml:space="preserve"> </w:t>
+      </w:r>
+      <w:r>
+        <w:t xml:space="preserve">(saveable framework) + a</w:t>
+      </w:r>
+      <w:r>
+        <w:t xml:space="preserve"> </w:t>
+      </w:r>
+      <w:r>
+        <w:rPr>
+          <w:b/>
+          <w:bCs/>
+        </w:rPr>
+        <w:t xml:space="preserve">Stories quiz</w:t>
+      </w:r>
+      <w:r>
+        <w:t xml:space="preserve"> </w:t>
+      </w:r>
+      <w:r>
+        <w:t xml:space="preserve">+ a</w:t>
+      </w:r>
+      <w:r>
+        <w:t xml:space="preserve"> </w:t>
+      </w:r>
+      <w:r>
+        <w:rPr>
+          <w:b/>
+          <w:bCs/>
+        </w:rPr>
+        <w:t xml:space="preserve">comment-to-DM</w:t>
+      </w:r>
+      <w:r>
+        <w:t xml:space="preserve"> </w:t>
+      </w:r>
+      <w:r>
+        <w:t xml:space="preserve">post + the</w:t>
+      </w:r>
+      <w:r>
+        <w:t xml:space="preserve"> </w:t>
+      </w:r>
+      <w:r>
+        <w:rPr>
+          <w:b/>
+          <w:bCs/>
+        </w:rPr>
+        <w:t xml:space="preserve">tailored PDF</w:t>
+      </w:r>
+      <w:r>
+        <w:t xml:space="preserve"> </w:t>
+      </w:r>
+      <w:r>
+        <w:t xml:space="preserve">in the DM. Think in ideas, not posts. One strong read should feed most of a week.</w:t>
+      </w:r>
+    </w:p>
+    <w:bookmarkEnd w:id="22"/>
+    <w:bookmarkStart w:id="23" w:name="face-format-reach"/>
     <w:p>
       <w:pPr>
         <w:pStyle w:val="Heading2"/>
       </w:pPr>
       <w:r>
-        <w:t xml:space="preserve">9. What we measure</w:t>
+        <w:t xml:space="preserve">13. Face, format, reach</w:t>
+      </w:r>
+    </w:p>
+    <w:p>
+      <w:pPr>
+        <w:pStyle w:val="FirstParagraph"/>
+      </w:pPr>
+      <w:r>
+        <w:t xml:space="preserve">Get Kade</w:t>
+      </w:r>
+      <w:r>
+        <w:t xml:space="preserve"> </w:t>
+      </w:r>
+      <w:r>
+        <w:rPr>
+          <w:b/>
+          <w:bCs/>
+        </w:rPr>
+        <w:t xml:space="preserve">on camera</w:t>
+      </w:r>
+      <w:r>
+        <w:t xml:space="preserve"> </w:t>
+      </w:r>
+      <w:r>
+        <w:t xml:space="preserve">- talking-head reels of you reading a situation build you as the authority, which is the real asset. Scale with</w:t>
+      </w:r>
+      <w:r>
+        <w:t xml:space="preserve"> </w:t>
+      </w:r>
+      <w:r>
+        <w:rPr>
+          <w:b/>
+          <w:bCs/>
+        </w:rPr>
+        <w:t xml:space="preserve">HeyGen</w:t>
+      </w:r>
+      <w:r>
+        <w:t xml:space="preserve"> </w:t>
+      </w:r>
+      <w:r>
+        <w:t xml:space="preserve">so filming isn’t a daily bottleneck. Lean</w:t>
+      </w:r>
+      <w:r>
+        <w:t xml:space="preserve"> </w:t>
+      </w:r>
+      <w:r>
+        <w:rPr>
+          <w:b/>
+          <w:bCs/>
+        </w:rPr>
+        <w:t xml:space="preserve">carousels (saves) + reels (reach)</w:t>
+      </w:r>
+      <w:r>
+        <w:t xml:space="preserve">; static is for proof and quotes, not the whole feed.</w:t>
+      </w:r>
+    </w:p>
+    <w:bookmarkEnd w:id="23"/>
+    <w:bookmarkStart w:id="24" w:name="turn-engagement-into-an-ad-engine"/>
+    <w:p>
+      <w:pPr>
+        <w:pStyle w:val="Heading2"/>
+      </w:pPr>
+      <w:r>
+        <w:t xml:space="preserve">14. Turn engagement into an ad engine</w:t>
+      </w:r>
+    </w:p>
+    <w:p>
+      <w:pPr>
+        <w:pStyle w:val="FirstParagraph"/>
+      </w:pPr>
+      <w:r>
+        <w:t xml:space="preserve">Everyone who comments a keyword or engages becomes a</w:t>
+      </w:r>
+      <w:r>
+        <w:t xml:space="preserve"> </w:t>
+      </w:r>
+      <w:r>
+        <w:rPr>
+          <w:b/>
+          <w:bCs/>
+        </w:rPr>
+        <w:t xml:space="preserve">warm custom audience</w:t>
+      </w:r>
+      <w:r>
+        <w:t xml:space="preserve"> </w:t>
+      </w:r>
+      <w:r>
+        <w:t xml:space="preserve">- retarget them with the Challenge. Free organic reach becomes cheap paid conversion; the organic and paid funnels feed each other.</w:t>
+      </w:r>
+    </w:p>
+    <w:bookmarkEnd w:id="24"/>
+    <w:bookmarkStart w:id="25" w:name="first-three-plays-to-test-next-2-3-weeks"/>
+    <w:p>
+      <w:pPr>
+        <w:pStyle w:val="Heading2"/>
+      </w:pPr>
+      <w:r>
+        <w:t xml:space="preserve">15. First three plays to test (next 2-3 weeks)</w:t>
+      </w:r>
+    </w:p>
+    <w:p>
+      <w:pPr>
+        <w:pStyle w:val="FirstParagraph"/>
+      </w:pPr>
+      <w:r>
+        <w:t xml:space="preserve">All three use the engine and funnel you already have:</w:t>
       </w:r>
     </w:p>
     <w:p>
@@ -1230,13 +2526,13 @@
           <w:b/>
           <w:bCs/>
         </w:rPr>
-        <w:t xml:space="preserve">Scorecard completions / week</w:t>
-      </w:r>
-      <w:r>
-        <w:t xml:space="preserve"> </w:t>
-      </w:r>
-      <w:r>
-        <w:t xml:space="preserve">(true top of funnel).</w:t>
+        <w:t xml:space="preserve">The Read</w:t>
+      </w:r>
+      <w:r>
+        <w:t xml:space="preserve"> </w:t>
+      </w:r>
+      <w:r>
+        <w:t xml:space="preserve">- the signature demo, weekly.</w:t>
       </w:r>
     </w:p>
     <w:p>
@@ -1252,7 +2548,13 @@
           <w:b/>
           <w:bCs/>
         </w:rPr>
-        <w:t xml:space="preserve">Scorecard -&gt; Challenge enrolment rate.</w:t>
+        <w:t xml:space="preserve">State of the Data</w:t>
+      </w:r>
+      <w:r>
+        <w:t xml:space="preserve"> </w:t>
+      </w:r>
+      <w:r>
+        <w:t xml:space="preserve">- your own scorecard patterns as content.</w:t>
       </w:r>
     </w:p>
     <w:p>
@@ -1268,41 +2570,21 @@
           <w:b/>
           <w:bCs/>
         </w:rPr>
-        <w:t xml:space="preserve">Challenge -&gt; Blueprint conversion.</w:t>
-      </w:r>
-    </w:p>
-    <w:p>
-      <w:pPr>
-        <w:pStyle w:val="Compact"/>
-        <w:numPr>
-          <w:ilvl w:val="0"/>
-          <w:numId w:val="1005"/>
-        </w:numPr>
-      </w:pPr>
-      <w:r>
-        <w:rPr>
-          <w:b/>
-          <w:bCs/>
-        </w:rPr>
-        <w:t xml:space="preserve">Cost per Lead</w:t>
-      </w:r>
-      <w:r>
-        <w:t xml:space="preserve"> </w:t>
-      </w:r>
-      <w:r>
-        <w:t xml:space="preserve">(Meta, the only event the site fires) and blended CAC.</w:t>
-      </w:r>
-    </w:p>
-    <w:p>
-      <w:pPr>
-        <w:pStyle w:val="Compact"/>
-        <w:numPr>
-          <w:ilvl w:val="0"/>
-          <w:numId w:val="1005"/>
-        </w:numPr>
-      </w:pPr>
-      <w:r>
-        <w:t xml:space="preserve">Reach -&gt; save -&gt; profile-visit -&gt; scorecard, gate by gate, to find the earliest broken step.</w:t>
+        <w:t xml:space="preserve">The personalised comment-to-DM read</w:t>
+      </w:r>
+      <w:r>
+        <w:t xml:space="preserve"> </w:t>
+      </w:r>
+      <w:r>
+        <w:t xml:space="preserve">- the upgraded lead mechanic.</w:t>
+      </w:r>
+    </w:p>
+    <w:p>
+      <w:pPr>
+        <w:pStyle w:val="FirstParagraph"/>
+      </w:pPr>
+      <w:r>
+        <w:t xml:space="preserve">Run against the current style for 2-3 weeks; let the numbers pick winners, then double down.</w:t>
       </w:r>
     </w:p>
     <w:p>
@@ -1312,14 +2594,24 @@
         </w:pict>
       </w:r>
     </w:p>
-    <w:bookmarkEnd w:id="17"/>
-    <w:bookmarkStart w:id="18" w:name="how-this-brand-relates-to-the-others"/>
+    <w:bookmarkEnd w:id="25"/>
+    <w:bookmarkEnd w:id="26"/>
+    <w:bookmarkStart w:id="31" w:name="part-iii---standards-measurement"/>
+    <w:p>
+      <w:pPr>
+        <w:pStyle w:val="Heading1"/>
+      </w:pPr>
+      <w:r>
+        <w:t xml:space="preserve">PART III - STANDARDS &amp; MEASUREMENT</w:t>
+      </w:r>
+    </w:p>
+    <w:bookmarkStart w:id="27" w:name="voice-design-rules"/>
     <w:p>
       <w:pPr>
         <w:pStyle w:val="Heading2"/>
       </w:pPr>
       <w:r>
-        <w:t xml:space="preserve">10. How this brand relates to the others</w:t>
+        <w:t xml:space="preserve">16. Voice &amp; design rules</w:t>
       </w:r>
     </w:p>
     <w:p>
@@ -1335,13 +2627,25 @@
           <w:b/>
           <w:bCs/>
         </w:rPr>
-        <w:t xml:space="preserve">Body Recode (this doc)</w:t>
-      </w:r>
-      <w:r>
-        <w:t xml:space="preserve"> </w:t>
-      </w:r>
-      <w:r>
-        <w:t xml:space="preserve">= consumer demand. Fills the top of the funnel and feeds coaching.</w:t>
+        <w:t xml:space="preserve">Voice:</w:t>
+      </w:r>
+      <w:r>
+        <w:t xml:space="preserve"> </w:t>
+      </w:r>
+      <w:r>
+        <w:t xml:space="preserve">interpretation-led, calm authority, no hype. Contractions, varied rhythm, read-aloud test. Fat-loss-explicit framing. No</w:t>
+      </w:r>
+      <w:r>
+        <w:t xml:space="preserve"> </w:t>
+      </w:r>
+      <w:r>
+        <w:t xml:space="preserve">“tips”</w:t>
+      </w:r>
+      <w:r>
+        <w:t xml:space="preserve"> </w:t>
+      </w:r>
+      <w:r>
+        <w:t xml:space="preserve">content - always the read underneath.</w:t>
       </w:r>
     </w:p>
     <w:p>
@@ -1357,13 +2661,13 @@
           <w:b/>
           <w:bCs/>
         </w:rPr>
-        <w:t xml:space="preserve">Performance Coaching</w:t>
-      </w:r>
-      <w:r>
-        <w:t xml:space="preserve"> </w:t>
-      </w:r>
-      <w:r>
-        <w:t xml:space="preserve">= the delivery arm the funnel feeds (not separately marketed).</w:t>
+        <w:t xml:space="preserve">No em dashes</w:t>
+      </w:r>
+      <w:r>
+        <w:t xml:space="preserve"> </w:t>
+      </w:r>
+      <w:r>
+        <w:t xml:space="preserve">(house style) - hyphens or rewrites.</w:t>
       </w:r>
     </w:p>
     <w:p>
@@ -1379,19 +2683,26 @@
           <w:b/>
           <w:bCs/>
         </w:rPr>
-        <w:t xml:space="preserve">The Collective</w:t>
-      </w:r>
-      <w:r>
-        <w:t xml:space="preserve"> </w:t>
-      </w:r>
-      <w:r>
-        <w:t xml:space="preserve">= the B2B licensing engine (</w:t>
-      </w:r>
-      <w:r>
-        <w:t xml:space="preserve">“Powered by Body Recode”</w:t>
-      </w:r>
-      <w:r>
-        <w:t xml:space="preserve">). Different audience (coaches), different channel (LinkedIn). Never mixed into consumer content.</w:t>
+        <w:t xml:space="preserve">Design:</w:t>
+      </w:r>
+      <w:r>
+        <w:t xml:space="preserve"> </w:t>
+      </w:r>
+      <w:r>
+        <w:t xml:space="preserve">Pure White / Graphite / Signal Blue (#1B6DFC). Social assets 1080x1350 (4:5); reels 9:16; 96px safe margins. All photos of Kade in BR graphics render</w:t>
+      </w:r>
+      <w:r>
+        <w:t xml:space="preserve"> </w:t>
+      </w:r>
+      <w:r>
+        <w:rPr>
+          <w:b/>
+          <w:bCs/>
+        </w:rPr>
+        <w:t xml:space="preserve">greyscale</w:t>
+      </w:r>
+      <w:r>
+        <w:t xml:space="preserve">, never colour.</w:t>
       </w:r>
     </w:p>
     <w:p>
@@ -1403,32 +2714,225 @@
         </w:numPr>
       </w:pPr>
       <w:r>
-        <w:rPr>
-          <w:b/>
-          <w:bCs/>
-        </w:rPr>
-        <w:t xml:space="preserve">Personal brand (</w:t>
+        <w:t xml:space="preserve">Kade’s public byline title:</w:t>
+      </w:r>
+      <w:r>
+        <w:t xml:space="preserve"> </w:t>
+      </w:r>
+      <w:r>
+        <w:rPr>
+          <w:b/>
+          <w:bCs/>
+        </w:rPr>
+        <w:t xml:space="preserve">“Sports Scientist”</w:t>
+      </w:r>
+      <w:r>
+        <w:t xml:space="preserve"> </w:t>
+      </w:r>
+      <w:r>
+        <w:t xml:space="preserve">(not</w:t>
+      </w:r>
+      <w:r>
+        <w:t xml:space="preserve"> </w:t>
+      </w:r>
+      <w:r>
+        <w:t xml:space="preserve">“Exercise Scientist”</w:t>
+      </w:r>
+      <w:r>
+        <w:t xml:space="preserve">).</w:t>
+      </w:r>
+    </w:p>
+    <w:bookmarkEnd w:id="27"/>
+    <w:bookmarkStart w:id="28" w:name="messaging-rules-do-dont"/>
+    <w:p>
+      <w:pPr>
+        <w:pStyle w:val="Heading2"/>
+      </w:pPr>
+      <w:r>
+        <w:t xml:space="preserve">17. Messaging rules (do / don’t)</w:t>
+      </w:r>
+    </w:p>
+    <w:p>
+      <w:pPr>
+        <w:pStyle w:val="FirstParagraph"/>
+      </w:pPr>
+      <w:r>
+        <w:rPr>
+          <w:b/>
+          <w:bCs/>
+        </w:rPr>
+        <w:t xml:space="preserve">Do:</w:t>
+      </w:r>
+      <w:r>
+        <w:t xml:space="preserve"> </w:t>
+      </w:r>
+      <w:r>
+        <w:t xml:space="preserve">lead with the stuck feeling; name the state; make the Scorecard the destination; use proof (real trajectories, with consent); keep the read ahead of the prescription; prove you can read people rather than teach them.</w:t>
+      </w:r>
+    </w:p>
+    <w:p>
+      <w:pPr>
+        <w:pStyle w:val="BodyText"/>
+      </w:pPr>
+      <w:r>
+        <w:rPr>
+          <w:b/>
+          <w:bCs/>
+        </w:rPr>
+        <w:t xml:space="preserve">Don’t:</w:t>
+      </w:r>
+      <w:r>
+        <w:t xml:space="preserve"> </w:t>
+      </w:r>
+      <w:r>
+        <w:t xml:space="preserve">open cold with doctrine vocabulary; sell the Blueprint/coaching before the Scorecard; run reels/video in cold-paid ad sets; use colour photos of Kade in BR graphics; ask one post to both earn engagement and drive a click; blur into the coach-licensing (Collective) audience.</w:t>
+      </w:r>
+    </w:p>
+    <w:bookmarkEnd w:id="28"/>
+    <w:bookmarkStart w:id="29" w:name="what-we-measure"/>
+    <w:p>
+      <w:pPr>
+        <w:pStyle w:val="Heading2"/>
+      </w:pPr>
+      <w:r>
+        <w:t xml:space="preserve">18. What we measure</w:t>
+      </w:r>
+    </w:p>
+    <w:p>
+      <w:pPr>
+        <w:pStyle w:val="FirstParagraph"/>
+      </w:pPr>
+      <w:r>
+        <w:t xml:space="preserve">Comments + saves + shares (real engagement), DM keyword captures, scorecard starts, and the earliest broken gate in the reach -&gt; save -&gt; profile -&gt; scorecard path. Not likes. We buy self-recognition and captured leads, not applause.</w:t>
+      </w:r>
+    </w:p>
+    <w:bookmarkEnd w:id="29"/>
+    <w:bookmarkStart w:id="30" w:name="build-dependencies"/>
+    <w:p>
+      <w:pPr>
+        <w:pStyle w:val="Heading2"/>
+      </w:pPr>
+      <w:r>
+        <w:t xml:space="preserve">19. Build dependencies</w:t>
+      </w:r>
+    </w:p>
+    <w:p>
+      <w:pPr>
+        <w:pStyle w:val="Compact"/>
+        <w:numPr>
+          <w:ilvl w:val="0"/>
+          <w:numId w:val="1007"/>
+        </w:numPr>
+      </w:pPr>
+      <w:r>
+        <w:rPr>
+          <w:b/>
+          <w:bCs/>
+        </w:rPr>
+        <w:t xml:space="preserve">Voice-of-customer swipe file</w:t>
+      </w:r>
+      <w:r>
+        <w:t xml:space="preserve"> </w:t>
+      </w:r>
+      <w:r>
+        <w:t xml:space="preserve">- mine real phrases from scorecard answers + DMs. (Buildable on our side.)</w:t>
+      </w:r>
+    </w:p>
+    <w:p>
+      <w:pPr>
+        <w:pStyle w:val="Compact"/>
+        <w:numPr>
+          <w:ilvl w:val="0"/>
+          <w:numId w:val="1007"/>
+        </w:numPr>
+      </w:pPr>
+      <w:r>
+        <w:rPr>
+          <w:b/>
+          <w:bCs/>
+        </w:rPr>
+        <w:t xml:space="preserve">Personalised-read DM flows</w:t>
+      </w:r>
+      <w:r>
+        <w:t xml:space="preserve"> </w:t>
+      </w:r>
+      <w:r>
+        <w:t xml:space="preserve">in ManyChat - Kade builds, spec provided.</w:t>
+      </w:r>
+    </w:p>
+    <w:p>
+      <w:pPr>
+        <w:pStyle w:val="Compact"/>
+        <w:numPr>
+          <w:ilvl w:val="0"/>
+          <w:numId w:val="1007"/>
+        </w:numPr>
+      </w:pPr>
+      <w:r>
+        <w:rPr>
+          <w:b/>
+          <w:bCs/>
+        </w:rPr>
+        <w:t xml:space="preserve">Leads webhook</w:t>
+      </w:r>
+      <w:r>
+        <w:t xml:space="preserve"> </w:t>
+      </w:r>
+      <w:r>
+        <w:t xml:space="preserve">- ManyChat -&gt; dashboard, leads tagged by keyword. (Buildable on our side.)</w:t>
+      </w:r>
+    </w:p>
+    <w:p>
+      <w:pPr>
+        <w:pStyle w:val="Compact"/>
+        <w:numPr>
+          <w:ilvl w:val="0"/>
+          <w:numId w:val="1007"/>
+        </w:numPr>
+      </w:pPr>
+      <w:r>
+        <w:rPr>
+          <w:b/>
+          <w:bCs/>
+        </w:rPr>
+        <w:t xml:space="preserve">Reels / face</w:t>
+      </w:r>
+      <w:r>
+        <w:t xml:space="preserve"> </w:t>
+      </w:r>
+      <w:r>
+        <w:t xml:space="preserve">- Kade films, or HeyGen scales it.</w:t>
+      </w:r>
+    </w:p>
+    <w:p>
+      <w:pPr>
+        <w:pStyle w:val="Compact"/>
+        <w:numPr>
+          <w:ilvl w:val="0"/>
+          <w:numId w:val="1007"/>
+        </w:numPr>
+      </w:pPr>
+      <w:r>
+        <w:rPr>
+          <w:b/>
+          <w:bCs/>
+        </w:rPr>
+        <w:t xml:space="preserve">Free lead magnets</w:t>
+      </w:r>
+      <w:r>
+        <w:t xml:space="preserve"> </w:t>
+      </w:r>
+      <w:r>
+        <w:t xml:space="preserve">- the tailored one-pagers as leave-behinds (</w:t>
       </w:r>
       <w:r>
         <w:rPr>
           <w:rStyle w:val="VerbatimChar"/>
-          <w:b/>
-          <w:bCs/>
-        </w:rPr>
-        <w:t xml:space="preserve">@kade_dunstone_</w:t>
-      </w:r>
-      <w:r>
-        <w:rPr>
-          <w:b/>
-          <w:bCs/>
-        </w:rPr>
-        <w:t xml:space="preserve">)</w:t>
-      </w:r>
-      <w:r>
-        <w:t xml:space="preserve"> </w:t>
-      </w:r>
-      <w:r>
-        <w:t xml:space="preserve">= Kade’s first-person voice; sends warm audience toward Body Recode but keeps its own pillars.</w:t>
+        </w:rPr>
+        <w:t xml:space="preserve">comment-to-dm-asset-map-v1.md</w:t>
+      </w:r>
+      <w:r>
+        <w:t xml:space="preserve">).</w:t>
       </w:r>
     </w:p>
     <w:p>
@@ -1447,11 +2951,11 @@
           <w:i/>
           <w:iCs/>
         </w:rPr>
-        <w:t xml:space="preserve">Consolidated 2026-07-19. Numbers reflect the locked funnel anchors (Scorecard + Challenge free, Blueprint $97); coaching/membership tiers per the current money model.</w:t>
-      </w:r>
-    </w:p>
-    <w:bookmarkEnd w:id="18"/>
-    <w:bookmarkEnd w:id="19"/>
+        <w:t xml:space="preserve">The whole thing in one line: stop broadcasting information, start demonstrating that you can read the person the industry has given up on. That is the only thing that makes Body Recode different in the feed, so make it the entire show.</w:t>
+      </w:r>
+    </w:p>
+    <w:bookmarkEnd w:id="30"/>
+    <w:bookmarkEnd w:id="31"/>
     <w:sectPr>
       <w:footnotePr>
         <w:numRestart w:val="eachSect"/>
@@ -1793,9 +3297,39 @@
     <w:abstractNumId w:val="991"/>
   </w:num>
   <w:num w:numId="1005">
+    <w:abstractNumId w:val="99411"/>
+    <w:lvlOverride w:ilvl="0">
+      <w:startOverride w:val="1"/>
+    </w:lvlOverride>
+    <w:lvlOverride w:ilvl="1">
+      <w:startOverride w:val="1"/>
+    </w:lvlOverride>
+    <w:lvlOverride w:ilvl="2">
+      <w:startOverride w:val="1"/>
+    </w:lvlOverride>
+    <w:lvlOverride w:ilvl="3">
+      <w:startOverride w:val="1"/>
+    </w:lvlOverride>
+    <w:lvlOverride w:ilvl="4">
+      <w:startOverride w:val="1"/>
+    </w:lvlOverride>
+    <w:lvlOverride w:ilvl="5">
+      <w:startOverride w:val="1"/>
+    </w:lvlOverride>
+    <w:lvlOverride w:ilvl="6">
+      <w:startOverride w:val="1"/>
+    </w:lvlOverride>
+    <w:lvlOverride w:ilvl="7">
+      <w:startOverride w:val="1"/>
+    </w:lvlOverride>
+    <w:lvlOverride w:ilvl="8">
+      <w:startOverride w:val="1"/>
+    </w:lvlOverride>
+  </w:num>
+  <w:num w:numId="1006">
     <w:abstractNumId w:val="991"/>
   </w:num>
-  <w:num w:numId="1006">
+  <w:num w:numId="1007">
     <w:abstractNumId w:val="991"/>
   </w:num>
 </w:numbering>

</xml_diff>

<commit_message>
Update BR audience section for the data: Transitioning + Depleted
Lead data (116 leads/77 scorecards) shows the audience is 48% Transitioning,
32% Depleted, 19% Ready - not the assumed Depleted skew. Section 2 rewritten
to speak to both states; messaging Do-rule added ('write for Transitioning
as well as Depleted'). Flagged the unconfirmed age/sex ICP and the ~3%
social-sourced caveat. Regenerated designed PDF + docx (v2.1).

Co-Authored-By: Claude Opus 4.8 (1M context) <noreply@anthropic.com>
</commit_message>
<xml_diff>
--- a/public/docs/strategy/body-recode/body-recode-consumer-marketing-strategy-v1.docx
+++ b/public/docs/strategy/body-recode/body-recode-consumer-marketing-strategy-v1.docx
@@ -166,23 +166,7 @@
         <w:pStyle w:val="FirstParagraph"/>
       </w:pPr>
       <w:r>
-        <w:t xml:space="preserve">High-functioning adults whose bodies have stopped responding to effort - training hard, eating well, consistent, and getting nothing back. Four archetypes, skewed toward the</w:t>
-      </w:r>
-      <w:r>
-        <w:t xml:space="preserve"> </w:t>
-      </w:r>
-      <w:r>
-        <w:rPr>
-          <w:b/>
-          <w:bCs/>
-        </w:rPr>
-        <w:t xml:space="preserve">Depleted</w:t>
-      </w:r>
-      <w:r>
-        <w:t xml:space="preserve"> </w:t>
-      </w:r>
-      <w:r>
-        <w:t xml:space="preserve">end (bodies in protection/remediation, not the lean-and-optimising end).</w:t>
+        <w:t xml:space="preserve">High-functioning adults whose bodies have stopped giving back what the effort should return - training hard, eating well, consistent.</w:t>
       </w:r>
     </w:p>
     <w:p>
@@ -190,41 +174,74 @@
         <w:pStyle w:val="BodyText"/>
       </w:pPr>
       <w:r>
-        <w:t xml:space="preserve">Lead with the feeling, not the vocabulary:</w:t>
-      </w:r>
-      <w:r>
-        <w:t xml:space="preserve"> </w:t>
-      </w:r>
-      <w:r>
-        <w:rPr>
-          <w:i/>
-          <w:iCs/>
-        </w:rPr>
-        <w:t xml:space="preserve">“You’re training. You’re eating well. You’re consistent. And nothing is moving.”</w:t>
-      </w:r>
-      <w:r>
-        <w:t xml:space="preserve"> </w:t>
-      </w:r>
-      <w:r>
-        <w:t xml:space="preserve">Name what they feel first, then reveal the read underneath it.</w:t>
-      </w:r>
-    </w:p>
-    <w:bookmarkEnd w:id="11"/>
-    <w:bookmarkStart w:id="12" w:name="the-body-state-doctrine-the-spine"/>
-    <w:p>
-      <w:pPr>
-        <w:pStyle w:val="Heading2"/>
-      </w:pPr>
-      <w:r>
-        <w:t xml:space="preserve">3. The body-state doctrine (the spine)</w:t>
-      </w:r>
-    </w:p>
-    <w:p>
-      <w:pPr>
-        <w:pStyle w:val="FirstParagraph"/>
-      </w:pPr>
-      <w:r>
-        <w:t xml:space="preserve">The body operates in one of three states, and each needs a different approach - the same program that works in one makes things worse in another:</w:t>
+        <w:rPr>
+          <w:b/>
+          <w:bCs/>
+        </w:rPr>
+        <w:t xml:space="preserve">What the data says (116 leads / 77 scorecards, 2026-07):</w:t>
+      </w:r>
+      <w:r>
+        <w:t xml:space="preserve"> </w:t>
+      </w:r>
+      <w:r>
+        <w:t xml:space="preserve">the audience splits</w:t>
+      </w:r>
+      <w:r>
+        <w:t xml:space="preserve"> </w:t>
+      </w:r>
+      <w:r>
+        <w:rPr>
+          <w:b/>
+          <w:bCs/>
+        </w:rPr>
+        <w:t xml:space="preserve">Transitioning 48% · Depleted 32% · Ready 19%.</w:t>
+      </w:r>
+      <w:r>
+        <w:t xml:space="preserve"> </w:t>
+      </w:r>
+      <w:r>
+        <w:t xml:space="preserve">The earlier</w:t>
+      </w:r>
+      <w:r>
+        <w:t xml:space="preserve"> </w:t>
+      </w:r>
+      <w:r>
+        <w:t xml:space="preserve">“Depleted-skewed”</w:t>
+      </w:r>
+      <w:r>
+        <w:t xml:space="preserve"> </w:t>
+      </w:r>
+      <w:r>
+        <w:t xml:space="preserve">assumption is wrong - the single biggest group is</w:t>
+      </w:r>
+      <w:r>
+        <w:t xml:space="preserve"> </w:t>
+      </w:r>
+      <w:r>
+        <w:rPr>
+          <w:b/>
+          <w:bCs/>
+        </w:rPr>
+        <w:t xml:space="preserve">Transitioning</w:t>
+      </w:r>
+      <w:r>
+        <w:t xml:space="preserve"> </w:t>
+      </w:r>
+      <w:r>
+        <w:t xml:space="preserve">(responding, but stalled and needing directed load), with Depleted second. So the message has to speak to</w:t>
+      </w:r>
+      <w:r>
+        <w:t xml:space="preserve"> </w:t>
+      </w:r>
+      <w:r>
+        <w:rPr>
+          <w:b/>
+          <w:bCs/>
+        </w:rPr>
+        <w:t xml:space="preserve">both</w:t>
+      </w:r>
+      <w:r>
+        <w:t xml:space="preserve">, not just the fully-stuck reader:</w:t>
       </w:r>
     </w:p>
     <w:p>
@@ -240,13 +257,23 @@
           <w:b/>
           <w:bCs/>
         </w:rPr>
-        <w:t xml:space="preserve">Depleted / Remediation</w:t>
-      </w:r>
-      <w:r>
-        <w:t xml:space="preserve"> </w:t>
-      </w:r>
-      <w:r>
-        <w:t xml:space="preserve">- protection mode; more training + less food makes it worse.</w:t>
+        <w:t xml:space="preserve">Depleted:</w:t>
+      </w:r>
+      <w:r>
+        <w:t xml:space="preserve"> </w:t>
+      </w:r>
+      <w:r>
+        <w:rPr>
+          <w:i/>
+          <w:iCs/>
+        </w:rPr>
+        <w:t xml:space="preserve">“You’re doing everything and nothing is moving.”</w:t>
+      </w:r>
+      <w:r>
+        <w:t xml:space="preserve"> </w:t>
+      </w:r>
+      <w:r>
+        <w:t xml:space="preserve">Protection mode - more effort backfires.</w:t>
       </w:r>
     </w:p>
     <w:p>
@@ -262,13 +289,117 @@
           <w:b/>
           <w:bCs/>
         </w:rPr>
-        <w:t xml:space="preserve">Transitioning / Optimisation</w:t>
-      </w:r>
-      <w:r>
-        <w:t xml:space="preserve"> </w:t>
-      </w:r>
-      <w:r>
-        <w:t xml:space="preserve">- responding, needs directed load.</w:t>
+        <w:t xml:space="preserve">Transitioning:</w:t>
+      </w:r>
+      <w:r>
+        <w:t xml:space="preserve"> </w:t>
+      </w:r>
+      <w:r>
+        <w:rPr>
+          <w:i/>
+          <w:iCs/>
+        </w:rPr>
+        <w:t xml:space="preserve">“It’s started to work, then it stalls and you can’t tell why.”</w:t>
+      </w:r>
+      <w:r>
+        <w:t xml:space="preserve"> </w:t>
+      </w:r>
+      <w:r>
+        <w:t xml:space="preserve">Responding, but the load isn’t directed.</w:t>
+      </w:r>
+    </w:p>
+    <w:p>
+      <w:pPr>
+        <w:pStyle w:val="FirstParagraph"/>
+      </w:pPr>
+      <w:r>
+        <w:t xml:space="preserve">Lead with the feeling, not the vocabulary, and make sure the hook lets a</w:t>
+      </w:r>
+      <w:r>
+        <w:t xml:space="preserve"> </w:t>
+      </w:r>
+      <w:r>
+        <w:rPr>
+          <w:b/>
+          <w:bCs/>
+        </w:rPr>
+        <w:t xml:space="preserve">Transitioning</w:t>
+      </w:r>
+      <w:r>
+        <w:t xml:space="preserve"> </w:t>
+      </w:r>
+      <w:r>
+        <w:t xml:space="preserve">reader see themselves too - if every post only says</w:t>
+      </w:r>
+      <w:r>
+        <w:t xml:space="preserve"> </w:t>
+      </w:r>
+      <w:r>
+        <w:t xml:space="preserve">“nothing is moving,”</w:t>
+      </w:r>
+      <w:r>
+        <w:t xml:space="preserve"> </w:t>
+      </w:r>
+      <w:r>
+        <w:t xml:space="preserve">half the room scrolls past. Name what they feel first, then reveal the read underneath it.</w:t>
+      </w:r>
+    </w:p>
+    <w:p>
+      <w:pPr>
+        <w:pStyle w:val="BodyText"/>
+      </w:pPr>
+      <w:r>
+        <w:rPr>
+          <w:i/>
+          <w:iCs/>
+        </w:rPr>
+        <w:t xml:space="preserve">Caveat: age/sex is not captured for most leads, so the</w:t>
+      </w:r>
+      <w:r>
+        <w:rPr>
+          <w:i/>
+          <w:iCs/>
+        </w:rPr>
+        <w:t xml:space="preserve"> </w:t>
+      </w:r>
+      <w:r>
+        <w:rPr>
+          <w:i/>
+          <w:iCs/>
+        </w:rPr>
+        <w:t xml:space="preserve">“women 35-50”</w:t>
+      </w:r>
+      <w:r>
+        <w:rPr>
+          <w:i/>
+          <w:iCs/>
+        </w:rPr>
+        <w:t xml:space="preserve"> </w:t>
+      </w:r>
+      <w:r>
+        <w:rPr>
+          <w:i/>
+          <w:iCs/>
+        </w:rPr>
+        <w:t xml:space="preserve">part of the ICP is unconfirmed - tighten capture before leaning on it. And note only ~3% of leads currently come from social, so this audience is barely tested on Instagram yet; get the content engine (Part II) driving real social volume before judging the audience.</w:t>
+      </w:r>
+    </w:p>
+    <w:bookmarkEnd w:id="11"/>
+    <w:bookmarkStart w:id="12" w:name="the-body-state-doctrine-the-spine"/>
+    <w:p>
+      <w:pPr>
+        <w:pStyle w:val="Heading2"/>
+      </w:pPr>
+      <w:r>
+        <w:t xml:space="preserve">3. The body-state doctrine (the spine)</w:t>
+      </w:r>
+    </w:p>
+    <w:p>
+      <w:pPr>
+        <w:pStyle w:val="FirstParagraph"/>
+      </w:pPr>
+      <w:r>
+        <w:t xml:space="preserve">The body operates in one of three states, and each needs a different approach - the same program that works in one makes things worse in another:</w:t>
       </w:r>
     </w:p>
     <w:p>
@@ -276,7 +407,51 @@
         <w:pStyle w:val="Compact"/>
         <w:numPr>
           <w:ilvl w:val="0"/>
-          <w:numId w:val="1001"/>
+          <w:numId w:val="1002"/>
+        </w:numPr>
+      </w:pPr>
+      <w:r>
+        <w:rPr>
+          <w:b/>
+          <w:bCs/>
+        </w:rPr>
+        <w:t xml:space="preserve">Depleted / Remediation</w:t>
+      </w:r>
+      <w:r>
+        <w:t xml:space="preserve"> </w:t>
+      </w:r>
+      <w:r>
+        <w:t xml:space="preserve">- protection mode; more training + less food makes it worse.</w:t>
+      </w:r>
+    </w:p>
+    <w:p>
+      <w:pPr>
+        <w:pStyle w:val="Compact"/>
+        <w:numPr>
+          <w:ilvl w:val="0"/>
+          <w:numId w:val="1002"/>
+        </w:numPr>
+      </w:pPr>
+      <w:r>
+        <w:rPr>
+          <w:b/>
+          <w:bCs/>
+        </w:rPr>
+        <w:t xml:space="preserve">Transitioning / Optimisation</w:t>
+      </w:r>
+      <w:r>
+        <w:t xml:space="preserve"> </w:t>
+      </w:r>
+      <w:r>
+        <w:t xml:space="preserve">- responding, needs directed load.</w:t>
+      </w:r>
+    </w:p>
+    <w:p>
+      <w:pPr>
+        <w:pStyle w:val="Compact"/>
+        <w:numPr>
+          <w:ilvl w:val="0"/>
+          <w:numId w:val="1002"/>
         </w:numPr>
       </w:pPr>
       <w:r>
@@ -664,7 +839,7 @@
         <w:pStyle w:val="Compact"/>
         <w:numPr>
           <w:ilvl w:val="0"/>
-          <w:numId w:val="1002"/>
+          <w:numId w:val="1003"/>
         </w:numPr>
       </w:pPr>
       <w:r>
@@ -679,199 +854,6 @@
       </w:r>
       <w:r>
         <w:t xml:space="preserve">= consumer demand. Fills the funnel and feeds coaching.</w:t>
-      </w:r>
-    </w:p>
-    <w:p>
-      <w:pPr>
-        <w:pStyle w:val="Compact"/>
-        <w:numPr>
-          <w:ilvl w:val="0"/>
-          <w:numId w:val="1002"/>
-        </w:numPr>
-      </w:pPr>
-      <w:r>
-        <w:rPr>
-          <w:b/>
-          <w:bCs/>
-        </w:rPr>
-        <w:t xml:space="preserve">Performance Coaching</w:t>
-      </w:r>
-      <w:r>
-        <w:t xml:space="preserve"> </w:t>
-      </w:r>
-      <w:r>
-        <w:t xml:space="preserve">= the delivery arm the funnel feeds (not separately marketed).</w:t>
-      </w:r>
-    </w:p>
-    <w:p>
-      <w:pPr>
-        <w:pStyle w:val="Compact"/>
-        <w:numPr>
-          <w:ilvl w:val="0"/>
-          <w:numId w:val="1002"/>
-        </w:numPr>
-      </w:pPr>
-      <w:r>
-        <w:rPr>
-          <w:b/>
-          <w:bCs/>
-        </w:rPr>
-        <w:t xml:space="preserve">The Collective</w:t>
-      </w:r>
-      <w:r>
-        <w:t xml:space="preserve"> </w:t>
-      </w:r>
-      <w:r>
-        <w:t xml:space="preserve">= the B2B licensing engine (</w:t>
-      </w:r>
-      <w:r>
-        <w:t xml:space="preserve">“Powered by Body Recode”</w:t>
-      </w:r>
-      <w:r>
-        <w:t xml:space="preserve">). Different audience (coaches), different channel (LinkedIn). Never mixed into consumer content.</w:t>
-      </w:r>
-    </w:p>
-    <w:p>
-      <w:pPr>
-        <w:pStyle w:val="Compact"/>
-        <w:numPr>
-          <w:ilvl w:val="0"/>
-          <w:numId w:val="1002"/>
-        </w:numPr>
-      </w:pPr>
-      <w:r>
-        <w:rPr>
-          <w:b/>
-          <w:bCs/>
-        </w:rPr>
-        <w:t xml:space="preserve">Personal brand (</w:t>
-      </w:r>
-      <w:r>
-        <w:rPr>
-          <w:rStyle w:val="VerbatimChar"/>
-          <w:b/>
-          <w:bCs/>
-        </w:rPr>
-        <w:t xml:space="preserve">@kade_dunstone_</w:t>
-      </w:r>
-      <w:r>
-        <w:rPr>
-          <w:b/>
-          <w:bCs/>
-        </w:rPr>
-        <w:t xml:space="preserve">)</w:t>
-      </w:r>
-      <w:r>
-        <w:t xml:space="preserve"> </w:t>
-      </w:r>
-      <w:r>
-        <w:t xml:space="preserve">= Kade’s first-person voice; sends warm audience toward Body Recode but keeps its own pillars.</w:t>
-      </w:r>
-    </w:p>
-    <w:p>
-      <w:r>
-        <w:pict>
-          <v:rect style="width:0;height:1.5pt" o:hralign="center" o:hrstd="t" o:hr="t"/>
-        </w:pict>
-      </w:r>
-    </w:p>
-    <w:bookmarkEnd w:id="14"/>
-    <w:bookmarkEnd w:id="15"/>
-    <w:bookmarkStart w:id="26" w:name="part-ii---the-content-engine-how"/>
-    <w:p>
-      <w:pPr>
-        <w:pStyle w:val="Heading1"/>
-      </w:pPr>
-      <w:r>
-        <w:t xml:space="preserve">PART II - THE CONTENT ENGINE (how)</w:t>
-      </w:r>
-    </w:p>
-    <w:bookmarkStart w:id="16" w:name="the-one-shift"/>
-    <w:p>
-      <w:pPr>
-        <w:pStyle w:val="Heading2"/>
-      </w:pPr>
-      <w:r>
-        <w:t xml:space="preserve">6. The one shift</w:t>
-      </w:r>
-    </w:p>
-    <w:p>
-      <w:pPr>
-        <w:pStyle w:val="FirstParagraph"/>
-      </w:pPr>
-      <w:r>
-        <w:rPr>
-          <w:b/>
-          <w:bCs/>
-        </w:rPr>
-        <w:t xml:space="preserve">Stop teaching. Start reading.</w:t>
-      </w:r>
-      <w:r>
-        <w:t xml:space="preserve"> </w:t>
-      </w:r>
-      <w:r>
-        <w:t xml:space="preserve">Engagement was low because the content taught, and teaching earns respect and gets scrolled past. Information travels in the head; self-recognition travels in the gut, and the gut taps the comment button. Every post does one of three things: makes someone</w:t>
-      </w:r>
-      <w:r>
-        <w:t xml:space="preserve"> </w:t>
-      </w:r>
-      <w:r>
-        <w:rPr>
-          <w:i/>
-          <w:iCs/>
-        </w:rPr>
-        <w:t xml:space="preserve">feel seen</w:t>
-      </w:r>
-      <w:r>
-        <w:t xml:space="preserve">, proves</w:t>
-      </w:r>
-      <w:r>
-        <w:t xml:space="preserve"> </w:t>
-      </w:r>
-      <w:r>
-        <w:rPr>
-          <w:i/>
-          <w:iCs/>
-        </w:rPr>
-        <w:t xml:space="preserve">you can read them</w:t>
-      </w:r>
-      <w:r>
-        <w:t xml:space="preserve">, or gives them a</w:t>
-      </w:r>
-      <w:r>
-        <w:t xml:space="preserve"> </w:t>
-      </w:r>
-      <w:r>
-        <w:rPr>
-          <w:i/>
-          <w:iCs/>
-        </w:rPr>
-        <w:t xml:space="preserve">result about themselves</w:t>
-      </w:r>
-      <w:r>
-        <w:t xml:space="preserve">. If a post only explains a concept, it doesn’t ship. This is the same</w:t>
-      </w:r>
-      <w:r>
-        <w:t xml:space="preserve"> </w:t>
-      </w:r>
-      <w:r>
-        <w:t xml:space="preserve">“interpretation before prescription”</w:t>
-      </w:r>
-      <w:r>
-        <w:t xml:space="preserve"> </w:t>
-      </w:r>
-      <w:r>
-        <w:t xml:space="preserve">idea from section 1, turned into content.</w:t>
-      </w:r>
-    </w:p>
-    <w:bookmarkEnd w:id="16"/>
-    <w:bookmarkStart w:id="17" w:name="three-writing-rules-non-negotiable"/>
-    <w:p>
-      <w:pPr>
-        <w:pStyle w:val="Heading2"/>
-      </w:pPr>
-      <w:r>
-        <w:t xml:space="preserve">7. Three writing rules (non-negotiable)</w:t>
       </w:r>
     </w:p>
     <w:p>
@@ -887,37 +869,13 @@
           <w:b/>
           <w:bCs/>
         </w:rPr>
-        <w:t xml:space="preserve">Scenarios over concepts.</w:t>
-      </w:r>
-      <w:r>
-        <w:t xml:space="preserve"> </w:t>
-      </w:r>
-      <w:r>
-        <w:t xml:space="preserve">A specific person in a specific moment.</w:t>
-      </w:r>
-      <w:r>
-        <w:t xml:space="preserve"> </w:t>
-      </w:r>
-      <w:r>
-        <w:t xml:space="preserve">“You’re 42, training five mornings, cut the wine, scale hasn’t moved in eight months”</w:t>
-      </w:r>
-      <w:r>
-        <w:t xml:space="preserve"> </w:t>
-      </w:r>
-      <w:r>
-        <w:t xml:space="preserve">beats</w:t>
-      </w:r>
-      <w:r>
-        <w:t xml:space="preserve"> </w:t>
-      </w:r>
-      <w:r>
-        <w:t xml:space="preserve">“your body may be depleted”</w:t>
-      </w:r>
-      <w:r>
-        <w:t xml:space="preserve"> </w:t>
-      </w:r>
-      <w:r>
-        <w:t xml:space="preserve">every time.</w:t>
+        <w:t xml:space="preserve">Performance Coaching</w:t>
+      </w:r>
+      <w:r>
+        <w:t xml:space="preserve"> </w:t>
+      </w:r>
+      <w:r>
+        <w:t xml:space="preserve">= the delivery arm the funnel feeds (not separately marketed).</w:t>
       </w:r>
     </w:p>
     <w:p>
@@ -933,13 +891,19 @@
           <w:b/>
           <w:bCs/>
         </w:rPr>
-        <w:t xml:space="preserve">Their words, not ours.</w:t>
-      </w:r>
-      <w:r>
-        <w:t xml:space="preserve"> </w:t>
-      </w:r>
-      <w:r>
-        <w:t xml:space="preserve">Open with the exact phrases people write in their scorecard answers and DMs. Sound like the voice already in their head. Keep a swipe file of real lines and pull from it.</w:t>
+        <w:t xml:space="preserve">The Collective</w:t>
+      </w:r>
+      <w:r>
+        <w:t xml:space="preserve"> </w:t>
+      </w:r>
+      <w:r>
+        <w:t xml:space="preserve">= the B2B licensing engine (</w:t>
+      </w:r>
+      <w:r>
+        <w:t xml:space="preserve">“Powered by Body Recode”</w:t>
+      </w:r>
+      <w:r>
+        <w:t xml:space="preserve">). Different audience (coaches), different channel (LinkedIn). Never mixed into consumer content.</w:t>
       </w:r>
     </w:p>
     <w:p>
@@ -948,6 +912,217 @@
         <w:numPr>
           <w:ilvl w:val="0"/>
           <w:numId w:val="1003"/>
+        </w:numPr>
+      </w:pPr>
+      <w:r>
+        <w:rPr>
+          <w:b/>
+          <w:bCs/>
+        </w:rPr>
+        <w:t xml:space="preserve">Personal brand (</w:t>
+      </w:r>
+      <w:r>
+        <w:rPr>
+          <w:rStyle w:val="VerbatimChar"/>
+          <w:b/>
+          <w:bCs/>
+        </w:rPr>
+        <w:t xml:space="preserve">@kade_dunstone_</w:t>
+      </w:r>
+      <w:r>
+        <w:rPr>
+          <w:b/>
+          <w:bCs/>
+        </w:rPr>
+        <w:t xml:space="preserve">)</w:t>
+      </w:r>
+      <w:r>
+        <w:t xml:space="preserve"> </w:t>
+      </w:r>
+      <w:r>
+        <w:t xml:space="preserve">= Kade’s first-person voice; sends warm audience toward Body Recode but keeps its own pillars.</w:t>
+      </w:r>
+    </w:p>
+    <w:p>
+      <w:r>
+        <w:pict>
+          <v:rect style="width:0;height:1.5pt" o:hralign="center" o:hrstd="t" o:hr="t"/>
+        </w:pict>
+      </w:r>
+    </w:p>
+    <w:bookmarkEnd w:id="14"/>
+    <w:bookmarkEnd w:id="15"/>
+    <w:bookmarkStart w:id="26" w:name="part-ii---the-content-engine-how"/>
+    <w:p>
+      <w:pPr>
+        <w:pStyle w:val="Heading1"/>
+      </w:pPr>
+      <w:r>
+        <w:t xml:space="preserve">PART II - THE CONTENT ENGINE (how)</w:t>
+      </w:r>
+    </w:p>
+    <w:bookmarkStart w:id="16" w:name="the-one-shift"/>
+    <w:p>
+      <w:pPr>
+        <w:pStyle w:val="Heading2"/>
+      </w:pPr>
+      <w:r>
+        <w:t xml:space="preserve">6. The one shift</w:t>
+      </w:r>
+    </w:p>
+    <w:p>
+      <w:pPr>
+        <w:pStyle w:val="FirstParagraph"/>
+      </w:pPr>
+      <w:r>
+        <w:rPr>
+          <w:b/>
+          <w:bCs/>
+        </w:rPr>
+        <w:t xml:space="preserve">Stop teaching. Start reading.</w:t>
+      </w:r>
+      <w:r>
+        <w:t xml:space="preserve"> </w:t>
+      </w:r>
+      <w:r>
+        <w:t xml:space="preserve">Engagement was low because the content taught, and teaching earns respect and gets scrolled past. Information travels in the head; self-recognition travels in the gut, and the gut taps the comment button. Every post does one of three things: makes someone</w:t>
+      </w:r>
+      <w:r>
+        <w:t xml:space="preserve"> </w:t>
+      </w:r>
+      <w:r>
+        <w:rPr>
+          <w:i/>
+          <w:iCs/>
+        </w:rPr>
+        <w:t xml:space="preserve">feel seen</w:t>
+      </w:r>
+      <w:r>
+        <w:t xml:space="preserve">, proves</w:t>
+      </w:r>
+      <w:r>
+        <w:t xml:space="preserve"> </w:t>
+      </w:r>
+      <w:r>
+        <w:rPr>
+          <w:i/>
+          <w:iCs/>
+        </w:rPr>
+        <w:t xml:space="preserve">you can read them</w:t>
+      </w:r>
+      <w:r>
+        <w:t xml:space="preserve">, or gives them a</w:t>
+      </w:r>
+      <w:r>
+        <w:t xml:space="preserve"> </w:t>
+      </w:r>
+      <w:r>
+        <w:rPr>
+          <w:i/>
+          <w:iCs/>
+        </w:rPr>
+        <w:t xml:space="preserve">result about themselves</w:t>
+      </w:r>
+      <w:r>
+        <w:t xml:space="preserve">. If a post only explains a concept, it doesn’t ship. This is the same</w:t>
+      </w:r>
+      <w:r>
+        <w:t xml:space="preserve"> </w:t>
+      </w:r>
+      <w:r>
+        <w:t xml:space="preserve">“interpretation before prescription”</w:t>
+      </w:r>
+      <w:r>
+        <w:t xml:space="preserve"> </w:t>
+      </w:r>
+      <w:r>
+        <w:t xml:space="preserve">idea from section 1, turned into content.</w:t>
+      </w:r>
+    </w:p>
+    <w:bookmarkEnd w:id="16"/>
+    <w:bookmarkStart w:id="17" w:name="three-writing-rules-non-negotiable"/>
+    <w:p>
+      <w:pPr>
+        <w:pStyle w:val="Heading2"/>
+      </w:pPr>
+      <w:r>
+        <w:t xml:space="preserve">7. Three writing rules (non-negotiable)</w:t>
+      </w:r>
+    </w:p>
+    <w:p>
+      <w:pPr>
+        <w:pStyle w:val="Compact"/>
+        <w:numPr>
+          <w:ilvl w:val="0"/>
+          <w:numId w:val="1004"/>
+        </w:numPr>
+      </w:pPr>
+      <w:r>
+        <w:rPr>
+          <w:b/>
+          <w:bCs/>
+        </w:rPr>
+        <w:t xml:space="preserve">Scenarios over concepts.</w:t>
+      </w:r>
+      <w:r>
+        <w:t xml:space="preserve"> </w:t>
+      </w:r>
+      <w:r>
+        <w:t xml:space="preserve">A specific person in a specific moment.</w:t>
+      </w:r>
+      <w:r>
+        <w:t xml:space="preserve"> </w:t>
+      </w:r>
+      <w:r>
+        <w:t xml:space="preserve">“You’re 42, training five mornings, cut the wine, scale hasn’t moved in eight months”</w:t>
+      </w:r>
+      <w:r>
+        <w:t xml:space="preserve"> </w:t>
+      </w:r>
+      <w:r>
+        <w:t xml:space="preserve">beats</w:t>
+      </w:r>
+      <w:r>
+        <w:t xml:space="preserve"> </w:t>
+      </w:r>
+      <w:r>
+        <w:t xml:space="preserve">“your body may be depleted”</w:t>
+      </w:r>
+      <w:r>
+        <w:t xml:space="preserve"> </w:t>
+      </w:r>
+      <w:r>
+        <w:t xml:space="preserve">every time.</w:t>
+      </w:r>
+    </w:p>
+    <w:p>
+      <w:pPr>
+        <w:pStyle w:val="Compact"/>
+        <w:numPr>
+          <w:ilvl w:val="0"/>
+          <w:numId w:val="1004"/>
+        </w:numPr>
+      </w:pPr>
+      <w:r>
+        <w:rPr>
+          <w:b/>
+          <w:bCs/>
+        </w:rPr>
+        <w:t xml:space="preserve">Their words, not ours.</w:t>
+      </w:r>
+      <w:r>
+        <w:t xml:space="preserve"> </w:t>
+      </w:r>
+      <w:r>
+        <w:t xml:space="preserve">Open with the exact phrases people write in their scorecard answers and DMs. Sound like the voice already in their head. Keep a swipe file of real lines and pull from it.</w:t>
+      </w:r>
+    </w:p>
+    <w:p>
+      <w:pPr>
+        <w:pStyle w:val="Compact"/>
+        <w:numPr>
+          <w:ilvl w:val="0"/>
+          <w:numId w:val="1004"/>
         </w:numPr>
       </w:pPr>
       <w:r>
@@ -1808,7 +1983,7 @@
         <w:pStyle w:val="Compact"/>
         <w:numPr>
           <w:ilvl w:val="0"/>
-          <w:numId w:val="1004"/>
+          <w:numId w:val="1005"/>
         </w:numPr>
       </w:pPr>
       <w:r>
@@ -2518,7 +2693,7 @@
         <w:pStyle w:val="Compact"/>
         <w:numPr>
           <w:ilvl w:val="0"/>
-          <w:numId w:val="1005"/>
+          <w:numId w:val="1006"/>
         </w:numPr>
       </w:pPr>
       <w:r>
@@ -2533,85 +2708,6 @@
       </w:r>
       <w:r>
         <w:t xml:space="preserve">- the signature demo, weekly.</w:t>
-      </w:r>
-    </w:p>
-    <w:p>
-      <w:pPr>
-        <w:pStyle w:val="Compact"/>
-        <w:numPr>
-          <w:ilvl w:val="0"/>
-          <w:numId w:val="1005"/>
-        </w:numPr>
-      </w:pPr>
-      <w:r>
-        <w:rPr>
-          <w:b/>
-          <w:bCs/>
-        </w:rPr>
-        <w:t xml:space="preserve">State of the Data</w:t>
-      </w:r>
-      <w:r>
-        <w:t xml:space="preserve"> </w:t>
-      </w:r>
-      <w:r>
-        <w:t xml:space="preserve">- your own scorecard patterns as content.</w:t>
-      </w:r>
-    </w:p>
-    <w:p>
-      <w:pPr>
-        <w:pStyle w:val="Compact"/>
-        <w:numPr>
-          <w:ilvl w:val="0"/>
-          <w:numId w:val="1005"/>
-        </w:numPr>
-      </w:pPr>
-      <w:r>
-        <w:rPr>
-          <w:b/>
-          <w:bCs/>
-        </w:rPr>
-        <w:t xml:space="preserve">The personalised comment-to-DM read</w:t>
-      </w:r>
-      <w:r>
-        <w:t xml:space="preserve"> </w:t>
-      </w:r>
-      <w:r>
-        <w:t xml:space="preserve">- the upgraded lead mechanic.</w:t>
-      </w:r>
-    </w:p>
-    <w:p>
-      <w:pPr>
-        <w:pStyle w:val="FirstParagraph"/>
-      </w:pPr>
-      <w:r>
-        <w:t xml:space="preserve">Run against the current style for 2-3 weeks; let the numbers pick winners, then double down.</w:t>
-      </w:r>
-    </w:p>
-    <w:p>
-      <w:r>
-        <w:pict>
-          <v:rect style="width:0;height:1.5pt" o:hralign="center" o:hrstd="t" o:hr="t"/>
-        </w:pict>
-      </w:r>
-    </w:p>
-    <w:bookmarkEnd w:id="25"/>
-    <w:bookmarkEnd w:id="26"/>
-    <w:bookmarkStart w:id="31" w:name="part-iii---standards-measurement"/>
-    <w:p>
-      <w:pPr>
-        <w:pStyle w:val="Heading1"/>
-      </w:pPr>
-      <w:r>
-        <w:t xml:space="preserve">PART III - STANDARDS &amp; MEASUREMENT</w:t>
-      </w:r>
-    </w:p>
-    <w:bookmarkStart w:id="27" w:name="voice-design-rules"/>
-    <w:p>
-      <w:pPr>
-        <w:pStyle w:val="Heading2"/>
-      </w:pPr>
-      <w:r>
-        <w:t xml:space="preserve">16. Voice &amp; design rules</w:t>
       </w:r>
     </w:p>
     <w:p>
@@ -2627,25 +2723,13 @@
           <w:b/>
           <w:bCs/>
         </w:rPr>
-        <w:t xml:space="preserve">Voice:</w:t>
-      </w:r>
-      <w:r>
-        <w:t xml:space="preserve"> </w:t>
-      </w:r>
-      <w:r>
-        <w:t xml:space="preserve">interpretation-led, calm authority, no hype. Contractions, varied rhythm, read-aloud test. Fat-loss-explicit framing. No</w:t>
-      </w:r>
-      <w:r>
-        <w:t xml:space="preserve"> </w:t>
-      </w:r>
-      <w:r>
-        <w:t xml:space="preserve">“tips”</w:t>
-      </w:r>
-      <w:r>
-        <w:t xml:space="preserve"> </w:t>
-      </w:r>
-      <w:r>
-        <w:t xml:space="preserve">content - always the read underneath.</w:t>
+        <w:t xml:space="preserve">State of the Data</w:t>
+      </w:r>
+      <w:r>
+        <w:t xml:space="preserve"> </w:t>
+      </w:r>
+      <w:r>
+        <w:t xml:space="preserve">- your own scorecard patterns as content.</w:t>
       </w:r>
     </w:p>
     <w:p>
@@ -2661,159 +2745,48 @@
           <w:b/>
           <w:bCs/>
         </w:rPr>
-        <w:t xml:space="preserve">No em dashes</w:t>
-      </w:r>
-      <w:r>
-        <w:t xml:space="preserve"> </w:t>
-      </w:r>
-      <w:r>
-        <w:t xml:space="preserve">(house style) - hyphens or rewrites.</w:t>
-      </w:r>
-    </w:p>
-    <w:p>
-      <w:pPr>
-        <w:pStyle w:val="Compact"/>
-        <w:numPr>
-          <w:ilvl w:val="0"/>
-          <w:numId w:val="1006"/>
-        </w:numPr>
-      </w:pPr>
-      <w:r>
-        <w:rPr>
-          <w:b/>
-          <w:bCs/>
-        </w:rPr>
-        <w:t xml:space="preserve">Design:</w:t>
-      </w:r>
-      <w:r>
-        <w:t xml:space="preserve"> </w:t>
-      </w:r>
-      <w:r>
-        <w:t xml:space="preserve">Pure White / Graphite / Signal Blue (#1B6DFC). Social assets 1080x1350 (4:5); reels 9:16; 96px safe margins. All photos of Kade in BR graphics render</w:t>
-      </w:r>
-      <w:r>
-        <w:t xml:space="preserve"> </w:t>
-      </w:r>
-      <w:r>
-        <w:rPr>
-          <w:b/>
-          <w:bCs/>
-        </w:rPr>
-        <w:t xml:space="preserve">greyscale</w:t>
-      </w:r>
-      <w:r>
-        <w:t xml:space="preserve">, never colour.</w:t>
-      </w:r>
-    </w:p>
-    <w:p>
-      <w:pPr>
-        <w:pStyle w:val="Compact"/>
-        <w:numPr>
-          <w:ilvl w:val="0"/>
-          <w:numId w:val="1006"/>
-        </w:numPr>
-      </w:pPr>
-      <w:r>
-        <w:t xml:space="preserve">Kade’s public byline title:</w:t>
-      </w:r>
-      <w:r>
-        <w:t xml:space="preserve"> </w:t>
-      </w:r>
-      <w:r>
-        <w:rPr>
-          <w:b/>
-          <w:bCs/>
-        </w:rPr>
-        <w:t xml:space="preserve">“Sports Scientist”</w:t>
-      </w:r>
-      <w:r>
-        <w:t xml:space="preserve"> </w:t>
-      </w:r>
-      <w:r>
-        <w:t xml:space="preserve">(not</w:t>
-      </w:r>
-      <w:r>
-        <w:t xml:space="preserve"> </w:t>
-      </w:r>
-      <w:r>
-        <w:t xml:space="preserve">“Exercise Scientist”</w:t>
-      </w:r>
-      <w:r>
-        <w:t xml:space="preserve">).</w:t>
-      </w:r>
-    </w:p>
-    <w:bookmarkEnd w:id="27"/>
-    <w:bookmarkStart w:id="28" w:name="messaging-rules-do-dont"/>
+        <w:t xml:space="preserve">The personalised comment-to-DM read</w:t>
+      </w:r>
+      <w:r>
+        <w:t xml:space="preserve"> </w:t>
+      </w:r>
+      <w:r>
+        <w:t xml:space="preserve">- the upgraded lead mechanic.</w:t>
+      </w:r>
+    </w:p>
+    <w:p>
+      <w:pPr>
+        <w:pStyle w:val="FirstParagraph"/>
+      </w:pPr>
+      <w:r>
+        <w:t xml:space="preserve">Run against the current style for 2-3 weeks; let the numbers pick winners, then double down.</w:t>
+      </w:r>
+    </w:p>
+    <w:p>
+      <w:r>
+        <w:pict>
+          <v:rect style="width:0;height:1.5pt" o:hralign="center" o:hrstd="t" o:hr="t"/>
+        </w:pict>
+      </w:r>
+    </w:p>
+    <w:bookmarkEnd w:id="25"/>
+    <w:bookmarkEnd w:id="26"/>
+    <w:bookmarkStart w:id="31" w:name="part-iii---standards-measurement"/>
+    <w:p>
+      <w:pPr>
+        <w:pStyle w:val="Heading1"/>
+      </w:pPr>
+      <w:r>
+        <w:t xml:space="preserve">PART III - STANDARDS &amp; MEASUREMENT</w:t>
+      </w:r>
+    </w:p>
+    <w:bookmarkStart w:id="27" w:name="voice-design-rules"/>
     <w:p>
       <w:pPr>
         <w:pStyle w:val="Heading2"/>
       </w:pPr>
       <w:r>
-        <w:t xml:space="preserve">17. Messaging rules (do / don’t)</w:t>
-      </w:r>
-    </w:p>
-    <w:p>
-      <w:pPr>
-        <w:pStyle w:val="FirstParagraph"/>
-      </w:pPr>
-      <w:r>
-        <w:rPr>
-          <w:b/>
-          <w:bCs/>
-        </w:rPr>
-        <w:t xml:space="preserve">Do:</w:t>
-      </w:r>
-      <w:r>
-        <w:t xml:space="preserve"> </w:t>
-      </w:r>
-      <w:r>
-        <w:t xml:space="preserve">lead with the stuck feeling; name the state; make the Scorecard the destination; use proof (real trajectories, with consent); keep the read ahead of the prescription; prove you can read people rather than teach them.</w:t>
-      </w:r>
-    </w:p>
-    <w:p>
-      <w:pPr>
-        <w:pStyle w:val="BodyText"/>
-      </w:pPr>
-      <w:r>
-        <w:rPr>
-          <w:b/>
-          <w:bCs/>
-        </w:rPr>
-        <w:t xml:space="preserve">Don’t:</w:t>
-      </w:r>
-      <w:r>
-        <w:t xml:space="preserve"> </w:t>
-      </w:r>
-      <w:r>
-        <w:t xml:space="preserve">open cold with doctrine vocabulary; sell the Blueprint/coaching before the Scorecard; run reels/video in cold-paid ad sets; use colour photos of Kade in BR graphics; ask one post to both earn engagement and drive a click; blur into the coach-licensing (Collective) audience.</w:t>
-      </w:r>
-    </w:p>
-    <w:bookmarkEnd w:id="28"/>
-    <w:bookmarkStart w:id="29" w:name="what-we-measure"/>
-    <w:p>
-      <w:pPr>
-        <w:pStyle w:val="Heading2"/>
-      </w:pPr>
-      <w:r>
-        <w:t xml:space="preserve">18. What we measure</w:t>
-      </w:r>
-    </w:p>
-    <w:p>
-      <w:pPr>
-        <w:pStyle w:val="FirstParagraph"/>
-      </w:pPr>
-      <w:r>
-        <w:t xml:space="preserve">Comments + saves + shares (real engagement), DM keyword captures, scorecard starts, and the earliest broken gate in the reach -&gt; save -&gt; profile -&gt; scorecard path. Not likes. We buy self-recognition and captured leads, not applause.</w:t>
-      </w:r>
-    </w:p>
-    <w:bookmarkEnd w:id="29"/>
-    <w:bookmarkStart w:id="30" w:name="build-dependencies"/>
-    <w:p>
-      <w:pPr>
-        <w:pStyle w:val="Heading2"/>
-      </w:pPr>
-      <w:r>
-        <w:t xml:space="preserve">19. Build dependencies</w:t>
+        <w:t xml:space="preserve">16. Voice &amp; design rules</w:t>
       </w:r>
     </w:p>
     <w:p>
@@ -2829,13 +2802,25 @@
           <w:b/>
           <w:bCs/>
         </w:rPr>
-        <w:t xml:space="preserve">Voice-of-customer swipe file</w:t>
-      </w:r>
-      <w:r>
-        <w:t xml:space="preserve"> </w:t>
-      </w:r>
-      <w:r>
-        <w:t xml:space="preserve">- mine real phrases from scorecard answers + DMs. (Buildable on our side.)</w:t>
+        <w:t xml:space="preserve">Voice:</w:t>
+      </w:r>
+      <w:r>
+        <w:t xml:space="preserve"> </w:t>
+      </w:r>
+      <w:r>
+        <w:t xml:space="preserve">interpretation-led, calm authority, no hype. Contractions, varied rhythm, read-aloud test. Fat-loss-explicit framing. No</w:t>
+      </w:r>
+      <w:r>
+        <w:t xml:space="preserve"> </w:t>
+      </w:r>
+      <w:r>
+        <w:t xml:space="preserve">“tips”</w:t>
+      </w:r>
+      <w:r>
+        <w:t xml:space="preserve"> </w:t>
+      </w:r>
+      <w:r>
+        <w:t xml:space="preserve">content - always the read underneath.</w:t>
       </w:r>
     </w:p>
     <w:p>
@@ -2851,13 +2836,13 @@
           <w:b/>
           <w:bCs/>
         </w:rPr>
-        <w:t xml:space="preserve">Personalised-read DM flows</w:t>
-      </w:r>
-      <w:r>
-        <w:t xml:space="preserve"> </w:t>
-      </w:r>
-      <w:r>
-        <w:t xml:space="preserve">in ManyChat - Kade builds, spec provided.</w:t>
+        <w:t xml:space="preserve">No em dashes</w:t>
+      </w:r>
+      <w:r>
+        <w:t xml:space="preserve"> </w:t>
+      </w:r>
+      <w:r>
+        <w:t xml:space="preserve">(house style) - hyphens or rewrites.</w:t>
       </w:r>
     </w:p>
     <w:p>
@@ -2873,13 +2858,26 @@
           <w:b/>
           <w:bCs/>
         </w:rPr>
-        <w:t xml:space="preserve">Leads webhook</w:t>
-      </w:r>
-      <w:r>
-        <w:t xml:space="preserve"> </w:t>
-      </w:r>
-      <w:r>
-        <w:t xml:space="preserve">- ManyChat -&gt; dashboard, leads tagged by keyword. (Buildable on our side.)</w:t>
+        <w:t xml:space="preserve">Design:</w:t>
+      </w:r>
+      <w:r>
+        <w:t xml:space="preserve"> </w:t>
+      </w:r>
+      <w:r>
+        <w:t xml:space="preserve">Pure White / Graphite / Signal Blue (#1B6DFC). Social assets 1080x1350 (4:5); reels 9:16; 96px safe margins. All photos of Kade in BR graphics render</w:t>
+      </w:r>
+      <w:r>
+        <w:t xml:space="preserve"> </w:t>
+      </w:r>
+      <w:r>
+        <w:rPr>
+          <w:b/>
+          <w:bCs/>
+        </w:rPr>
+        <w:t xml:space="preserve">greyscale</w:t>
+      </w:r>
+      <w:r>
+        <w:t xml:space="preserve">, never colour.</w:t>
       </w:r>
     </w:p>
     <w:p>
@@ -2891,17 +2889,143 @@
         </w:numPr>
       </w:pPr>
       <w:r>
-        <w:rPr>
-          <w:b/>
-          <w:bCs/>
-        </w:rPr>
-        <w:t xml:space="preserve">Reels / face</w:t>
-      </w:r>
-      <w:r>
-        <w:t xml:space="preserve"> </w:t>
-      </w:r>
-      <w:r>
-        <w:t xml:space="preserve">- Kade films, or HeyGen scales it.</w:t>
+        <w:t xml:space="preserve">Kade’s public byline title:</w:t>
+      </w:r>
+      <w:r>
+        <w:t xml:space="preserve"> </w:t>
+      </w:r>
+      <w:r>
+        <w:rPr>
+          <w:b/>
+          <w:bCs/>
+        </w:rPr>
+        <w:t xml:space="preserve">“Sports Scientist”</w:t>
+      </w:r>
+      <w:r>
+        <w:t xml:space="preserve"> </w:t>
+      </w:r>
+      <w:r>
+        <w:t xml:space="preserve">(not</w:t>
+      </w:r>
+      <w:r>
+        <w:t xml:space="preserve"> </w:t>
+      </w:r>
+      <w:r>
+        <w:t xml:space="preserve">“Exercise Scientist”</w:t>
+      </w:r>
+      <w:r>
+        <w:t xml:space="preserve">).</w:t>
+      </w:r>
+    </w:p>
+    <w:bookmarkEnd w:id="27"/>
+    <w:bookmarkStart w:id="28" w:name="messaging-rules-do-dont"/>
+    <w:p>
+      <w:pPr>
+        <w:pStyle w:val="Heading2"/>
+      </w:pPr>
+      <w:r>
+        <w:t xml:space="preserve">17. Messaging rules (do / don’t)</w:t>
+      </w:r>
+    </w:p>
+    <w:p>
+      <w:pPr>
+        <w:pStyle w:val="FirstParagraph"/>
+      </w:pPr>
+      <w:r>
+        <w:rPr>
+          <w:b/>
+          <w:bCs/>
+        </w:rPr>
+        <w:t xml:space="preserve">Do:</w:t>
+      </w:r>
+      <w:r>
+        <w:t xml:space="preserve"> </w:t>
+      </w:r>
+      <w:r>
+        <w:t xml:space="preserve">lead with the stuck feeling; name the state;</w:t>
+      </w:r>
+      <w:r>
+        <w:t xml:space="preserve"> </w:t>
+      </w:r>
+      <w:r>
+        <w:rPr>
+          <w:b/>
+          <w:bCs/>
+        </w:rPr>
+        <w:t xml:space="preserve">write for Transitioning as well as Depleted</w:t>
+      </w:r>
+      <w:r>
+        <w:t xml:space="preserve"> </w:t>
+      </w:r>
+      <w:r>
+        <w:t xml:space="preserve">(nearly half the audience is Transitioning - a</w:t>
+      </w:r>
+      <w:r>
+        <w:t xml:space="preserve"> </w:t>
+      </w:r>
+      <w:r>
+        <w:t xml:space="preserve">“nothing’s moving”</w:t>
+      </w:r>
+      <w:r>
+        <w:t xml:space="preserve"> </w:t>
+      </w:r>
+      <w:r>
+        <w:t xml:space="preserve">hook alone misses them; also speak to</w:t>
+      </w:r>
+      <w:r>
+        <w:t xml:space="preserve"> </w:t>
+      </w:r>
+      <w:r>
+        <w:t xml:space="preserve">“it works then stalls”</w:t>
+      </w:r>
+      <w:r>
+        <w:t xml:space="preserve">); make the Scorecard the destination; use proof (real trajectories, with consent); keep the read ahead of the prescription; prove you can read people rather than teach them.</w:t>
+      </w:r>
+    </w:p>
+    <w:p>
+      <w:pPr>
+        <w:pStyle w:val="BodyText"/>
+      </w:pPr>
+      <w:r>
+        <w:rPr>
+          <w:b/>
+          <w:bCs/>
+        </w:rPr>
+        <w:t xml:space="preserve">Don’t:</w:t>
+      </w:r>
+      <w:r>
+        <w:t xml:space="preserve"> </w:t>
+      </w:r>
+      <w:r>
+        <w:t xml:space="preserve">open cold with doctrine vocabulary; sell the Blueprint/coaching before the Scorecard; run reels/video in cold-paid ad sets; use colour photos of Kade in BR graphics; ask one post to both earn engagement and drive a click; blur into the coach-licensing (Collective) audience.</w:t>
+      </w:r>
+    </w:p>
+    <w:bookmarkEnd w:id="28"/>
+    <w:bookmarkStart w:id="29" w:name="what-we-measure"/>
+    <w:p>
+      <w:pPr>
+        <w:pStyle w:val="Heading2"/>
+      </w:pPr>
+      <w:r>
+        <w:t xml:space="preserve">18. What we measure</w:t>
+      </w:r>
+    </w:p>
+    <w:p>
+      <w:pPr>
+        <w:pStyle w:val="FirstParagraph"/>
+      </w:pPr>
+      <w:r>
+        <w:t xml:space="preserve">Comments + saves + shares (real engagement), DM keyword captures, scorecard starts, and the earliest broken gate in the reach -&gt; save -&gt; profile -&gt; scorecard path. Not likes. We buy self-recognition and captured leads, not applause.</w:t>
+      </w:r>
+    </w:p>
+    <w:bookmarkEnd w:id="29"/>
+    <w:bookmarkStart w:id="30" w:name="build-dependencies"/>
+    <w:p>
+      <w:pPr>
+        <w:pStyle w:val="Heading2"/>
+      </w:pPr>
+      <w:r>
+        <w:t xml:space="preserve">19. Build dependencies</w:t>
       </w:r>
     </w:p>
     <w:p>
@@ -2909,7 +3033,95 @@
         <w:pStyle w:val="Compact"/>
         <w:numPr>
           <w:ilvl w:val="0"/>
-          <w:numId w:val="1007"/>
+          <w:numId w:val="1008"/>
+        </w:numPr>
+      </w:pPr>
+      <w:r>
+        <w:rPr>
+          <w:b/>
+          <w:bCs/>
+        </w:rPr>
+        <w:t xml:space="preserve">Voice-of-customer swipe file</w:t>
+      </w:r>
+      <w:r>
+        <w:t xml:space="preserve"> </w:t>
+      </w:r>
+      <w:r>
+        <w:t xml:space="preserve">- mine real phrases from scorecard answers + DMs. (Buildable on our side.)</w:t>
+      </w:r>
+    </w:p>
+    <w:p>
+      <w:pPr>
+        <w:pStyle w:val="Compact"/>
+        <w:numPr>
+          <w:ilvl w:val="0"/>
+          <w:numId w:val="1008"/>
+        </w:numPr>
+      </w:pPr>
+      <w:r>
+        <w:rPr>
+          <w:b/>
+          <w:bCs/>
+        </w:rPr>
+        <w:t xml:space="preserve">Personalised-read DM flows</w:t>
+      </w:r>
+      <w:r>
+        <w:t xml:space="preserve"> </w:t>
+      </w:r>
+      <w:r>
+        <w:t xml:space="preserve">in ManyChat - Kade builds, spec provided.</w:t>
+      </w:r>
+    </w:p>
+    <w:p>
+      <w:pPr>
+        <w:pStyle w:val="Compact"/>
+        <w:numPr>
+          <w:ilvl w:val="0"/>
+          <w:numId w:val="1008"/>
+        </w:numPr>
+      </w:pPr>
+      <w:r>
+        <w:rPr>
+          <w:b/>
+          <w:bCs/>
+        </w:rPr>
+        <w:t xml:space="preserve">Leads webhook</w:t>
+      </w:r>
+      <w:r>
+        <w:t xml:space="preserve"> </w:t>
+      </w:r>
+      <w:r>
+        <w:t xml:space="preserve">- ManyChat -&gt; dashboard, leads tagged by keyword. (Buildable on our side.)</w:t>
+      </w:r>
+    </w:p>
+    <w:p>
+      <w:pPr>
+        <w:pStyle w:val="Compact"/>
+        <w:numPr>
+          <w:ilvl w:val="0"/>
+          <w:numId w:val="1008"/>
+        </w:numPr>
+      </w:pPr>
+      <w:r>
+        <w:rPr>
+          <w:b/>
+          <w:bCs/>
+        </w:rPr>
+        <w:t xml:space="preserve">Reels / face</w:t>
+      </w:r>
+      <w:r>
+        <w:t xml:space="preserve"> </w:t>
+      </w:r>
+      <w:r>
+        <w:t xml:space="preserve">- Kade films, or HeyGen scales it.</w:t>
+      </w:r>
+    </w:p>
+    <w:p>
+      <w:pPr>
+        <w:pStyle w:val="Compact"/>
+        <w:numPr>
+          <w:ilvl w:val="0"/>
+          <w:numId w:val="1008"/>
         </w:numPr>
       </w:pPr>
       <w:r>
@@ -3264,6 +3476,9 @@
     <w:abstractNumId w:val="991"/>
   </w:num>
   <w:num w:numId="1003">
+    <w:abstractNumId w:val="991"/>
+  </w:num>
+  <w:num w:numId="1004">
     <w:abstractNumId w:val="99411"/>
     <w:lvlOverride w:ilvl="0">
       <w:startOverride w:val="1"/>
@@ -3293,10 +3508,10 @@
       <w:startOverride w:val="1"/>
     </w:lvlOverride>
   </w:num>
-  <w:num w:numId="1004">
+  <w:num w:numId="1005">
     <w:abstractNumId w:val="991"/>
   </w:num>
-  <w:num w:numId="1005">
+  <w:num w:numId="1006">
     <w:abstractNumId w:val="99411"/>
     <w:lvlOverride w:ilvl="0">
       <w:startOverride w:val="1"/>
@@ -3326,10 +3541,10 @@
       <w:startOverride w:val="1"/>
     </w:lvlOverride>
   </w:num>
-  <w:num w:numId="1006">
+  <w:num w:numId="1007">
     <w:abstractNumId w:val="991"/>
   </w:num>
-  <w:num w:numId="1007">
+  <w:num w:numId="1008">
     <w:abstractNumId w:val="991"/>
   </w:num>
 </w:numbering>

</xml_diff>

<commit_message>
Correct BR audience: validated 100% Depleted (scorecard underestimates)
Reverses the earlier scorecard-based 'Transitioning-heavy' read. Per the
validated archetypes doc: 100% of paying clients classify Remediation/
Depleted by CFFS; the 5-Q scorecard underestimates depletion (high
performers self-report Ready but read Depleted on the 200-Q intake), so
the raw scorecard state split is a measurement artifact. Section 2
rewritten to the 4 validated archetypes + 'don't soft-pedal, sharp hooks';
Do-rule fixed; folded in the 5 owned topics, 5-step messaging frame,
never-say list, CTA rules, tone principles. v2.2.

Co-Authored-By: Claude Opus 4.8 (1M context) <noreply@anthropic.com>
</commit_message>
<xml_diff>
--- a/public/docs/strategy/body-recode/body-recode-consumer-marketing-strategy-v1.docx
+++ b/public/docs/strategy/body-recode/body-recode-consumer-marketing-strategy-v1.docx
@@ -166,82 +166,33 @@
         <w:pStyle w:val="FirstParagraph"/>
       </w:pPr>
       <w:r>
-        <w:t xml:space="preserve">High-functioning adults whose bodies have stopped giving back what the effort should return - training hard, eating well, consistent.</w:t>
-      </w:r>
-    </w:p>
-    <w:p>
-      <w:pPr>
-        <w:pStyle w:val="BodyText"/>
-      </w:pPr>
-      <w:r>
-        <w:rPr>
-          <w:b/>
-          <w:bCs/>
-        </w:rPr>
-        <w:t xml:space="preserve">What the data says (116 leads / 77 scorecards, 2026-07):</w:t>
-      </w:r>
-      <w:r>
-        <w:t xml:space="preserve"> </w:t>
-      </w:r>
-      <w:r>
-        <w:t xml:space="preserve">the audience splits</w:t>
-      </w:r>
-      <w:r>
-        <w:t xml:space="preserve"> </w:t>
-      </w:r>
-      <w:r>
-        <w:rPr>
-          <w:b/>
-          <w:bCs/>
-        </w:rPr>
-        <w:t xml:space="preserve">Transitioning 48% · Depleted 32% · Ready 19%.</w:t>
-      </w:r>
-      <w:r>
-        <w:t xml:space="preserve"> </w:t>
-      </w:r>
-      <w:r>
-        <w:t xml:space="preserve">The earlier</w:t>
-      </w:r>
-      <w:r>
-        <w:t xml:space="preserve"> </w:t>
-      </w:r>
-      <w:r>
-        <w:t xml:space="preserve">“Depleted-skewed”</w:t>
-      </w:r>
-      <w:r>
-        <w:t xml:space="preserve"> </w:t>
-      </w:r>
-      <w:r>
-        <w:t xml:space="preserve">assumption is wrong - the single biggest group is</w:t>
-      </w:r>
-      <w:r>
-        <w:t xml:space="preserve"> </w:t>
-      </w:r>
-      <w:r>
-        <w:rPr>
-          <w:b/>
-          <w:bCs/>
-        </w:rPr>
-        <w:t xml:space="preserve">Transitioning</w:t>
-      </w:r>
-      <w:r>
-        <w:t xml:space="preserve"> </w:t>
-      </w:r>
-      <w:r>
-        <w:t xml:space="preserve">(responding, but stalled and needing directed load), with Depleted second. So the message has to speak to</w:t>
-      </w:r>
-      <w:r>
-        <w:t xml:space="preserve"> </w:t>
-      </w:r>
-      <w:r>
-        <w:rPr>
-          <w:b/>
-          <w:bCs/>
-        </w:rPr>
-        <w:t xml:space="preserve">both</w:t>
-      </w:r>
-      <w:r>
-        <w:t xml:space="preserve">, not just the fully-stuck reader:</w:t>
+        <w:rPr>
+          <w:b/>
+          <w:bCs/>
+        </w:rPr>
+        <w:t xml:space="preserve">The audience is Depleted. Full stop.</w:t>
+      </w:r>
+      <w:r>
+        <w:t xml:space="preserve"> </w:t>
+      </w:r>
+      <w:r>
+        <w:t xml:space="preserve">100% of paying clients (May 2026, full client list) classify as</w:t>
+      </w:r>
+      <w:r>
+        <w:t xml:space="preserve"> </w:t>
+      </w:r>
+      <w:r>
+        <w:rPr>
+          <w:b/>
+          <w:bCs/>
+        </w:rPr>
+        <w:t xml:space="preserve">Remediation / Depleted</w:t>
+      </w:r>
+      <w:r>
+        <w:t xml:space="preserve"> </w:t>
+      </w:r>
+      <w:r>
+        <w:t xml:space="preserve">by CFFS - the real, validated read. Four validated archetypes, all Depleted-leaning, in observed prevalence order:</w:t>
       </w:r>
     </w:p>
     <w:p>
@@ -257,7 +208,7 @@
           <w:b/>
           <w:bCs/>
         </w:rPr>
-        <w:t xml:space="preserve">Depleted:</w:t>
+        <w:t xml:space="preserve">The Stressed Executive Woman</w:t>
       </w:r>
       <w:r>
         <w:t xml:space="preserve"> </w:t>
@@ -267,13 +218,29 @@
           <w:i/>
           <w:iCs/>
         </w:rPr>
-        <w:t xml:space="preserve">“You’re doing everything and nothing is moving.”</w:t>
-      </w:r>
-      <w:r>
-        <w:t xml:space="preserve"> </w:t>
-      </w:r>
-      <w:r>
-        <w:t xml:space="preserve">Protection mode - more effort backfires.</w:t>
+        <w:t xml:space="preserve">(DOMINANT · Stress-Stored)</w:t>
+      </w:r>
+      <w:r>
+        <w:t xml:space="preserve"> </w:t>
+      </w:r>
+      <w:r>
+        <w:t xml:space="preserve">- 35-48, corporate/finance/law/consulting/health/gov, Brisbane, often kids, $100K-180K+. Abdominal fat won’t budge, wired-and-tired, 3pm crash, wakes at 3am. Self-story:</w:t>
+      </w:r>
+      <w:r>
+        <w:t xml:space="preserve"> </w:t>
+      </w:r>
+      <w:r>
+        <w:rPr>
+          <w:i/>
+          <w:iCs/>
+        </w:rPr>
+        <w:t xml:space="preserve">“I just need to be more disciplined.”</w:t>
+      </w:r>
+      <w:r>
+        <w:t xml:space="preserve"> </w:t>
+      </w:r>
+      <w:r>
+        <w:t xml:space="preserve">Channel: IG (lunch) + LinkedIn (morning).</w:t>
       </w:r>
     </w:p>
     <w:p>
@@ -289,7 +256,7 @@
           <w:b/>
           <w:bCs/>
         </w:rPr>
-        <w:t xml:space="preserve">Transitioning:</w:t>
+        <w:t xml:space="preserve">The Perimenopausal Performer</w:t>
       </w:r>
       <w:r>
         <w:t xml:space="preserve"> </w:t>
@@ -299,67 +266,63 @@
           <w:i/>
           <w:iCs/>
         </w:rPr>
-        <w:t xml:space="preserve">“It’s started to work, then it stalls and you can’t tell why.”</w:t>
-      </w:r>
-      <w:r>
-        <w:t xml:space="preserve"> </w:t>
-      </w:r>
-      <w:r>
-        <w:t xml:space="preserve">Responding, but the load isn’t directed.</w:t>
-      </w:r>
-    </w:p>
-    <w:p>
-      <w:pPr>
-        <w:pStyle w:val="FirstParagraph"/>
-      </w:pPr>
-      <w:r>
-        <w:t xml:space="preserve">Lead with the feeling, not the vocabulary, and make sure the hook lets a</w:t>
-      </w:r>
-      <w:r>
-        <w:t xml:space="preserve"> </w:t>
-      </w:r>
-      <w:r>
-        <w:rPr>
-          <w:b/>
-          <w:bCs/>
-        </w:rPr>
-        <w:t xml:space="preserve">Transitioning</w:t>
-      </w:r>
-      <w:r>
-        <w:t xml:space="preserve"> </w:t>
-      </w:r>
-      <w:r>
-        <w:t xml:space="preserve">reader see themselves too - if every post only says</w:t>
-      </w:r>
-      <w:r>
-        <w:t xml:space="preserve"> </w:t>
-      </w:r>
-      <w:r>
-        <w:t xml:space="preserve">“nothing is moving,”</w:t>
-      </w:r>
-      <w:r>
-        <w:t xml:space="preserve"> </w:t>
-      </w:r>
-      <w:r>
-        <w:t xml:space="preserve">half the room scrolls past. Name what they feel first, then reveal the read underneath it.</w:t>
-      </w:r>
-    </w:p>
-    <w:p>
-      <w:pPr>
-        <w:pStyle w:val="BodyText"/>
-      </w:pPr>
+        <w:t xml:space="preserve">(STRONG · Estrogen-Shift)</w:t>
+      </w:r>
+      <w:r>
+        <w:t xml:space="preserve"> </w:t>
+      </w:r>
+      <w:r>
+        <w:t xml:space="preserve">- 40-50, was lean in her 30s, mother of teens. 5-10kg gained over 2-3 years, storage to hips/thighs + bra-line, cycle irregular.</w:t>
+      </w:r>
+      <w:r>
+        <w:t xml:space="preserve"> </w:t>
+      </w:r>
       <w:r>
         <w:rPr>
           <w:i/>
           <w:iCs/>
         </w:rPr>
-        <w:t xml:space="preserve">Caveat: age/sex is not captured for most leads, so the</w:t>
+        <w:t xml:space="preserve">“It’s just menopause / my bloods are fine.”</w:t>
+      </w:r>
+      <w:r>
+        <w:t xml:space="preserve"> </w:t>
+      </w:r>
+      <w:r>
+        <w:t xml:space="preserve">Channel: IG (evening).</w:t>
+      </w:r>
+    </w:p>
+    <w:p>
+      <w:pPr>
+        <w:pStyle w:val="Compact"/>
+        <w:numPr>
+          <w:ilvl w:val="0"/>
+          <w:numId w:val="1001"/>
+        </w:numPr>
+      </w:pPr>
+      <w:r>
+        <w:rPr>
+          <w:b/>
+          <w:bCs/>
+        </w:rPr>
+        <w:t xml:space="preserve">The Postnatal Athlete</w:t>
+      </w:r>
+      <w:r>
+        <w:t xml:space="preserve"> </w:t>
       </w:r>
       <w:r>
         <w:rPr>
           <w:i/>
           <w:iCs/>
         </w:rPr>
+        <w:t xml:space="preserve">(Stress-Stored / Estrogen-Shift hybrid)</w:t>
+      </w:r>
+      <w:r>
+        <w:t xml:space="preserve"> </w:t>
+      </w:r>
+      <w:r>
+        <w:t xml:space="preserve">- 32-42, kids 2-7 years ago, athletic pre-kids, underslept for years. Never got back to baseline, carries 3-7kg, recovery broken.</w:t>
+      </w:r>
+      <w:r>
         <w:t xml:space="preserve"> </w:t>
       </w:r>
       <w:r>
@@ -367,13 +330,47 @@
           <w:i/>
           <w:iCs/>
         </w:rPr>
-        <w:t xml:space="preserve">“women 35-50”</w:t>
+        <w:t xml:space="preserve">“My body changed after kids.”</w:t>
+      </w:r>
+      <w:r>
+        <w:t xml:space="preserve"> </w:t>
+      </w:r>
+      <w:r>
+        <w:t xml:space="preserve">Channel: IG (evening / naptime).</w:t>
+      </w:r>
+    </w:p>
+    <w:p>
+      <w:pPr>
+        <w:pStyle w:val="Compact"/>
+        <w:numPr>
+          <w:ilvl w:val="0"/>
+          <w:numId w:val="1001"/>
+        </w:numPr>
+      </w:pPr>
+      <w:r>
+        <w:rPr>
+          <w:b/>
+          <w:bCs/>
+        </w:rPr>
+        <w:t xml:space="preserve">The Slipping High Performer</w:t>
+      </w:r>
+      <w:r>
+        <w:t xml:space="preserve"> </w:t>
       </w:r>
       <w:r>
         <w:rPr>
           <w:i/>
           <w:iCs/>
         </w:rPr>
+        <w:t xml:space="preserve">(male · Androgen-Decline + Stress-Stored)</w:t>
+      </w:r>
+      <w:r>
+        <w:t xml:space="preserve"> </w:t>
+      </w:r>
+      <w:r>
+        <w:t xml:space="preserve">- 42-55, executive/partner-track/surgeon, travels. Capacity, drive, recovery, sharpness slipping; performance is the flag, not weight.</w:t>
+      </w:r>
+      <w:r>
         <w:t xml:space="preserve"> </w:t>
       </w:r>
       <w:r>
@@ -381,7 +378,135 @@
           <w:i/>
           <w:iCs/>
         </w:rPr>
-        <w:t xml:space="preserve">part of the ICP is unconfirmed - tighten capture before leaning on it. And note only ~3% of leads currently come from social, so this audience is barely tested on Instagram yet; get the content engine (Part II) driving real social volume before judging the audience.</w:t>
+        <w:t xml:space="preserve">“I’m just getting older / bloods are normal.”</w:t>
+      </w:r>
+      <w:r>
+        <w:t xml:space="preserve"> </w:t>
+      </w:r>
+      <w:r>
+        <w:t xml:space="preserve">Channel: LinkedIn (morning).</w:t>
+      </w:r>
+    </w:p>
+    <w:p>
+      <w:pPr>
+        <w:pStyle w:val="FirstParagraph"/>
+      </w:pPr>
+      <w:r>
+        <w:t xml:space="preserve">Watch list (do NOT target in primary content/ads yet): the Ex-Athlete Founder (Insulin-Drift, male) - may appear as the LinkedIn/founder audience grows. Full personas:</w:t>
+      </w:r>
+      <w:r>
+        <w:t xml:space="preserve"> </w:t>
+      </w:r>
+      <w:r>
+        <w:rPr>
+          <w:rStyle w:val="VerbatimChar"/>
+        </w:rPr>
+        <w:t xml:space="preserve">~/Dropbox/01_BODY_RECODE/06_SAAS_PLATFORM_BUILD/AUDIENCE-ARCHETYPES-V1.md</w:t>
+      </w:r>
+      <w:r>
+        <w:t xml:space="preserve">.</w:t>
+      </w:r>
+    </w:p>
+    <w:p>
+      <w:pPr>
+        <w:pStyle w:val="BodyText"/>
+      </w:pPr>
+      <w:r>
+        <w:rPr>
+          <w:b/>
+          <w:bCs/>
+        </w:rPr>
+        <w:t xml:space="preserve">Critical - the scorecard UNDERESTIMATES depletion.</w:t>
+      </w:r>
+      <w:r>
+        <w:t xml:space="preserve"> </w:t>
+      </w:r>
+      <w:r>
+        <w:t xml:space="preserve">High performers self-report better than they are. The 5-question scorecard is a coarse signal; the 200-question intake is the real read. Example: Michael scored 12 (Ready) on the scorecard, then classified Depleted by CFFS once a client. Discipline hides depletion in self-reporting.</w:t>
+      </w:r>
+      <w:r>
+        <w:t xml:space="preserve"> </w:t>
+      </w:r>
+      <w:r>
+        <w:rPr>
+          <w:b/>
+          <w:bCs/>
+        </w:rPr>
+        <w:t xml:space="preserve">So a raw scorecard state distribution that looks</w:t>
+      </w:r>
+      <w:r>
+        <w:rPr>
+          <w:b/>
+          <w:bCs/>
+        </w:rPr>
+        <w:t xml:space="preserve"> </w:t>
+      </w:r>
+      <w:r>
+        <w:rPr>
+          <w:b/>
+          <w:bCs/>
+        </w:rPr>
+        <w:t xml:space="preserve">“Transitioning-heavy”</w:t>
+      </w:r>
+      <w:r>
+        <w:rPr>
+          <w:b/>
+          <w:bCs/>
+        </w:rPr>
+        <w:t xml:space="preserve"> </w:t>
+      </w:r>
+      <w:r>
+        <w:rPr>
+          <w:b/>
+          <w:bCs/>
+        </w:rPr>
+        <w:t xml:space="preserve">is a measurement artifact - do not calibrate marketing to it. The clients are Depleted.</w:t>
+      </w:r>
+    </w:p>
+    <w:p>
+      <w:pPr>
+        <w:pStyle w:val="BodyText"/>
+      </w:pPr>
+      <w:r>
+        <w:rPr>
+          <w:b/>
+          <w:bCs/>
+        </w:rPr>
+        <w:t xml:space="preserve">Implication for hooks:</w:t>
+      </w:r>
+      <w:r>
+        <w:t xml:space="preserve"> </w:t>
+      </w:r>
+      <w:r>
+        <w:t xml:space="preserve">write</w:t>
+      </w:r>
+      <w:r>
+        <w:t xml:space="preserve"> </w:t>
+      </w:r>
+      <w:r>
+        <w:rPr>
+          <w:b/>
+          <w:bCs/>
+        </w:rPr>
+        <w:t xml:space="preserve">sharp enough to catch a high performer who would self-score Ready on a 5-question quiz but is clinically Depleted.</w:t>
+      </w:r>
+      <w:r>
+        <w:t xml:space="preserve"> </w:t>
+      </w:r>
+      <w:r>
+        <w:t xml:space="preserve">Do not soft-pedal because their self-image is</w:t>
+      </w:r>
+      <w:r>
+        <w:t xml:space="preserve"> </w:t>
+      </w:r>
+      <w:r>
+        <w:t xml:space="preserve">“I’m doing fine, just stuck.”</w:t>
+      </w:r>
+      <w:r>
+        <w:t xml:space="preserve"> </w:t>
+      </w:r>
+      <w:r>
+        <w:t xml:space="preserve">Lead with the feeling in their words, name the state, then interpret.</w:t>
       </w:r>
     </w:p>
     <w:bookmarkEnd w:id="11"/>
@@ -1187,6 +1312,104 @@
       </w:r>
       <w:r>
         <w:t xml:space="preserve">are the repeatable shows that deliver them. Run the formats until the audience knows them on sight.</w:t>
+      </w:r>
+    </w:p>
+    <w:p>
+      <w:pPr>
+        <w:pStyle w:val="BodyText"/>
+      </w:pPr>
+      <w:r>
+        <w:rPr>
+          <w:b/>
+          <w:bCs/>
+        </w:rPr>
+        <w:t xml:space="preserve">The 5 topics you own (intellectual territory - nothing outside these):</w:t>
+      </w:r>
+      <w:r>
+        <w:t xml:space="preserve"> </w:t>
+      </w:r>
+      <w:r>
+        <w:t xml:space="preserve">(1)</w:t>
+      </w:r>
+      <w:r>
+        <w:t xml:space="preserve"> </w:t>
+      </w:r>
+      <w:r>
+        <w:rPr>
+          <w:b/>
+          <w:bCs/>
+        </w:rPr>
+        <w:t xml:space="preserve">Body State</w:t>
+      </w:r>
+      <w:r>
+        <w:t xml:space="preserve"> </w:t>
+      </w:r>
+      <w:r>
+        <w:t xml:space="preserve">- Depleted/Transitioning/Ready and why it determines everything; (2)</w:t>
+      </w:r>
+      <w:r>
+        <w:t xml:space="preserve"> </w:t>
+      </w:r>
+      <w:r>
+        <w:rPr>
+          <w:b/>
+          <w:bCs/>
+        </w:rPr>
+        <w:t xml:space="preserve">Why Effort Isn’t Working</w:t>
+      </w:r>
+      <w:r>
+        <w:t xml:space="preserve"> </w:t>
+      </w:r>
+      <w:r>
+        <w:t xml:space="preserve">- the train-harder/eat-less trap; (3)</w:t>
+      </w:r>
+      <w:r>
+        <w:t xml:space="preserve"> </w:t>
+      </w:r>
+      <w:r>
+        <w:rPr>
+          <w:b/>
+          <w:bCs/>
+        </w:rPr>
+        <w:t xml:space="preserve">Cortisol &amp; Fat Storage</w:t>
+      </w:r>
+      <w:r>
+        <w:t xml:space="preserve"> </w:t>
+      </w:r>
+      <w:r>
+        <w:t xml:space="preserve">- stress belt, protection mode, why the body resists fat loss under load; (4)</w:t>
+      </w:r>
+      <w:r>
+        <w:t xml:space="preserve"> </w:t>
+      </w:r>
+      <w:r>
+        <w:rPr>
+          <w:b/>
+          <w:bCs/>
+        </w:rPr>
+        <w:t xml:space="preserve">Prescription Without Interpretation</w:t>
+      </w:r>
+      <w:r>
+        <w:t xml:space="preserve"> </w:t>
+      </w:r>
+      <w:r>
+        <w:t xml:space="preserve">- the core flaw in mainstream fitness; (5)</w:t>
+      </w:r>
+      <w:r>
+        <w:t xml:space="preserve"> </w:t>
+      </w:r>
+      <w:r>
+        <w:rPr>
+          <w:b/>
+          <w:bCs/>
+        </w:rPr>
+        <w:t xml:space="preserve">The Intelligent Approach</w:t>
+      </w:r>
+      <w:r>
+        <w:t xml:space="preserve"> </w:t>
+      </w:r>
+      <w:r>
+        <w:t xml:space="preserve">- what reading the body first looks like (the BR system). Every post maps to one of these.</w:t>
       </w:r>
     </w:p>
     <w:tbl>
@@ -2952,34 +3175,41 @@
           <w:b/>
           <w:bCs/>
         </w:rPr>
-        <w:t xml:space="preserve">write for Transitioning as well as Depleted</w:t>
-      </w:r>
-      <w:r>
-        <w:t xml:space="preserve"> </w:t>
-      </w:r>
-      <w:r>
-        <w:t xml:space="preserve">(nearly half the audience is Transitioning - a</w:t>
-      </w:r>
-      <w:r>
-        <w:t xml:space="preserve"> </w:t>
-      </w:r>
-      <w:r>
-        <w:t xml:space="preserve">“nothing’s moving”</w:t>
-      </w:r>
-      <w:r>
-        <w:t xml:space="preserve"> </w:t>
-      </w:r>
-      <w:r>
-        <w:t xml:space="preserve">hook alone misses them; also speak to</w:t>
-      </w:r>
-      <w:r>
-        <w:t xml:space="preserve"> </w:t>
-      </w:r>
-      <w:r>
-        <w:t xml:space="preserve">“it works then stalls”</w:t>
-      </w:r>
-      <w:r>
-        <w:t xml:space="preserve">); make the Scorecard the destination; use proof (real trajectories, with consent); keep the read ahead of the prescription; prove you can read people rather than teach them.</w:t>
+        <w:t xml:space="preserve">write sharp enough to catch the high performer who self-scores</w:t>
+      </w:r>
+      <w:r>
+        <w:rPr>
+          <w:b/>
+          <w:bCs/>
+        </w:rPr>
+        <w:t xml:space="preserve"> </w:t>
+      </w:r>
+      <w:r>
+        <w:rPr>
+          <w:b/>
+          <w:bCs/>
+        </w:rPr>
+        <w:t xml:space="preserve">“fine, just stuck”</w:t>
+      </w:r>
+      <w:r>
+        <w:rPr>
+          <w:b/>
+          <w:bCs/>
+        </w:rPr>
+        <w:t xml:space="preserve"> </w:t>
+      </w:r>
+      <w:r>
+        <w:rPr>
+          <w:b/>
+          <w:bCs/>
+        </w:rPr>
+        <w:t xml:space="preserve">but is clinically Depleted</w:t>
+      </w:r>
+      <w:r>
+        <w:t xml:space="preserve"> </w:t>
+      </w:r>
+      <w:r>
+        <w:t xml:space="preserve">(the scorecard underestimates depletion - do not soft-pedal); make the Scorecard the destination; use proof (real trajectories, with consent); keep the read ahead of the prescription; prove you can read people rather than teach them.</w:t>
       </w:r>
     </w:p>
     <w:p>
@@ -2998,6 +3228,275 @@
       </w:r>
       <w:r>
         <w:t xml:space="preserve">open cold with doctrine vocabulary; sell the Blueprint/coaching before the Scorecard; run reels/video in cold-paid ad sets; use colour photos of Kade in BR graphics; ask one post to both earn engagement and drive a click; blur into the coach-licensing (Collective) audience.</w:t>
+      </w:r>
+    </w:p>
+    <w:p>
+      <w:pPr>
+        <w:pStyle w:val="BodyText"/>
+      </w:pPr>
+      <w:r>
+        <w:rPr>
+          <w:b/>
+          <w:bCs/>
+        </w:rPr>
+        <w:t xml:space="preserve">Never say or do:</w:t>
+      </w:r>
+      <w:r>
+        <w:t xml:space="preserve"> </w:t>
+      </w:r>
+      <w:r>
+        <w:t xml:space="preserve">fitness clichés (</w:t>
+      </w:r>
+      <w:r>
+        <w:t xml:space="preserve">“crush it”</w:t>
+      </w:r>
+      <w:r>
+        <w:t xml:space="preserve">,</w:t>
+      </w:r>
+      <w:r>
+        <w:t xml:space="preserve"> </w:t>
+      </w:r>
+      <w:r>
+        <w:t xml:space="preserve">“no excuses”</w:t>
+      </w:r>
+      <w:r>
+        <w:t xml:space="preserve">,</w:t>
+      </w:r>
+      <w:r>
+        <w:t xml:space="preserve"> </w:t>
+      </w:r>
+      <w:r>
+        <w:t xml:space="preserve">“grind”</w:t>
+      </w:r>
+      <w:r>
+        <w:t xml:space="preserve">,</w:t>
+      </w:r>
+      <w:r>
+        <w:t xml:space="preserve"> </w:t>
+      </w:r>
+      <w:r>
+        <w:t xml:space="preserve">“hustle”</w:t>
+      </w:r>
+      <w:r>
+        <w:t xml:space="preserve">); blame the client for biological symptoms; shame or guilt messaging; hype or exaggerated promises; long-winded clinical explanations; direct selling (always guide, never push).</w:t>
+      </w:r>
+    </w:p>
+    <w:p>
+      <w:pPr>
+        <w:pStyle w:val="BodyText"/>
+      </w:pPr>
+      <w:r>
+        <w:rPr>
+          <w:b/>
+          <w:bCs/>
+        </w:rPr>
+        <w:t xml:space="preserve">CTA rules:</w:t>
+      </w:r>
+      <w:r>
+        <w:t xml:space="preserve"> </w:t>
+      </w:r>
+      <w:r>
+        <w:t xml:space="preserve">Instagram =</w:t>
+      </w:r>
+      <w:r>
+        <w:t xml:space="preserve"> </w:t>
+      </w:r>
+      <w:r>
+        <w:rPr>
+          <w:b/>
+          <w:bCs/>
+        </w:rPr>
+        <w:t xml:space="preserve">one CTA per post</w:t>
+      </w:r>
+      <w:r>
+        <w:t xml:space="preserve">, and it’s</w:t>
+      </w:r>
+      <w:r>
+        <w:t xml:space="preserve"> </w:t>
+      </w:r>
+      <w:r>
+        <w:t xml:space="preserve">“take the Scorecard”</w:t>
+      </w:r>
+      <w:r>
+        <w:t xml:space="preserve"> </w:t>
+      </w:r>
+      <w:r>
+        <w:t xml:space="preserve">(one job per post). LinkedIn = CTA every</w:t>
+      </w:r>
+      <w:r>
+        <w:t xml:space="preserve"> </w:t>
+      </w:r>
+      <w:r>
+        <w:rPr>
+          <w:b/>
+          <w:bCs/>
+        </w:rPr>
+        <w:t xml:space="preserve">4-5 posts only</w:t>
+      </w:r>
+      <w:r>
+        <w:t xml:space="preserve">; most posts build credibility without selling.</w:t>
+      </w:r>
+    </w:p>
+    <w:p>
+      <w:pPr>
+        <w:pStyle w:val="BodyText"/>
+      </w:pPr>
+      <w:r>
+        <w:rPr>
+          <w:b/>
+          <w:bCs/>
+        </w:rPr>
+        <w:t xml:space="preserve">Every post follows the 5-step frame:</w:t>
+      </w:r>
+      <w:r>
+        <w:t xml:space="preserve"> </w:t>
+      </w:r>
+      <w:r>
+        <w:t xml:space="preserve">(1)</w:t>
+      </w:r>
+      <w:r>
+        <w:t xml:space="preserve"> </w:t>
+      </w:r>
+      <w:r>
+        <w:rPr>
+          <w:b/>
+          <w:bCs/>
+        </w:rPr>
+        <w:t xml:space="preserve">Insight</w:t>
+      </w:r>
+      <w:r>
+        <w:t xml:space="preserve"> </w:t>
+      </w:r>
+      <w:r>
+        <w:t xml:space="preserve">- the physiological truth; (2)</w:t>
+      </w:r>
+      <w:r>
+        <w:t xml:space="preserve"> </w:t>
+      </w:r>
+      <w:r>
+        <w:rPr>
+          <w:b/>
+          <w:bCs/>
+        </w:rPr>
+        <w:t xml:space="preserve">Signal</w:t>
+      </w:r>
+      <w:r>
+        <w:t xml:space="preserve"> </w:t>
+      </w:r>
+      <w:r>
+        <w:t xml:space="preserve">- what it means for them; (3)</w:t>
+      </w:r>
+      <w:r>
+        <w:t xml:space="preserve"> </w:t>
+      </w:r>
+      <w:r>
+        <w:rPr>
+          <w:b/>
+          <w:bCs/>
+        </w:rPr>
+        <w:t xml:space="preserve">Shift</w:t>
+      </w:r>
+      <w:r>
+        <w:t xml:space="preserve"> </w:t>
+      </w:r>
+      <w:r>
+        <w:t xml:space="preserve">- reframe their understanding; (4)</w:t>
+      </w:r>
+      <w:r>
+        <w:t xml:space="preserve"> </w:t>
+      </w:r>
+      <w:r>
+        <w:rPr>
+          <w:b/>
+          <w:bCs/>
+        </w:rPr>
+        <w:t xml:space="preserve">Solution</w:t>
+      </w:r>
+      <w:r>
+        <w:t xml:space="preserve"> </w:t>
+      </w:r>
+      <w:r>
+        <w:t xml:space="preserve">- the Body Recode system or action; (5)</w:t>
+      </w:r>
+      <w:r>
+        <w:t xml:space="preserve"> </w:t>
+      </w:r>
+      <w:r>
+        <w:rPr>
+          <w:b/>
+          <w:bCs/>
+        </w:rPr>
+        <w:t xml:space="preserve">Momentum</w:t>
+      </w:r>
+      <w:r>
+        <w:t xml:space="preserve"> </w:t>
+      </w:r>
+      <w:r>
+        <w:t xml:space="preserve">- end with clarity or direction. It must make them</w:t>
+      </w:r>
+      <w:r>
+        <w:t xml:space="preserve"> </w:t>
+      </w:r>
+      <w:r>
+        <w:rPr>
+          <w:b/>
+          <w:bCs/>
+        </w:rPr>
+        <w:t xml:space="preserve">feel</w:t>
+      </w:r>
+      <w:r>
+        <w:t xml:space="preserve"> </w:t>
+      </w:r>
+      <w:r>
+        <w:rPr>
+          <w:i/>
+          <w:iCs/>
+        </w:rPr>
+        <w:t xml:space="preserve">“finally, someone gets it,”</w:t>
+      </w:r>
+      <w:r>
+        <w:t xml:space="preserve"> </w:t>
+      </w:r>
+      <w:r>
+        <w:t xml:space="preserve">then</w:t>
+      </w:r>
+      <w:r>
+        <w:t xml:space="preserve"> </w:t>
+      </w:r>
+      <w:r>
+        <w:rPr>
+          <w:b/>
+          <w:bCs/>
+        </w:rPr>
+        <w:t xml:space="preserve">think</w:t>
+      </w:r>
+      <w:r>
+        <w:t xml:space="preserve"> </w:t>
+      </w:r>
+      <w:r>
+        <w:rPr>
+          <w:i/>
+          <w:iCs/>
+        </w:rPr>
+        <w:t xml:space="preserve">“I need to take that scorecard.”</w:t>
+      </w:r>
+    </w:p>
+    <w:p>
+      <w:pPr>
+        <w:pStyle w:val="BodyText"/>
+      </w:pPr>
+      <w:r>
+        <w:rPr>
+          <w:b/>
+          <w:bCs/>
+        </w:rPr>
+        <w:t xml:space="preserve">Tone (6 principles):</w:t>
+      </w:r>
+      <w:r>
+        <w:t xml:space="preserve"> </w:t>
+      </w:r>
+      <w:r>
+        <w:t xml:space="preserve">intelligent not complicated · confident not arrogant · direct not blunt · warm not soft · scientific not clinical · forward-thinking not abstract.</w:t>
       </w:r>
     </w:p>
     <w:bookmarkEnd w:id="28"/>
@@ -3278,6 +3777,91 @@
       </w:pPr>
     </w:lvl>
   </w:abstractNum>
+  <w:abstractNum w:abstractNumId="99411">
+    <w:nsid w:val="00A99411"/>
+    <w:multiLevelType w:val="multilevel"/>
+    <w:lvl w:ilvl="0">
+      <w:start w:val="1"/>
+      <w:numFmt w:val="decimal"/>
+      <w:lvlText w:val="%1."/>
+      <w:lvlJc w:val="left"/>
+      <w:pPr>
+        <w:ind w:left="720" w:hanging="360"/>
+      </w:pPr>
+    </w:lvl>
+    <w:lvl w:ilvl="1">
+      <w:start w:val="1"/>
+      <w:numFmt w:val="decimal"/>
+      <w:lvlText w:val="%2."/>
+      <w:lvlJc w:val="left"/>
+      <w:pPr>
+        <w:ind w:left="1440" w:hanging="360"/>
+      </w:pPr>
+    </w:lvl>
+    <w:lvl w:ilvl="2">
+      <w:start w:val="1"/>
+      <w:numFmt w:val="decimal"/>
+      <w:lvlText w:val="%3."/>
+      <w:lvlJc w:val="left"/>
+      <w:pPr>
+        <w:ind w:left="2160" w:hanging="360"/>
+      </w:pPr>
+    </w:lvl>
+    <w:lvl w:ilvl="3">
+      <w:start w:val="1"/>
+      <w:numFmt w:val="decimal"/>
+      <w:lvlText w:val="%4."/>
+      <w:lvlJc w:val="left"/>
+      <w:pPr>
+        <w:ind w:left="2880" w:hanging="360"/>
+      </w:pPr>
+    </w:lvl>
+    <w:lvl w:ilvl="4">
+      <w:start w:val="1"/>
+      <w:numFmt w:val="decimal"/>
+      <w:lvlText w:val="%5."/>
+      <w:lvlJc w:val="left"/>
+      <w:pPr>
+        <w:ind w:left="3600" w:hanging="360"/>
+      </w:pPr>
+    </w:lvl>
+    <w:lvl w:ilvl="5">
+      <w:start w:val="1"/>
+      <w:numFmt w:val="decimal"/>
+      <w:lvlText w:val="%6."/>
+      <w:lvlJc w:val="left"/>
+      <w:pPr>
+        <w:ind w:left="4320" w:hanging="360"/>
+      </w:pPr>
+    </w:lvl>
+    <w:lvl w:ilvl="6">
+      <w:start w:val="1"/>
+      <w:numFmt w:val="decimal"/>
+      <w:lvlText w:val="%7."/>
+      <w:lvlJc w:val="left"/>
+      <w:pPr>
+        <w:ind w:left="5040" w:hanging="360"/>
+      </w:pPr>
+    </w:lvl>
+    <w:lvl w:ilvl="7">
+      <w:start w:val="1"/>
+      <w:numFmt w:val="decimal"/>
+      <w:lvlText w:val="%8."/>
+      <w:lvlJc w:val="left"/>
+      <w:pPr>
+        <w:ind w:left="5760" w:hanging="360"/>
+      </w:pPr>
+    </w:lvl>
+    <w:lvl w:ilvl="8">
+      <w:start w:val="1"/>
+      <w:numFmt w:val="decimal"/>
+      <w:lvlText w:val="%9."/>
+      <w:lvlJc w:val="left"/>
+      <w:pPr>
+        <w:ind w:left="6480" w:hanging="360"/>
+      </w:pPr>
+    </w:lvl>
+  </w:abstractNum>
   <w:abstractNum w:abstractNumId="991">
     <w:nsid w:val="0000A991"/>
     <w:multiLevelType w:val="multilevel"/>
@@ -3381,96 +3965,38 @@
       </w:rPr>
     </w:lvl>
   </w:abstractNum>
-  <w:abstractNum w:abstractNumId="99411">
-    <w:nsid w:val="00A99411"/>
-    <w:multiLevelType w:val="multilevel"/>
-    <w:lvl w:ilvl="0">
-      <w:start w:val="1"/>
-      <w:numFmt w:val="decimal"/>
-      <w:lvlText w:val="%1."/>
-      <w:lvlJc w:val="left"/>
-      <w:pPr>
-        <w:ind w:left="720" w:hanging="360"/>
-      </w:pPr>
-    </w:lvl>
-    <w:lvl w:ilvl="1">
-      <w:start w:val="1"/>
-      <w:numFmt w:val="decimal"/>
-      <w:lvlText w:val="%2."/>
-      <w:lvlJc w:val="left"/>
-      <w:pPr>
-        <w:ind w:left="1440" w:hanging="360"/>
-      </w:pPr>
-    </w:lvl>
-    <w:lvl w:ilvl="2">
-      <w:start w:val="1"/>
-      <w:numFmt w:val="decimal"/>
-      <w:lvlText w:val="%3."/>
-      <w:lvlJc w:val="left"/>
-      <w:pPr>
-        <w:ind w:left="2160" w:hanging="360"/>
-      </w:pPr>
-    </w:lvl>
-    <w:lvl w:ilvl="3">
-      <w:start w:val="1"/>
-      <w:numFmt w:val="decimal"/>
-      <w:lvlText w:val="%4."/>
-      <w:lvlJc w:val="left"/>
-      <w:pPr>
-        <w:ind w:left="2880" w:hanging="360"/>
-      </w:pPr>
-    </w:lvl>
-    <w:lvl w:ilvl="4">
-      <w:start w:val="1"/>
-      <w:numFmt w:val="decimal"/>
-      <w:lvlText w:val="%5."/>
-      <w:lvlJc w:val="left"/>
-      <w:pPr>
-        <w:ind w:left="3600" w:hanging="360"/>
-      </w:pPr>
-    </w:lvl>
-    <w:lvl w:ilvl="5">
-      <w:start w:val="1"/>
-      <w:numFmt w:val="decimal"/>
-      <w:lvlText w:val="%6."/>
-      <w:lvlJc w:val="left"/>
-      <w:pPr>
-        <w:ind w:left="4320" w:hanging="360"/>
-      </w:pPr>
-    </w:lvl>
-    <w:lvl w:ilvl="6">
-      <w:start w:val="1"/>
-      <w:numFmt w:val="decimal"/>
-      <w:lvlText w:val="%7."/>
-      <w:lvlJc w:val="left"/>
-      <w:pPr>
-        <w:ind w:left="5040" w:hanging="360"/>
-      </w:pPr>
-    </w:lvl>
-    <w:lvl w:ilvl="7">
-      <w:start w:val="1"/>
-      <w:numFmt w:val="decimal"/>
-      <w:lvlText w:val="%8."/>
-      <w:lvlJc w:val="left"/>
-      <w:pPr>
-        <w:ind w:left="5760" w:hanging="360"/>
-      </w:pPr>
-    </w:lvl>
-    <w:lvl w:ilvl="8">
-      <w:start w:val="1"/>
-      <w:numFmt w:val="decimal"/>
-      <w:lvlText w:val="%9."/>
-      <w:lvlJc w:val="left"/>
-      <w:pPr>
-        <w:ind w:left="6480" w:hanging="360"/>
-      </w:pPr>
-    </w:lvl>
-  </w:abstractNum>
   <w:num w:numId="1000">
     <w:abstractNumId w:val="990"/>
   </w:num>
   <w:num w:numId="1001">
-    <w:abstractNumId w:val="991"/>
+    <w:abstractNumId w:val="99411"/>
+    <w:lvlOverride w:ilvl="0">
+      <w:startOverride w:val="1"/>
+    </w:lvlOverride>
+    <w:lvlOverride w:ilvl="1">
+      <w:startOverride w:val="1"/>
+    </w:lvlOverride>
+    <w:lvlOverride w:ilvl="2">
+      <w:startOverride w:val="1"/>
+    </w:lvlOverride>
+    <w:lvlOverride w:ilvl="3">
+      <w:startOverride w:val="1"/>
+    </w:lvlOverride>
+    <w:lvlOverride w:ilvl="4">
+      <w:startOverride w:val="1"/>
+    </w:lvlOverride>
+    <w:lvlOverride w:ilvl="5">
+      <w:startOverride w:val="1"/>
+    </w:lvlOverride>
+    <w:lvlOverride w:ilvl="6">
+      <w:startOverride w:val="1"/>
+    </w:lvlOverride>
+    <w:lvlOverride w:ilvl="7">
+      <w:startOverride w:val="1"/>
+    </w:lvlOverride>
+    <w:lvlOverride w:ilvl="8">
+      <w:startOverride w:val="1"/>
+    </w:lvlOverride>
   </w:num>
   <w:num w:numId="1002">
     <w:abstractNumId w:val="991"/>

</xml_diff>

<commit_message>
Align dashboard marketing strategy with the canonical doc
Funnel: Overview rebuilt to show Funnel B (Challenge->Blueprint->Membership)
as PRIMARY + Funnel A (Scorecard->Zoom->1:1 coaching) as the higher-intent
path off the shared scorecard; revenue sequence + the $97 downsell-vs-Blueprint
distinction clarified; ad budget fixed to Option D ($25->$75/day).
Content: folded the content engine into the existing 5 post types - added a
'Stop Teaching, Start Reading' card mapping the signature formats (The Read,
State of the Data, What Your ___ Says, Autopsy, comment-to-DM) onto Authority/
Pattern/Coach/Contrarian/Diagnostic. Fixed the Meta optimisation event
(Lead only; CompleteRegistration never wired). Doc regenerated v2.3.

Co-Authored-By: Claude Opus 4.8 (1M context) <noreply@anthropic.com>
</commit_message>
<xml_diff>
--- a/public/docs/strategy/body-recode/body-recode-consumer-marketing-strategy-v1.docx
+++ b/public/docs/strategy/body-recode/body-recode-consumer-marketing-strategy-v1.docx
@@ -660,13 +660,13 @@
       </w:r>
     </w:p>
     <w:bookmarkEnd w:id="12"/>
-    <w:bookmarkStart w:id="13" w:name="the-funnel-scorecard-first"/>
+    <w:bookmarkStart w:id="13" w:name="the-funnel-scorecard-first-two-paths"/>
     <w:p>
       <w:pPr>
         <w:pStyle w:val="Heading2"/>
       </w:pPr>
       <w:r>
-        <w:t xml:space="preserve">4. The funnel (scorecard-first)</w:t>
+        <w:t xml:space="preserve">4. The funnel (scorecard-first, two paths)</w:t>
       </w:r>
     </w:p>
     <w:p>
@@ -690,7 +690,19 @@
         <w:t xml:space="preserve"> </w:t>
       </w:r>
       <w:r>
-        <w:t xml:space="preserve">first - the free, no-email-until-result diagnostic that turns a stranger into a named, segmented lead. The ladder from there:</w:t>
+        <w:t xml:space="preserve">first - the free, no-email-until-result diagnostic that turns a stranger into a named, segmented lead. From the one front door, two paths run:</w:t>
+      </w:r>
+    </w:p>
+    <w:p>
+      <w:pPr>
+        <w:pStyle w:val="BodyText"/>
+      </w:pPr>
+      <w:r>
+        <w:rPr>
+          <w:b/>
+          <w:bCs/>
+        </w:rPr>
+        <w:t xml:space="preserve">Funnel B - the PRIMARY consumer path (Challenge-led):</w:t>
       </w:r>
     </w:p>
     <w:tbl>
@@ -766,7 +778,7 @@
               <w:pStyle w:val="Compact"/>
             </w:pPr>
             <w:r>
-              <w:t xml:space="preserve">Free 2-minute diagnostic. Names your state + pattern. The universal front door.</w:t>
+              <w:t xml:space="preserve">Free 2-minute diagnostic. The universal front door.</w:t>
             </w:r>
           </w:p>
         </w:tc>
@@ -805,7 +817,7 @@
               <w:pStyle w:val="Compact"/>
             </w:pPr>
             <w:r>
-              <w:t xml:space="preserve">Free 14-day challenge (Funnel B). Day-0 intake, in-portal experience, Day-14 reveal.</w:t>
+              <w:t xml:space="preserve">Free 14-day challenge. Day-0 intake, in-portal experience, Day-14 reveal - proof the read works before any purchase.</w:t>
             </w:r>
           </w:p>
         </w:tc>
@@ -844,7 +856,7 @@
               <w:pStyle w:val="Compact"/>
             </w:pPr>
             <w:r>
-              <w:t xml:space="preserve">The paid next step after the Challenge - your personalised plan off the read.</w:t>
+              <w:t xml:space="preserve">The paid step after the Challenge - your personalised plan off the read.</w:t>
             </w:r>
           </w:p>
         </w:tc>
@@ -872,29 +884,29 @@
                 <w:b/>
                 <w:bCs/>
               </w:rPr>
-              <w:t xml:space="preserve">Coaching / Membership</w:t>
-            </w:r>
-          </w:p>
-        </w:tc>
-        <w:tc>
-          <w:tcPr/>
-          <w:p>
-            <w:pPr>
-              <w:pStyle w:val="Compact"/>
-            </w:pPr>
-            <w:r>
-              <w:t xml:space="preserve">Ongoing Performance Coaching + membership - the delivery arm the funnel feeds.</w:t>
-            </w:r>
-          </w:p>
-        </w:tc>
-        <w:tc>
-          <w:tcPr/>
-          <w:p>
-            <w:pPr>
-              <w:pStyle w:val="Compact"/>
-            </w:pPr>
-            <w:r>
-              <w:t xml:space="preserve">Paid tiers</w:t>
+              <w:t xml:space="preserve">Membership</w:t>
+            </w:r>
+          </w:p>
+        </w:tc>
+        <w:tc>
+          <w:tcPr/>
+          <w:p>
+            <w:pPr>
+              <w:pStyle w:val="Compact"/>
+            </w:pPr>
+            <w:r>
+              <w:t xml:space="preserve">Ongoing membership.</w:t>
+            </w:r>
+          </w:p>
+        </w:tc>
+        <w:tc>
+          <w:tcPr/>
+          <w:p>
+            <w:pPr>
+              <w:pStyle w:val="Compact"/>
+            </w:pPr>
+            <w:r>
+              <w:t xml:space="preserve">Paid</w:t>
             </w:r>
           </w:p>
         </w:tc>
@@ -905,36 +917,43 @@
         <w:pStyle w:val="BodyText"/>
       </w:pPr>
       <w:r>
-        <w:t xml:space="preserve">Two ad streams feed the top:</w:t>
-      </w:r>
-      <w:r>
-        <w:t xml:space="preserve"> </w:t>
-      </w:r>
-      <w:r>
-        <w:rPr>
-          <w:b/>
-          <w:bCs/>
-        </w:rPr>
-        <w:t xml:space="preserve">cold -&gt; Scorecard</w:t>
-      </w:r>
-      <w:r>
-        <w:t xml:space="preserve"> </w:t>
-      </w:r>
-      <w:r>
-        <w:t xml:space="preserve">(diagnosis-led) and</w:t>
-      </w:r>
-      <w:r>
-        <w:t xml:space="preserve"> </w:t>
-      </w:r>
-      <w:r>
-        <w:rPr>
-          <w:b/>
-          <w:bCs/>
-        </w:rPr>
-        <w:t xml:space="preserve">retargeting -&gt; Challenge + Membership</w:t>
-      </w:r>
-      <w:r>
-        <w:t xml:space="preserve">. Local/warm can route straight to the Challenge. Promos always route to</w:t>
+        <w:rPr>
+          <w:b/>
+          <w:bCs/>
+        </w:rPr>
+        <w:t xml:space="preserve">Funnel A - the higher-intent COACHING path:</w:t>
+      </w:r>
+    </w:p>
+    <w:p>
+      <w:pPr>
+        <w:pStyle w:val="BodyText"/>
+      </w:pPr>
+      <w:r>
+        <w:t xml:space="preserve">Scorecard -&gt; Performance Check-In -&gt; Zoom consultation -&gt; 1:1 Performance Coaching ($299-409/wk). For people ready to work with a coach directly instead of self-serving. The $37 report and $240 commencement fee sit on this path. (Note: a separate Zoom-decline</w:t>
+      </w:r>
+      <w:r>
+        <w:t xml:space="preserve"> </w:t>
+      </w:r>
+      <w:r>
+        <w:rPr>
+          <w:b/>
+          <w:bCs/>
+        </w:rPr>
+        <w:t xml:space="preserve">downsell</w:t>
+      </w:r>
+      <w:r>
+        <w:t xml:space="preserve"> </w:t>
+      </w:r>
+      <w:r>
+        <w:t xml:space="preserve">offers a $97 self-guided program - distinct from the Blueprint despite the shared price.)</w:t>
+      </w:r>
+    </w:p>
+    <w:p>
+      <w:pPr>
+        <w:pStyle w:val="BodyText"/>
+      </w:pPr>
+      <w:r>
+        <w:t xml:space="preserve">Both paths share the Scorecard as the front door. Promos always route to</w:t>
       </w:r>
       <w:r>
         <w:t xml:space="preserve"> </w:t>
@@ -946,7 +965,23 @@
         <w:t xml:space="preserve">/scorecard?intent=challenge</w:t>
       </w:r>
       <w:r>
-        <w:t xml:space="preserve">, never straight to a sales page. Reach is upstream of conversion - fix the earliest broken gate before blaming a caption.</w:t>
+        <w:t xml:space="preserve">, never straight to a sales page.</w:t>
+      </w:r>
+      <w:r>
+        <w:t xml:space="preserve"> </w:t>
+      </w:r>
+      <w:r>
+        <w:rPr>
+          <w:b/>
+          <w:bCs/>
+        </w:rPr>
+        <w:t xml:space="preserve">Cold -&gt; Scorecard; retargeting -&gt; Challenge + Membership.</w:t>
+      </w:r>
+      <w:r>
+        <w:t xml:space="preserve"> </w:t>
+      </w:r>
+      <w:r>
+        <w:t xml:space="preserve">Reach is upstream of conversion - fix the earliest broken gate before blaming a caption.</w:t>
       </w:r>
     </w:p>
     <w:bookmarkEnd w:id="13"/>
@@ -2111,94 +2146,22 @@
         </w:tc>
       </w:tr>
     </w:tbl>
-    <w:bookmarkEnd w:id="18"/>
-    <w:bookmarkStart w:id="19" w:name="the-enemy"/>
-    <w:p>
-      <w:pPr>
-        <w:pStyle w:val="Heading2"/>
-      </w:pPr>
-      <w:r>
-        <w:t xml:space="preserve">9. The enemy</w:t>
-      </w:r>
-    </w:p>
-    <w:p>
-      <w:pPr>
-        <w:pStyle w:val="FirstParagraph"/>
-      </w:pPr>
-      <w:r>
-        <w:t xml:space="preserve">Give people something to be against: the</w:t>
-      </w:r>
-      <w:r>
-        <w:t xml:space="preserve"> </w:t>
-      </w:r>
-      <w:r>
-        <w:rPr>
-          <w:b/>
-          <w:bCs/>
-        </w:rPr>
-        <w:t xml:space="preserve">eat-less-move-more machine.</w:t>
-      </w:r>
-      <w:r>
-        <w:t xml:space="preserve"> </w:t>
-      </w:r>
-      <w:r>
-        <w:t xml:space="preserve">Protocol without interpretation. A brand with an enemy builds a movement, not an audience - people share what they’re angry about, and being the calm expert who defends them is a magnetic position.</w:t>
-      </w:r>
-    </w:p>
-    <w:bookmarkEnd w:id="19"/>
-    <w:bookmarkStart w:id="20" w:name="the-lead-mechanic-comment-to-dm-upgraded"/>
-    <w:p>
-      <w:pPr>
-        <w:pStyle w:val="Heading2"/>
-      </w:pPr>
-      <w:r>
-        <w:t xml:space="preserve">10. The lead mechanic (comment-to-DM, upgraded)</w:t>
-      </w:r>
-    </w:p>
-    <w:p>
-      <w:pPr>
-        <w:pStyle w:val="FirstParagraph"/>
-      </w:pPr>
-      <w:r>
-        <w:t xml:space="preserve">The giveaway is</w:t>
-      </w:r>
-      <w:r>
-        <w:t xml:space="preserve"> </w:t>
-      </w:r>
-      <w:r>
-        <w:rPr>
-          <w:b/>
-          <w:bCs/>
-        </w:rPr>
-        <w:t xml:space="preserve">a personalised micro-read, not a PDF.</w:t>
-      </w:r>
-      <w:r>
-        <w:t xml:space="preserve"> </w:t>
-      </w:r>
-      <w:r>
-        <w:t xml:space="preserve">Comment the keyword -&gt; the DM asks 2-3 quick questions -&gt; it hands back their likely pattern, the one reason it’s happening, and the single thing to change first, then invites them to the scorecard for the full read. ManyChat delivers it (it has Meta’s approved messaging access, so it sidesteps the app-review wall). The branded PDF becomes the tailored leave-behind. Keyword + copy spec:</w:t>
-      </w:r>
-      <w:r>
-        <w:t xml:space="preserve"> </w:t>
-      </w:r>
-      <w:r>
-        <w:rPr>
-          <w:rStyle w:val="VerbatimChar"/>
-        </w:rPr>
-        <w:t xml:space="preserve">comment-to-dm-asset-map-v1.md</w:t>
-      </w:r>
-      <w:r>
-        <w:t xml:space="preserve">. Cap at 1-2 comment-to-DM posts a week, always on a scenario hook.</w:t>
-      </w:r>
-    </w:p>
-    <w:bookmarkEnd w:id="20"/>
-    <w:bookmarkStart w:id="21" w:name="channels-cadence-weekly-rhythm"/>
-    <w:p>
-      <w:pPr>
-        <w:pStyle w:val="Heading2"/>
-      </w:pPr>
-      <w:r>
-        <w:t xml:space="preserve">11. Channels, cadence &amp; weekly rhythm</w:t>
+    <w:p>
+      <w:pPr>
+        <w:pStyle w:val="BodyText"/>
+      </w:pPr>
+      <w:r>
+        <w:rPr>
+          <w:b/>
+          <w:bCs/>
+        </w:rPr>
+        <w:t xml:space="preserve">These formats are variants within your canonical 5 post types</w:t>
+      </w:r>
+      <w:r>
+        <w:t xml:space="preserve"> </w:t>
+      </w:r>
+      <w:r>
+        <w:t xml:space="preserve">(see the Content System tab) - not a competing system:</w:t>
       </w:r>
     </w:p>
     <w:p>
@@ -2214,6 +2177,214 @@
           <w:b/>
           <w:bCs/>
         </w:rPr>
+        <w:t xml:space="preserve">Authority</w:t>
+      </w:r>
+      <w:r>
+        <w:t xml:space="preserve"> </w:t>
+      </w:r>
+      <w:r>
+        <w:t xml:space="preserve">-&gt; State of the Data, Receipts of the Read</w:t>
+      </w:r>
+    </w:p>
+    <w:p>
+      <w:pPr>
+        <w:pStyle w:val="Compact"/>
+        <w:numPr>
+          <w:ilvl w:val="0"/>
+          <w:numId w:val="1005"/>
+        </w:numPr>
+      </w:pPr>
+      <w:r>
+        <w:rPr>
+          <w:b/>
+          <w:bCs/>
+        </w:rPr>
+        <w:t xml:space="preserve">Pattern Recognition</w:t>
+      </w:r>
+      <w:r>
+        <w:t xml:space="preserve"> </w:t>
+      </w:r>
+      <w:r>
+        <w:t xml:space="preserve">-&gt; What Your ___ Says, The Scenario</w:t>
+      </w:r>
+    </w:p>
+    <w:p>
+      <w:pPr>
+        <w:pStyle w:val="Compact"/>
+        <w:numPr>
+          <w:ilvl w:val="0"/>
+          <w:numId w:val="1005"/>
+        </w:numPr>
+      </w:pPr>
+      <w:r>
+        <w:rPr>
+          <w:b/>
+          <w:bCs/>
+        </w:rPr>
+        <w:t xml:space="preserve">Coach Perspective</w:t>
+      </w:r>
+      <w:r>
+        <w:t xml:space="preserve"> </w:t>
+      </w:r>
+      <w:r>
+        <w:t xml:space="preserve">-&gt; React to DMs, Receipts</w:t>
+      </w:r>
+    </w:p>
+    <w:p>
+      <w:pPr>
+        <w:pStyle w:val="Compact"/>
+        <w:numPr>
+          <w:ilvl w:val="0"/>
+          <w:numId w:val="1005"/>
+        </w:numPr>
+      </w:pPr>
+      <w:r>
+        <w:rPr>
+          <w:b/>
+          <w:bCs/>
+        </w:rPr>
+        <w:t xml:space="preserve">Contrarian</w:t>
+      </w:r>
+      <w:r>
+        <w:t xml:space="preserve"> </w:t>
+      </w:r>
+      <w:r>
+        <w:t xml:space="preserve">-&gt; The Autopsy</w:t>
+      </w:r>
+    </w:p>
+    <w:p>
+      <w:pPr>
+        <w:pStyle w:val="Compact"/>
+        <w:numPr>
+          <w:ilvl w:val="0"/>
+          <w:numId w:val="1005"/>
+        </w:numPr>
+      </w:pPr>
+      <w:r>
+        <w:rPr>
+          <w:b/>
+          <w:bCs/>
+        </w:rPr>
+        <w:t xml:space="preserve">Diagnostic / Funnel</w:t>
+      </w:r>
+      <w:r>
+        <w:t xml:space="preserve"> </w:t>
+      </w:r>
+      <w:r>
+        <w:t xml:space="preserve">-&gt; The Read, The Prediction Flex, the comment-to-DM read</w:t>
+      </w:r>
+    </w:p>
+    <w:p>
+      <w:pPr>
+        <w:pStyle w:val="FirstParagraph"/>
+      </w:pPr>
+      <w:r>
+        <w:t xml:space="preserve">Same 5 types, same archetype rotation and hook banks - the formats just give each type a sharper, more repeatable, more scroll-stopping shape.</w:t>
+      </w:r>
+    </w:p>
+    <w:bookmarkEnd w:id="18"/>
+    <w:bookmarkStart w:id="19" w:name="the-enemy"/>
+    <w:p>
+      <w:pPr>
+        <w:pStyle w:val="Heading2"/>
+      </w:pPr>
+      <w:r>
+        <w:t xml:space="preserve">9. The enemy</w:t>
+      </w:r>
+    </w:p>
+    <w:p>
+      <w:pPr>
+        <w:pStyle w:val="FirstParagraph"/>
+      </w:pPr>
+      <w:r>
+        <w:t xml:space="preserve">Give people something to be against: the</w:t>
+      </w:r>
+      <w:r>
+        <w:t xml:space="preserve"> </w:t>
+      </w:r>
+      <w:r>
+        <w:rPr>
+          <w:b/>
+          <w:bCs/>
+        </w:rPr>
+        <w:t xml:space="preserve">eat-less-move-more machine.</w:t>
+      </w:r>
+      <w:r>
+        <w:t xml:space="preserve"> </w:t>
+      </w:r>
+      <w:r>
+        <w:t xml:space="preserve">Protocol without interpretation. A brand with an enemy builds a movement, not an audience - people share what they’re angry about, and being the calm expert who defends them is a magnetic position.</w:t>
+      </w:r>
+    </w:p>
+    <w:bookmarkEnd w:id="19"/>
+    <w:bookmarkStart w:id="20" w:name="the-lead-mechanic-comment-to-dm-upgraded"/>
+    <w:p>
+      <w:pPr>
+        <w:pStyle w:val="Heading2"/>
+      </w:pPr>
+      <w:r>
+        <w:t xml:space="preserve">10. The lead mechanic (comment-to-DM, upgraded)</w:t>
+      </w:r>
+    </w:p>
+    <w:p>
+      <w:pPr>
+        <w:pStyle w:val="FirstParagraph"/>
+      </w:pPr>
+      <w:r>
+        <w:t xml:space="preserve">The giveaway is</w:t>
+      </w:r>
+      <w:r>
+        <w:t xml:space="preserve"> </w:t>
+      </w:r>
+      <w:r>
+        <w:rPr>
+          <w:b/>
+          <w:bCs/>
+        </w:rPr>
+        <w:t xml:space="preserve">a personalised micro-read, not a PDF.</w:t>
+      </w:r>
+      <w:r>
+        <w:t xml:space="preserve"> </w:t>
+      </w:r>
+      <w:r>
+        <w:t xml:space="preserve">Comment the keyword -&gt; the DM asks 2-3 quick questions -&gt; it hands back their likely pattern, the one reason it’s happening, and the single thing to change first, then invites them to the scorecard for the full read. ManyChat delivers it (it has Meta’s approved messaging access, so it sidesteps the app-review wall). The branded PDF becomes the tailored leave-behind. Keyword + copy spec:</w:t>
+      </w:r>
+      <w:r>
+        <w:t xml:space="preserve"> </w:t>
+      </w:r>
+      <w:r>
+        <w:rPr>
+          <w:rStyle w:val="VerbatimChar"/>
+        </w:rPr>
+        <w:t xml:space="preserve">comment-to-dm-asset-map-v1.md</w:t>
+      </w:r>
+      <w:r>
+        <w:t xml:space="preserve">. Cap at 1-2 comment-to-DM posts a week, always on a scenario hook.</w:t>
+      </w:r>
+    </w:p>
+    <w:bookmarkEnd w:id="20"/>
+    <w:bookmarkStart w:id="21" w:name="channels-cadence-weekly-rhythm"/>
+    <w:p>
+      <w:pPr>
+        <w:pStyle w:val="Heading2"/>
+      </w:pPr>
+      <w:r>
+        <w:t xml:space="preserve">11. Channels, cadence &amp; weekly rhythm</w:t>
+      </w:r>
+    </w:p>
+    <w:p>
+      <w:pPr>
+        <w:pStyle w:val="Compact"/>
+        <w:numPr>
+          <w:ilvl w:val="0"/>
+          <w:numId w:val="1006"/>
+        </w:numPr>
+      </w:pPr>
+      <w:r>
+        <w:rPr>
+          <w:b/>
+          <w:bCs/>
+        </w:rPr>
         <w:t xml:space="preserve">Instagram</w:t>
       </w:r>
       <w:r>
@@ -2314,21 +2485,19 @@
         <w:pStyle w:val="FirstParagraph"/>
       </w:pPr>
       <w:r>
-        <w:t xml:space="preserve">Starting weekly grid (E = engagement-first, no link; C = click/lead):</w:t>
+        <w:t xml:space="preserve">Weekly structure = your canonical 5-post-type week (the Content System tab), with the signature formats slotted in and archetypes rotating 1 -&gt; 4 across the week (Sunday always archetype 01, the Stressed Exec Woman):</w:t>
       </w:r>
     </w:p>
     <w:tbl>
       <w:tblPr>
         <w:tblStyle w:val="Table"/>
-        <w:tblW w:type="pct" w:w="5000"/>
-        <w:tblLayout w:type="fixed"/>
+        <w:tblW w:type="auto" w:w="0"/>
         <w:tblLook w:firstRow="1" w:lastRow="0" w:firstColumn="0" w:lastColumn="0" w:noHBand="0" w:noVBand="0" w:val="0020"/>
       </w:tblPr>
       <w:tblGrid>
-        <w:gridCol w:w="1980"/>
-        <w:gridCol w:w="1980"/>
-        <w:gridCol w:w="1980"/>
-        <w:gridCol w:w="1980"/>
+        <w:gridCol w:w="2640"/>
+        <w:gridCol w:w="2640"/>
+        <w:gridCol w:w="2640"/>
       </w:tblGrid>
       <w:tr>
         <w:trPr>
@@ -2352,29 +2521,18 @@
               <w:pStyle w:val="Compact"/>
             </w:pPr>
             <w:r>
-              <w:t xml:space="preserve">Format</w:t>
-            </w:r>
-          </w:p>
-        </w:tc>
-        <w:tc>
-          <w:tcPr/>
-          <w:p>
-            <w:pPr>
-              <w:pStyle w:val="Compact"/>
-            </w:pPr>
-            <w:r>
-              <w:t xml:space="preserve">Job</w:t>
-            </w:r>
-          </w:p>
-        </w:tc>
-        <w:tc>
-          <w:tcPr/>
-          <w:p>
-            <w:pPr>
-              <w:pStyle w:val="Compact"/>
-            </w:pPr>
-            <w:r>
-              <w:t xml:space="preserve">Medium</w:t>
+              <w:t xml:space="preserve">Post type (canonical)</w:t>
+            </w:r>
+          </w:p>
+        </w:tc>
+        <w:tc>
+          <w:tcPr/>
+          <w:p>
+            <w:pPr>
+              <w:pStyle w:val="Compact"/>
+            </w:pPr>
+            <w:r>
+              <w:t xml:space="preserve">Formats it can run</w:t>
             </w:r>
           </w:p>
         </w:tc>
@@ -2402,29 +2560,18 @@
                 <w:b/>
                 <w:bCs/>
               </w:rPr>
-              <w:t xml:space="preserve">The Read</w:t>
-            </w:r>
-          </w:p>
-        </w:tc>
-        <w:tc>
-          <w:tcPr/>
-          <w:p>
-            <w:pPr>
-              <w:pStyle w:val="Compact"/>
-            </w:pPr>
-            <w:r>
-              <w:t xml:space="preserve">E</w:t>
-            </w:r>
-          </w:p>
-        </w:tc>
-        <w:tc>
-          <w:tcPr/>
-          <w:p>
-            <w:pPr>
-              <w:pStyle w:val="Compact"/>
-            </w:pPr>
-            <w:r>
-              <w:t xml:space="preserve">Reel / carousel</w:t>
+              <w:t xml:space="preserve">Authority</w:t>
+            </w:r>
+          </w:p>
+        </w:tc>
+        <w:tc>
+          <w:tcPr/>
+          <w:p>
+            <w:pPr>
+              <w:pStyle w:val="Compact"/>
+            </w:pPr>
+            <w:r>
+              <w:t xml:space="preserve">State of the Data · The Read</w:t>
             </w:r>
           </w:p>
         </w:tc>
@@ -2452,29 +2599,18 @@
                 <w:b/>
                 <w:bCs/>
               </w:rPr>
-              <w:t xml:space="preserve">What Your ___ Says</w:t>
-            </w:r>
-          </w:p>
-        </w:tc>
-        <w:tc>
-          <w:tcPr/>
-          <w:p>
-            <w:pPr>
-              <w:pStyle w:val="Compact"/>
-            </w:pPr>
-            <w:r>
-              <w:t xml:space="preserve">E</w:t>
-            </w:r>
-          </w:p>
-        </w:tc>
-        <w:tc>
-          <w:tcPr/>
-          <w:p>
-            <w:pPr>
-              <w:pStyle w:val="Compact"/>
-            </w:pPr>
-            <w:r>
-              <w:t xml:space="preserve">Carousel</w:t>
+              <w:t xml:space="preserve">Contrarian</w:t>
+            </w:r>
+          </w:p>
+        </w:tc>
+        <w:tc>
+          <w:tcPr/>
+          <w:p>
+            <w:pPr>
+              <w:pStyle w:val="Compact"/>
+            </w:pPr>
+            <w:r>
+              <w:t xml:space="preserve">The Autopsy</w:t>
             </w:r>
           </w:p>
         </w:tc>
@@ -2502,45 +2638,57 @@
                 <w:b/>
                 <w:bCs/>
               </w:rPr>
-              <w:t xml:space="preserve">The Scenario</w:t>
-            </w:r>
-            <w:r>
-              <w:t xml:space="preserve"> </w:t>
-            </w:r>
-            <w:r>
-              <w:t xml:space="preserve">or</w:t>
-            </w:r>
-            <w:r>
-              <w:t xml:space="preserve"> </w:t>
-            </w:r>
+              <w:t xml:space="preserve">Pattern Recognition</w:t>
+            </w:r>
+          </w:p>
+        </w:tc>
+        <w:tc>
+          <w:tcPr/>
+          <w:p>
+            <w:pPr>
+              <w:pStyle w:val="Compact"/>
+            </w:pPr>
+            <w:r>
+              <w:t xml:space="preserve">What Your ___ Says · The Scenario</w:t>
+            </w:r>
+          </w:p>
+        </w:tc>
+      </w:tr>
+      <w:tr>
+        <w:tc>
+          <w:tcPr/>
+          <w:p>
+            <w:pPr>
+              <w:pStyle w:val="Compact"/>
+            </w:pPr>
+            <w:r>
+              <w:t xml:space="preserve">Fri</w:t>
+            </w:r>
+          </w:p>
+        </w:tc>
+        <w:tc>
+          <w:tcPr/>
+          <w:p>
+            <w:pPr>
+              <w:pStyle w:val="Compact"/>
+            </w:pPr>
             <w:r>
               <w:rPr>
                 <w:b/>
                 <w:bCs/>
               </w:rPr>
-              <w:t xml:space="preserve">The Autopsy</w:t>
-            </w:r>
-          </w:p>
-        </w:tc>
-        <w:tc>
-          <w:tcPr/>
-          <w:p>
-            <w:pPr>
-              <w:pStyle w:val="Compact"/>
-            </w:pPr>
-            <w:r>
-              <w:t xml:space="preserve">E</w:t>
-            </w:r>
-          </w:p>
-        </w:tc>
-        <w:tc>
-          <w:tcPr/>
-          <w:p>
-            <w:pPr>
-              <w:pStyle w:val="Compact"/>
-            </w:pPr>
-            <w:r>
-              <w:t xml:space="preserve">Static / reel</w:t>
+              <w:t xml:space="preserve">Coach Perspective</w:t>
+            </w:r>
+          </w:p>
+        </w:tc>
+        <w:tc>
+          <w:tcPr/>
+          <w:p>
+            <w:pPr>
+              <w:pStyle w:val="Compact"/>
+            </w:pPr>
+            <w:r>
+              <w:t xml:space="preserve">Receipts · React to DMs</w:t>
             </w:r>
           </w:p>
         </w:tc>
@@ -2553,7 +2701,7 @@
               <w:pStyle w:val="Compact"/>
             </w:pPr>
             <w:r>
-              <w:t xml:space="preserve">Thu</w:t>
+              <w:t xml:space="preserve">Sun</w:t>
             </w:r>
           </w:p>
         </w:tc>
@@ -2568,111 +2716,18 @@
                 <w:b/>
                 <w:bCs/>
               </w:rPr>
-              <w:t xml:space="preserve">Receipts</w:t>
-            </w:r>
-            <w:r>
-              <w:t xml:space="preserve"> </w:t>
-            </w:r>
-            <w:r>
-              <w:t xml:space="preserve">or</w:t>
-            </w:r>
-            <w:r>
-              <w:t xml:space="preserve"> </w:t>
-            </w:r>
-            <w:r>
-              <w:rPr>
-                <w:b/>
-                <w:bCs/>
-              </w:rPr>
-              <w:t xml:space="preserve">React to DMs</w:t>
-            </w:r>
-          </w:p>
-        </w:tc>
-        <w:tc>
-          <w:tcPr/>
-          <w:p>
-            <w:pPr>
-              <w:pStyle w:val="Compact"/>
-            </w:pPr>
-            <w:r>
-              <w:t xml:space="preserve">E (proof)</w:t>
-            </w:r>
-          </w:p>
-        </w:tc>
-        <w:tc>
-          <w:tcPr/>
-          <w:p>
-            <w:pPr>
-              <w:pStyle w:val="Compact"/>
-            </w:pPr>
-            <w:r>
-              <w:t xml:space="preserve">Reel</w:t>
-            </w:r>
-          </w:p>
-        </w:tc>
-      </w:tr>
-      <w:tr>
-        <w:tc>
-          <w:tcPr/>
-          <w:p>
-            <w:pPr>
-              <w:pStyle w:val="Compact"/>
-            </w:pPr>
-            <w:r>
-              <w:t xml:space="preserve">Fri</w:t>
-            </w:r>
-          </w:p>
-        </w:tc>
-        <w:tc>
-          <w:tcPr/>
-          <w:p>
-            <w:pPr>
-              <w:pStyle w:val="Compact"/>
-            </w:pPr>
-            <w:r>
-              <w:rPr>
-                <w:b/>
-                <w:bCs/>
-              </w:rPr>
-              <w:t xml:space="preserve">Comment-to-DM read</w:t>
-            </w:r>
-            <w:r>
-              <w:t xml:space="preserve"> </w:t>
-            </w:r>
-            <w:r>
-              <w:t xml:space="preserve">or</w:t>
-            </w:r>
-            <w:r>
-              <w:t xml:space="preserve"> </w:t>
-            </w:r>
-            <w:r>
-              <w:rPr>
-                <w:b/>
-                <w:bCs/>
-              </w:rPr>
-              <w:t xml:space="preserve">State of the Data</w:t>
-            </w:r>
-          </w:p>
-        </w:tc>
-        <w:tc>
-          <w:tcPr/>
-          <w:p>
-            <w:pPr>
-              <w:pStyle w:val="Compact"/>
-            </w:pPr>
-            <w:r>
-              <w:t xml:space="preserve">C</w:t>
-            </w:r>
-          </w:p>
-        </w:tc>
-        <w:tc>
-          <w:tcPr/>
-          <w:p>
-            <w:pPr>
-              <w:pStyle w:val="Compact"/>
-            </w:pPr>
-            <w:r>
-              <w:t xml:space="preserve">Static + DM</w:t>
+              <w:t xml:space="preserve">Diagnostic / Funnel</w:t>
+            </w:r>
+          </w:p>
+        </w:tc>
+        <w:tc>
+          <w:tcPr/>
+          <w:p>
+            <w:pPr>
+              <w:pStyle w:val="Compact"/>
+            </w:pPr>
+            <w:r>
+              <w:t xml:space="preserve">The Read · comment-to-DM read</w:t>
             </w:r>
           </w:p>
         </w:tc>
@@ -2683,7 +2738,7 @@
         <w:pStyle w:val="BodyText"/>
       </w:pPr>
       <w:r>
-        <w:t xml:space="preserve">Stories run alongside daily: the</w:t>
+        <w:t xml:space="preserve">One CTA per post = the Scorecard (engagement-first posts still earn the comment first; the Scorecard stays the single funnel CTA). Stories run alongside daily: the</w:t>
       </w:r>
       <w:r>
         <w:t xml:space="preserve"> </w:t>
@@ -2695,7 +2750,7 @@
         <w:t xml:space="preserve"> </w:t>
       </w:r>
       <w:r>
-        <w:t xml:space="preserve">mini-quiz, polls, behind-the-scenes reads. Appointment content: The Read is always Monday, so the audience learns to show up.</w:t>
+        <w:t xml:space="preserve">mini-quiz, polls, behind-the-scenes reads.</w:t>
       </w:r>
     </w:p>
     <w:bookmarkEnd w:id="21"/>
@@ -2909,107 +2964,6 @@
       </w:pPr>
       <w:r>
         <w:t xml:space="preserve">All three use the engine and funnel you already have:</w:t>
-      </w:r>
-    </w:p>
-    <w:p>
-      <w:pPr>
-        <w:pStyle w:val="Compact"/>
-        <w:numPr>
-          <w:ilvl w:val="0"/>
-          <w:numId w:val="1006"/>
-        </w:numPr>
-      </w:pPr>
-      <w:r>
-        <w:rPr>
-          <w:b/>
-          <w:bCs/>
-        </w:rPr>
-        <w:t xml:space="preserve">The Read</w:t>
-      </w:r>
-      <w:r>
-        <w:t xml:space="preserve"> </w:t>
-      </w:r>
-      <w:r>
-        <w:t xml:space="preserve">- the signature demo, weekly.</w:t>
-      </w:r>
-    </w:p>
-    <w:p>
-      <w:pPr>
-        <w:pStyle w:val="Compact"/>
-        <w:numPr>
-          <w:ilvl w:val="0"/>
-          <w:numId w:val="1006"/>
-        </w:numPr>
-      </w:pPr>
-      <w:r>
-        <w:rPr>
-          <w:b/>
-          <w:bCs/>
-        </w:rPr>
-        <w:t xml:space="preserve">State of the Data</w:t>
-      </w:r>
-      <w:r>
-        <w:t xml:space="preserve"> </w:t>
-      </w:r>
-      <w:r>
-        <w:t xml:space="preserve">- your own scorecard patterns as content.</w:t>
-      </w:r>
-    </w:p>
-    <w:p>
-      <w:pPr>
-        <w:pStyle w:val="Compact"/>
-        <w:numPr>
-          <w:ilvl w:val="0"/>
-          <w:numId w:val="1006"/>
-        </w:numPr>
-      </w:pPr>
-      <w:r>
-        <w:rPr>
-          <w:b/>
-          <w:bCs/>
-        </w:rPr>
-        <w:t xml:space="preserve">The personalised comment-to-DM read</w:t>
-      </w:r>
-      <w:r>
-        <w:t xml:space="preserve"> </w:t>
-      </w:r>
-      <w:r>
-        <w:t xml:space="preserve">- the upgraded lead mechanic.</w:t>
-      </w:r>
-    </w:p>
-    <w:p>
-      <w:pPr>
-        <w:pStyle w:val="FirstParagraph"/>
-      </w:pPr>
-      <w:r>
-        <w:t xml:space="preserve">Run against the current style for 2-3 weeks; let the numbers pick winners, then double down.</w:t>
-      </w:r>
-    </w:p>
-    <w:p>
-      <w:r>
-        <w:pict>
-          <v:rect style="width:0;height:1.5pt" o:hralign="center" o:hrstd="t" o:hr="t"/>
-        </w:pict>
-      </w:r>
-    </w:p>
-    <w:bookmarkEnd w:id="25"/>
-    <w:bookmarkEnd w:id="26"/>
-    <w:bookmarkStart w:id="31" w:name="part-iii---standards-measurement"/>
-    <w:p>
-      <w:pPr>
-        <w:pStyle w:val="Heading1"/>
-      </w:pPr>
-      <w:r>
-        <w:t xml:space="preserve">PART III - STANDARDS &amp; MEASUREMENT</w:t>
-      </w:r>
-    </w:p>
-    <w:bookmarkStart w:id="27" w:name="voice-design-rules"/>
-    <w:p>
-      <w:pPr>
-        <w:pStyle w:val="Heading2"/>
-      </w:pPr>
-      <w:r>
-        <w:t xml:space="preserve">16. Voice &amp; design rules</w:t>
       </w:r>
     </w:p>
     <w:p>
@@ -3025,25 +2979,13 @@
           <w:b/>
           <w:bCs/>
         </w:rPr>
-        <w:t xml:space="preserve">Voice:</w:t>
-      </w:r>
-      <w:r>
-        <w:t xml:space="preserve"> </w:t>
-      </w:r>
-      <w:r>
-        <w:t xml:space="preserve">interpretation-led, calm authority, no hype. Contractions, varied rhythm, read-aloud test. Fat-loss-explicit framing. No</w:t>
-      </w:r>
-      <w:r>
-        <w:t xml:space="preserve"> </w:t>
-      </w:r>
-      <w:r>
-        <w:t xml:space="preserve">“tips”</w:t>
-      </w:r>
-      <w:r>
-        <w:t xml:space="preserve"> </w:t>
-      </w:r>
-      <w:r>
-        <w:t xml:space="preserve">content - always the read underneath.</w:t>
+        <w:t xml:space="preserve">The Read</w:t>
+      </w:r>
+      <w:r>
+        <w:t xml:space="preserve"> </w:t>
+      </w:r>
+      <w:r>
+        <w:t xml:space="preserve">- the signature demo, weekly.</w:t>
       </w:r>
     </w:p>
     <w:p>
@@ -3059,13 +3001,13 @@
           <w:b/>
           <w:bCs/>
         </w:rPr>
-        <w:t xml:space="preserve">No em dashes</w:t>
-      </w:r>
-      <w:r>
-        <w:t xml:space="preserve"> </w:t>
-      </w:r>
-      <w:r>
-        <w:t xml:space="preserve">(house style) - hyphens or rewrites.</w:t>
+        <w:t xml:space="preserve">State of the Data</w:t>
+      </w:r>
+      <w:r>
+        <w:t xml:space="preserve"> </w:t>
+      </w:r>
+      <w:r>
+        <w:t xml:space="preserve">- your own scorecard patterns as content.</w:t>
       </w:r>
     </w:p>
     <w:p>
@@ -3081,450 +3023,48 @@
           <w:b/>
           <w:bCs/>
         </w:rPr>
-        <w:t xml:space="preserve">Design:</w:t>
-      </w:r>
-      <w:r>
-        <w:t xml:space="preserve"> </w:t>
-      </w:r>
-      <w:r>
-        <w:t xml:space="preserve">Pure White / Graphite / Signal Blue (#1B6DFC). Social assets 1080x1350 (4:5); reels 9:16; 96px safe margins. All photos of Kade in BR graphics render</w:t>
-      </w:r>
-      <w:r>
-        <w:t xml:space="preserve"> </w:t>
-      </w:r>
-      <w:r>
-        <w:rPr>
-          <w:b/>
-          <w:bCs/>
-        </w:rPr>
-        <w:t xml:space="preserve">greyscale</w:t>
-      </w:r>
-      <w:r>
-        <w:t xml:space="preserve">, never colour.</w:t>
-      </w:r>
-    </w:p>
-    <w:p>
-      <w:pPr>
-        <w:pStyle w:val="Compact"/>
-        <w:numPr>
-          <w:ilvl w:val="0"/>
-          <w:numId w:val="1007"/>
-        </w:numPr>
-      </w:pPr>
-      <w:r>
-        <w:t xml:space="preserve">Kade’s public byline title:</w:t>
-      </w:r>
-      <w:r>
-        <w:t xml:space="preserve"> </w:t>
-      </w:r>
-      <w:r>
-        <w:rPr>
-          <w:b/>
-          <w:bCs/>
-        </w:rPr>
-        <w:t xml:space="preserve">“Sports Scientist”</w:t>
-      </w:r>
-      <w:r>
-        <w:t xml:space="preserve"> </w:t>
-      </w:r>
-      <w:r>
-        <w:t xml:space="preserve">(not</w:t>
-      </w:r>
-      <w:r>
-        <w:t xml:space="preserve"> </w:t>
-      </w:r>
-      <w:r>
-        <w:t xml:space="preserve">“Exercise Scientist”</w:t>
-      </w:r>
-      <w:r>
-        <w:t xml:space="preserve">).</w:t>
-      </w:r>
-    </w:p>
-    <w:bookmarkEnd w:id="27"/>
-    <w:bookmarkStart w:id="28" w:name="messaging-rules-do-dont"/>
+        <w:t xml:space="preserve">The personalised comment-to-DM read</w:t>
+      </w:r>
+      <w:r>
+        <w:t xml:space="preserve"> </w:t>
+      </w:r>
+      <w:r>
+        <w:t xml:space="preserve">- the upgraded lead mechanic.</w:t>
+      </w:r>
+    </w:p>
+    <w:p>
+      <w:pPr>
+        <w:pStyle w:val="FirstParagraph"/>
+      </w:pPr>
+      <w:r>
+        <w:t xml:space="preserve">Run against the current style for 2-3 weeks; let the numbers pick winners, then double down.</w:t>
+      </w:r>
+    </w:p>
+    <w:p>
+      <w:r>
+        <w:pict>
+          <v:rect style="width:0;height:1.5pt" o:hralign="center" o:hrstd="t" o:hr="t"/>
+        </w:pict>
+      </w:r>
+    </w:p>
+    <w:bookmarkEnd w:id="25"/>
+    <w:bookmarkEnd w:id="26"/>
+    <w:bookmarkStart w:id="31" w:name="part-iii---standards-measurement"/>
+    <w:p>
+      <w:pPr>
+        <w:pStyle w:val="Heading1"/>
+      </w:pPr>
+      <w:r>
+        <w:t xml:space="preserve">PART III - STANDARDS &amp; MEASUREMENT</w:t>
+      </w:r>
+    </w:p>
+    <w:bookmarkStart w:id="27" w:name="voice-design-rules"/>
     <w:p>
       <w:pPr>
         <w:pStyle w:val="Heading2"/>
       </w:pPr>
       <w:r>
-        <w:t xml:space="preserve">17. Messaging rules (do / don’t)</w:t>
-      </w:r>
-    </w:p>
-    <w:p>
-      <w:pPr>
-        <w:pStyle w:val="FirstParagraph"/>
-      </w:pPr>
-      <w:r>
-        <w:rPr>
-          <w:b/>
-          <w:bCs/>
-        </w:rPr>
-        <w:t xml:space="preserve">Do:</w:t>
-      </w:r>
-      <w:r>
-        <w:t xml:space="preserve"> </w:t>
-      </w:r>
-      <w:r>
-        <w:t xml:space="preserve">lead with the stuck feeling; name the state;</w:t>
-      </w:r>
-      <w:r>
-        <w:t xml:space="preserve"> </w:t>
-      </w:r>
-      <w:r>
-        <w:rPr>
-          <w:b/>
-          <w:bCs/>
-        </w:rPr>
-        <w:t xml:space="preserve">write sharp enough to catch the high performer who self-scores</w:t>
-      </w:r>
-      <w:r>
-        <w:rPr>
-          <w:b/>
-          <w:bCs/>
-        </w:rPr>
-        <w:t xml:space="preserve"> </w:t>
-      </w:r>
-      <w:r>
-        <w:rPr>
-          <w:b/>
-          <w:bCs/>
-        </w:rPr>
-        <w:t xml:space="preserve">“fine, just stuck”</w:t>
-      </w:r>
-      <w:r>
-        <w:rPr>
-          <w:b/>
-          <w:bCs/>
-        </w:rPr>
-        <w:t xml:space="preserve"> </w:t>
-      </w:r>
-      <w:r>
-        <w:rPr>
-          <w:b/>
-          <w:bCs/>
-        </w:rPr>
-        <w:t xml:space="preserve">but is clinically Depleted</w:t>
-      </w:r>
-      <w:r>
-        <w:t xml:space="preserve"> </w:t>
-      </w:r>
-      <w:r>
-        <w:t xml:space="preserve">(the scorecard underestimates depletion - do not soft-pedal); make the Scorecard the destination; use proof (real trajectories, with consent); keep the read ahead of the prescription; prove you can read people rather than teach them.</w:t>
-      </w:r>
-    </w:p>
-    <w:p>
-      <w:pPr>
-        <w:pStyle w:val="BodyText"/>
-      </w:pPr>
-      <w:r>
-        <w:rPr>
-          <w:b/>
-          <w:bCs/>
-        </w:rPr>
-        <w:t xml:space="preserve">Don’t:</w:t>
-      </w:r>
-      <w:r>
-        <w:t xml:space="preserve"> </w:t>
-      </w:r>
-      <w:r>
-        <w:t xml:space="preserve">open cold with doctrine vocabulary; sell the Blueprint/coaching before the Scorecard; run reels/video in cold-paid ad sets; use colour photos of Kade in BR graphics; ask one post to both earn engagement and drive a click; blur into the coach-licensing (Collective) audience.</w:t>
-      </w:r>
-    </w:p>
-    <w:p>
-      <w:pPr>
-        <w:pStyle w:val="BodyText"/>
-      </w:pPr>
-      <w:r>
-        <w:rPr>
-          <w:b/>
-          <w:bCs/>
-        </w:rPr>
-        <w:t xml:space="preserve">Never say or do:</w:t>
-      </w:r>
-      <w:r>
-        <w:t xml:space="preserve"> </w:t>
-      </w:r>
-      <w:r>
-        <w:t xml:space="preserve">fitness clichés (</w:t>
-      </w:r>
-      <w:r>
-        <w:t xml:space="preserve">“crush it”</w:t>
-      </w:r>
-      <w:r>
-        <w:t xml:space="preserve">,</w:t>
-      </w:r>
-      <w:r>
-        <w:t xml:space="preserve"> </w:t>
-      </w:r>
-      <w:r>
-        <w:t xml:space="preserve">“no excuses”</w:t>
-      </w:r>
-      <w:r>
-        <w:t xml:space="preserve">,</w:t>
-      </w:r>
-      <w:r>
-        <w:t xml:space="preserve"> </w:t>
-      </w:r>
-      <w:r>
-        <w:t xml:space="preserve">“grind”</w:t>
-      </w:r>
-      <w:r>
-        <w:t xml:space="preserve">,</w:t>
-      </w:r>
-      <w:r>
-        <w:t xml:space="preserve"> </w:t>
-      </w:r>
-      <w:r>
-        <w:t xml:space="preserve">“hustle”</w:t>
-      </w:r>
-      <w:r>
-        <w:t xml:space="preserve">); blame the client for biological symptoms; shame or guilt messaging; hype or exaggerated promises; long-winded clinical explanations; direct selling (always guide, never push).</w:t>
-      </w:r>
-    </w:p>
-    <w:p>
-      <w:pPr>
-        <w:pStyle w:val="BodyText"/>
-      </w:pPr>
-      <w:r>
-        <w:rPr>
-          <w:b/>
-          <w:bCs/>
-        </w:rPr>
-        <w:t xml:space="preserve">CTA rules:</w:t>
-      </w:r>
-      <w:r>
-        <w:t xml:space="preserve"> </w:t>
-      </w:r>
-      <w:r>
-        <w:t xml:space="preserve">Instagram =</w:t>
-      </w:r>
-      <w:r>
-        <w:t xml:space="preserve"> </w:t>
-      </w:r>
-      <w:r>
-        <w:rPr>
-          <w:b/>
-          <w:bCs/>
-        </w:rPr>
-        <w:t xml:space="preserve">one CTA per post</w:t>
-      </w:r>
-      <w:r>
-        <w:t xml:space="preserve">, and it’s</w:t>
-      </w:r>
-      <w:r>
-        <w:t xml:space="preserve"> </w:t>
-      </w:r>
-      <w:r>
-        <w:t xml:space="preserve">“take the Scorecard”</w:t>
-      </w:r>
-      <w:r>
-        <w:t xml:space="preserve"> </w:t>
-      </w:r>
-      <w:r>
-        <w:t xml:space="preserve">(one job per post). LinkedIn = CTA every</w:t>
-      </w:r>
-      <w:r>
-        <w:t xml:space="preserve"> </w:t>
-      </w:r>
-      <w:r>
-        <w:rPr>
-          <w:b/>
-          <w:bCs/>
-        </w:rPr>
-        <w:t xml:space="preserve">4-5 posts only</w:t>
-      </w:r>
-      <w:r>
-        <w:t xml:space="preserve">; most posts build credibility without selling.</w:t>
-      </w:r>
-    </w:p>
-    <w:p>
-      <w:pPr>
-        <w:pStyle w:val="BodyText"/>
-      </w:pPr>
-      <w:r>
-        <w:rPr>
-          <w:b/>
-          <w:bCs/>
-        </w:rPr>
-        <w:t xml:space="preserve">Every post follows the 5-step frame:</w:t>
-      </w:r>
-      <w:r>
-        <w:t xml:space="preserve"> </w:t>
-      </w:r>
-      <w:r>
-        <w:t xml:space="preserve">(1)</w:t>
-      </w:r>
-      <w:r>
-        <w:t xml:space="preserve"> </w:t>
-      </w:r>
-      <w:r>
-        <w:rPr>
-          <w:b/>
-          <w:bCs/>
-        </w:rPr>
-        <w:t xml:space="preserve">Insight</w:t>
-      </w:r>
-      <w:r>
-        <w:t xml:space="preserve"> </w:t>
-      </w:r>
-      <w:r>
-        <w:t xml:space="preserve">- the physiological truth; (2)</w:t>
-      </w:r>
-      <w:r>
-        <w:t xml:space="preserve"> </w:t>
-      </w:r>
-      <w:r>
-        <w:rPr>
-          <w:b/>
-          <w:bCs/>
-        </w:rPr>
-        <w:t xml:space="preserve">Signal</w:t>
-      </w:r>
-      <w:r>
-        <w:t xml:space="preserve"> </w:t>
-      </w:r>
-      <w:r>
-        <w:t xml:space="preserve">- what it means for them; (3)</w:t>
-      </w:r>
-      <w:r>
-        <w:t xml:space="preserve"> </w:t>
-      </w:r>
-      <w:r>
-        <w:rPr>
-          <w:b/>
-          <w:bCs/>
-        </w:rPr>
-        <w:t xml:space="preserve">Shift</w:t>
-      </w:r>
-      <w:r>
-        <w:t xml:space="preserve"> </w:t>
-      </w:r>
-      <w:r>
-        <w:t xml:space="preserve">- reframe their understanding; (4)</w:t>
-      </w:r>
-      <w:r>
-        <w:t xml:space="preserve"> </w:t>
-      </w:r>
-      <w:r>
-        <w:rPr>
-          <w:b/>
-          <w:bCs/>
-        </w:rPr>
-        <w:t xml:space="preserve">Solution</w:t>
-      </w:r>
-      <w:r>
-        <w:t xml:space="preserve"> </w:t>
-      </w:r>
-      <w:r>
-        <w:t xml:space="preserve">- the Body Recode system or action; (5)</w:t>
-      </w:r>
-      <w:r>
-        <w:t xml:space="preserve"> </w:t>
-      </w:r>
-      <w:r>
-        <w:rPr>
-          <w:b/>
-          <w:bCs/>
-        </w:rPr>
-        <w:t xml:space="preserve">Momentum</w:t>
-      </w:r>
-      <w:r>
-        <w:t xml:space="preserve"> </w:t>
-      </w:r>
-      <w:r>
-        <w:t xml:space="preserve">- end with clarity or direction. It must make them</w:t>
-      </w:r>
-      <w:r>
-        <w:t xml:space="preserve"> </w:t>
-      </w:r>
-      <w:r>
-        <w:rPr>
-          <w:b/>
-          <w:bCs/>
-        </w:rPr>
-        <w:t xml:space="preserve">feel</w:t>
-      </w:r>
-      <w:r>
-        <w:t xml:space="preserve"> </w:t>
-      </w:r>
-      <w:r>
-        <w:rPr>
-          <w:i/>
-          <w:iCs/>
-        </w:rPr>
-        <w:t xml:space="preserve">“finally, someone gets it,”</w:t>
-      </w:r>
-      <w:r>
-        <w:t xml:space="preserve"> </w:t>
-      </w:r>
-      <w:r>
-        <w:t xml:space="preserve">then</w:t>
-      </w:r>
-      <w:r>
-        <w:t xml:space="preserve"> </w:t>
-      </w:r>
-      <w:r>
-        <w:rPr>
-          <w:b/>
-          <w:bCs/>
-        </w:rPr>
-        <w:t xml:space="preserve">think</w:t>
-      </w:r>
-      <w:r>
-        <w:t xml:space="preserve"> </w:t>
-      </w:r>
-      <w:r>
-        <w:rPr>
-          <w:i/>
-          <w:iCs/>
-        </w:rPr>
-        <w:t xml:space="preserve">“I need to take that scorecard.”</w:t>
-      </w:r>
-    </w:p>
-    <w:p>
-      <w:pPr>
-        <w:pStyle w:val="BodyText"/>
-      </w:pPr>
-      <w:r>
-        <w:rPr>
-          <w:b/>
-          <w:bCs/>
-        </w:rPr>
-        <w:t xml:space="preserve">Tone (6 principles):</w:t>
-      </w:r>
-      <w:r>
-        <w:t xml:space="preserve"> </w:t>
-      </w:r>
-      <w:r>
-        <w:t xml:space="preserve">intelligent not complicated · confident not arrogant · direct not blunt · warm not soft · scientific not clinical · forward-thinking not abstract.</w:t>
-      </w:r>
-    </w:p>
-    <w:bookmarkEnd w:id="28"/>
-    <w:bookmarkStart w:id="29" w:name="what-we-measure"/>
-    <w:p>
-      <w:pPr>
-        <w:pStyle w:val="Heading2"/>
-      </w:pPr>
-      <w:r>
-        <w:t xml:space="preserve">18. What we measure</w:t>
-      </w:r>
-    </w:p>
-    <w:p>
-      <w:pPr>
-        <w:pStyle w:val="FirstParagraph"/>
-      </w:pPr>
-      <w:r>
-        <w:t xml:space="preserve">Comments + saves + shares (real engagement), DM keyword captures, scorecard starts, and the earliest broken gate in the reach -&gt; save -&gt; profile -&gt; scorecard path. Not likes. We buy self-recognition and captured leads, not applause.</w:t>
-      </w:r>
-    </w:p>
-    <w:bookmarkEnd w:id="29"/>
-    <w:bookmarkStart w:id="30" w:name="build-dependencies"/>
-    <w:p>
-      <w:pPr>
-        <w:pStyle w:val="Heading2"/>
-      </w:pPr>
-      <w:r>
-        <w:t xml:space="preserve">19. Build dependencies</w:t>
+        <w:t xml:space="preserve">16. Voice &amp; design rules</w:t>
       </w:r>
     </w:p>
     <w:p>
@@ -3540,13 +3080,25 @@
           <w:b/>
           <w:bCs/>
         </w:rPr>
-        <w:t xml:space="preserve">Voice-of-customer swipe file</w:t>
-      </w:r>
-      <w:r>
-        <w:t xml:space="preserve"> </w:t>
-      </w:r>
-      <w:r>
-        <w:t xml:space="preserve">- mine real phrases from scorecard answers + DMs. (Buildable on our side.)</w:t>
+        <w:t xml:space="preserve">Voice:</w:t>
+      </w:r>
+      <w:r>
+        <w:t xml:space="preserve"> </w:t>
+      </w:r>
+      <w:r>
+        <w:t xml:space="preserve">interpretation-led, calm authority, no hype. Contractions, varied rhythm, read-aloud test. Fat-loss-explicit framing. No</w:t>
+      </w:r>
+      <w:r>
+        <w:t xml:space="preserve"> </w:t>
+      </w:r>
+      <w:r>
+        <w:t xml:space="preserve">“tips”</w:t>
+      </w:r>
+      <w:r>
+        <w:t xml:space="preserve"> </w:t>
+      </w:r>
+      <w:r>
+        <w:t xml:space="preserve">content - always the read underneath.</w:t>
       </w:r>
     </w:p>
     <w:p>
@@ -3562,13 +3114,13 @@
           <w:b/>
           <w:bCs/>
         </w:rPr>
-        <w:t xml:space="preserve">Personalised-read DM flows</w:t>
-      </w:r>
-      <w:r>
-        <w:t xml:space="preserve"> </w:t>
-      </w:r>
-      <w:r>
-        <w:t xml:space="preserve">in ManyChat - Kade builds, spec provided.</w:t>
+        <w:t xml:space="preserve">No em dashes</w:t>
+      </w:r>
+      <w:r>
+        <w:t xml:space="preserve"> </w:t>
+      </w:r>
+      <w:r>
+        <w:t xml:space="preserve">(house style) - hyphens or rewrites.</w:t>
       </w:r>
     </w:p>
     <w:p>
@@ -3584,13 +3136,26 @@
           <w:b/>
           <w:bCs/>
         </w:rPr>
-        <w:t xml:space="preserve">Leads webhook</w:t>
-      </w:r>
-      <w:r>
-        <w:t xml:space="preserve"> </w:t>
-      </w:r>
-      <w:r>
-        <w:t xml:space="preserve">- ManyChat -&gt; dashboard, leads tagged by keyword. (Buildable on our side.)</w:t>
+        <w:t xml:space="preserve">Design:</w:t>
+      </w:r>
+      <w:r>
+        <w:t xml:space="preserve"> </w:t>
+      </w:r>
+      <w:r>
+        <w:t xml:space="preserve">Pure White / Graphite / Signal Blue (#1B6DFC). Social assets 1080x1350 (4:5); reels 9:16; 96px safe margins. All photos of Kade in BR graphics render</w:t>
+      </w:r>
+      <w:r>
+        <w:t xml:space="preserve"> </w:t>
+      </w:r>
+      <w:r>
+        <w:rPr>
+          <w:b/>
+          <w:bCs/>
+        </w:rPr>
+        <w:t xml:space="preserve">greyscale</w:t>
+      </w:r>
+      <w:r>
+        <w:t xml:space="preserve">, never colour.</w:t>
       </w:r>
     </w:p>
     <w:p>
@@ -3602,17 +3167,419 @@
         </w:numPr>
       </w:pPr>
       <w:r>
-        <w:rPr>
-          <w:b/>
-          <w:bCs/>
-        </w:rPr>
-        <w:t xml:space="preserve">Reels / face</w:t>
-      </w:r>
-      <w:r>
-        <w:t xml:space="preserve"> </w:t>
-      </w:r>
-      <w:r>
-        <w:t xml:space="preserve">- Kade films, or HeyGen scales it.</w:t>
+        <w:t xml:space="preserve">Kade’s public byline title:</w:t>
+      </w:r>
+      <w:r>
+        <w:t xml:space="preserve"> </w:t>
+      </w:r>
+      <w:r>
+        <w:rPr>
+          <w:b/>
+          <w:bCs/>
+        </w:rPr>
+        <w:t xml:space="preserve">“Sports Scientist”</w:t>
+      </w:r>
+      <w:r>
+        <w:t xml:space="preserve"> </w:t>
+      </w:r>
+      <w:r>
+        <w:t xml:space="preserve">(not</w:t>
+      </w:r>
+      <w:r>
+        <w:t xml:space="preserve"> </w:t>
+      </w:r>
+      <w:r>
+        <w:t xml:space="preserve">“Exercise Scientist”</w:t>
+      </w:r>
+      <w:r>
+        <w:t xml:space="preserve">).</w:t>
+      </w:r>
+    </w:p>
+    <w:bookmarkEnd w:id="27"/>
+    <w:bookmarkStart w:id="28" w:name="messaging-rules-do-dont"/>
+    <w:p>
+      <w:pPr>
+        <w:pStyle w:val="Heading2"/>
+      </w:pPr>
+      <w:r>
+        <w:t xml:space="preserve">17. Messaging rules (do / don’t)</w:t>
+      </w:r>
+    </w:p>
+    <w:p>
+      <w:pPr>
+        <w:pStyle w:val="FirstParagraph"/>
+      </w:pPr>
+      <w:r>
+        <w:rPr>
+          <w:b/>
+          <w:bCs/>
+        </w:rPr>
+        <w:t xml:space="preserve">Do:</w:t>
+      </w:r>
+      <w:r>
+        <w:t xml:space="preserve"> </w:t>
+      </w:r>
+      <w:r>
+        <w:t xml:space="preserve">lead with the stuck feeling; name the state;</w:t>
+      </w:r>
+      <w:r>
+        <w:t xml:space="preserve"> </w:t>
+      </w:r>
+      <w:r>
+        <w:rPr>
+          <w:b/>
+          <w:bCs/>
+        </w:rPr>
+        <w:t xml:space="preserve">write sharp enough to catch the high performer who self-scores</w:t>
+      </w:r>
+      <w:r>
+        <w:rPr>
+          <w:b/>
+          <w:bCs/>
+        </w:rPr>
+        <w:t xml:space="preserve"> </w:t>
+      </w:r>
+      <w:r>
+        <w:rPr>
+          <w:b/>
+          <w:bCs/>
+        </w:rPr>
+        <w:t xml:space="preserve">“fine, just stuck”</w:t>
+      </w:r>
+      <w:r>
+        <w:rPr>
+          <w:b/>
+          <w:bCs/>
+        </w:rPr>
+        <w:t xml:space="preserve"> </w:t>
+      </w:r>
+      <w:r>
+        <w:rPr>
+          <w:b/>
+          <w:bCs/>
+        </w:rPr>
+        <w:t xml:space="preserve">but is clinically Depleted</w:t>
+      </w:r>
+      <w:r>
+        <w:t xml:space="preserve"> </w:t>
+      </w:r>
+      <w:r>
+        <w:t xml:space="preserve">(the scorecard underestimates depletion - do not soft-pedal); make the Scorecard the destination; use proof (real trajectories, with consent); keep the read ahead of the prescription; prove you can read people rather than teach them.</w:t>
+      </w:r>
+    </w:p>
+    <w:p>
+      <w:pPr>
+        <w:pStyle w:val="BodyText"/>
+      </w:pPr>
+      <w:r>
+        <w:rPr>
+          <w:b/>
+          <w:bCs/>
+        </w:rPr>
+        <w:t xml:space="preserve">Don’t:</w:t>
+      </w:r>
+      <w:r>
+        <w:t xml:space="preserve"> </w:t>
+      </w:r>
+      <w:r>
+        <w:t xml:space="preserve">open cold with doctrine vocabulary; sell the Blueprint/coaching before the Scorecard; run reels/video in cold-paid ad sets; use colour photos of Kade in BR graphics; ask one post to both earn engagement and drive a click; blur into the coach-licensing (Collective) audience.</w:t>
+      </w:r>
+    </w:p>
+    <w:p>
+      <w:pPr>
+        <w:pStyle w:val="BodyText"/>
+      </w:pPr>
+      <w:r>
+        <w:rPr>
+          <w:b/>
+          <w:bCs/>
+        </w:rPr>
+        <w:t xml:space="preserve">Never say or do:</w:t>
+      </w:r>
+      <w:r>
+        <w:t xml:space="preserve"> </w:t>
+      </w:r>
+      <w:r>
+        <w:t xml:space="preserve">fitness clichés (</w:t>
+      </w:r>
+      <w:r>
+        <w:t xml:space="preserve">“crush it”</w:t>
+      </w:r>
+      <w:r>
+        <w:t xml:space="preserve">,</w:t>
+      </w:r>
+      <w:r>
+        <w:t xml:space="preserve"> </w:t>
+      </w:r>
+      <w:r>
+        <w:t xml:space="preserve">“no excuses”</w:t>
+      </w:r>
+      <w:r>
+        <w:t xml:space="preserve">,</w:t>
+      </w:r>
+      <w:r>
+        <w:t xml:space="preserve"> </w:t>
+      </w:r>
+      <w:r>
+        <w:t xml:space="preserve">“grind”</w:t>
+      </w:r>
+      <w:r>
+        <w:t xml:space="preserve">,</w:t>
+      </w:r>
+      <w:r>
+        <w:t xml:space="preserve"> </w:t>
+      </w:r>
+      <w:r>
+        <w:t xml:space="preserve">“hustle”</w:t>
+      </w:r>
+      <w:r>
+        <w:t xml:space="preserve">); blame the client for biological symptoms; shame or guilt messaging; hype or exaggerated promises; long-winded clinical explanations; direct selling (always guide, never push).</w:t>
+      </w:r>
+    </w:p>
+    <w:p>
+      <w:pPr>
+        <w:pStyle w:val="BodyText"/>
+      </w:pPr>
+      <w:r>
+        <w:rPr>
+          <w:b/>
+          <w:bCs/>
+        </w:rPr>
+        <w:t xml:space="preserve">CTA rules:</w:t>
+      </w:r>
+      <w:r>
+        <w:t xml:space="preserve"> </w:t>
+      </w:r>
+      <w:r>
+        <w:t xml:space="preserve">Instagram =</w:t>
+      </w:r>
+      <w:r>
+        <w:t xml:space="preserve"> </w:t>
+      </w:r>
+      <w:r>
+        <w:rPr>
+          <w:b/>
+          <w:bCs/>
+        </w:rPr>
+        <w:t xml:space="preserve">one CTA per post</w:t>
+      </w:r>
+      <w:r>
+        <w:t xml:space="preserve">, and it’s</w:t>
+      </w:r>
+      <w:r>
+        <w:t xml:space="preserve"> </w:t>
+      </w:r>
+      <w:r>
+        <w:t xml:space="preserve">“take the Scorecard”</w:t>
+      </w:r>
+      <w:r>
+        <w:t xml:space="preserve"> </w:t>
+      </w:r>
+      <w:r>
+        <w:t xml:space="preserve">(one job per post). LinkedIn = CTA every</w:t>
+      </w:r>
+      <w:r>
+        <w:t xml:space="preserve"> </w:t>
+      </w:r>
+      <w:r>
+        <w:rPr>
+          <w:b/>
+          <w:bCs/>
+        </w:rPr>
+        <w:t xml:space="preserve">4-5 posts only</w:t>
+      </w:r>
+      <w:r>
+        <w:t xml:space="preserve">; most posts build credibility without selling.</w:t>
+      </w:r>
+    </w:p>
+    <w:p>
+      <w:pPr>
+        <w:pStyle w:val="BodyText"/>
+      </w:pPr>
+      <w:r>
+        <w:rPr>
+          <w:b/>
+          <w:bCs/>
+        </w:rPr>
+        <w:t xml:space="preserve">Every post follows the 5-step frame:</w:t>
+      </w:r>
+      <w:r>
+        <w:t xml:space="preserve"> </w:t>
+      </w:r>
+      <w:r>
+        <w:t xml:space="preserve">(1)</w:t>
+      </w:r>
+      <w:r>
+        <w:t xml:space="preserve"> </w:t>
+      </w:r>
+      <w:r>
+        <w:rPr>
+          <w:b/>
+          <w:bCs/>
+        </w:rPr>
+        <w:t xml:space="preserve">Insight</w:t>
+      </w:r>
+      <w:r>
+        <w:t xml:space="preserve"> </w:t>
+      </w:r>
+      <w:r>
+        <w:t xml:space="preserve">- the physiological truth; (2)</w:t>
+      </w:r>
+      <w:r>
+        <w:t xml:space="preserve"> </w:t>
+      </w:r>
+      <w:r>
+        <w:rPr>
+          <w:b/>
+          <w:bCs/>
+        </w:rPr>
+        <w:t xml:space="preserve">Signal</w:t>
+      </w:r>
+      <w:r>
+        <w:t xml:space="preserve"> </w:t>
+      </w:r>
+      <w:r>
+        <w:t xml:space="preserve">- what it means for them; (3)</w:t>
+      </w:r>
+      <w:r>
+        <w:t xml:space="preserve"> </w:t>
+      </w:r>
+      <w:r>
+        <w:rPr>
+          <w:b/>
+          <w:bCs/>
+        </w:rPr>
+        <w:t xml:space="preserve">Shift</w:t>
+      </w:r>
+      <w:r>
+        <w:t xml:space="preserve"> </w:t>
+      </w:r>
+      <w:r>
+        <w:t xml:space="preserve">- reframe their understanding; (4)</w:t>
+      </w:r>
+      <w:r>
+        <w:t xml:space="preserve"> </w:t>
+      </w:r>
+      <w:r>
+        <w:rPr>
+          <w:b/>
+          <w:bCs/>
+        </w:rPr>
+        <w:t xml:space="preserve">Solution</w:t>
+      </w:r>
+      <w:r>
+        <w:t xml:space="preserve"> </w:t>
+      </w:r>
+      <w:r>
+        <w:t xml:space="preserve">- the Body Recode system or action; (5)</w:t>
+      </w:r>
+      <w:r>
+        <w:t xml:space="preserve"> </w:t>
+      </w:r>
+      <w:r>
+        <w:rPr>
+          <w:b/>
+          <w:bCs/>
+        </w:rPr>
+        <w:t xml:space="preserve">Momentum</w:t>
+      </w:r>
+      <w:r>
+        <w:t xml:space="preserve"> </w:t>
+      </w:r>
+      <w:r>
+        <w:t xml:space="preserve">- end with clarity or direction. It must make them</w:t>
+      </w:r>
+      <w:r>
+        <w:t xml:space="preserve"> </w:t>
+      </w:r>
+      <w:r>
+        <w:rPr>
+          <w:b/>
+          <w:bCs/>
+        </w:rPr>
+        <w:t xml:space="preserve">feel</w:t>
+      </w:r>
+      <w:r>
+        <w:t xml:space="preserve"> </w:t>
+      </w:r>
+      <w:r>
+        <w:rPr>
+          <w:i/>
+          <w:iCs/>
+        </w:rPr>
+        <w:t xml:space="preserve">“finally, someone gets it,”</w:t>
+      </w:r>
+      <w:r>
+        <w:t xml:space="preserve"> </w:t>
+      </w:r>
+      <w:r>
+        <w:t xml:space="preserve">then</w:t>
+      </w:r>
+      <w:r>
+        <w:t xml:space="preserve"> </w:t>
+      </w:r>
+      <w:r>
+        <w:rPr>
+          <w:b/>
+          <w:bCs/>
+        </w:rPr>
+        <w:t xml:space="preserve">think</w:t>
+      </w:r>
+      <w:r>
+        <w:t xml:space="preserve"> </w:t>
+      </w:r>
+      <w:r>
+        <w:rPr>
+          <w:i/>
+          <w:iCs/>
+        </w:rPr>
+        <w:t xml:space="preserve">“I need to take that scorecard.”</w:t>
+      </w:r>
+    </w:p>
+    <w:p>
+      <w:pPr>
+        <w:pStyle w:val="BodyText"/>
+      </w:pPr>
+      <w:r>
+        <w:rPr>
+          <w:b/>
+          <w:bCs/>
+        </w:rPr>
+        <w:t xml:space="preserve">Tone (6 principles):</w:t>
+      </w:r>
+      <w:r>
+        <w:t xml:space="preserve"> </w:t>
+      </w:r>
+      <w:r>
+        <w:t xml:space="preserve">intelligent not complicated · confident not arrogant · direct not blunt · warm not soft · scientific not clinical · forward-thinking not abstract.</w:t>
+      </w:r>
+    </w:p>
+    <w:bookmarkEnd w:id="28"/>
+    <w:bookmarkStart w:id="29" w:name="what-we-measure"/>
+    <w:p>
+      <w:pPr>
+        <w:pStyle w:val="Heading2"/>
+      </w:pPr>
+      <w:r>
+        <w:t xml:space="preserve">18. What we measure</w:t>
+      </w:r>
+    </w:p>
+    <w:p>
+      <w:pPr>
+        <w:pStyle w:val="FirstParagraph"/>
+      </w:pPr>
+      <w:r>
+        <w:t xml:space="preserve">Comments + saves + shares (real engagement), DM keyword captures, scorecard starts, and the earliest broken gate in the reach -&gt; save -&gt; profile -&gt; scorecard path. Not likes. We buy self-recognition and captured leads, not applause.</w:t>
+      </w:r>
+    </w:p>
+    <w:bookmarkEnd w:id="29"/>
+    <w:bookmarkStart w:id="30" w:name="build-dependencies"/>
+    <w:p>
+      <w:pPr>
+        <w:pStyle w:val="Heading2"/>
+      </w:pPr>
+      <w:r>
+        <w:t xml:space="preserve">19. Build dependencies</w:t>
       </w:r>
     </w:p>
     <w:p>
@@ -3620,7 +3587,95 @@
         <w:pStyle w:val="Compact"/>
         <w:numPr>
           <w:ilvl w:val="0"/>
-          <w:numId w:val="1008"/>
+          <w:numId w:val="1009"/>
+        </w:numPr>
+      </w:pPr>
+      <w:r>
+        <w:rPr>
+          <w:b/>
+          <w:bCs/>
+        </w:rPr>
+        <w:t xml:space="preserve">Voice-of-customer swipe file</w:t>
+      </w:r>
+      <w:r>
+        <w:t xml:space="preserve"> </w:t>
+      </w:r>
+      <w:r>
+        <w:t xml:space="preserve">- mine real phrases from scorecard answers + DMs. (Buildable on our side.)</w:t>
+      </w:r>
+    </w:p>
+    <w:p>
+      <w:pPr>
+        <w:pStyle w:val="Compact"/>
+        <w:numPr>
+          <w:ilvl w:val="0"/>
+          <w:numId w:val="1009"/>
+        </w:numPr>
+      </w:pPr>
+      <w:r>
+        <w:rPr>
+          <w:b/>
+          <w:bCs/>
+        </w:rPr>
+        <w:t xml:space="preserve">Personalised-read DM flows</w:t>
+      </w:r>
+      <w:r>
+        <w:t xml:space="preserve"> </w:t>
+      </w:r>
+      <w:r>
+        <w:t xml:space="preserve">in ManyChat - Kade builds, spec provided.</w:t>
+      </w:r>
+    </w:p>
+    <w:p>
+      <w:pPr>
+        <w:pStyle w:val="Compact"/>
+        <w:numPr>
+          <w:ilvl w:val="0"/>
+          <w:numId w:val="1009"/>
+        </w:numPr>
+      </w:pPr>
+      <w:r>
+        <w:rPr>
+          <w:b/>
+          <w:bCs/>
+        </w:rPr>
+        <w:t xml:space="preserve">Leads webhook</w:t>
+      </w:r>
+      <w:r>
+        <w:t xml:space="preserve"> </w:t>
+      </w:r>
+      <w:r>
+        <w:t xml:space="preserve">- ManyChat -&gt; dashboard, leads tagged by keyword. (Buildable on our side.)</w:t>
+      </w:r>
+    </w:p>
+    <w:p>
+      <w:pPr>
+        <w:pStyle w:val="Compact"/>
+        <w:numPr>
+          <w:ilvl w:val="0"/>
+          <w:numId w:val="1009"/>
+        </w:numPr>
+      </w:pPr>
+      <w:r>
+        <w:rPr>
+          <w:b/>
+          <w:bCs/>
+        </w:rPr>
+        <w:t xml:space="preserve">Reels / face</w:t>
+      </w:r>
+      <w:r>
+        <w:t xml:space="preserve"> </w:t>
+      </w:r>
+      <w:r>
+        <w:t xml:space="preserve">- Kade films, or HeyGen scales it.</w:t>
+      </w:r>
+    </w:p>
+    <w:p>
+      <w:pPr>
+        <w:pStyle w:val="Compact"/>
+        <w:numPr>
+          <w:ilvl w:val="0"/>
+          <w:numId w:val="1009"/>
         </w:numPr>
       </w:pPr>
       <w:r>
@@ -4038,6 +4093,9 @@
     <w:abstractNumId w:val="991"/>
   </w:num>
   <w:num w:numId="1006">
+    <w:abstractNumId w:val="991"/>
+  </w:num>
+  <w:num w:numId="1007">
     <w:abstractNumId w:val="99411"/>
     <w:lvlOverride w:ilvl="0">
       <w:startOverride w:val="1"/>
@@ -4067,10 +4125,10 @@
       <w:startOverride w:val="1"/>
     </w:lvlOverride>
   </w:num>
-  <w:num w:numId="1007">
+  <w:num w:numId="1008">
     <w:abstractNumId w:val="991"/>
   </w:num>
-  <w:num w:numId="1008">
+  <w:num w:numId="1009">
     <w:abstractNumId w:val="991"/>
   </w:num>
 </w:numbering>

</xml_diff>

<commit_message>
Correct funnel flow: Challenge landing page is the front door, scorecard is the Day-0 routing gate
All marketing drives to the Challenge landing page (not the scorecard).
Flow: Content/Ad -> Challenge LP -> signup -> in-portal Scorecard gate
(reads state, routes, flags coaching-ready) -> Blueprint -> Membership.
Standalone /scorecard kept for direct/legacy links. Overview funnel +
mission + doc funnel section + doc CTA references updated to 'join the
Challenge'. Doc v2.4.

Co-Authored-By: Claude Opus 4.8 (1M context) <noreply@anthropic.com>
</commit_message>
<xml_diff>
--- a/public/docs/strategy/body-recode/body-recode-consumer-marketing-strategy-v1.docx
+++ b/public/docs/strategy/body-recode/body-recode-consumer-marketing-strategy-v1.docx
@@ -70,7 +70,7 @@
         <w:t xml:space="preserve">@body_recode_</w:t>
       </w:r>
       <w:r>
-        <w:t xml:space="preserve">, bodyrecode.au marketing, and the scorecard -&gt; Challenge -&gt; Blueprint -&gt; coaching/membership funnel. Not the licensing engine (see the Collective strategy) or the internal coaching delivery (Performance Coaching).</w:t>
+        <w:t xml:space="preserve">, bodyrecode.au marketing, and the Challenge -&gt; Blueprint -&gt; membership funnel (with the scorecard as the Day-0 in-portal routing gate). Not the licensing engine (see the Collective strategy) or the internal coaching delivery (Performance Coaching).</w:t>
       </w:r>
     </w:p>
     <w:p>
@@ -660,13 +660,13 @@
       </w:r>
     </w:p>
     <w:bookmarkEnd w:id="12"/>
-    <w:bookmarkStart w:id="13" w:name="the-funnel-scorecard-first-two-paths"/>
+    <w:bookmarkStart w:id="13" w:name="X2ca4407ef6d4eb902fbebca1d7634a8107d42b3"/>
     <w:p>
       <w:pPr>
         <w:pStyle w:val="Heading2"/>
       </w:pPr>
       <w:r>
-        <w:t xml:space="preserve">4. The funnel (scorecard-first, two paths)</w:t>
+        <w:t xml:space="preserve">4. The funnel (Challenge-led; the scorecard is the routing gate, not the front door)</w:t>
       </w:r>
     </w:p>
     <w:p>
@@ -674,23 +674,69 @@
         <w:pStyle w:val="FirstParagraph"/>
       </w:pPr>
       <w:r>
-        <w:t xml:space="preserve">Everything routes to the</w:t>
-      </w:r>
-      <w:r>
-        <w:t xml:space="preserve"> </w:t>
-      </w:r>
-      <w:r>
-        <w:rPr>
-          <w:b/>
-          <w:bCs/>
-        </w:rPr>
-        <w:t xml:space="preserve">Body State Scorecard</w:t>
-      </w:r>
-      <w:r>
-        <w:t xml:space="preserve"> </w:t>
-      </w:r>
-      <w:r>
-        <w:t xml:space="preserve">first - the free, no-email-until-result diagnostic that turns a stranger into a named, segmented lead. From the one front door, two paths run:</w:t>
+        <w:rPr>
+          <w:b/>
+          <w:bCs/>
+        </w:rPr>
+        <w:t xml:space="preserve">All marketing now drives to the Challenge landing page - NOT the scorecard.</w:t>
+      </w:r>
+      <w:r>
+        <w:t xml:space="preserve"> </w:t>
+      </w:r>
+      <w:r>
+        <w:t xml:space="preserve">The scorecard sits</w:t>
+      </w:r>
+      <w:r>
+        <w:t xml:space="preserve"> </w:t>
+      </w:r>
+      <w:r>
+        <w:rPr>
+          <w:i/>
+          <w:iCs/>
+        </w:rPr>
+        <w:t xml:space="preserve">inside</w:t>
+      </w:r>
+      <w:r>
+        <w:t xml:space="preserve"> </w:t>
+      </w:r>
+      <w:r>
+        <w:t xml:space="preserve">the Challenge as the Day-0 gate. The flow:</w:t>
+      </w:r>
+    </w:p>
+    <w:p>
+      <w:pPr>
+        <w:pStyle w:val="BodyText"/>
+      </w:pPr>
+      <w:r>
+        <w:rPr>
+          <w:b/>
+          <w:bCs/>
+        </w:rPr>
+        <w:t xml:space="preserve">Content / Ad -&gt; Challenge landing page -&gt; sign up (free 14-Day Body Decode Challenge) -&gt; first portal gate: complete the Body State Scorecard -&gt; the scorecard reads their state and routes them</w:t>
+      </w:r>
+      <w:r>
+        <w:t xml:space="preserve"> </w:t>
+      </w:r>
+      <w:r>
+        <w:t xml:space="preserve">(which Challenge experience they get, and whether they’re flagged coaching-ready).</w:t>
+      </w:r>
+    </w:p>
+    <w:p>
+      <w:pPr>
+        <w:pStyle w:val="BodyText"/>
+      </w:pPr>
+      <w:r>
+        <w:t xml:space="preserve">So the scorecard is no longer the front door - it’s the first in-portal gate after signup, and the router.</w:t>
+      </w:r>
+      <w:r>
+        <w:t xml:space="preserve"> </w:t>
+      </w:r>
+      <w:r>
+        <w:rPr>
+          <w:b/>
+          <w:bCs/>
+        </w:rPr>
+        <w:t xml:space="preserve">The Challenge landing page is the front door.</w:t>
       </w:r>
     </w:p>
     <w:p>
@@ -767,29 +813,29 @@
                 <w:b/>
                 <w:bCs/>
               </w:rPr>
-              <w:t xml:space="preserve">Body State Scorecard</w:t>
-            </w:r>
-          </w:p>
-        </w:tc>
-        <w:tc>
-          <w:tcPr/>
-          <w:p>
-            <w:pPr>
-              <w:pStyle w:val="Compact"/>
-            </w:pPr>
-            <w:r>
-              <w:t xml:space="preserve">Free 2-minute diagnostic. The universal front door.</w:t>
-            </w:r>
-          </w:p>
-        </w:tc>
-        <w:tc>
-          <w:tcPr/>
-          <w:p>
-            <w:pPr>
-              <w:pStyle w:val="Compact"/>
-            </w:pPr>
-            <w:r>
-              <w:t xml:space="preserve">Free</w:t>
+              <w:t xml:space="preserve">Challenge landing page</w:t>
+            </w:r>
+          </w:p>
+        </w:tc>
+        <w:tc>
+          <w:tcPr/>
+          <w:p>
+            <w:pPr>
+              <w:pStyle w:val="Compact"/>
+            </w:pPr>
+            <w:r>
+              <w:t xml:space="preserve">Where all marketing points. The front door.</w:t>
+            </w:r>
+          </w:p>
+        </w:tc>
+        <w:tc>
+          <w:tcPr/>
+          <w:p>
+            <w:pPr>
+              <w:pStyle w:val="Compact"/>
+            </w:pPr>
+            <w:r>
+              <w:t xml:space="preserve">-</w:t>
             </w:r>
           </w:p>
         </w:tc>
@@ -817,7 +863,23 @@
               <w:pStyle w:val="Compact"/>
             </w:pPr>
             <w:r>
-              <w:t xml:space="preserve">Free 14-day challenge. Day-0 intake, in-portal experience, Day-14 reveal - proof the read works before any purchase.</w:t>
+              <w:t xml:space="preserve">Free. After signup, the</w:t>
+            </w:r>
+            <w:r>
+              <w:t xml:space="preserve"> </w:t>
+            </w:r>
+            <w:r>
+              <w:rPr>
+                <w:b/>
+                <w:bCs/>
+              </w:rPr>
+              <w:t xml:space="preserve">Scorecard is the Day-0 gate</w:t>
+            </w:r>
+            <w:r>
+              <w:t xml:space="preserve"> </w:t>
+            </w:r>
+            <w:r>
+              <w:t xml:space="preserve">that reads state + routes. Then the in-portal experience, Day-14 reveal - proof the read works before any purchase.</w:t>
             </w:r>
           </w:p>
         </w:tc>
@@ -856,7 +918,7 @@
               <w:pStyle w:val="Compact"/>
             </w:pPr>
             <w:r>
-              <w:t xml:space="preserve">The paid step after the Challenge - your personalised plan off the read.</w:t>
+              <w:t xml:space="preserve">The paid step after the Challenge - personalised plan off the read.</w:t>
             </w:r>
           </w:p>
         </w:tc>
@@ -929,7 +991,22 @@
         <w:pStyle w:val="BodyText"/>
       </w:pPr>
       <w:r>
-        <w:t xml:space="preserve">Scorecard -&gt; Performance Check-In -&gt; Zoom consultation -&gt; 1:1 Performance Coaching ($299-409/wk). For people ready to work with a coach directly instead of self-serving. The $37 report and $240 commencement fee sit on this path. (Note: a separate Zoom-decline</w:t>
+        <w:t xml:space="preserve">For people who want a coach directly (or whom the scorecard flags coaching-ready): Check-In -&gt; Zoom consultation -&gt; 1:1 Performance Coaching ($299-409/wk), with the $37 report + $240 commencement fee. The standalone scorecard at</w:t>
+      </w:r>
+      <w:r>
+        <w:t xml:space="preserve"> </w:t>
+      </w:r>
+      <w:r>
+        <w:rPr>
+          <w:rStyle w:val="VerbatimChar"/>
+        </w:rPr>
+        <w:t xml:space="preserve">/scorecard</w:t>
+      </w:r>
+      <w:r>
+        <w:t xml:space="preserve"> </w:t>
+      </w:r>
+      <w:r>
+        <w:t xml:space="preserve">still exists for direct/legacy links. (The $97 Zoom-decline self-guided</w:t>
       </w:r>
       <w:r>
         <w:t xml:space="preserve"> </w:t>
@@ -945,7 +1022,7 @@
         <w:t xml:space="preserve"> </w:t>
       </w:r>
       <w:r>
-        <w:t xml:space="preserve">offers a $97 self-guided program - distinct from the Blueprint despite the shared price.)</w:t>
+        <w:t xml:space="preserve">is distinct from the Blueprint despite the shared price.)</w:t>
       </w:r>
     </w:p>
     <w:p>
@@ -953,29 +1030,11 @@
         <w:pStyle w:val="BodyText"/>
       </w:pPr>
       <w:r>
-        <w:t xml:space="preserve">Both paths share the Scorecard as the front door. Promos always route to</w:t>
-      </w:r>
-      <w:r>
-        <w:t xml:space="preserve"> </w:t>
-      </w:r>
-      <w:r>
-        <w:rPr>
-          <w:rStyle w:val="VerbatimChar"/>
-        </w:rPr>
-        <w:t xml:space="preserve">/scorecard?intent=challenge</w:t>
-      </w:r>
-      <w:r>
-        <w:t xml:space="preserve">, never straight to a sales page.</w:t>
-      </w:r>
-      <w:r>
-        <w:t xml:space="preserve"> </w:t>
-      </w:r>
-      <w:r>
-        <w:rPr>
-          <w:b/>
-          <w:bCs/>
-        </w:rPr>
-        <w:t xml:space="preserve">Cold -&gt; Scorecard; retargeting -&gt; Challenge + Membership.</w:t>
+        <w:rPr>
+          <w:b/>
+          <w:bCs/>
+        </w:rPr>
+        <w:t xml:space="preserve">Cold -&gt; Challenge landing page; retargeting -&gt; Challenge + Membership.</w:t>
       </w:r>
       <w:r>
         <w:t xml:space="preserve"> </w:t>
@@ -1296,7 +1355,7 @@
         <w:t xml:space="preserve"> </w:t>
       </w:r>
       <w:r>
-        <w:t xml:space="preserve">Some posts earn comments and saves (pure value, end on a question, no link). Others drive the click (scorecard). Never ask one post to do both - that’s why they currently land neither.</w:t>
+        <w:t xml:space="preserve">Some posts earn comments and saves (pure value, end on a question, no link). Others drive the click (the Challenge). Never ask one post to do both - that’s why they currently land neither.</w:t>
       </w:r>
     </w:p>
     <w:bookmarkEnd w:id="17"/>
@@ -2738,7 +2797,23 @@
         <w:pStyle w:val="BodyText"/>
       </w:pPr>
       <w:r>
-        <w:t xml:space="preserve">One CTA per post = the Scorecard (engagement-first posts still earn the comment first; the Scorecard stays the single funnel CTA). Stories run alongside daily: the</w:t>
+        <w:t xml:space="preserve">One CTA per post = the</w:t>
+      </w:r>
+      <w:r>
+        <w:t xml:space="preserve"> </w:t>
+      </w:r>
+      <w:r>
+        <w:rPr>
+          <w:b/>
+          <w:bCs/>
+        </w:rPr>
+        <w:t xml:space="preserve">Challenge landing page</w:t>
+      </w:r>
+      <w:r>
+        <w:t xml:space="preserve"> </w:t>
+      </w:r>
+      <w:r>
+        <w:t xml:space="preserve">(engagement-first posts still earn the comment first; the Challenge stays the single funnel CTA). The scorecard is now the in-portal gate, not the marketing destination. Stories run alongside daily: the</w:t>
       </w:r>
       <w:r>
         <w:t xml:space="preserve"> </w:t>
@@ -3264,7 +3339,23 @@
         <w:t xml:space="preserve"> </w:t>
       </w:r>
       <w:r>
-        <w:t xml:space="preserve">(the scorecard underestimates depletion - do not soft-pedal); make the Scorecard the destination; use proof (real trajectories, with consent); keep the read ahead of the prescription; prove you can read people rather than teach them.</w:t>
+        <w:t xml:space="preserve">(the scorecard underestimates depletion - do not soft-pedal); make the</w:t>
+      </w:r>
+      <w:r>
+        <w:t xml:space="preserve"> </w:t>
+      </w:r>
+      <w:r>
+        <w:rPr>
+          <w:b/>
+          <w:bCs/>
+        </w:rPr>
+        <w:t xml:space="preserve">Challenge landing page</w:t>
+      </w:r>
+      <w:r>
+        <w:t xml:space="preserve"> </w:t>
+      </w:r>
+      <w:r>
+        <w:t xml:space="preserve">the destination; use proof (real trajectories, with consent); keep the read ahead of the prescription; prove you can read people rather than teach them.</w:t>
       </w:r>
     </w:p>
     <w:p>
@@ -3370,13 +3461,13 @@
         <w:t xml:space="preserve"> </w:t>
       </w:r>
       <w:r>
-        <w:t xml:space="preserve">“take the Scorecard”</w:t>
-      </w:r>
-      <w:r>
-        <w:t xml:space="preserve"> </w:t>
-      </w:r>
-      <w:r>
-        <w:t xml:space="preserve">(one job per post). LinkedIn = CTA every</w:t>
+        <w:t xml:space="preserve">“join the Challenge”</w:t>
+      </w:r>
+      <w:r>
+        <w:t xml:space="preserve"> </w:t>
+      </w:r>
+      <w:r>
+        <w:t xml:space="preserve">(the free 14-day Challenge landing page - one job per post). LinkedIn = CTA every</w:t>
       </w:r>
       <w:r>
         <w:t xml:space="preserve"> </w:t>
@@ -3533,7 +3624,7 @@
           <w:i/>
           <w:iCs/>
         </w:rPr>
-        <w:t xml:space="preserve">“I need to take that scorecard.”</w:t>
+        <w:t xml:space="preserve">“I need to join that challenge.”</w:t>
       </w:r>
     </w:p>
     <w:p>

</xml_diff>

<commit_message>
Two-door funnel + Challenge promo layer; CTA by post type
Resolves the CTA: doctrine/engagement content -> scorecard ('find your
state', low friction, routes into the Challenge); Challenge promo content
-> Challenge landing page ('join the free 14-day Challenge'). Both doors
converge on Funnel B. Added the Challenge-promo content layer (~1/week +
wave-open bursts, rotating angles). Doc v2.5 + Overview funnel, mission,
Positioning CTA rule, Content System engine card all updated.

Co-Authored-By: Claude Opus 4.8 (1M context) <noreply@anthropic.com>
</commit_message>
<xml_diff>
--- a/public/docs/strategy/body-recode/body-recode-consumer-marketing-strategy-v1.docx
+++ b/public/docs/strategy/body-recode/body-recode-consumer-marketing-strategy-v1.docx
@@ -660,13 +660,13 @@
       </w:r>
     </w:p>
     <w:bookmarkEnd w:id="12"/>
-    <w:bookmarkStart w:id="13" w:name="X2ca4407ef6d4eb902fbebca1d7634a8107d42b3"/>
+    <w:bookmarkStart w:id="13" w:name="Xfa281962c0f6c57fbf908b02245568810284f2f"/>
     <w:p>
       <w:pPr>
         <w:pStyle w:val="Heading2"/>
       </w:pPr>
       <w:r>
-        <w:t xml:space="preserve">4. The funnel (Challenge-led; the scorecard is the routing gate, not the front door)</w:t>
+        <w:t xml:space="preserve">4. The funnel (two doors, both routed by the scorecard)</w:t>
       </w:r>
     </w:p>
     <w:p>
@@ -674,17 +674,39 @@
         <w:pStyle w:val="FirstParagraph"/>
       </w:pPr>
       <w:r>
-        <w:rPr>
-          <w:b/>
-          <w:bCs/>
-        </w:rPr>
-        <w:t xml:space="preserve">All marketing now drives to the Challenge landing page - NOT the scorecard.</w:t>
-      </w:r>
-      <w:r>
-        <w:t xml:space="preserve"> </w:t>
-      </w:r>
-      <w:r>
-        <w:t xml:space="preserve">The scorecard sits</w:t>
+        <w:t xml:space="preserve">Consumer content runs through</w:t>
+      </w:r>
+      <w:r>
+        <w:t xml:space="preserve"> </w:t>
+      </w:r>
+      <w:r>
+        <w:rPr>
+          <w:b/>
+          <w:bCs/>
+        </w:rPr>
+        <w:t xml:space="preserve">two entry doors, matched to the post’s intent - and both converge on the Challenge:</w:t>
+      </w:r>
+    </w:p>
+    <w:p>
+      <w:pPr>
+        <w:pStyle w:val="Compact"/>
+        <w:numPr>
+          <w:ilvl w:val="0"/>
+          <w:numId w:val="1003"/>
+        </w:numPr>
+      </w:pPr>
+      <w:r>
+        <w:rPr>
+          <w:b/>
+          <w:bCs/>
+        </w:rPr>
+        <w:t xml:space="preserve">Door 1 - the curiosity door (doctrine / engagement content).</w:t>
+      </w:r>
+      <w:r>
+        <w:t xml:space="preserve"> </w:t>
+      </w:r>
+      <w:r>
+        <w:t xml:space="preserve">CTA =</w:t>
       </w:r>
       <w:r>
         <w:t xml:space="preserve"> </w:t>
@@ -694,49 +716,136 @@
           <w:i/>
           <w:iCs/>
         </w:rPr>
-        <w:t xml:space="preserve">inside</w:t>
-      </w:r>
-      <w:r>
-        <w:t xml:space="preserve"> </w:t>
-      </w:r>
-      <w:r>
-        <w:t xml:space="preserve">the Challenge as the Day-0 gate. The flow:</w:t>
-      </w:r>
-    </w:p>
-    <w:p>
-      <w:pPr>
-        <w:pStyle w:val="BodyText"/>
-      </w:pPr>
-      <w:r>
-        <w:rPr>
-          <w:b/>
-          <w:bCs/>
-        </w:rPr>
-        <w:t xml:space="preserve">Content / Ad -&gt; Challenge landing page -&gt; sign up (free 14-Day Body Decode Challenge) -&gt; first portal gate: complete the Body State Scorecard -&gt; the scorecard reads their state and routes them</w:t>
-      </w:r>
-      <w:r>
-        <w:t xml:space="preserve"> </w:t>
-      </w:r>
-      <w:r>
-        <w:t xml:space="preserve">(which Challenge experience they get, and whether they’re flagged coaching-ready).</w:t>
-      </w:r>
-    </w:p>
-    <w:p>
-      <w:pPr>
-        <w:pStyle w:val="BodyText"/>
-      </w:pPr>
-      <w:r>
-        <w:t xml:space="preserve">So the scorecard is no longer the front door - it’s the first in-portal gate after signup, and the router.</w:t>
-      </w:r>
-      <w:r>
-        <w:t xml:space="preserve"> </w:t>
-      </w:r>
-      <w:r>
-        <w:rPr>
-          <w:b/>
-          <w:bCs/>
-        </w:rPr>
-        <w:t xml:space="preserve">The Challenge landing page is the front door.</w:t>
+        <w:t xml:space="preserve">“find your state, take the scorecard.”</w:t>
+      </w:r>
+      <w:r>
+        <w:t xml:space="preserve"> </w:t>
+      </w:r>
+      <w:r>
+        <w:t xml:space="preserve">Links to the</w:t>
+      </w:r>
+      <w:r>
+        <w:t xml:space="preserve"> </w:t>
+      </w:r>
+      <w:r>
+        <w:rPr>
+          <w:b/>
+          <w:bCs/>
+        </w:rPr>
+        <w:t xml:space="preserve">standalone scorecard</w:t>
+      </w:r>
+      <w:r>
+        <w:t xml:space="preserve">. Low friction - people love finding out something about themselves. When they finish, the scorecard reads their state and</w:t>
+      </w:r>
+      <w:r>
+        <w:t xml:space="preserve"> </w:t>
+      </w:r>
+      <w:r>
+        <w:rPr>
+          <w:b/>
+          <w:bCs/>
+        </w:rPr>
+        <w:t xml:space="preserve">routes them, primarily into the free Challenge</w:t>
+      </w:r>
+      <w:r>
+        <w:t xml:space="preserve"> </w:t>
+      </w:r>
+      <w:r>
+        <w:t xml:space="preserve">(coaching-ready leads get flagged for Funnel A).</w:t>
+      </w:r>
+    </w:p>
+    <w:p>
+      <w:pPr>
+        <w:pStyle w:val="Compact"/>
+        <w:numPr>
+          <w:ilvl w:val="0"/>
+          <w:numId w:val="1003"/>
+        </w:numPr>
+      </w:pPr>
+      <w:r>
+        <w:rPr>
+          <w:b/>
+          <w:bCs/>
+        </w:rPr>
+        <w:t xml:space="preserve">Door 2 - the direct door (Challenge promo content).</w:t>
+      </w:r>
+      <w:r>
+        <w:t xml:space="preserve"> </w:t>
+      </w:r>
+      <w:r>
+        <w:t xml:space="preserve">CTA =</w:t>
+      </w:r>
+      <w:r>
+        <w:t xml:space="preserve"> </w:t>
+      </w:r>
+      <w:r>
+        <w:rPr>
+          <w:i/>
+          <w:iCs/>
+        </w:rPr>
+        <w:t xml:space="preserve">“join the free 14-day Challenge.”</w:t>
+      </w:r>
+      <w:r>
+        <w:t xml:space="preserve"> </w:t>
+      </w:r>
+      <w:r>
+        <w:t xml:space="preserve">Links to the</w:t>
+      </w:r>
+      <w:r>
+        <w:t xml:space="preserve"> </w:t>
+      </w:r>
+      <w:r>
+        <w:rPr>
+          <w:b/>
+          <w:bCs/>
+        </w:rPr>
+        <w:t xml:space="preserve">Challenge landing page</w:t>
+      </w:r>
+      <w:r>
+        <w:t xml:space="preserve"> </w:t>
+      </w:r>
+      <w:r>
+        <w:t xml:space="preserve">-&gt; sign up -&gt; the scorecard runs as the</w:t>
+      </w:r>
+      <w:r>
+        <w:t xml:space="preserve"> </w:t>
+      </w:r>
+      <w:r>
+        <w:rPr>
+          <w:b/>
+          <w:bCs/>
+        </w:rPr>
+        <w:t xml:space="preserve">Day-0 in-portal gate</w:t>
+      </w:r>
+      <w:r>
+        <w:t xml:space="preserve"> </w:t>
+      </w:r>
+      <w:r>
+        <w:t xml:space="preserve">and routes them.</w:t>
+      </w:r>
+    </w:p>
+    <w:p>
+      <w:pPr>
+        <w:pStyle w:val="FirstParagraph"/>
+      </w:pPr>
+      <w:r>
+        <w:t xml:space="preserve">So the</w:t>
+      </w:r>
+      <w:r>
+        <w:t xml:space="preserve"> </w:t>
+      </w:r>
+      <w:r>
+        <w:rPr>
+          <w:b/>
+          <w:bCs/>
+        </w:rPr>
+        <w:t xml:space="preserve">scorecard lives in two places</w:t>
+      </w:r>
+      <w:r>
+        <w:t xml:space="preserve"> </w:t>
+      </w:r>
+      <w:r>
+        <w:t xml:space="preserve">(standalone, and the Day-0 in-portal gate) and is the router in both. Both doors feed Funnel B.</w:t>
       </w:r>
     </w:p>
     <w:p>
@@ -813,29 +922,29 @@
                 <w:b/>
                 <w:bCs/>
               </w:rPr>
-              <w:t xml:space="preserve">Challenge landing page</w:t>
-            </w:r>
-          </w:p>
-        </w:tc>
-        <w:tc>
-          <w:tcPr/>
-          <w:p>
-            <w:pPr>
-              <w:pStyle w:val="Compact"/>
-            </w:pPr>
-            <w:r>
-              <w:t xml:space="preserve">Where all marketing points. The front door.</w:t>
-            </w:r>
-          </w:p>
-        </w:tc>
-        <w:tc>
-          <w:tcPr/>
-          <w:p>
-            <w:pPr>
-              <w:pStyle w:val="Compact"/>
-            </w:pPr>
-            <w:r>
-              <w:t xml:space="preserve">-</w:t>
+              <w:t xml:space="preserve">Two front doors</w:t>
+            </w:r>
+          </w:p>
+        </w:tc>
+        <w:tc>
+          <w:tcPr/>
+          <w:p>
+            <w:pPr>
+              <w:pStyle w:val="Compact"/>
+            </w:pPr>
+            <w:r>
+              <w:t xml:space="preserve">Door 1 = standalone scorecard (curiosity content); Door 2 = Challenge landing page (promo content).</w:t>
+            </w:r>
+          </w:p>
+        </w:tc>
+        <w:tc>
+          <w:tcPr/>
+          <w:p>
+            <w:pPr>
+              <w:pStyle w:val="Compact"/>
+            </w:pPr>
+            <w:r>
+              <w:t xml:space="preserve">Free</w:t>
             </w:r>
           </w:p>
         </w:tc>
@@ -1034,7 +1143,7 @@
           <w:b/>
           <w:bCs/>
         </w:rPr>
-        <w:t xml:space="preserve">Cold -&gt; Challenge landing page; retargeting -&gt; Challenge + Membership.</w:t>
+        <w:t xml:space="preserve">Cold -&gt; either door by content type; retargeting -&gt; Challenge + Membership.</w:t>
       </w:r>
       <w:r>
         <w:t xml:space="preserve"> </w:t>
@@ -1051,221 +1160,6 @@
       </w:pPr>
       <w:r>
         <w:t xml:space="preserve">5. How this brand relates to the others</w:t>
-      </w:r>
-    </w:p>
-    <w:p>
-      <w:pPr>
-        <w:pStyle w:val="Compact"/>
-        <w:numPr>
-          <w:ilvl w:val="0"/>
-          <w:numId w:val="1003"/>
-        </w:numPr>
-      </w:pPr>
-      <w:r>
-        <w:rPr>
-          <w:b/>
-          <w:bCs/>
-        </w:rPr>
-        <w:t xml:space="preserve">Body Recode (this doc)</w:t>
-      </w:r>
-      <w:r>
-        <w:t xml:space="preserve"> </w:t>
-      </w:r>
-      <w:r>
-        <w:t xml:space="preserve">= consumer demand. Fills the funnel and feeds coaching.</w:t>
-      </w:r>
-    </w:p>
-    <w:p>
-      <w:pPr>
-        <w:pStyle w:val="Compact"/>
-        <w:numPr>
-          <w:ilvl w:val="0"/>
-          <w:numId w:val="1003"/>
-        </w:numPr>
-      </w:pPr>
-      <w:r>
-        <w:rPr>
-          <w:b/>
-          <w:bCs/>
-        </w:rPr>
-        <w:t xml:space="preserve">Performance Coaching</w:t>
-      </w:r>
-      <w:r>
-        <w:t xml:space="preserve"> </w:t>
-      </w:r>
-      <w:r>
-        <w:t xml:space="preserve">= the delivery arm the funnel feeds (not separately marketed).</w:t>
-      </w:r>
-    </w:p>
-    <w:p>
-      <w:pPr>
-        <w:pStyle w:val="Compact"/>
-        <w:numPr>
-          <w:ilvl w:val="0"/>
-          <w:numId w:val="1003"/>
-        </w:numPr>
-      </w:pPr>
-      <w:r>
-        <w:rPr>
-          <w:b/>
-          <w:bCs/>
-        </w:rPr>
-        <w:t xml:space="preserve">The Collective</w:t>
-      </w:r>
-      <w:r>
-        <w:t xml:space="preserve"> </w:t>
-      </w:r>
-      <w:r>
-        <w:t xml:space="preserve">= the B2B licensing engine (</w:t>
-      </w:r>
-      <w:r>
-        <w:t xml:space="preserve">“Powered by Body Recode”</w:t>
-      </w:r>
-      <w:r>
-        <w:t xml:space="preserve">). Different audience (coaches), different channel (LinkedIn). Never mixed into consumer content.</w:t>
-      </w:r>
-    </w:p>
-    <w:p>
-      <w:pPr>
-        <w:pStyle w:val="Compact"/>
-        <w:numPr>
-          <w:ilvl w:val="0"/>
-          <w:numId w:val="1003"/>
-        </w:numPr>
-      </w:pPr>
-      <w:r>
-        <w:rPr>
-          <w:b/>
-          <w:bCs/>
-        </w:rPr>
-        <w:t xml:space="preserve">Personal brand (</w:t>
-      </w:r>
-      <w:r>
-        <w:rPr>
-          <w:rStyle w:val="VerbatimChar"/>
-          <w:b/>
-          <w:bCs/>
-        </w:rPr>
-        <w:t xml:space="preserve">@kade_dunstone_</w:t>
-      </w:r>
-      <w:r>
-        <w:rPr>
-          <w:b/>
-          <w:bCs/>
-        </w:rPr>
-        <w:t xml:space="preserve">)</w:t>
-      </w:r>
-      <w:r>
-        <w:t xml:space="preserve"> </w:t>
-      </w:r>
-      <w:r>
-        <w:t xml:space="preserve">= Kade’s first-person voice; sends warm audience toward Body Recode but keeps its own pillars.</w:t>
-      </w:r>
-    </w:p>
-    <w:p>
-      <w:r>
-        <w:pict>
-          <v:rect style="width:0;height:1.5pt" o:hralign="center" o:hrstd="t" o:hr="t"/>
-        </w:pict>
-      </w:r>
-    </w:p>
-    <w:bookmarkEnd w:id="14"/>
-    <w:bookmarkEnd w:id="15"/>
-    <w:bookmarkStart w:id="26" w:name="part-ii---the-content-engine-how"/>
-    <w:p>
-      <w:pPr>
-        <w:pStyle w:val="Heading1"/>
-      </w:pPr>
-      <w:r>
-        <w:t xml:space="preserve">PART II - THE CONTENT ENGINE (how)</w:t>
-      </w:r>
-    </w:p>
-    <w:bookmarkStart w:id="16" w:name="the-one-shift"/>
-    <w:p>
-      <w:pPr>
-        <w:pStyle w:val="Heading2"/>
-      </w:pPr>
-      <w:r>
-        <w:t xml:space="preserve">6. The one shift</w:t>
-      </w:r>
-    </w:p>
-    <w:p>
-      <w:pPr>
-        <w:pStyle w:val="FirstParagraph"/>
-      </w:pPr>
-      <w:r>
-        <w:rPr>
-          <w:b/>
-          <w:bCs/>
-        </w:rPr>
-        <w:t xml:space="preserve">Stop teaching. Start reading.</w:t>
-      </w:r>
-      <w:r>
-        <w:t xml:space="preserve"> </w:t>
-      </w:r>
-      <w:r>
-        <w:t xml:space="preserve">Engagement was low because the content taught, and teaching earns respect and gets scrolled past. Information travels in the head; self-recognition travels in the gut, and the gut taps the comment button. Every post does one of three things: makes someone</w:t>
-      </w:r>
-      <w:r>
-        <w:t xml:space="preserve"> </w:t>
-      </w:r>
-      <w:r>
-        <w:rPr>
-          <w:i/>
-          <w:iCs/>
-        </w:rPr>
-        <w:t xml:space="preserve">feel seen</w:t>
-      </w:r>
-      <w:r>
-        <w:t xml:space="preserve">, proves</w:t>
-      </w:r>
-      <w:r>
-        <w:t xml:space="preserve"> </w:t>
-      </w:r>
-      <w:r>
-        <w:rPr>
-          <w:i/>
-          <w:iCs/>
-        </w:rPr>
-        <w:t xml:space="preserve">you can read them</w:t>
-      </w:r>
-      <w:r>
-        <w:t xml:space="preserve">, or gives them a</w:t>
-      </w:r>
-      <w:r>
-        <w:t xml:space="preserve"> </w:t>
-      </w:r>
-      <w:r>
-        <w:rPr>
-          <w:i/>
-          <w:iCs/>
-        </w:rPr>
-        <w:t xml:space="preserve">result about themselves</w:t>
-      </w:r>
-      <w:r>
-        <w:t xml:space="preserve">. If a post only explains a concept, it doesn’t ship. This is the same</w:t>
-      </w:r>
-      <w:r>
-        <w:t xml:space="preserve"> </w:t>
-      </w:r>
-      <w:r>
-        <w:t xml:space="preserve">“interpretation before prescription”</w:t>
-      </w:r>
-      <w:r>
-        <w:t xml:space="preserve"> </w:t>
-      </w:r>
-      <w:r>
-        <w:t xml:space="preserve">idea from section 1, turned into content.</w:t>
-      </w:r>
-    </w:p>
-    <w:bookmarkEnd w:id="16"/>
-    <w:bookmarkStart w:id="17" w:name="three-writing-rules-non-negotiable"/>
-    <w:p>
-      <w:pPr>
-        <w:pStyle w:val="Heading2"/>
-      </w:pPr>
-      <w:r>
-        <w:t xml:space="preserve">7. Three writing rules (non-negotiable)</w:t>
       </w:r>
     </w:p>
     <w:p>
@@ -1281,37 +1175,13 @@
           <w:b/>
           <w:bCs/>
         </w:rPr>
-        <w:t xml:space="preserve">Scenarios over concepts.</w:t>
-      </w:r>
-      <w:r>
-        <w:t xml:space="preserve"> </w:t>
-      </w:r>
-      <w:r>
-        <w:t xml:space="preserve">A specific person in a specific moment.</w:t>
-      </w:r>
-      <w:r>
-        <w:t xml:space="preserve"> </w:t>
-      </w:r>
-      <w:r>
-        <w:t xml:space="preserve">“You’re 42, training five mornings, cut the wine, scale hasn’t moved in eight months”</w:t>
-      </w:r>
-      <w:r>
-        <w:t xml:space="preserve"> </w:t>
-      </w:r>
-      <w:r>
-        <w:t xml:space="preserve">beats</w:t>
-      </w:r>
-      <w:r>
-        <w:t xml:space="preserve"> </w:t>
-      </w:r>
-      <w:r>
-        <w:t xml:space="preserve">“your body may be depleted”</w:t>
-      </w:r>
-      <w:r>
-        <w:t xml:space="preserve"> </w:t>
-      </w:r>
-      <w:r>
-        <w:t xml:space="preserve">every time.</w:t>
+        <w:t xml:space="preserve">Body Recode (this doc)</w:t>
+      </w:r>
+      <w:r>
+        <w:t xml:space="preserve"> </w:t>
+      </w:r>
+      <w:r>
+        <w:t xml:space="preserve">= consumer demand. Fills the funnel and feeds coaching.</w:t>
       </w:r>
     </w:p>
     <w:p>
@@ -1327,13 +1197,13 @@
           <w:b/>
           <w:bCs/>
         </w:rPr>
-        <w:t xml:space="preserve">Their words, not ours.</w:t>
-      </w:r>
-      <w:r>
-        <w:t xml:space="preserve"> </w:t>
-      </w:r>
-      <w:r>
-        <w:t xml:space="preserve">Open with the exact phrases people write in their scorecard answers and DMs. Sound like the voice already in their head. Keep a swipe file of real lines and pull from it.</w:t>
+        <w:t xml:space="preserve">Performance Coaching</w:t>
+      </w:r>
+      <w:r>
+        <w:t xml:space="preserve"> </w:t>
+      </w:r>
+      <w:r>
+        <w:t xml:space="preserve">= the delivery arm the funnel feeds (not separately marketed).</w:t>
       </w:r>
     </w:p>
     <w:p>
@@ -1349,13 +1219,252 @@
           <w:b/>
           <w:bCs/>
         </w:rPr>
+        <w:t xml:space="preserve">The Collective</w:t>
+      </w:r>
+      <w:r>
+        <w:t xml:space="preserve"> </w:t>
+      </w:r>
+      <w:r>
+        <w:t xml:space="preserve">= the B2B licensing engine (</w:t>
+      </w:r>
+      <w:r>
+        <w:t xml:space="preserve">“Powered by Body Recode”</w:t>
+      </w:r>
+      <w:r>
+        <w:t xml:space="preserve">). Different audience (coaches), different channel (LinkedIn). Never mixed into consumer content.</w:t>
+      </w:r>
+    </w:p>
+    <w:p>
+      <w:pPr>
+        <w:pStyle w:val="Compact"/>
+        <w:numPr>
+          <w:ilvl w:val="0"/>
+          <w:numId w:val="1004"/>
+        </w:numPr>
+      </w:pPr>
+      <w:r>
+        <w:rPr>
+          <w:b/>
+          <w:bCs/>
+        </w:rPr>
+        <w:t xml:space="preserve">Personal brand (</w:t>
+      </w:r>
+      <w:r>
+        <w:rPr>
+          <w:rStyle w:val="VerbatimChar"/>
+          <w:b/>
+          <w:bCs/>
+        </w:rPr>
+        <w:t xml:space="preserve">@kade_dunstone_</w:t>
+      </w:r>
+      <w:r>
+        <w:rPr>
+          <w:b/>
+          <w:bCs/>
+        </w:rPr>
+        <w:t xml:space="preserve">)</w:t>
+      </w:r>
+      <w:r>
+        <w:t xml:space="preserve"> </w:t>
+      </w:r>
+      <w:r>
+        <w:t xml:space="preserve">= Kade’s first-person voice; sends warm audience toward Body Recode but keeps its own pillars.</w:t>
+      </w:r>
+    </w:p>
+    <w:p>
+      <w:r>
+        <w:pict>
+          <v:rect style="width:0;height:1.5pt" o:hralign="center" o:hrstd="t" o:hr="t"/>
+        </w:pict>
+      </w:r>
+    </w:p>
+    <w:bookmarkEnd w:id="14"/>
+    <w:bookmarkEnd w:id="15"/>
+    <w:bookmarkStart w:id="27" w:name="part-ii---the-content-engine-how"/>
+    <w:p>
+      <w:pPr>
+        <w:pStyle w:val="Heading1"/>
+      </w:pPr>
+      <w:r>
+        <w:t xml:space="preserve">PART II - THE CONTENT ENGINE (how)</w:t>
+      </w:r>
+    </w:p>
+    <w:bookmarkStart w:id="16" w:name="the-one-shift"/>
+    <w:p>
+      <w:pPr>
+        <w:pStyle w:val="Heading2"/>
+      </w:pPr>
+      <w:r>
+        <w:t xml:space="preserve">6. The one shift</w:t>
+      </w:r>
+    </w:p>
+    <w:p>
+      <w:pPr>
+        <w:pStyle w:val="FirstParagraph"/>
+      </w:pPr>
+      <w:r>
+        <w:rPr>
+          <w:b/>
+          <w:bCs/>
+        </w:rPr>
+        <w:t xml:space="preserve">Stop teaching. Start reading.</w:t>
+      </w:r>
+      <w:r>
+        <w:t xml:space="preserve"> </w:t>
+      </w:r>
+      <w:r>
+        <w:t xml:space="preserve">Engagement was low because the content taught, and teaching earns respect and gets scrolled past. Information travels in the head; self-recognition travels in the gut, and the gut taps the comment button. Every post does one of three things: makes someone</w:t>
+      </w:r>
+      <w:r>
+        <w:t xml:space="preserve"> </w:t>
+      </w:r>
+      <w:r>
+        <w:rPr>
+          <w:i/>
+          <w:iCs/>
+        </w:rPr>
+        <w:t xml:space="preserve">feel seen</w:t>
+      </w:r>
+      <w:r>
+        <w:t xml:space="preserve">, proves</w:t>
+      </w:r>
+      <w:r>
+        <w:t xml:space="preserve"> </w:t>
+      </w:r>
+      <w:r>
+        <w:rPr>
+          <w:i/>
+          <w:iCs/>
+        </w:rPr>
+        <w:t xml:space="preserve">you can read them</w:t>
+      </w:r>
+      <w:r>
+        <w:t xml:space="preserve">, or gives them a</w:t>
+      </w:r>
+      <w:r>
+        <w:t xml:space="preserve"> </w:t>
+      </w:r>
+      <w:r>
+        <w:rPr>
+          <w:i/>
+          <w:iCs/>
+        </w:rPr>
+        <w:t xml:space="preserve">result about themselves</w:t>
+      </w:r>
+      <w:r>
+        <w:t xml:space="preserve">. If a post only explains a concept, it doesn’t ship. This is the same</w:t>
+      </w:r>
+      <w:r>
+        <w:t xml:space="preserve"> </w:t>
+      </w:r>
+      <w:r>
+        <w:t xml:space="preserve">“interpretation before prescription”</w:t>
+      </w:r>
+      <w:r>
+        <w:t xml:space="preserve"> </w:t>
+      </w:r>
+      <w:r>
+        <w:t xml:space="preserve">idea from section 1, turned into content.</w:t>
+      </w:r>
+    </w:p>
+    <w:bookmarkEnd w:id="16"/>
+    <w:bookmarkStart w:id="17" w:name="three-writing-rules-non-negotiable"/>
+    <w:p>
+      <w:pPr>
+        <w:pStyle w:val="Heading2"/>
+      </w:pPr>
+      <w:r>
+        <w:t xml:space="preserve">7. Three writing rules (non-negotiable)</w:t>
+      </w:r>
+    </w:p>
+    <w:p>
+      <w:pPr>
+        <w:pStyle w:val="Compact"/>
+        <w:numPr>
+          <w:ilvl w:val="0"/>
+          <w:numId w:val="1005"/>
+        </w:numPr>
+      </w:pPr>
+      <w:r>
+        <w:rPr>
+          <w:b/>
+          <w:bCs/>
+        </w:rPr>
+        <w:t xml:space="preserve">Scenarios over concepts.</w:t>
+      </w:r>
+      <w:r>
+        <w:t xml:space="preserve"> </w:t>
+      </w:r>
+      <w:r>
+        <w:t xml:space="preserve">A specific person in a specific moment.</w:t>
+      </w:r>
+      <w:r>
+        <w:t xml:space="preserve"> </w:t>
+      </w:r>
+      <w:r>
+        <w:t xml:space="preserve">“You’re 42, training five mornings, cut the wine, scale hasn’t moved in eight months”</w:t>
+      </w:r>
+      <w:r>
+        <w:t xml:space="preserve"> </w:t>
+      </w:r>
+      <w:r>
+        <w:t xml:space="preserve">beats</w:t>
+      </w:r>
+      <w:r>
+        <w:t xml:space="preserve"> </w:t>
+      </w:r>
+      <w:r>
+        <w:t xml:space="preserve">“your body may be depleted”</w:t>
+      </w:r>
+      <w:r>
+        <w:t xml:space="preserve"> </w:t>
+      </w:r>
+      <w:r>
+        <w:t xml:space="preserve">every time.</w:t>
+      </w:r>
+    </w:p>
+    <w:p>
+      <w:pPr>
+        <w:pStyle w:val="Compact"/>
+        <w:numPr>
+          <w:ilvl w:val="0"/>
+          <w:numId w:val="1005"/>
+        </w:numPr>
+      </w:pPr>
+      <w:r>
+        <w:rPr>
+          <w:b/>
+          <w:bCs/>
+        </w:rPr>
+        <w:t xml:space="preserve">Their words, not ours.</w:t>
+      </w:r>
+      <w:r>
+        <w:t xml:space="preserve"> </w:t>
+      </w:r>
+      <w:r>
+        <w:t xml:space="preserve">Open with the exact phrases people write in their scorecard answers and DMs. Sound like the voice already in their head. Keep a swipe file of real lines and pull from it.</w:t>
+      </w:r>
+    </w:p>
+    <w:p>
+      <w:pPr>
+        <w:pStyle w:val="Compact"/>
+        <w:numPr>
+          <w:ilvl w:val="0"/>
+          <w:numId w:val="1005"/>
+        </w:numPr>
+      </w:pPr>
+      <w:r>
+        <w:rPr>
+          <w:b/>
+          <w:bCs/>
+        </w:rPr>
         <w:t xml:space="preserve">Split the job.</w:t>
       </w:r>
       <w:r>
         <w:t xml:space="preserve"> </w:t>
       </w:r>
       <w:r>
-        <w:t xml:space="preserve">Some posts earn comments and saves (pure value, end on a question, no link). Others drive the click (the Challenge). Never ask one post to do both - that’s why they currently land neither.</w:t>
+        <w:t xml:space="preserve">Some posts earn comments and saves (pure value, end on a question, no link). Others drive the click (scorecard for doctrine, Challenge for promo). Never ask one post to do both - that’s why they currently land neither.</w:t>
       </w:r>
     </w:p>
     <w:bookmarkEnd w:id="17"/>
@@ -2228,7 +2337,7 @@
         <w:pStyle w:val="Compact"/>
         <w:numPr>
           <w:ilvl w:val="0"/>
-          <w:numId w:val="1005"/>
+          <w:numId w:val="1006"/>
         </w:numPr>
       </w:pPr>
       <w:r>
@@ -2243,192 +2352,6 @@
       </w:r>
       <w:r>
         <w:t xml:space="preserve">-&gt; State of the Data, Receipts of the Read</w:t>
-      </w:r>
-    </w:p>
-    <w:p>
-      <w:pPr>
-        <w:pStyle w:val="Compact"/>
-        <w:numPr>
-          <w:ilvl w:val="0"/>
-          <w:numId w:val="1005"/>
-        </w:numPr>
-      </w:pPr>
-      <w:r>
-        <w:rPr>
-          <w:b/>
-          <w:bCs/>
-        </w:rPr>
-        <w:t xml:space="preserve">Pattern Recognition</w:t>
-      </w:r>
-      <w:r>
-        <w:t xml:space="preserve"> </w:t>
-      </w:r>
-      <w:r>
-        <w:t xml:space="preserve">-&gt; What Your ___ Says, The Scenario</w:t>
-      </w:r>
-    </w:p>
-    <w:p>
-      <w:pPr>
-        <w:pStyle w:val="Compact"/>
-        <w:numPr>
-          <w:ilvl w:val="0"/>
-          <w:numId w:val="1005"/>
-        </w:numPr>
-      </w:pPr>
-      <w:r>
-        <w:rPr>
-          <w:b/>
-          <w:bCs/>
-        </w:rPr>
-        <w:t xml:space="preserve">Coach Perspective</w:t>
-      </w:r>
-      <w:r>
-        <w:t xml:space="preserve"> </w:t>
-      </w:r>
-      <w:r>
-        <w:t xml:space="preserve">-&gt; React to DMs, Receipts</w:t>
-      </w:r>
-    </w:p>
-    <w:p>
-      <w:pPr>
-        <w:pStyle w:val="Compact"/>
-        <w:numPr>
-          <w:ilvl w:val="0"/>
-          <w:numId w:val="1005"/>
-        </w:numPr>
-      </w:pPr>
-      <w:r>
-        <w:rPr>
-          <w:b/>
-          <w:bCs/>
-        </w:rPr>
-        <w:t xml:space="preserve">Contrarian</w:t>
-      </w:r>
-      <w:r>
-        <w:t xml:space="preserve"> </w:t>
-      </w:r>
-      <w:r>
-        <w:t xml:space="preserve">-&gt; The Autopsy</w:t>
-      </w:r>
-    </w:p>
-    <w:p>
-      <w:pPr>
-        <w:pStyle w:val="Compact"/>
-        <w:numPr>
-          <w:ilvl w:val="0"/>
-          <w:numId w:val="1005"/>
-        </w:numPr>
-      </w:pPr>
-      <w:r>
-        <w:rPr>
-          <w:b/>
-          <w:bCs/>
-        </w:rPr>
-        <w:t xml:space="preserve">Diagnostic / Funnel</w:t>
-      </w:r>
-      <w:r>
-        <w:t xml:space="preserve"> </w:t>
-      </w:r>
-      <w:r>
-        <w:t xml:space="preserve">-&gt; The Read, The Prediction Flex, the comment-to-DM read</w:t>
-      </w:r>
-    </w:p>
-    <w:p>
-      <w:pPr>
-        <w:pStyle w:val="FirstParagraph"/>
-      </w:pPr>
-      <w:r>
-        <w:t xml:space="preserve">Same 5 types, same archetype rotation and hook banks - the formats just give each type a sharper, more repeatable, more scroll-stopping shape.</w:t>
-      </w:r>
-    </w:p>
-    <w:bookmarkEnd w:id="18"/>
-    <w:bookmarkStart w:id="19" w:name="the-enemy"/>
-    <w:p>
-      <w:pPr>
-        <w:pStyle w:val="Heading2"/>
-      </w:pPr>
-      <w:r>
-        <w:t xml:space="preserve">9. The enemy</w:t>
-      </w:r>
-    </w:p>
-    <w:p>
-      <w:pPr>
-        <w:pStyle w:val="FirstParagraph"/>
-      </w:pPr>
-      <w:r>
-        <w:t xml:space="preserve">Give people something to be against: the</w:t>
-      </w:r>
-      <w:r>
-        <w:t xml:space="preserve"> </w:t>
-      </w:r>
-      <w:r>
-        <w:rPr>
-          <w:b/>
-          <w:bCs/>
-        </w:rPr>
-        <w:t xml:space="preserve">eat-less-move-more machine.</w:t>
-      </w:r>
-      <w:r>
-        <w:t xml:space="preserve"> </w:t>
-      </w:r>
-      <w:r>
-        <w:t xml:space="preserve">Protocol without interpretation. A brand with an enemy builds a movement, not an audience - people share what they’re angry about, and being the calm expert who defends them is a magnetic position.</w:t>
-      </w:r>
-    </w:p>
-    <w:bookmarkEnd w:id="19"/>
-    <w:bookmarkStart w:id="20" w:name="the-lead-mechanic-comment-to-dm-upgraded"/>
-    <w:p>
-      <w:pPr>
-        <w:pStyle w:val="Heading2"/>
-      </w:pPr>
-      <w:r>
-        <w:t xml:space="preserve">10. The lead mechanic (comment-to-DM, upgraded)</w:t>
-      </w:r>
-    </w:p>
-    <w:p>
-      <w:pPr>
-        <w:pStyle w:val="FirstParagraph"/>
-      </w:pPr>
-      <w:r>
-        <w:t xml:space="preserve">The giveaway is</w:t>
-      </w:r>
-      <w:r>
-        <w:t xml:space="preserve"> </w:t>
-      </w:r>
-      <w:r>
-        <w:rPr>
-          <w:b/>
-          <w:bCs/>
-        </w:rPr>
-        <w:t xml:space="preserve">a personalised micro-read, not a PDF.</w:t>
-      </w:r>
-      <w:r>
-        <w:t xml:space="preserve"> </w:t>
-      </w:r>
-      <w:r>
-        <w:t xml:space="preserve">Comment the keyword -&gt; the DM asks 2-3 quick questions -&gt; it hands back their likely pattern, the one reason it’s happening, and the single thing to change first, then invites them to the scorecard for the full read. ManyChat delivers it (it has Meta’s approved messaging access, so it sidesteps the app-review wall). The branded PDF becomes the tailored leave-behind. Keyword + copy spec:</w:t>
-      </w:r>
-      <w:r>
-        <w:t xml:space="preserve"> </w:t>
-      </w:r>
-      <w:r>
-        <w:rPr>
-          <w:rStyle w:val="VerbatimChar"/>
-        </w:rPr>
-        <w:t xml:space="preserve">comment-to-dm-asset-map-v1.md</w:t>
-      </w:r>
-      <w:r>
-        <w:t xml:space="preserve">. Cap at 1-2 comment-to-DM posts a week, always on a scenario hook.</w:t>
-      </w:r>
-    </w:p>
-    <w:bookmarkEnd w:id="20"/>
-    <w:bookmarkStart w:id="21" w:name="channels-cadence-weekly-rhythm"/>
-    <w:p>
-      <w:pPr>
-        <w:pStyle w:val="Heading2"/>
-      </w:pPr>
-      <w:r>
-        <w:t xml:space="preserve">11. Channels, cadence &amp; weekly rhythm</w:t>
       </w:r>
     </w:p>
     <w:p>
@@ -2437,6 +2360,469 @@
         <w:numPr>
           <w:ilvl w:val="0"/>
           <w:numId w:val="1006"/>
+        </w:numPr>
+      </w:pPr>
+      <w:r>
+        <w:rPr>
+          <w:b/>
+          <w:bCs/>
+        </w:rPr>
+        <w:t xml:space="preserve">Pattern Recognition</w:t>
+      </w:r>
+      <w:r>
+        <w:t xml:space="preserve"> </w:t>
+      </w:r>
+      <w:r>
+        <w:t xml:space="preserve">-&gt; What Your ___ Says, The Scenario</w:t>
+      </w:r>
+    </w:p>
+    <w:p>
+      <w:pPr>
+        <w:pStyle w:val="Compact"/>
+        <w:numPr>
+          <w:ilvl w:val="0"/>
+          <w:numId w:val="1006"/>
+        </w:numPr>
+      </w:pPr>
+      <w:r>
+        <w:rPr>
+          <w:b/>
+          <w:bCs/>
+        </w:rPr>
+        <w:t xml:space="preserve">Coach Perspective</w:t>
+      </w:r>
+      <w:r>
+        <w:t xml:space="preserve"> </w:t>
+      </w:r>
+      <w:r>
+        <w:t xml:space="preserve">-&gt; React to DMs, Receipts</w:t>
+      </w:r>
+    </w:p>
+    <w:p>
+      <w:pPr>
+        <w:pStyle w:val="Compact"/>
+        <w:numPr>
+          <w:ilvl w:val="0"/>
+          <w:numId w:val="1006"/>
+        </w:numPr>
+      </w:pPr>
+      <w:r>
+        <w:rPr>
+          <w:b/>
+          <w:bCs/>
+        </w:rPr>
+        <w:t xml:space="preserve">Contrarian</w:t>
+      </w:r>
+      <w:r>
+        <w:t xml:space="preserve"> </w:t>
+      </w:r>
+      <w:r>
+        <w:t xml:space="preserve">-&gt; The Autopsy</w:t>
+      </w:r>
+    </w:p>
+    <w:p>
+      <w:pPr>
+        <w:pStyle w:val="Compact"/>
+        <w:numPr>
+          <w:ilvl w:val="0"/>
+          <w:numId w:val="1006"/>
+        </w:numPr>
+      </w:pPr>
+      <w:r>
+        <w:rPr>
+          <w:b/>
+          <w:bCs/>
+        </w:rPr>
+        <w:t xml:space="preserve">Diagnostic / Funnel</w:t>
+      </w:r>
+      <w:r>
+        <w:t xml:space="preserve"> </w:t>
+      </w:r>
+      <w:r>
+        <w:t xml:space="preserve">-&gt; The Read, The Prediction Flex, the comment-to-DM read</w:t>
+      </w:r>
+    </w:p>
+    <w:p>
+      <w:pPr>
+        <w:pStyle w:val="FirstParagraph"/>
+      </w:pPr>
+      <w:r>
+        <w:t xml:space="preserve">Same 5 types, same archetype rotation and hook banks - the formats just give each type a sharper, more repeatable, more scroll-stopping shape.</w:t>
+      </w:r>
+    </w:p>
+    <w:bookmarkEnd w:id="18"/>
+    <w:bookmarkStart w:id="19" w:name="b.-the-challenge-promo-layer-door-2"/>
+    <w:p>
+      <w:pPr>
+        <w:pStyle w:val="Heading2"/>
+      </w:pPr>
+      <w:r>
+        <w:t xml:space="preserve">8b. The Challenge promo layer (Door 2)</w:t>
+      </w:r>
+    </w:p>
+    <w:p>
+      <w:pPr>
+        <w:pStyle w:val="FirstParagraph"/>
+      </w:pPr>
+      <w:r>
+        <w:t xml:space="preserve">Alongside the doctrine content, run a</w:t>
+      </w:r>
+      <w:r>
+        <w:t xml:space="preserve"> </w:t>
+      </w:r>
+      <w:r>
+        <w:rPr>
+          <w:b/>
+          <w:bCs/>
+        </w:rPr>
+        <w:t xml:space="preserve">direct Challenge-invite layer</w:t>
+      </w:r>
+      <w:r>
+        <w:t xml:space="preserve"> </w:t>
+      </w:r>
+      <w:r>
+        <w:t xml:space="preserve">- the posts whose whole job is to fill the Challenge. Not every post (over-promoting trains the scroll-past);</w:t>
+      </w:r>
+      <w:r>
+        <w:t xml:space="preserve"> </w:t>
+      </w:r>
+      <w:r>
+        <w:rPr>
+          <w:b/>
+          <w:bCs/>
+        </w:rPr>
+        <w:t xml:space="preserve">~1 explicit promo/week</w:t>
+      </w:r>
+      <w:r>
+        <w:t xml:space="preserve">, plus a</w:t>
+      </w:r>
+      <w:r>
+        <w:t xml:space="preserve"> </w:t>
+      </w:r>
+      <w:r>
+        <w:rPr>
+          <w:b/>
+          <w:bCs/>
+        </w:rPr>
+        <w:t xml:space="preserve">heavier burst when a new wave opens</w:t>
+      </w:r>
+      <w:r>
+        <w:t xml:space="preserve"> </w:t>
+      </w:r>
+      <w:r>
+        <w:t xml:space="preserve">(tie to the wave-cap plan: W1=50, W2=+25…).</w:t>
+      </w:r>
+    </w:p>
+    <w:p>
+      <w:pPr>
+        <w:pStyle w:val="BodyText"/>
+      </w:pPr>
+      <w:r>
+        <w:rPr>
+          <w:b/>
+          <w:bCs/>
+        </w:rPr>
+        <w:t xml:space="preserve">Rotating promo angles (don’t repeat the same one):</w:t>
+      </w:r>
+      <w:r>
+        <w:t xml:space="preserve"> </w:t>
+      </w:r>
+      <w:r>
+        <w:t xml:space="preserve">-</w:t>
+      </w:r>
+      <w:r>
+        <w:t xml:space="preserve"> </w:t>
+      </w:r>
+      <w:r>
+        <w:rPr>
+          <w:b/>
+          <w:bCs/>
+        </w:rPr>
+        <w:t xml:space="preserve">What it is</w:t>
+      </w:r>
+      <w:r>
+        <w:t xml:space="preserve"> </w:t>
+      </w:r>
+      <w:r>
+        <w:t xml:space="preserve">-</w:t>
+      </w:r>
+      <w:r>
+        <w:t xml:space="preserve"> </w:t>
+      </w:r>
+      <w:r>
+        <w:t xml:space="preserve">“A free 14-day read of your body, not another meal plan.”</w:t>
+      </w:r>
+      <w:r>
+        <w:t xml:space="preserve"> </w:t>
+      </w:r>
+      <w:r>
+        <w:t xml:space="preserve">-</w:t>
+      </w:r>
+      <w:r>
+        <w:t xml:space="preserve"> </w:t>
+      </w:r>
+      <w:r>
+        <w:rPr>
+          <w:b/>
+          <w:bCs/>
+        </w:rPr>
+        <w:t xml:space="preserve">What you get</w:t>
+      </w:r>
+      <w:r>
+        <w:t xml:space="preserve"> </w:t>
+      </w:r>
+      <w:r>
+        <w:t xml:space="preserve">- the Day-14 reveal, your personalised read.</w:t>
+      </w:r>
+      <w:r>
+        <w:t xml:space="preserve"> </w:t>
+      </w:r>
+      <w:r>
+        <w:t xml:space="preserve">-</w:t>
+      </w:r>
+      <w:r>
+        <w:t xml:space="preserve"> </w:t>
+      </w:r>
+      <w:r>
+        <w:rPr>
+          <w:b/>
+          <w:bCs/>
+        </w:rPr>
+        <w:t xml:space="preserve">Who it’s for</w:t>
+      </w:r>
+      <w:r>
+        <w:t xml:space="preserve"> </w:t>
+      </w:r>
+      <w:r>
+        <w:t xml:space="preserve">- the archetype mirror (</w:t>
+      </w:r>
+      <w:r>
+        <w:t xml:space="preserve">“if you’re doing everything and nothing’s moving…”</w:t>
+      </w:r>
+      <w:r>
+        <w:t xml:space="preserve">).</w:t>
+      </w:r>
+      <w:r>
+        <w:t xml:space="preserve"> </w:t>
+      </w:r>
+      <w:r>
+        <w:t xml:space="preserve">-</w:t>
+      </w:r>
+      <w:r>
+        <w:t xml:space="preserve"> </w:t>
+      </w:r>
+      <w:r>
+        <w:rPr>
+          <w:b/>
+          <w:bCs/>
+        </w:rPr>
+        <w:t xml:space="preserve">Proof</w:t>
+      </w:r>
+      <w:r>
+        <w:t xml:space="preserve"> </w:t>
+      </w:r>
+      <w:r>
+        <w:t xml:space="preserve">- a real, consented result/quote, or State-of-the-Data.</w:t>
+      </w:r>
+      <w:r>
+        <w:t xml:space="preserve"> </w:t>
+      </w:r>
+      <w:r>
+        <w:t xml:space="preserve">-</w:t>
+      </w:r>
+      <w:r>
+        <w:t xml:space="preserve"> </w:t>
+      </w:r>
+      <w:r>
+        <w:rPr>
+          <w:b/>
+          <w:bCs/>
+        </w:rPr>
+        <w:t xml:space="preserve">Why now</w:t>
+      </w:r>
+      <w:r>
+        <w:t xml:space="preserve"> </w:t>
+      </w:r>
+      <w:r>
+        <w:t xml:space="preserve">- wave scarcity (spots left).</w:t>
+      </w:r>
+      <w:r>
+        <w:t xml:space="preserve"> </w:t>
+      </w:r>
+      <w:r>
+        <w:t xml:space="preserve">-</w:t>
+      </w:r>
+      <w:r>
+        <w:t xml:space="preserve"> </w:t>
+      </w:r>
+      <w:r>
+        <w:rPr>
+          <w:b/>
+          <w:bCs/>
+        </w:rPr>
+        <w:t xml:space="preserve">Objection-kill</w:t>
+      </w:r>
+      <w:r>
+        <w:t xml:space="preserve"> </w:t>
+      </w:r>
+      <w:r>
+        <w:t xml:space="preserve">-</w:t>
+      </w:r>
+      <w:r>
+        <w:t xml:space="preserve"> </w:t>
+      </w:r>
+      <w:r>
+        <w:t xml:space="preserve">“free, no credit card, you keep the result.”</w:t>
+      </w:r>
+    </w:p>
+    <w:p>
+      <w:pPr>
+        <w:pStyle w:val="BodyText"/>
+      </w:pPr>
+      <w:r>
+        <w:t xml:space="preserve">Promo posts carry the</w:t>
+      </w:r>
+      <w:r>
+        <w:t xml:space="preserve"> </w:t>
+      </w:r>
+      <w:r>
+        <w:rPr>
+          <w:b/>
+          <w:bCs/>
+        </w:rPr>
+        <w:t xml:space="preserve">Door 2 CTA</w:t>
+      </w:r>
+      <w:r>
+        <w:t xml:space="preserve"> </w:t>
+      </w:r>
+      <w:r>
+        <w:t xml:space="preserve">(</w:t>
+      </w:r>
+      <w:r>
+        <w:t xml:space="preserve">“join the free 14-day Challenge”</w:t>
+      </w:r>
+      <w:r>
+        <w:t xml:space="preserve">); doctrine posts carry the</w:t>
+      </w:r>
+      <w:r>
+        <w:t xml:space="preserve"> </w:t>
+      </w:r>
+      <w:r>
+        <w:rPr>
+          <w:b/>
+          <w:bCs/>
+        </w:rPr>
+        <w:t xml:space="preserve">Door 1 CTA</w:t>
+      </w:r>
+      <w:r>
+        <w:t xml:space="preserve"> </w:t>
+      </w:r>
+      <w:r>
+        <w:t xml:space="preserve">(</w:t>
+      </w:r>
+      <w:r>
+        <w:t xml:space="preserve">“find your state”</w:t>
+      </w:r>
+      <w:r>
+        <w:t xml:space="preserve">). A typical week = 4 doctrine + 1 promo, with promo turned up at wave-open.</w:t>
+      </w:r>
+    </w:p>
+    <w:bookmarkEnd w:id="19"/>
+    <w:bookmarkStart w:id="20" w:name="the-enemy"/>
+    <w:p>
+      <w:pPr>
+        <w:pStyle w:val="Heading2"/>
+      </w:pPr>
+      <w:r>
+        <w:t xml:space="preserve">9. The enemy</w:t>
+      </w:r>
+    </w:p>
+    <w:p>
+      <w:pPr>
+        <w:pStyle w:val="FirstParagraph"/>
+      </w:pPr>
+      <w:r>
+        <w:t xml:space="preserve">Give people something to be against: the</w:t>
+      </w:r>
+      <w:r>
+        <w:t xml:space="preserve"> </w:t>
+      </w:r>
+      <w:r>
+        <w:rPr>
+          <w:b/>
+          <w:bCs/>
+        </w:rPr>
+        <w:t xml:space="preserve">eat-less-move-more machine.</w:t>
+      </w:r>
+      <w:r>
+        <w:t xml:space="preserve"> </w:t>
+      </w:r>
+      <w:r>
+        <w:t xml:space="preserve">Protocol without interpretation. A brand with an enemy builds a movement, not an audience - people share what they’re angry about, and being the calm expert who defends them is a magnetic position.</w:t>
+      </w:r>
+    </w:p>
+    <w:bookmarkEnd w:id="20"/>
+    <w:bookmarkStart w:id="21" w:name="the-lead-mechanic-comment-to-dm-upgraded"/>
+    <w:p>
+      <w:pPr>
+        <w:pStyle w:val="Heading2"/>
+      </w:pPr>
+      <w:r>
+        <w:t xml:space="preserve">10. The lead mechanic (comment-to-DM, upgraded)</w:t>
+      </w:r>
+    </w:p>
+    <w:p>
+      <w:pPr>
+        <w:pStyle w:val="FirstParagraph"/>
+      </w:pPr>
+      <w:r>
+        <w:t xml:space="preserve">The giveaway is</w:t>
+      </w:r>
+      <w:r>
+        <w:t xml:space="preserve"> </w:t>
+      </w:r>
+      <w:r>
+        <w:rPr>
+          <w:b/>
+          <w:bCs/>
+        </w:rPr>
+        <w:t xml:space="preserve">a personalised micro-read, not a PDF.</w:t>
+      </w:r>
+      <w:r>
+        <w:t xml:space="preserve"> </w:t>
+      </w:r>
+      <w:r>
+        <w:t xml:space="preserve">Comment the keyword -&gt; the DM asks 2-3 quick questions -&gt; it hands back their likely pattern, the one reason it’s happening, and the single thing to change first, then invites them to the scorecard for the full read. ManyChat delivers it (it has Meta’s approved messaging access, so it sidesteps the app-review wall). The branded PDF becomes the tailored leave-behind. Keyword + copy spec:</w:t>
+      </w:r>
+      <w:r>
+        <w:t xml:space="preserve"> </w:t>
+      </w:r>
+      <w:r>
+        <w:rPr>
+          <w:rStyle w:val="VerbatimChar"/>
+        </w:rPr>
+        <w:t xml:space="preserve">comment-to-dm-asset-map-v1.md</w:t>
+      </w:r>
+      <w:r>
+        <w:t xml:space="preserve">. Cap at 1-2 comment-to-DM posts a week, always on a scenario hook.</w:t>
+      </w:r>
+    </w:p>
+    <w:bookmarkEnd w:id="21"/>
+    <w:bookmarkStart w:id="22" w:name="channels-cadence-weekly-rhythm"/>
+    <w:p>
+      <w:pPr>
+        <w:pStyle w:val="Heading2"/>
+      </w:pPr>
+      <w:r>
+        <w:t xml:space="preserve">11. Channels, cadence &amp; weekly rhythm</w:t>
+      </w:r>
+    </w:p>
+    <w:p>
+      <w:pPr>
+        <w:pStyle w:val="Compact"/>
+        <w:numPr>
+          <w:ilvl w:val="0"/>
+          <w:numId w:val="1007"/>
         </w:numPr>
       </w:pPr>
       <w:r>
@@ -2797,23 +3183,55 @@
         <w:pStyle w:val="BodyText"/>
       </w:pPr>
       <w:r>
-        <w:t xml:space="preserve">One CTA per post = the</w:t>
-      </w:r>
-      <w:r>
-        <w:t xml:space="preserve"> </w:t>
-      </w:r>
-      <w:r>
-        <w:rPr>
-          <w:b/>
-          <w:bCs/>
-        </w:rPr>
-        <w:t xml:space="preserve">Challenge landing page</w:t>
-      </w:r>
-      <w:r>
-        <w:t xml:space="preserve"> </w:t>
-      </w:r>
-      <w:r>
-        <w:t xml:space="preserve">(engagement-first posts still earn the comment first; the Challenge stays the single funnel CTA). The scorecard is now the in-portal gate, not the marketing destination. Stories run alongside daily: the</w:t>
+        <w:t xml:space="preserve">One CTA per post, and which one depends on the post</w:t>
+      </w:r>
+      <w:r>
+        <w:t xml:space="preserve"> </w:t>
+      </w:r>
+      <w:r>
+        <w:rPr>
+          <w:b/>
+          <w:bCs/>
+        </w:rPr>
+        <w:t xml:space="preserve">type</w:t>
+      </w:r>
+      <w:r>
+        <w:t xml:space="preserve">: doctrine/engagement posts -&gt;</w:t>
+      </w:r>
+      <w:r>
+        <w:t xml:space="preserve"> </w:t>
+      </w:r>
+      <w:r>
+        <w:rPr>
+          <w:b/>
+          <w:bCs/>
+        </w:rPr>
+        <w:t xml:space="preserve">the scorecard</w:t>
+      </w:r>
+      <w:r>
+        <w:t xml:space="preserve"> </w:t>
+      </w:r>
+      <w:r>
+        <w:t xml:space="preserve">(</w:t>
+      </w:r>
+      <w:r>
+        <w:t xml:space="preserve">“find your state”</w:t>
+      </w:r>
+      <w:r>
+        <w:t xml:space="preserve">); Challenge promo posts -&gt;</w:t>
+      </w:r>
+      <w:r>
+        <w:t xml:space="preserve"> </w:t>
+      </w:r>
+      <w:r>
+        <w:rPr>
+          <w:b/>
+          <w:bCs/>
+        </w:rPr>
+        <w:t xml:space="preserve">join the Challenge</w:t>
+      </w:r>
+      <w:r>
+        <w:t xml:space="preserve">. Engagement-first posts earn the comment first. Stories run alongside daily: the</w:t>
       </w:r>
       <w:r>
         <w:t xml:space="preserve"> </w:t>
@@ -2828,8 +3246,8 @@
         <w:t xml:space="preserve">mini-quiz, polls, behind-the-scenes reads.</w:t>
       </w:r>
     </w:p>
-    <w:bookmarkEnd w:id="21"/>
-    <w:bookmarkStart w:id="22" w:name="atomisation-volume-without-more-thinking"/>
+    <w:bookmarkEnd w:id="22"/>
+    <w:bookmarkStart w:id="23" w:name="atomisation-volume-without-more-thinking"/>
     <w:p>
       <w:pPr>
         <w:pStyle w:val="Heading2"/>
@@ -2926,8 +3344,8 @@
         <w:t xml:space="preserve">in the DM. Think in ideas, not posts. One strong read should feed most of a week.</w:t>
       </w:r>
     </w:p>
-    <w:bookmarkEnd w:id="22"/>
-    <w:bookmarkStart w:id="23" w:name="face-format-reach"/>
+    <w:bookmarkEnd w:id="23"/>
+    <w:bookmarkStart w:id="24" w:name="face-format-reach"/>
     <w:p>
       <w:pPr>
         <w:pStyle w:val="Heading2"/>
@@ -2989,8 +3407,8 @@
         <w:t xml:space="preserve">; static is for proof and quotes, not the whole feed.</w:t>
       </w:r>
     </w:p>
-    <w:bookmarkEnd w:id="23"/>
-    <w:bookmarkStart w:id="24" w:name="turn-engagement-into-an-ad-engine"/>
+    <w:bookmarkEnd w:id="24"/>
+    <w:bookmarkStart w:id="25" w:name="turn-engagement-into-an-ad-engine"/>
     <w:p>
       <w:pPr>
         <w:pStyle w:val="Heading2"/>
@@ -3023,8 +3441,8 @@
         <w:t xml:space="preserve">- retarget them with the Challenge. Free organic reach becomes cheap paid conversion; the organic and paid funnels feed each other.</w:t>
       </w:r>
     </w:p>
-    <w:bookmarkEnd w:id="24"/>
-    <w:bookmarkStart w:id="25" w:name="first-three-plays-to-test-next-2-3-weeks"/>
+    <w:bookmarkEnd w:id="25"/>
+    <w:bookmarkStart w:id="26" w:name="first-three-plays-to-test-next-2-3-weeks"/>
     <w:p>
       <w:pPr>
         <w:pStyle w:val="Heading2"/>
@@ -3039,107 +3457,6 @@
       </w:pPr>
       <w:r>
         <w:t xml:space="preserve">All three use the engine and funnel you already have:</w:t>
-      </w:r>
-    </w:p>
-    <w:p>
-      <w:pPr>
-        <w:pStyle w:val="Compact"/>
-        <w:numPr>
-          <w:ilvl w:val="0"/>
-          <w:numId w:val="1007"/>
-        </w:numPr>
-      </w:pPr>
-      <w:r>
-        <w:rPr>
-          <w:b/>
-          <w:bCs/>
-        </w:rPr>
-        <w:t xml:space="preserve">The Read</w:t>
-      </w:r>
-      <w:r>
-        <w:t xml:space="preserve"> </w:t>
-      </w:r>
-      <w:r>
-        <w:t xml:space="preserve">- the signature demo, weekly.</w:t>
-      </w:r>
-    </w:p>
-    <w:p>
-      <w:pPr>
-        <w:pStyle w:val="Compact"/>
-        <w:numPr>
-          <w:ilvl w:val="0"/>
-          <w:numId w:val="1007"/>
-        </w:numPr>
-      </w:pPr>
-      <w:r>
-        <w:rPr>
-          <w:b/>
-          <w:bCs/>
-        </w:rPr>
-        <w:t xml:space="preserve">State of the Data</w:t>
-      </w:r>
-      <w:r>
-        <w:t xml:space="preserve"> </w:t>
-      </w:r>
-      <w:r>
-        <w:t xml:space="preserve">- your own scorecard patterns as content.</w:t>
-      </w:r>
-    </w:p>
-    <w:p>
-      <w:pPr>
-        <w:pStyle w:val="Compact"/>
-        <w:numPr>
-          <w:ilvl w:val="0"/>
-          <w:numId w:val="1007"/>
-        </w:numPr>
-      </w:pPr>
-      <w:r>
-        <w:rPr>
-          <w:b/>
-          <w:bCs/>
-        </w:rPr>
-        <w:t xml:space="preserve">The personalised comment-to-DM read</w:t>
-      </w:r>
-      <w:r>
-        <w:t xml:space="preserve"> </w:t>
-      </w:r>
-      <w:r>
-        <w:t xml:space="preserve">- the upgraded lead mechanic.</w:t>
-      </w:r>
-    </w:p>
-    <w:p>
-      <w:pPr>
-        <w:pStyle w:val="FirstParagraph"/>
-      </w:pPr>
-      <w:r>
-        <w:t xml:space="preserve">Run against the current style for 2-3 weeks; let the numbers pick winners, then double down.</w:t>
-      </w:r>
-    </w:p>
-    <w:p>
-      <w:r>
-        <w:pict>
-          <v:rect style="width:0;height:1.5pt" o:hralign="center" o:hrstd="t" o:hr="t"/>
-        </w:pict>
-      </w:r>
-    </w:p>
-    <w:bookmarkEnd w:id="25"/>
-    <w:bookmarkEnd w:id="26"/>
-    <w:bookmarkStart w:id="31" w:name="part-iii---standards-measurement"/>
-    <w:p>
-      <w:pPr>
-        <w:pStyle w:val="Heading1"/>
-      </w:pPr>
-      <w:r>
-        <w:t xml:space="preserve">PART III - STANDARDS &amp; MEASUREMENT</w:t>
-      </w:r>
-    </w:p>
-    <w:bookmarkStart w:id="27" w:name="voice-design-rules"/>
-    <w:p>
-      <w:pPr>
-        <w:pStyle w:val="Heading2"/>
-      </w:pPr>
-      <w:r>
-        <w:t xml:space="preserve">16. Voice &amp; design rules</w:t>
       </w:r>
     </w:p>
     <w:p>
@@ -3155,25 +3472,13 @@
           <w:b/>
           <w:bCs/>
         </w:rPr>
-        <w:t xml:space="preserve">Voice:</w:t>
-      </w:r>
-      <w:r>
-        <w:t xml:space="preserve"> </w:t>
-      </w:r>
-      <w:r>
-        <w:t xml:space="preserve">interpretation-led, calm authority, no hype. Contractions, varied rhythm, read-aloud test. Fat-loss-explicit framing. No</w:t>
-      </w:r>
-      <w:r>
-        <w:t xml:space="preserve"> </w:t>
-      </w:r>
-      <w:r>
-        <w:t xml:space="preserve">“tips”</w:t>
-      </w:r>
-      <w:r>
-        <w:t xml:space="preserve"> </w:t>
-      </w:r>
-      <w:r>
-        <w:t xml:space="preserve">content - always the read underneath.</w:t>
+        <w:t xml:space="preserve">The Read</w:t>
+      </w:r>
+      <w:r>
+        <w:t xml:space="preserve"> </w:t>
+      </w:r>
+      <w:r>
+        <w:t xml:space="preserve">- the signature demo, weekly.</w:t>
       </w:r>
     </w:p>
     <w:p>
@@ -3189,13 +3494,13 @@
           <w:b/>
           <w:bCs/>
         </w:rPr>
-        <w:t xml:space="preserve">No em dashes</w:t>
-      </w:r>
-      <w:r>
-        <w:t xml:space="preserve"> </w:t>
-      </w:r>
-      <w:r>
-        <w:t xml:space="preserve">(house style) - hyphens or rewrites.</w:t>
+        <w:t xml:space="preserve">State of the Data</w:t>
+      </w:r>
+      <w:r>
+        <w:t xml:space="preserve"> </w:t>
+      </w:r>
+      <w:r>
+        <w:t xml:space="preserve">- your own scorecard patterns as content.</w:t>
       </w:r>
     </w:p>
     <w:p>
@@ -3211,466 +3516,48 @@
           <w:b/>
           <w:bCs/>
         </w:rPr>
-        <w:t xml:space="preserve">Design:</w:t>
-      </w:r>
-      <w:r>
-        <w:t xml:space="preserve"> </w:t>
-      </w:r>
-      <w:r>
-        <w:t xml:space="preserve">Pure White / Graphite / Signal Blue (#1B6DFC). Social assets 1080x1350 (4:5); reels 9:16; 96px safe margins. All photos of Kade in BR graphics render</w:t>
-      </w:r>
-      <w:r>
-        <w:t xml:space="preserve"> </w:t>
-      </w:r>
-      <w:r>
-        <w:rPr>
-          <w:b/>
-          <w:bCs/>
-        </w:rPr>
-        <w:t xml:space="preserve">greyscale</w:t>
-      </w:r>
-      <w:r>
-        <w:t xml:space="preserve">, never colour.</w:t>
-      </w:r>
-    </w:p>
-    <w:p>
-      <w:pPr>
-        <w:pStyle w:val="Compact"/>
-        <w:numPr>
-          <w:ilvl w:val="0"/>
-          <w:numId w:val="1008"/>
-        </w:numPr>
-      </w:pPr>
-      <w:r>
-        <w:t xml:space="preserve">Kade’s public byline title:</w:t>
-      </w:r>
-      <w:r>
-        <w:t xml:space="preserve"> </w:t>
-      </w:r>
-      <w:r>
-        <w:rPr>
-          <w:b/>
-          <w:bCs/>
-        </w:rPr>
-        <w:t xml:space="preserve">“Sports Scientist”</w:t>
-      </w:r>
-      <w:r>
-        <w:t xml:space="preserve"> </w:t>
-      </w:r>
-      <w:r>
-        <w:t xml:space="preserve">(not</w:t>
-      </w:r>
-      <w:r>
-        <w:t xml:space="preserve"> </w:t>
-      </w:r>
-      <w:r>
-        <w:t xml:space="preserve">“Exercise Scientist”</w:t>
-      </w:r>
-      <w:r>
-        <w:t xml:space="preserve">).</w:t>
-      </w:r>
-    </w:p>
+        <w:t xml:space="preserve">The personalised comment-to-DM read</w:t>
+      </w:r>
+      <w:r>
+        <w:t xml:space="preserve"> </w:t>
+      </w:r>
+      <w:r>
+        <w:t xml:space="preserve">- the upgraded lead mechanic.</w:t>
+      </w:r>
+    </w:p>
+    <w:p>
+      <w:pPr>
+        <w:pStyle w:val="FirstParagraph"/>
+      </w:pPr>
+      <w:r>
+        <w:t xml:space="preserve">Run against the current style for 2-3 weeks; let the numbers pick winners, then double down.</w:t>
+      </w:r>
+    </w:p>
+    <w:p>
+      <w:r>
+        <w:pict>
+          <v:rect style="width:0;height:1.5pt" o:hralign="center" o:hrstd="t" o:hr="t"/>
+        </w:pict>
+      </w:r>
+    </w:p>
+    <w:bookmarkEnd w:id="26"/>
     <w:bookmarkEnd w:id="27"/>
-    <w:bookmarkStart w:id="28" w:name="messaging-rules-do-dont"/>
+    <w:bookmarkStart w:id="32" w:name="part-iii---standards-measurement"/>
+    <w:p>
+      <w:pPr>
+        <w:pStyle w:val="Heading1"/>
+      </w:pPr>
+      <w:r>
+        <w:t xml:space="preserve">PART III - STANDARDS &amp; MEASUREMENT</w:t>
+      </w:r>
+    </w:p>
+    <w:bookmarkStart w:id="28" w:name="voice-design-rules"/>
     <w:p>
       <w:pPr>
         <w:pStyle w:val="Heading2"/>
       </w:pPr>
       <w:r>
-        <w:t xml:space="preserve">17. Messaging rules (do / don’t)</w:t>
-      </w:r>
-    </w:p>
-    <w:p>
-      <w:pPr>
-        <w:pStyle w:val="FirstParagraph"/>
-      </w:pPr>
-      <w:r>
-        <w:rPr>
-          <w:b/>
-          <w:bCs/>
-        </w:rPr>
-        <w:t xml:space="preserve">Do:</w:t>
-      </w:r>
-      <w:r>
-        <w:t xml:space="preserve"> </w:t>
-      </w:r>
-      <w:r>
-        <w:t xml:space="preserve">lead with the stuck feeling; name the state;</w:t>
-      </w:r>
-      <w:r>
-        <w:t xml:space="preserve"> </w:t>
-      </w:r>
-      <w:r>
-        <w:rPr>
-          <w:b/>
-          <w:bCs/>
-        </w:rPr>
-        <w:t xml:space="preserve">write sharp enough to catch the high performer who self-scores</w:t>
-      </w:r>
-      <w:r>
-        <w:rPr>
-          <w:b/>
-          <w:bCs/>
-        </w:rPr>
-        <w:t xml:space="preserve"> </w:t>
-      </w:r>
-      <w:r>
-        <w:rPr>
-          <w:b/>
-          <w:bCs/>
-        </w:rPr>
-        <w:t xml:space="preserve">“fine, just stuck”</w:t>
-      </w:r>
-      <w:r>
-        <w:rPr>
-          <w:b/>
-          <w:bCs/>
-        </w:rPr>
-        <w:t xml:space="preserve"> </w:t>
-      </w:r>
-      <w:r>
-        <w:rPr>
-          <w:b/>
-          <w:bCs/>
-        </w:rPr>
-        <w:t xml:space="preserve">but is clinically Depleted</w:t>
-      </w:r>
-      <w:r>
-        <w:t xml:space="preserve"> </w:t>
-      </w:r>
-      <w:r>
-        <w:t xml:space="preserve">(the scorecard underestimates depletion - do not soft-pedal); make the</w:t>
-      </w:r>
-      <w:r>
-        <w:t xml:space="preserve"> </w:t>
-      </w:r>
-      <w:r>
-        <w:rPr>
-          <w:b/>
-          <w:bCs/>
-        </w:rPr>
-        <w:t xml:space="preserve">Challenge landing page</w:t>
-      </w:r>
-      <w:r>
-        <w:t xml:space="preserve"> </w:t>
-      </w:r>
-      <w:r>
-        <w:t xml:space="preserve">the destination; use proof (real trajectories, with consent); keep the read ahead of the prescription; prove you can read people rather than teach them.</w:t>
-      </w:r>
-    </w:p>
-    <w:p>
-      <w:pPr>
-        <w:pStyle w:val="BodyText"/>
-      </w:pPr>
-      <w:r>
-        <w:rPr>
-          <w:b/>
-          <w:bCs/>
-        </w:rPr>
-        <w:t xml:space="preserve">Don’t:</w:t>
-      </w:r>
-      <w:r>
-        <w:t xml:space="preserve"> </w:t>
-      </w:r>
-      <w:r>
-        <w:t xml:space="preserve">open cold with doctrine vocabulary; sell the Blueprint/coaching before the Scorecard; run reels/video in cold-paid ad sets; use colour photos of Kade in BR graphics; ask one post to both earn engagement and drive a click; blur into the coach-licensing (Collective) audience.</w:t>
-      </w:r>
-    </w:p>
-    <w:p>
-      <w:pPr>
-        <w:pStyle w:val="BodyText"/>
-      </w:pPr>
-      <w:r>
-        <w:rPr>
-          <w:b/>
-          <w:bCs/>
-        </w:rPr>
-        <w:t xml:space="preserve">Never say or do:</w:t>
-      </w:r>
-      <w:r>
-        <w:t xml:space="preserve"> </w:t>
-      </w:r>
-      <w:r>
-        <w:t xml:space="preserve">fitness clichés (</w:t>
-      </w:r>
-      <w:r>
-        <w:t xml:space="preserve">“crush it”</w:t>
-      </w:r>
-      <w:r>
-        <w:t xml:space="preserve">,</w:t>
-      </w:r>
-      <w:r>
-        <w:t xml:space="preserve"> </w:t>
-      </w:r>
-      <w:r>
-        <w:t xml:space="preserve">“no excuses”</w:t>
-      </w:r>
-      <w:r>
-        <w:t xml:space="preserve">,</w:t>
-      </w:r>
-      <w:r>
-        <w:t xml:space="preserve"> </w:t>
-      </w:r>
-      <w:r>
-        <w:t xml:space="preserve">“grind”</w:t>
-      </w:r>
-      <w:r>
-        <w:t xml:space="preserve">,</w:t>
-      </w:r>
-      <w:r>
-        <w:t xml:space="preserve"> </w:t>
-      </w:r>
-      <w:r>
-        <w:t xml:space="preserve">“hustle”</w:t>
-      </w:r>
-      <w:r>
-        <w:t xml:space="preserve">); blame the client for biological symptoms; shame or guilt messaging; hype or exaggerated promises; long-winded clinical explanations; direct selling (always guide, never push).</w:t>
-      </w:r>
-    </w:p>
-    <w:p>
-      <w:pPr>
-        <w:pStyle w:val="BodyText"/>
-      </w:pPr>
-      <w:r>
-        <w:rPr>
-          <w:b/>
-          <w:bCs/>
-        </w:rPr>
-        <w:t xml:space="preserve">CTA rules:</w:t>
-      </w:r>
-      <w:r>
-        <w:t xml:space="preserve"> </w:t>
-      </w:r>
-      <w:r>
-        <w:t xml:space="preserve">Instagram =</w:t>
-      </w:r>
-      <w:r>
-        <w:t xml:space="preserve"> </w:t>
-      </w:r>
-      <w:r>
-        <w:rPr>
-          <w:b/>
-          <w:bCs/>
-        </w:rPr>
-        <w:t xml:space="preserve">one CTA per post</w:t>
-      </w:r>
-      <w:r>
-        <w:t xml:space="preserve">, and it’s</w:t>
-      </w:r>
-      <w:r>
-        <w:t xml:space="preserve"> </w:t>
-      </w:r>
-      <w:r>
-        <w:t xml:space="preserve">“join the Challenge”</w:t>
-      </w:r>
-      <w:r>
-        <w:t xml:space="preserve"> </w:t>
-      </w:r>
-      <w:r>
-        <w:t xml:space="preserve">(the free 14-day Challenge landing page - one job per post). LinkedIn = CTA every</w:t>
-      </w:r>
-      <w:r>
-        <w:t xml:space="preserve"> </w:t>
-      </w:r>
-      <w:r>
-        <w:rPr>
-          <w:b/>
-          <w:bCs/>
-        </w:rPr>
-        <w:t xml:space="preserve">4-5 posts only</w:t>
-      </w:r>
-      <w:r>
-        <w:t xml:space="preserve">; most posts build credibility without selling.</w:t>
-      </w:r>
-    </w:p>
-    <w:p>
-      <w:pPr>
-        <w:pStyle w:val="BodyText"/>
-      </w:pPr>
-      <w:r>
-        <w:rPr>
-          <w:b/>
-          <w:bCs/>
-        </w:rPr>
-        <w:t xml:space="preserve">Every post follows the 5-step frame:</w:t>
-      </w:r>
-      <w:r>
-        <w:t xml:space="preserve"> </w:t>
-      </w:r>
-      <w:r>
-        <w:t xml:space="preserve">(1)</w:t>
-      </w:r>
-      <w:r>
-        <w:t xml:space="preserve"> </w:t>
-      </w:r>
-      <w:r>
-        <w:rPr>
-          <w:b/>
-          <w:bCs/>
-        </w:rPr>
-        <w:t xml:space="preserve">Insight</w:t>
-      </w:r>
-      <w:r>
-        <w:t xml:space="preserve"> </w:t>
-      </w:r>
-      <w:r>
-        <w:t xml:space="preserve">- the physiological truth; (2)</w:t>
-      </w:r>
-      <w:r>
-        <w:t xml:space="preserve"> </w:t>
-      </w:r>
-      <w:r>
-        <w:rPr>
-          <w:b/>
-          <w:bCs/>
-        </w:rPr>
-        <w:t xml:space="preserve">Signal</w:t>
-      </w:r>
-      <w:r>
-        <w:t xml:space="preserve"> </w:t>
-      </w:r>
-      <w:r>
-        <w:t xml:space="preserve">- what it means for them; (3)</w:t>
-      </w:r>
-      <w:r>
-        <w:t xml:space="preserve"> </w:t>
-      </w:r>
-      <w:r>
-        <w:rPr>
-          <w:b/>
-          <w:bCs/>
-        </w:rPr>
-        <w:t xml:space="preserve">Shift</w:t>
-      </w:r>
-      <w:r>
-        <w:t xml:space="preserve"> </w:t>
-      </w:r>
-      <w:r>
-        <w:t xml:space="preserve">- reframe their understanding; (4)</w:t>
-      </w:r>
-      <w:r>
-        <w:t xml:space="preserve"> </w:t>
-      </w:r>
-      <w:r>
-        <w:rPr>
-          <w:b/>
-          <w:bCs/>
-        </w:rPr>
-        <w:t xml:space="preserve">Solution</w:t>
-      </w:r>
-      <w:r>
-        <w:t xml:space="preserve"> </w:t>
-      </w:r>
-      <w:r>
-        <w:t xml:space="preserve">- the Body Recode system or action; (5)</w:t>
-      </w:r>
-      <w:r>
-        <w:t xml:space="preserve"> </w:t>
-      </w:r>
-      <w:r>
-        <w:rPr>
-          <w:b/>
-          <w:bCs/>
-        </w:rPr>
-        <w:t xml:space="preserve">Momentum</w:t>
-      </w:r>
-      <w:r>
-        <w:t xml:space="preserve"> </w:t>
-      </w:r>
-      <w:r>
-        <w:t xml:space="preserve">- end with clarity or direction. It must make them</w:t>
-      </w:r>
-      <w:r>
-        <w:t xml:space="preserve"> </w:t>
-      </w:r>
-      <w:r>
-        <w:rPr>
-          <w:b/>
-          <w:bCs/>
-        </w:rPr>
-        <w:t xml:space="preserve">feel</w:t>
-      </w:r>
-      <w:r>
-        <w:t xml:space="preserve"> </w:t>
-      </w:r>
-      <w:r>
-        <w:rPr>
-          <w:i/>
-          <w:iCs/>
-        </w:rPr>
-        <w:t xml:space="preserve">“finally, someone gets it,”</w:t>
-      </w:r>
-      <w:r>
-        <w:t xml:space="preserve"> </w:t>
-      </w:r>
-      <w:r>
-        <w:t xml:space="preserve">then</w:t>
-      </w:r>
-      <w:r>
-        <w:t xml:space="preserve"> </w:t>
-      </w:r>
-      <w:r>
-        <w:rPr>
-          <w:b/>
-          <w:bCs/>
-        </w:rPr>
-        <w:t xml:space="preserve">think</w:t>
-      </w:r>
-      <w:r>
-        <w:t xml:space="preserve"> </w:t>
-      </w:r>
-      <w:r>
-        <w:rPr>
-          <w:i/>
-          <w:iCs/>
-        </w:rPr>
-        <w:t xml:space="preserve">“I need to join that challenge.”</w:t>
-      </w:r>
-    </w:p>
-    <w:p>
-      <w:pPr>
-        <w:pStyle w:val="BodyText"/>
-      </w:pPr>
-      <w:r>
-        <w:rPr>
-          <w:b/>
-          <w:bCs/>
-        </w:rPr>
-        <w:t xml:space="preserve">Tone (6 principles):</w:t>
-      </w:r>
-      <w:r>
-        <w:t xml:space="preserve"> </w:t>
-      </w:r>
-      <w:r>
-        <w:t xml:space="preserve">intelligent not complicated · confident not arrogant · direct not blunt · warm not soft · scientific not clinical · forward-thinking not abstract.</w:t>
-      </w:r>
-    </w:p>
-    <w:bookmarkEnd w:id="28"/>
-    <w:bookmarkStart w:id="29" w:name="what-we-measure"/>
-    <w:p>
-      <w:pPr>
-        <w:pStyle w:val="Heading2"/>
-      </w:pPr>
-      <w:r>
-        <w:t xml:space="preserve">18. What we measure</w:t>
-      </w:r>
-    </w:p>
-    <w:p>
-      <w:pPr>
-        <w:pStyle w:val="FirstParagraph"/>
-      </w:pPr>
-      <w:r>
-        <w:t xml:space="preserve">Comments + saves + shares (real engagement), DM keyword captures, scorecard starts, and the earliest broken gate in the reach -&gt; save -&gt; profile -&gt; scorecard path. Not likes. We buy self-recognition and captured leads, not applause.</w:t>
-      </w:r>
-    </w:p>
-    <w:bookmarkEnd w:id="29"/>
-    <w:bookmarkStart w:id="30" w:name="build-dependencies"/>
-    <w:p>
-      <w:pPr>
-        <w:pStyle w:val="Heading2"/>
-      </w:pPr>
-      <w:r>
-        <w:t xml:space="preserve">19. Build dependencies</w:t>
+        <w:t xml:space="preserve">16. Voice &amp; design rules</w:t>
       </w:r>
     </w:p>
     <w:p>
@@ -3686,13 +3573,25 @@
           <w:b/>
           <w:bCs/>
         </w:rPr>
-        <w:t xml:space="preserve">Voice-of-customer swipe file</w:t>
-      </w:r>
-      <w:r>
-        <w:t xml:space="preserve"> </w:t>
-      </w:r>
-      <w:r>
-        <w:t xml:space="preserve">- mine real phrases from scorecard answers + DMs. (Buildable on our side.)</w:t>
+        <w:t xml:space="preserve">Voice:</w:t>
+      </w:r>
+      <w:r>
+        <w:t xml:space="preserve"> </w:t>
+      </w:r>
+      <w:r>
+        <w:t xml:space="preserve">interpretation-led, calm authority, no hype. Contractions, varied rhythm, read-aloud test. Fat-loss-explicit framing. No</w:t>
+      </w:r>
+      <w:r>
+        <w:t xml:space="preserve"> </w:t>
+      </w:r>
+      <w:r>
+        <w:t xml:space="preserve">“tips”</w:t>
+      </w:r>
+      <w:r>
+        <w:t xml:space="preserve"> </w:t>
+      </w:r>
+      <w:r>
+        <w:t xml:space="preserve">content - always the read underneath.</w:t>
       </w:r>
     </w:p>
     <w:p>
@@ -3708,13 +3607,13 @@
           <w:b/>
           <w:bCs/>
         </w:rPr>
-        <w:t xml:space="preserve">Personalised-read DM flows</w:t>
-      </w:r>
-      <w:r>
-        <w:t xml:space="preserve"> </w:t>
-      </w:r>
-      <w:r>
-        <w:t xml:space="preserve">in ManyChat - Kade builds, spec provided.</w:t>
+        <w:t xml:space="preserve">No em dashes</w:t>
+      </w:r>
+      <w:r>
+        <w:t xml:space="preserve"> </w:t>
+      </w:r>
+      <w:r>
+        <w:t xml:space="preserve">(house style) - hyphens or rewrites.</w:t>
       </w:r>
     </w:p>
     <w:p>
@@ -3730,13 +3629,26 @@
           <w:b/>
           <w:bCs/>
         </w:rPr>
-        <w:t xml:space="preserve">Leads webhook</w:t>
-      </w:r>
-      <w:r>
-        <w:t xml:space="preserve"> </w:t>
-      </w:r>
-      <w:r>
-        <w:t xml:space="preserve">- ManyChat -&gt; dashboard, leads tagged by keyword. (Buildable on our side.)</w:t>
+        <w:t xml:space="preserve">Design:</w:t>
+      </w:r>
+      <w:r>
+        <w:t xml:space="preserve"> </w:t>
+      </w:r>
+      <w:r>
+        <w:t xml:space="preserve">Pure White / Graphite / Signal Blue (#1B6DFC). Social assets 1080x1350 (4:5); reels 9:16; 96px safe margins. All photos of Kade in BR graphics render</w:t>
+      </w:r>
+      <w:r>
+        <w:t xml:space="preserve"> </w:t>
+      </w:r>
+      <w:r>
+        <w:rPr>
+          <w:b/>
+          <w:bCs/>
+        </w:rPr>
+        <w:t xml:space="preserve">greyscale</w:t>
+      </w:r>
+      <w:r>
+        <w:t xml:space="preserve">, never colour.</w:t>
       </w:r>
     </w:p>
     <w:p>
@@ -3748,17 +3660,453 @@
         </w:numPr>
       </w:pPr>
       <w:r>
-        <w:rPr>
-          <w:b/>
-          <w:bCs/>
-        </w:rPr>
-        <w:t xml:space="preserve">Reels / face</w:t>
-      </w:r>
-      <w:r>
-        <w:t xml:space="preserve"> </w:t>
-      </w:r>
-      <w:r>
-        <w:t xml:space="preserve">- Kade films, or HeyGen scales it.</w:t>
+        <w:t xml:space="preserve">Kade’s public byline title:</w:t>
+      </w:r>
+      <w:r>
+        <w:t xml:space="preserve"> </w:t>
+      </w:r>
+      <w:r>
+        <w:rPr>
+          <w:b/>
+          <w:bCs/>
+        </w:rPr>
+        <w:t xml:space="preserve">“Sports Scientist”</w:t>
+      </w:r>
+      <w:r>
+        <w:t xml:space="preserve"> </w:t>
+      </w:r>
+      <w:r>
+        <w:t xml:space="preserve">(not</w:t>
+      </w:r>
+      <w:r>
+        <w:t xml:space="preserve"> </w:t>
+      </w:r>
+      <w:r>
+        <w:t xml:space="preserve">“Exercise Scientist”</w:t>
+      </w:r>
+      <w:r>
+        <w:t xml:space="preserve">).</w:t>
+      </w:r>
+    </w:p>
+    <w:bookmarkEnd w:id="28"/>
+    <w:bookmarkStart w:id="29" w:name="messaging-rules-do-dont"/>
+    <w:p>
+      <w:pPr>
+        <w:pStyle w:val="Heading2"/>
+      </w:pPr>
+      <w:r>
+        <w:t xml:space="preserve">17. Messaging rules (do / don’t)</w:t>
+      </w:r>
+    </w:p>
+    <w:p>
+      <w:pPr>
+        <w:pStyle w:val="FirstParagraph"/>
+      </w:pPr>
+      <w:r>
+        <w:rPr>
+          <w:b/>
+          <w:bCs/>
+        </w:rPr>
+        <w:t xml:space="preserve">Do:</w:t>
+      </w:r>
+      <w:r>
+        <w:t xml:space="preserve"> </w:t>
+      </w:r>
+      <w:r>
+        <w:t xml:space="preserve">lead with the stuck feeling; name the state;</w:t>
+      </w:r>
+      <w:r>
+        <w:t xml:space="preserve"> </w:t>
+      </w:r>
+      <w:r>
+        <w:rPr>
+          <w:b/>
+          <w:bCs/>
+        </w:rPr>
+        <w:t xml:space="preserve">write sharp enough to catch the high performer who self-scores</w:t>
+      </w:r>
+      <w:r>
+        <w:rPr>
+          <w:b/>
+          <w:bCs/>
+        </w:rPr>
+        <w:t xml:space="preserve"> </w:t>
+      </w:r>
+      <w:r>
+        <w:rPr>
+          <w:b/>
+          <w:bCs/>
+        </w:rPr>
+        <w:t xml:space="preserve">“fine, just stuck”</w:t>
+      </w:r>
+      <w:r>
+        <w:rPr>
+          <w:b/>
+          <w:bCs/>
+        </w:rPr>
+        <w:t xml:space="preserve"> </w:t>
+      </w:r>
+      <w:r>
+        <w:rPr>
+          <w:b/>
+          <w:bCs/>
+        </w:rPr>
+        <w:t xml:space="preserve">but is clinically Depleted</w:t>
+      </w:r>
+      <w:r>
+        <w:t xml:space="preserve"> </w:t>
+      </w:r>
+      <w:r>
+        <w:t xml:space="preserve">(the scorecard underestimates depletion - do not soft-pedal); match the CTA to the post type (doctrine -&gt; scorecard, promo -&gt; Challenge); use proof (real trajectories, with consent); keep the read ahead of the prescription; prove you can read people rather than teach them.</w:t>
+      </w:r>
+    </w:p>
+    <w:p>
+      <w:pPr>
+        <w:pStyle w:val="BodyText"/>
+      </w:pPr>
+      <w:r>
+        <w:rPr>
+          <w:b/>
+          <w:bCs/>
+        </w:rPr>
+        <w:t xml:space="preserve">Don’t:</w:t>
+      </w:r>
+      <w:r>
+        <w:t xml:space="preserve"> </w:t>
+      </w:r>
+      <w:r>
+        <w:t xml:space="preserve">open cold with doctrine vocabulary; sell the Blueprint/coaching before the Scorecard; run reels/video in cold-paid ad sets; use colour photos of Kade in BR graphics; ask one post to both earn engagement and drive a click; blur into the coach-licensing (Collective) audience.</w:t>
+      </w:r>
+    </w:p>
+    <w:p>
+      <w:pPr>
+        <w:pStyle w:val="BodyText"/>
+      </w:pPr>
+      <w:r>
+        <w:rPr>
+          <w:b/>
+          <w:bCs/>
+        </w:rPr>
+        <w:t xml:space="preserve">Never say or do:</w:t>
+      </w:r>
+      <w:r>
+        <w:t xml:space="preserve"> </w:t>
+      </w:r>
+      <w:r>
+        <w:t xml:space="preserve">fitness clichés (</w:t>
+      </w:r>
+      <w:r>
+        <w:t xml:space="preserve">“crush it”</w:t>
+      </w:r>
+      <w:r>
+        <w:t xml:space="preserve">,</w:t>
+      </w:r>
+      <w:r>
+        <w:t xml:space="preserve"> </w:t>
+      </w:r>
+      <w:r>
+        <w:t xml:space="preserve">“no excuses”</w:t>
+      </w:r>
+      <w:r>
+        <w:t xml:space="preserve">,</w:t>
+      </w:r>
+      <w:r>
+        <w:t xml:space="preserve"> </w:t>
+      </w:r>
+      <w:r>
+        <w:t xml:space="preserve">“grind”</w:t>
+      </w:r>
+      <w:r>
+        <w:t xml:space="preserve">,</w:t>
+      </w:r>
+      <w:r>
+        <w:t xml:space="preserve"> </w:t>
+      </w:r>
+      <w:r>
+        <w:t xml:space="preserve">“hustle”</w:t>
+      </w:r>
+      <w:r>
+        <w:t xml:space="preserve">); blame the client for biological symptoms; shame or guilt messaging; hype or exaggerated promises; long-winded clinical explanations; direct selling (always guide, never push).</w:t>
+      </w:r>
+    </w:p>
+    <w:p>
+      <w:pPr>
+        <w:pStyle w:val="BodyText"/>
+      </w:pPr>
+      <w:r>
+        <w:rPr>
+          <w:b/>
+          <w:bCs/>
+        </w:rPr>
+        <w:t xml:space="preserve">CTA rules:</w:t>
+      </w:r>
+      <w:r>
+        <w:t xml:space="preserve"> </w:t>
+      </w:r>
+      <w:r>
+        <w:t xml:space="preserve">Instagram =</w:t>
+      </w:r>
+      <w:r>
+        <w:t xml:space="preserve"> </w:t>
+      </w:r>
+      <w:r>
+        <w:rPr>
+          <w:b/>
+          <w:bCs/>
+        </w:rPr>
+        <w:t xml:space="preserve">one CTA per post, matched to type</w:t>
+      </w:r>
+      <w:r>
+        <w:t xml:space="preserve">: doctrine/engagement -&gt;</w:t>
+      </w:r>
+      <w:r>
+        <w:t xml:space="preserve"> </w:t>
+      </w:r>
+      <w:r>
+        <w:t xml:space="preserve">“find your state, take the scorecard”</w:t>
+      </w:r>
+      <w:r>
+        <w:t xml:space="preserve"> </w:t>
+      </w:r>
+      <w:r>
+        <w:t xml:space="preserve">(standalone scorecard); Challenge promo -&gt;</w:t>
+      </w:r>
+      <w:r>
+        <w:t xml:space="preserve"> </w:t>
+      </w:r>
+      <w:r>
+        <w:t xml:space="preserve">“join the free 14-day Challenge”</w:t>
+      </w:r>
+      <w:r>
+        <w:t xml:space="preserve"> </w:t>
+      </w:r>
+      <w:r>
+        <w:t xml:space="preserve">(Challenge landing page). One job per post. LinkedIn = CTA every</w:t>
+      </w:r>
+      <w:r>
+        <w:t xml:space="preserve"> </w:t>
+      </w:r>
+      <w:r>
+        <w:rPr>
+          <w:b/>
+          <w:bCs/>
+        </w:rPr>
+        <w:t xml:space="preserve">4-5 posts only</w:t>
+      </w:r>
+      <w:r>
+        <w:t xml:space="preserve">; most posts build credibility without selling.</w:t>
+      </w:r>
+    </w:p>
+    <w:p>
+      <w:pPr>
+        <w:pStyle w:val="BodyText"/>
+      </w:pPr>
+      <w:r>
+        <w:rPr>
+          <w:b/>
+          <w:bCs/>
+        </w:rPr>
+        <w:t xml:space="preserve">Every post follows the 5-step frame:</w:t>
+      </w:r>
+      <w:r>
+        <w:t xml:space="preserve"> </w:t>
+      </w:r>
+      <w:r>
+        <w:t xml:space="preserve">(1)</w:t>
+      </w:r>
+      <w:r>
+        <w:t xml:space="preserve"> </w:t>
+      </w:r>
+      <w:r>
+        <w:rPr>
+          <w:b/>
+          <w:bCs/>
+        </w:rPr>
+        <w:t xml:space="preserve">Insight</w:t>
+      </w:r>
+      <w:r>
+        <w:t xml:space="preserve"> </w:t>
+      </w:r>
+      <w:r>
+        <w:t xml:space="preserve">- the physiological truth; (2)</w:t>
+      </w:r>
+      <w:r>
+        <w:t xml:space="preserve"> </w:t>
+      </w:r>
+      <w:r>
+        <w:rPr>
+          <w:b/>
+          <w:bCs/>
+        </w:rPr>
+        <w:t xml:space="preserve">Signal</w:t>
+      </w:r>
+      <w:r>
+        <w:t xml:space="preserve"> </w:t>
+      </w:r>
+      <w:r>
+        <w:t xml:space="preserve">- what it means for them; (3)</w:t>
+      </w:r>
+      <w:r>
+        <w:t xml:space="preserve"> </w:t>
+      </w:r>
+      <w:r>
+        <w:rPr>
+          <w:b/>
+          <w:bCs/>
+        </w:rPr>
+        <w:t xml:space="preserve">Shift</w:t>
+      </w:r>
+      <w:r>
+        <w:t xml:space="preserve"> </w:t>
+      </w:r>
+      <w:r>
+        <w:t xml:space="preserve">- reframe their understanding; (4)</w:t>
+      </w:r>
+      <w:r>
+        <w:t xml:space="preserve"> </w:t>
+      </w:r>
+      <w:r>
+        <w:rPr>
+          <w:b/>
+          <w:bCs/>
+        </w:rPr>
+        <w:t xml:space="preserve">Solution</w:t>
+      </w:r>
+      <w:r>
+        <w:t xml:space="preserve"> </w:t>
+      </w:r>
+      <w:r>
+        <w:t xml:space="preserve">- the Body Recode system or action; (5)</w:t>
+      </w:r>
+      <w:r>
+        <w:t xml:space="preserve"> </w:t>
+      </w:r>
+      <w:r>
+        <w:rPr>
+          <w:b/>
+          <w:bCs/>
+        </w:rPr>
+        <w:t xml:space="preserve">Momentum</w:t>
+      </w:r>
+      <w:r>
+        <w:t xml:space="preserve"> </w:t>
+      </w:r>
+      <w:r>
+        <w:t xml:space="preserve">- end with clarity or direction. It must make them</w:t>
+      </w:r>
+      <w:r>
+        <w:t xml:space="preserve"> </w:t>
+      </w:r>
+      <w:r>
+        <w:rPr>
+          <w:b/>
+          <w:bCs/>
+        </w:rPr>
+        <w:t xml:space="preserve">feel</w:t>
+      </w:r>
+      <w:r>
+        <w:t xml:space="preserve"> </w:t>
+      </w:r>
+      <w:r>
+        <w:rPr>
+          <w:i/>
+          <w:iCs/>
+        </w:rPr>
+        <w:t xml:space="preserve">“finally, someone gets it,”</w:t>
+      </w:r>
+      <w:r>
+        <w:t xml:space="preserve"> </w:t>
+      </w:r>
+      <w:r>
+        <w:t xml:space="preserve">then</w:t>
+      </w:r>
+      <w:r>
+        <w:t xml:space="preserve"> </w:t>
+      </w:r>
+      <w:r>
+        <w:rPr>
+          <w:b/>
+          <w:bCs/>
+        </w:rPr>
+        <w:t xml:space="preserve">think</w:t>
+      </w:r>
+      <w:r>
+        <w:t xml:space="preserve"> </w:t>
+      </w:r>
+      <w:r>
+        <w:rPr>
+          <w:i/>
+          <w:iCs/>
+        </w:rPr>
+        <w:t xml:space="preserve">“I need to find my state”</w:t>
+      </w:r>
+      <w:r>
+        <w:t xml:space="preserve"> </w:t>
+      </w:r>
+      <w:r>
+        <w:t xml:space="preserve">(doctrine) or</w:t>
+      </w:r>
+      <w:r>
+        <w:t xml:space="preserve"> </w:t>
+      </w:r>
+      <w:r>
+        <w:rPr>
+          <w:i/>
+          <w:iCs/>
+        </w:rPr>
+        <w:t xml:space="preserve">“I need to join that challenge”</w:t>
+      </w:r>
+      <w:r>
+        <w:t xml:space="preserve"> </w:t>
+      </w:r>
+      <w:r>
+        <w:t xml:space="preserve">(promo).</w:t>
+      </w:r>
+    </w:p>
+    <w:p>
+      <w:pPr>
+        <w:pStyle w:val="BodyText"/>
+      </w:pPr>
+      <w:r>
+        <w:rPr>
+          <w:b/>
+          <w:bCs/>
+        </w:rPr>
+        <w:t xml:space="preserve">Tone (6 principles):</w:t>
+      </w:r>
+      <w:r>
+        <w:t xml:space="preserve"> </w:t>
+      </w:r>
+      <w:r>
+        <w:t xml:space="preserve">intelligent not complicated · confident not arrogant · direct not blunt · warm not soft · scientific not clinical · forward-thinking not abstract.</w:t>
+      </w:r>
+    </w:p>
+    <w:bookmarkEnd w:id="29"/>
+    <w:bookmarkStart w:id="30" w:name="what-we-measure"/>
+    <w:p>
+      <w:pPr>
+        <w:pStyle w:val="Heading2"/>
+      </w:pPr>
+      <w:r>
+        <w:t xml:space="preserve">18. What we measure</w:t>
+      </w:r>
+    </w:p>
+    <w:p>
+      <w:pPr>
+        <w:pStyle w:val="FirstParagraph"/>
+      </w:pPr>
+      <w:r>
+        <w:t xml:space="preserve">Comments + saves + shares (real engagement), DM keyword captures, scorecard starts, and the earliest broken gate in the reach -&gt; save -&gt; profile -&gt; scorecard path. Not likes. We buy self-recognition and captured leads, not applause.</w:t>
+      </w:r>
+    </w:p>
+    <w:bookmarkEnd w:id="30"/>
+    <w:bookmarkStart w:id="31" w:name="build-dependencies"/>
+    <w:p>
+      <w:pPr>
+        <w:pStyle w:val="Heading2"/>
+      </w:pPr>
+      <w:r>
+        <w:t xml:space="preserve">19. Build dependencies</w:t>
       </w:r>
     </w:p>
     <w:p>
@@ -3766,7 +4114,95 @@
         <w:pStyle w:val="Compact"/>
         <w:numPr>
           <w:ilvl w:val="0"/>
-          <w:numId w:val="1009"/>
+          <w:numId w:val="1010"/>
+        </w:numPr>
+      </w:pPr>
+      <w:r>
+        <w:rPr>
+          <w:b/>
+          <w:bCs/>
+        </w:rPr>
+        <w:t xml:space="preserve">Voice-of-customer swipe file</w:t>
+      </w:r>
+      <w:r>
+        <w:t xml:space="preserve"> </w:t>
+      </w:r>
+      <w:r>
+        <w:t xml:space="preserve">- mine real phrases from scorecard answers + DMs. (Buildable on our side.)</w:t>
+      </w:r>
+    </w:p>
+    <w:p>
+      <w:pPr>
+        <w:pStyle w:val="Compact"/>
+        <w:numPr>
+          <w:ilvl w:val="0"/>
+          <w:numId w:val="1010"/>
+        </w:numPr>
+      </w:pPr>
+      <w:r>
+        <w:rPr>
+          <w:b/>
+          <w:bCs/>
+        </w:rPr>
+        <w:t xml:space="preserve">Personalised-read DM flows</w:t>
+      </w:r>
+      <w:r>
+        <w:t xml:space="preserve"> </w:t>
+      </w:r>
+      <w:r>
+        <w:t xml:space="preserve">in ManyChat - Kade builds, spec provided.</w:t>
+      </w:r>
+    </w:p>
+    <w:p>
+      <w:pPr>
+        <w:pStyle w:val="Compact"/>
+        <w:numPr>
+          <w:ilvl w:val="0"/>
+          <w:numId w:val="1010"/>
+        </w:numPr>
+      </w:pPr>
+      <w:r>
+        <w:rPr>
+          <w:b/>
+          <w:bCs/>
+        </w:rPr>
+        <w:t xml:space="preserve">Leads webhook</w:t>
+      </w:r>
+      <w:r>
+        <w:t xml:space="preserve"> </w:t>
+      </w:r>
+      <w:r>
+        <w:t xml:space="preserve">- ManyChat -&gt; dashboard, leads tagged by keyword. (Buildable on our side.)</w:t>
+      </w:r>
+    </w:p>
+    <w:p>
+      <w:pPr>
+        <w:pStyle w:val="Compact"/>
+        <w:numPr>
+          <w:ilvl w:val="0"/>
+          <w:numId w:val="1010"/>
+        </w:numPr>
+      </w:pPr>
+      <w:r>
+        <w:rPr>
+          <w:b/>
+          <w:bCs/>
+        </w:rPr>
+        <w:t xml:space="preserve">Reels / face</w:t>
+      </w:r>
+      <w:r>
+        <w:t xml:space="preserve"> </w:t>
+      </w:r>
+      <w:r>
+        <w:t xml:space="preserve">- Kade films, or HeyGen scales it.</w:t>
+      </w:r>
+    </w:p>
+    <w:p>
+      <w:pPr>
+        <w:pStyle w:val="Compact"/>
+        <w:numPr>
+          <w:ilvl w:val="0"/>
+          <w:numId w:val="1010"/>
         </w:numPr>
       </w:pPr>
       <w:r>
@@ -3811,8 +4247,8 @@
         <w:t xml:space="preserve">The whole thing in one line: stop broadcasting information, start demonstrating that you can read the person the industry has given up on. That is the only thing that makes Body Recode different in the feed, so make it the entire show.</w:t>
       </w:r>
     </w:p>
-    <w:bookmarkEnd w:id="30"/>
     <w:bookmarkEnd w:id="31"/>
+    <w:bookmarkEnd w:id="32"/>
     <w:sectPr>
       <w:footnotePr>
         <w:numRestart w:val="eachSect"/>
@@ -4151,6 +4587,9 @@
     <w:abstractNumId w:val="991"/>
   </w:num>
   <w:num w:numId="1004">
+    <w:abstractNumId w:val="991"/>
+  </w:num>
+  <w:num w:numId="1005">
     <w:abstractNumId w:val="99411"/>
     <w:lvlOverride w:ilvl="0">
       <w:startOverride w:val="1"/>
@@ -4180,13 +4619,13 @@
       <w:startOverride w:val="1"/>
     </w:lvlOverride>
   </w:num>
-  <w:num w:numId="1005">
-    <w:abstractNumId w:val="991"/>
-  </w:num>
   <w:num w:numId="1006">
     <w:abstractNumId w:val="991"/>
   </w:num>
   <w:num w:numId="1007">
+    <w:abstractNumId w:val="991"/>
+  </w:num>
+  <w:num w:numId="1008">
     <w:abstractNumId w:val="99411"/>
     <w:lvlOverride w:ilvl="0">
       <w:startOverride w:val="1"/>
@@ -4216,10 +4655,10 @@
       <w:startOverride w:val="1"/>
     </w:lvlOverride>
   </w:num>
-  <w:num w:numId="1008">
+  <w:num w:numId="1009">
     <w:abstractNumId w:val="991"/>
   </w:num>
-  <w:num w:numId="1009">
+  <w:num w:numId="1010">
     <w:abstractNumId w:val="991"/>
   </w:num>
 </w:numbering>

</xml_diff>

<commit_message>
Reconcile the two conflicting weekly plans into one
The Weekly Action Plan (Organic tab) and Weekly Structure (Content System)
disagreed on Mon/Wed/Fri post types. Aligned both to one mapping: Mon
Authority / Tue Contrarian / Wed Pattern / Fri Coach / Sun Challenge Promo.
Sunday is now the weekly Challenge-promo slot (Door 2, 'join the free
14-day Challenge') instead of a scorecard CTA - so the week is 4 doctrine
(Door 1) + 1 promo (Door 2). Kept all the DM/engagement actions. Doc v2.6.

Co-Authored-By: Claude Opus 4.8 (1M context) <noreply@anthropic.com>
</commit_message>
<xml_diff>
--- a/public/docs/strategy/body-recode/body-recode-consumer-marketing-strategy-v1.docx
+++ b/public/docs/strategy/body-recode/body-recode-consumer-marketing-strategy-v1.docx
@@ -2936,7 +2936,8 @@
     <w:tbl>
       <w:tblPr>
         <w:tblStyle w:val="Table"/>
-        <w:tblW w:type="auto" w:w="0"/>
+        <w:tblW w:type="pct" w:w="5000"/>
+        <w:tblLayout w:type="fixed"/>
         <w:tblLook w:firstRow="1" w:lastRow="0" w:firstColumn="0" w:lastColumn="0" w:noHBand="0" w:noVBand="0" w:val="0020"/>
       </w:tblPr>
       <w:tblGrid>
@@ -3161,18 +3162,30 @@
                 <w:b/>
                 <w:bCs/>
               </w:rPr>
-              <w:t xml:space="preserve">Diagnostic / Funnel</w:t>
-            </w:r>
-          </w:p>
-        </w:tc>
-        <w:tc>
-          <w:tcPr/>
-          <w:p>
-            <w:pPr>
-              <w:pStyle w:val="Compact"/>
-            </w:pPr>
-            <w:r>
-              <w:t xml:space="preserve">The Read · comment-to-DM read</w:t>
+              <w:t xml:space="preserve">Challenge Promo (Door 2)</w:t>
+            </w:r>
+          </w:p>
+        </w:tc>
+        <w:tc>
+          <w:tcPr/>
+          <w:p>
+            <w:pPr>
+              <w:pStyle w:val="Compact"/>
+            </w:pPr>
+            <w:r>
+              <w:t xml:space="preserve">the weekly Challenge invite —</w:t>
+            </w:r>
+            <w:r>
+              <w:t xml:space="preserve"> </w:t>
+            </w:r>
+            <w:r>
+              <w:t xml:space="preserve">“join the free 14-day Challenge”</w:t>
+            </w:r>
+            <w:r>
+              <w:t xml:space="preserve"> </w:t>
+            </w:r>
+            <w:r>
+              <w:t xml:space="preserve">(wave-scarcity when a wave opens)</w:t>
             </w:r>
           </w:p>
         </w:tc>

</xml_diff>

<commit_message>
Evergreen ladder marketing model + calendar reshape
Kade confirmed all 3 funnel stages are evergreen (Challenge always-on,
Blueprint live 27 Jul, Membership ~7 Sep). Strategy doc now has section
4b (evergreen ladder): protect the cold->Challenge engine, Blueprint as
a warm-audience monetisation layer (Day-14 handoff + retargeting + ~1
post/wk), content as a permanent weekly loop with a rotating promo slot,
2->3 always-on ad campaigns. Sections 8b + 11 aligned to the rotating
promo. Rebuilt branded PDF (v2.7) + docx.

Calendar reshaped in DB (not in repo): 12 premature Membership posts
shifted +28d to 29 Aug-9 Sep (launch lands Mon 7 Sep); August's vacated
weekly slots backfilled with Blueprint-drive scaffold so Aug is a full
Blueprint-drive month.

Co-Authored-By: Claude Opus 4.8 (1M context) <noreply@anthropic.com>
</commit_message>
<xml_diff>
--- a/public/docs/strategy/body-recode/body-recode-consumer-marketing-strategy-v1.docx
+++ b/public/docs/strategy/body-recode/body-recode-consumer-marketing-strategy-v1.docx
@@ -81,7 +81,7 @@
       </w:r>
     </w:p>
     <w:bookmarkEnd w:id="9"/>
-    <w:bookmarkStart w:id="15" w:name="part-i---the-strategy-what-why"/>
+    <w:bookmarkStart w:id="16" w:name="part-i---the-strategy-what-why"/>
     <w:p>
       <w:pPr>
         <w:pStyle w:val="Heading1"/>
@@ -1153,7 +1153,592 @@
       </w:r>
     </w:p>
     <w:bookmarkEnd w:id="13"/>
-    <w:bookmarkStart w:id="14" w:name="how-this-brand-relates-to-the-others"/>
+    <w:bookmarkStart w:id="14" w:name="Xdb399976a74e5bc44135e62be7446d7ec3b379e"/>
+    <w:p>
+      <w:pPr>
+        <w:pStyle w:val="Heading2"/>
+      </w:pPr>
+      <w:r>
+        <w:t xml:space="preserve">4b. The evergreen ladder (always-on marketing model)</w:t>
+      </w:r>
+    </w:p>
+    <w:p>
+      <w:pPr>
+        <w:pStyle w:val="FirstParagraph"/>
+      </w:pPr>
+      <w:r>
+        <w:rPr>
+          <w:b/>
+          <w:bCs/>
+        </w:rPr>
+        <w:t xml:space="preserve">All three stages are evergreen. Nothing</w:t>
+      </w:r>
+      <w:r>
+        <w:rPr>
+          <w:b/>
+          <w:bCs/>
+        </w:rPr>
+        <w:t xml:space="preserve"> </w:t>
+      </w:r>
+      <w:r>
+        <w:rPr>
+          <w:b/>
+          <w:bCs/>
+        </w:rPr>
+        <w:t xml:space="preserve">“launches”</w:t>
+      </w:r>
+      <w:r>
+        <w:rPr>
+          <w:b/>
+          <w:bCs/>
+        </w:rPr>
+        <w:t xml:space="preserve"> </w:t>
+      </w:r>
+      <w:r>
+        <w:rPr>
+          <w:b/>
+          <w:bCs/>
+        </w:rPr>
+        <w:t xml:space="preserve">- the ladder runs continuously.</w:t>
+      </w:r>
+      <w:r>
+        <w:t xml:space="preserve"> </w:t>
+      </w:r>
+      <w:r>
+        <w:t xml:space="preserve">The Challenge is always open (fed by ads), the Blueprint is always available, and Membership joins the same always-on loop once live. So we market it as a steady engine, not a launch sequence. No false urgency, no</w:t>
+      </w:r>
+      <w:r>
+        <w:t xml:space="preserve"> </w:t>
+      </w:r>
+      <w:r>
+        <w:t xml:space="preserve">“doors closing”</w:t>
+      </w:r>
+      <w:r>
+        <w:t xml:space="preserve"> </w:t>
+      </w:r>
+      <w:r>
+        <w:t xml:space="preserve">- just a permanent rhythm that fills the top and monetises the back.</w:t>
+      </w:r>
+    </w:p>
+    <w:p>
+      <w:pPr>
+        <w:pStyle w:val="BodyText"/>
+      </w:pPr>
+      <w:r>
+        <w:rPr>
+          <w:b/>
+          <w:bCs/>
+        </w:rPr>
+        <w:t xml:space="preserve">Timeline (evergreen from each go-live):</w:t>
+      </w:r>
+      <w:r>
+        <w:t xml:space="preserve"> </w:t>
+      </w:r>
+      <w:r>
+        <w:t xml:space="preserve">Challenge live (13 Jul, ongoing).</w:t>
+      </w:r>
+      <w:r>
+        <w:t xml:space="preserve"> </w:t>
+      </w:r>
+      <w:r>
+        <w:rPr>
+          <w:b/>
+          <w:bCs/>
+        </w:rPr>
+        <w:t xml:space="preserve">Blueprint live 27 Jul.</w:t>
+      </w:r>
+      <w:r>
+        <w:t xml:space="preserve"> </w:t>
+      </w:r>
+      <w:r>
+        <w:rPr>
+          <w:b/>
+          <w:bCs/>
+        </w:rPr>
+        <w:t xml:space="preserve">Membership ~7 Sep</w:t>
+      </w:r>
+      <w:r>
+        <w:t xml:space="preserve"> </w:t>
+      </w:r>
+      <w:r>
+        <w:t xml:space="preserve">(≈6 weeks after the Blueprint). Every stage stays on after its go-live.</w:t>
+      </w:r>
+    </w:p>
+    <w:p>
+      <w:pPr>
+        <w:pStyle w:val="BodyText"/>
+      </w:pPr>
+      <w:r>
+        <w:rPr>
+          <w:b/>
+          <w:bCs/>
+        </w:rPr>
+        <w:t xml:space="preserve">1. Protect the Challenge engine - never disrupt what works.</w:t>
+      </w:r>
+      <w:r>
+        <w:t xml:space="preserve"> </w:t>
+      </w:r>
+      <w:r>
+        <w:t xml:space="preserve">Cold Meta ads -&gt; the free Challenge, unchanged. That ~2-3 sign-ups/day is the volume engine; it runs untouched. Organic doctrine content keeps feeding the scorecard/Challenge too.</w:t>
+      </w:r>
+      <w:r>
+        <w:t xml:space="preserve"> </w:t>
+      </w:r>
+      <w:r>
+        <w:rPr>
+          <w:b/>
+          <w:bCs/>
+        </w:rPr>
+        <w:t xml:space="preserve">Cold traffic always enters through the free Challenge</w:t>
+      </w:r>
+      <w:r>
+        <w:t xml:space="preserve"> </w:t>
+      </w:r>
+      <w:r>
+        <w:t xml:space="preserve">- low friction is why it converts. We never point cold ads at a paid product.</w:t>
+      </w:r>
+    </w:p>
+    <w:p>
+      <w:pPr>
+        <w:pStyle w:val="BodyText"/>
+      </w:pPr>
+      <w:r>
+        <w:rPr>
+          <w:b/>
+          <w:bCs/>
+        </w:rPr>
+        <w:t xml:space="preserve">2. The Blueprint is a monetisation layer aimed at WARM audiences only.</w:t>
+      </w:r>
+      <w:r>
+        <w:t xml:space="preserve"> </w:t>
+      </w:r>
+      <w:r>
+        <w:t xml:space="preserve">It’s the paid</w:t>
+      </w:r>
+      <w:r>
+        <w:t xml:space="preserve"> </w:t>
+      </w:r>
+      <w:r>
+        <w:t xml:space="preserve">“now correct it”</w:t>
+      </w:r>
+      <w:r>
+        <w:t xml:space="preserve"> </w:t>
+      </w:r>
+      <w:r>
+        <w:t xml:space="preserve">step</w:t>
+      </w:r>
+      <w:r>
+        <w:t xml:space="preserve"> </w:t>
+      </w:r>
+      <w:r>
+        <w:rPr>
+          <w:i/>
+          <w:iCs/>
+        </w:rPr>
+        <w:t xml:space="preserve">after</w:t>
+      </w:r>
+      <w:r>
+        <w:t xml:space="preserve"> </w:t>
+      </w:r>
+      <w:r>
+        <w:t xml:space="preserve">the read, so we promote it to people who’ve already met us - never to cold. Three warm channels:</w:t>
+      </w:r>
+      <w:r>
+        <w:t xml:space="preserve"> </w:t>
+      </w:r>
+      <w:r>
+        <w:t xml:space="preserve">-</w:t>
+      </w:r>
+      <w:r>
+        <w:t xml:space="preserve"> </w:t>
+      </w:r>
+      <w:r>
+        <w:rPr>
+          <w:b/>
+          <w:bCs/>
+        </w:rPr>
+        <w:t xml:space="preserve">The Day-14 -&gt; Blueprint handoff (primary path).</w:t>
+      </w:r>
+      <w:r>
+        <w:t xml:space="preserve"> </w:t>
+      </w:r>
+      <w:r>
+        <w:t xml:space="preserve">At the Day-14 reveal the portal delivers the read, then the CTA becomes the Blueprint:</w:t>
+      </w:r>
+      <w:r>
+        <w:t xml:space="preserve"> </w:t>
+      </w:r>
+      <w:r>
+        <w:rPr>
+          <w:i/>
+          <w:iCs/>
+        </w:rPr>
+        <w:t xml:space="preserve">“you’ve seen the pattern - the Blueprint is the 6-week correction.”</w:t>
+      </w:r>
+      <w:r>
+        <w:t xml:space="preserve"> </w:t>
+      </w:r>
+      <w:r>
+        <w:t xml:space="preserve">Email + in-portal. Warmest possible audience (they just watched the read prove itself), so this converts hardest. Built into the Challenge flow - runs automatically for every cohort, forever.</w:t>
+      </w:r>
+      <w:r>
+        <w:t xml:space="preserve"> </w:t>
+      </w:r>
+      <w:r>
+        <w:t xml:space="preserve">-</w:t>
+      </w:r>
+      <w:r>
+        <w:t xml:space="preserve"> </w:t>
+      </w:r>
+      <w:r>
+        <w:rPr>
+          <w:b/>
+          <w:bCs/>
+        </w:rPr>
+        <w:t xml:space="preserve">Retargeting ads -&gt; Blueprint.</w:t>
+      </w:r>
+      <w:r>
+        <w:t xml:space="preserve"> </w:t>
+      </w:r>
+      <w:r>
+        <w:t xml:space="preserve">Audience = Challenge completers + scorecard finishers + video-viewers/engagers. Optimise for Blueprint purchase. Stand this up ~27 Jul.</w:t>
+      </w:r>
+      <w:r>
+        <w:t xml:space="preserve"> </w:t>
+      </w:r>
+      <w:r>
+        <w:t xml:space="preserve">-</w:t>
+      </w:r>
+      <w:r>
+        <w:t xml:space="preserve"> </w:t>
+      </w:r>
+      <w:r>
+        <w:rPr>
+          <w:b/>
+          <w:bCs/>
+        </w:rPr>
+        <w:t xml:space="preserve">~1 organic Blueprint post/week</w:t>
+      </w:r>
+      <w:r>
+        <w:t xml:space="preserve"> </w:t>
+      </w:r>
+      <w:r>
+        <w:t xml:space="preserve">to existing followers (the rotating Sunday promo slot, below).</w:t>
+      </w:r>
+    </w:p>
+    <w:p>
+      <w:pPr>
+        <w:pStyle w:val="BodyText"/>
+      </w:pPr>
+      <w:r>
+        <w:rPr>
+          <w:b/>
+          <w:bCs/>
+        </w:rPr>
+        <w:t xml:space="preserve">3. Content = a permanent weekly loop with a rotating promo slot.</w:t>
+      </w:r>
+      <w:r>
+        <w:t xml:space="preserve"> </w:t>
+      </w:r>
+      <w:r>
+        <w:t xml:space="preserve">Run the section-11 weekly structure (Mon Authority / Tue Contrarian / Wed Pattern / Fri Coach doctrine -&gt; scorecard;</w:t>
+      </w:r>
+      <w:r>
+        <w:t xml:space="preserve"> </w:t>
+      </w:r>
+      <w:r>
+        <w:rPr>
+          <w:b/>
+          <w:bCs/>
+        </w:rPr>
+        <w:t xml:space="preserve">Sun = the promo slot</w:t>
+      </w:r>
+      <w:r>
+        <w:t xml:space="preserve">)</w:t>
+      </w:r>
+      <w:r>
+        <w:t xml:space="preserve"> </w:t>
+      </w:r>
+      <w:r>
+        <w:rPr>
+          <w:i/>
+          <w:iCs/>
+        </w:rPr>
+        <w:t xml:space="preserve">forever</w:t>
+      </w:r>
+      <w:r>
+        <w:t xml:space="preserve">. The only thing that changes over time is what the Sunday promo points at:</w:t>
+      </w:r>
+      <w:r>
+        <w:t xml:space="preserve"> </w:t>
+      </w:r>
+      <w:r>
+        <w:t xml:space="preserve">-</w:t>
+      </w:r>
+      <w:r>
+        <w:t xml:space="preserve"> </w:t>
+      </w:r>
+      <w:r>
+        <w:rPr>
+          <w:b/>
+          <w:bCs/>
+        </w:rPr>
+        <w:t xml:space="preserve">now -&gt; 27 Jul:</w:t>
+      </w:r>
+      <w:r>
+        <w:t xml:space="preserve"> </w:t>
+      </w:r>
+      <w:r>
+        <w:t xml:space="preserve">promo = Challenge invite (keep filling it)</w:t>
+      </w:r>
+      <w:r>
+        <w:t xml:space="preserve"> </w:t>
+      </w:r>
+      <w:r>
+        <w:t xml:space="preserve">-</w:t>
+      </w:r>
+      <w:r>
+        <w:t xml:space="preserve"> </w:t>
+      </w:r>
+      <w:r>
+        <w:rPr>
+          <w:b/>
+          <w:bCs/>
+        </w:rPr>
+        <w:t xml:space="preserve">from 27 Jul:</w:t>
+      </w:r>
+      <w:r>
+        <w:t xml:space="preserve"> </w:t>
+      </w:r>
+      <w:r>
+        <w:t xml:space="preserve">rotate the promo ~</w:t>
+      </w:r>
+      <w:r>
+        <w:rPr>
+          <w:b/>
+          <w:bCs/>
+        </w:rPr>
+        <w:t xml:space="preserve">2 Challenge : 1 Blueprint</w:t>
+      </w:r>
+      <w:r>
+        <w:t xml:space="preserve"> </w:t>
+      </w:r>
+      <w:r>
+        <w:t xml:space="preserve">(Blueprint’s live; warm followers get it)</w:t>
+      </w:r>
+      <w:r>
+        <w:t xml:space="preserve"> </w:t>
+      </w:r>
+      <w:r>
+        <w:t xml:space="preserve">-</w:t>
+      </w:r>
+      <w:r>
+        <w:t xml:space="preserve"> </w:t>
+      </w:r>
+      <w:r>
+        <w:rPr>
+          <w:b/>
+          <w:bCs/>
+        </w:rPr>
+        <w:t xml:space="preserve">from mid-Aug:</w:t>
+      </w:r>
+      <w:r>
+        <w:t xml:space="preserve"> </w:t>
+      </w:r>
+      <w:r>
+        <w:t xml:space="preserve">fold in soft</w:t>
+      </w:r>
+      <w:r>
+        <w:t xml:space="preserve"> </w:t>
+      </w:r>
+      <w:r>
+        <w:rPr>
+          <w:b/>
+          <w:bCs/>
+        </w:rPr>
+        <w:t xml:space="preserve">Membership teases</w:t>
+      </w:r>
+      <w:r>
+        <w:t xml:space="preserve"> </w:t>
+      </w:r>
+      <w:r>
+        <w:t xml:space="preserve">(</w:t>
+      </w:r>
+      <w:r>
+        <w:t xml:space="preserve">“what comes after the correction”</w:t>
+      </w:r>
+      <w:r>
+        <w:t xml:space="preserve">) building toward ~7 Sep</w:t>
+      </w:r>
+      <w:r>
+        <w:t xml:space="preserve"> </w:t>
+      </w:r>
+      <w:r>
+        <w:t xml:space="preserve">-</w:t>
+      </w:r>
+      <w:r>
+        <w:t xml:space="preserve"> </w:t>
+      </w:r>
+      <w:r>
+        <w:rPr>
+          <w:b/>
+          <w:bCs/>
+        </w:rPr>
+        <w:t xml:space="preserve">from ~7 Sep:</w:t>
+      </w:r>
+      <w:r>
+        <w:t xml:space="preserve"> </w:t>
+      </w:r>
+      <w:r>
+        <w:t xml:space="preserve">Membership joins the rotation; the loop then cycles all three indefinitely</w:t>
+      </w:r>
+    </w:p>
+    <w:p>
+      <w:pPr>
+        <w:pStyle w:val="BodyText"/>
+      </w:pPr>
+      <w:r>
+        <w:t xml:space="preserve">Doctrine posts (Mon-Fri) always drive to the scorecard/Challenge regardless of date - they’re top-of-funnel and never change.</w:t>
+      </w:r>
+    </w:p>
+    <w:p>
+      <w:pPr>
+        <w:pStyle w:val="BodyText"/>
+      </w:pPr>
+      <w:r>
+        <w:rPr>
+          <w:b/>
+          <w:bCs/>
+        </w:rPr>
+        <w:t xml:space="preserve">4. Ads = always-on campaigns (two now, three from Sep):</w:t>
+      </w:r>
+      <w:r>
+        <w:t xml:space="preserve"> </w:t>
+      </w:r>
+      <w:r>
+        <w:t xml:space="preserve">-</w:t>
+      </w:r>
+      <w:r>
+        <w:t xml:space="preserve"> </w:t>
+      </w:r>
+      <w:r>
+        <w:rPr>
+          <w:b/>
+          <w:bCs/>
+        </w:rPr>
+        <w:t xml:space="preserve">Cold -&gt; Challenge</w:t>
+      </w:r>
+      <w:r>
+        <w:t xml:space="preserve"> </w:t>
+      </w:r>
+      <w:r>
+        <w:t xml:space="preserve">- the engine. Never stops. (Meta, optimise for</w:t>
+      </w:r>
+      <w:r>
+        <w:t xml:space="preserve"> </w:t>
+      </w:r>
+      <w:r>
+        <w:rPr>
+          <w:rStyle w:val="VerbatimChar"/>
+        </w:rPr>
+        <w:t xml:space="preserve">Lead</w:t>
+      </w:r>
+      <w:r>
+        <w:t xml:space="preserve">.)</w:t>
+      </w:r>
+      <w:r>
+        <w:t xml:space="preserve"> </w:t>
+      </w:r>
+      <w:r>
+        <w:t xml:space="preserve">-</w:t>
+      </w:r>
+      <w:r>
+        <w:t xml:space="preserve"> </w:t>
+      </w:r>
+      <w:r>
+        <w:rPr>
+          <w:b/>
+          <w:bCs/>
+        </w:rPr>
+        <w:t xml:space="preserve">Retargeting -&gt; Blueprint</w:t>
+      </w:r>
+      <w:r>
+        <w:t xml:space="preserve"> </w:t>
+      </w:r>
+      <w:r>
+        <w:t xml:space="preserve">- monetise the warm audience. Live ~27 Jul.</w:t>
+      </w:r>
+      <w:r>
+        <w:t xml:space="preserve"> </w:t>
+      </w:r>
+      <w:r>
+        <w:t xml:space="preserve">-</w:t>
+      </w:r>
+      <w:r>
+        <w:t xml:space="preserve"> </w:t>
+      </w:r>
+      <w:r>
+        <w:rPr>
+          <w:b/>
+          <w:bCs/>
+        </w:rPr>
+        <w:t xml:space="preserve">+ Retargeting -&gt; Membership</w:t>
+      </w:r>
+      <w:r>
+        <w:t xml:space="preserve"> </w:t>
+      </w:r>
+      <w:r>
+        <w:t xml:space="preserve">- from ~Sep, audience = Blueprint buyers.</w:t>
+      </w:r>
+    </w:p>
+    <w:p>
+      <w:pPr>
+        <w:pStyle w:val="BodyText"/>
+      </w:pPr>
+      <w:r>
+        <w:rPr>
+          <w:b/>
+          <w:bCs/>
+        </w:rPr>
+        <w:t xml:space="preserve">5. No launch urgency, ever.</w:t>
+      </w:r>
+      <w:r>
+        <w:t xml:space="preserve"> </w:t>
+      </w:r>
+      <w:r>
+        <w:t xml:space="preserve">Evergreen means steady positioning, not</w:t>
+      </w:r>
+      <w:r>
+        <w:t xml:space="preserve"> </w:t>
+      </w:r>
+      <w:r>
+        <w:t xml:space="preserve">“launching now / spots closing.”</w:t>
+      </w:r>
+      <w:r>
+        <w:t xml:space="preserve"> </w:t>
+      </w:r>
+      <w:r>
+        <w:t xml:space="preserve">The line is always the same:</w:t>
+      </w:r>
+      <w:r>
+        <w:t xml:space="preserve"> </w:t>
+      </w:r>
+      <w:r>
+        <w:rPr>
+          <w:i/>
+          <w:iCs/>
+        </w:rPr>
+        <w:t xml:space="preserve">the Challenge reads your state (free), the Blueprint corrects it ($97), Membership compounds it (ongoing)</w:t>
+      </w:r>
+      <w:r>
+        <w:t xml:space="preserve"> </w:t>
+      </w:r>
+      <w:r>
+        <w:t xml:space="preserve">- all three always available, each promoted to the right temperature of audience.</w:t>
+      </w:r>
+    </w:p>
+    <w:bookmarkEnd w:id="14"/>
+    <w:bookmarkStart w:id="15" w:name="how-this-brand-relates-to-the-others"/>
     <w:p>
       <w:pPr>
         <w:pStyle w:val="Heading2"/>
@@ -1278,9 +1863,9 @@
         </w:pict>
       </w:r>
     </w:p>
-    <w:bookmarkEnd w:id="14"/>
     <w:bookmarkEnd w:id="15"/>
-    <w:bookmarkStart w:id="27" w:name="part-ii---the-content-engine-how"/>
+    <w:bookmarkEnd w:id="16"/>
+    <w:bookmarkStart w:id="28" w:name="part-ii---the-content-engine-how"/>
     <w:p>
       <w:pPr>
         <w:pStyle w:val="Heading1"/>
@@ -1289,7 +1874,7 @@
         <w:t xml:space="preserve">PART II - THE CONTENT ENGINE (how)</w:t>
       </w:r>
     </w:p>
-    <w:bookmarkStart w:id="16" w:name="the-one-shift"/>
+    <w:bookmarkStart w:id="17" w:name="the-one-shift"/>
     <w:p>
       <w:pPr>
         <w:pStyle w:val="Heading2"/>
@@ -1367,8 +1952,8 @@
         <w:t xml:space="preserve">idea from section 1, turned into content.</w:t>
       </w:r>
     </w:p>
-    <w:bookmarkEnd w:id="16"/>
-    <w:bookmarkStart w:id="17" w:name="three-writing-rules-non-negotiable"/>
+    <w:bookmarkEnd w:id="17"/>
+    <w:bookmarkStart w:id="18" w:name="three-writing-rules-non-negotiable"/>
     <w:p>
       <w:pPr>
         <w:pStyle w:val="Heading2"/>
@@ -1467,8 +2052,8 @@
         <w:t xml:space="preserve">Some posts earn comments and saves (pure value, end on a question, no link). Others drive the click (scorecard for doctrine, Challenge for promo). Never ask one post to do both - that’s why they currently land neither.</w:t>
       </w:r>
     </w:p>
-    <w:bookmarkEnd w:id="17"/>
-    <w:bookmarkStart w:id="18" w:name="pillars-x-formats-themes-meet-shows"/>
+    <w:bookmarkEnd w:id="18"/>
+    <w:bookmarkStart w:id="19" w:name="pillars-x-formats-themes-meet-shows"/>
     <w:p>
       <w:pPr>
         <w:pStyle w:val="Heading2"/>
@@ -2450,8 +3035,8 @@
         <w:t xml:space="preserve">Same 5 types, same archetype rotation and hook banks - the formats just give each type a sharper, more repeatable, more scroll-stopping shape.</w:t>
       </w:r>
     </w:p>
-    <w:bookmarkEnd w:id="18"/>
-    <w:bookmarkStart w:id="19" w:name="b.-the-challenge-promo-layer-door-2"/>
+    <w:bookmarkEnd w:id="19"/>
+    <w:bookmarkStart w:id="20" w:name="b.-the-challenge-promo-layer-door-2"/>
     <w:p>
       <w:pPr>
         <w:pStyle w:val="Heading2"/>
@@ -2724,11 +3309,57 @@
         <w:t xml:space="preserve">“find your state”</w:t>
       </w:r>
       <w:r>
-        <w:t xml:space="preserve">). A typical week = 4 doctrine + 1 promo, with promo turned up at wave-open.</w:t>
-      </w:r>
-    </w:p>
-    <w:bookmarkEnd w:id="19"/>
-    <w:bookmarkStart w:id="20" w:name="the-enemy"/>
+        <w:t xml:space="preserve">). A typical week = 4 doctrine + 1 promo.</w:t>
+      </w:r>
+    </w:p>
+    <w:p>
+      <w:pPr>
+        <w:pStyle w:val="BodyText"/>
+      </w:pPr>
+      <w:r>
+        <w:rPr>
+          <w:b/>
+          <w:bCs/>
+        </w:rPr>
+        <w:t xml:space="preserve">The promo slot rotates its target over time (see 4b - evergreen ladder):</w:t>
+      </w:r>
+      <w:r>
+        <w:t xml:space="preserve"> </w:t>
+      </w:r>
+      <w:r>
+        <w:t xml:space="preserve">Challenge-only until 27 Jul, then ~2 Challenge : 1 Blueprint once the Blueprint’s live, then soft Membership teases folded in from mid-Aug toward the ~7 Sep Membership go-live. Blueprint/Membership promo goes to the</w:t>
+      </w:r>
+      <w:r>
+        <w:t xml:space="preserve"> </w:t>
+      </w:r>
+      <w:r>
+        <w:rPr>
+          <w:b/>
+          <w:bCs/>
+        </w:rPr>
+        <w:t xml:space="preserve">warm</w:t>
+      </w:r>
+      <w:r>
+        <w:t xml:space="preserve"> </w:t>
+      </w:r>
+      <w:r>
+        <w:t xml:space="preserve">audience (existing followers); the Challenge invite stays the cold/curiosity front door. Because the ladder is evergreen, lean on genuine reasons-to-act (the read, the result, the correction) rather than</w:t>
+      </w:r>
+      <w:r>
+        <w:t xml:space="preserve"> </w:t>
+      </w:r>
+      <w:r>
+        <w:t xml:space="preserve">“spots closing”</w:t>
+      </w:r>
+      <w:r>
+        <w:t xml:space="preserve"> </w:t>
+      </w:r>
+      <w:r>
+        <w:t xml:space="preserve">- the only real scarcity is the Challenge wave cap, used sparingly at wave-open, not a permanent countdown.</w:t>
+      </w:r>
+    </w:p>
+    <w:bookmarkEnd w:id="20"/>
+    <w:bookmarkStart w:id="21" w:name="the-enemy"/>
     <w:p>
       <w:pPr>
         <w:pStyle w:val="Heading2"/>
@@ -2761,8 +3392,8 @@
         <w:t xml:space="preserve">Protocol without interpretation. A brand with an enemy builds a movement, not an audience - people share what they’re angry about, and being the calm expert who defends them is a magnetic position.</w:t>
       </w:r>
     </w:p>
-    <w:bookmarkEnd w:id="20"/>
-    <w:bookmarkStart w:id="21" w:name="the-lead-mechanic-comment-to-dm-upgraded"/>
+    <w:bookmarkEnd w:id="21"/>
+    <w:bookmarkStart w:id="22" w:name="the-lead-mechanic-comment-to-dm-upgraded"/>
     <w:p>
       <w:pPr>
         <w:pStyle w:val="Heading2"/>
@@ -2807,8 +3438,8 @@
         <w:t xml:space="preserve">. Cap at 1-2 comment-to-DM posts a week, always on a scenario hook.</w:t>
       </w:r>
     </w:p>
-    <w:bookmarkEnd w:id="21"/>
-    <w:bookmarkStart w:id="22" w:name="channels-cadence-weekly-rhythm"/>
+    <w:bookmarkEnd w:id="22"/>
+    <w:bookmarkStart w:id="23" w:name="channels-cadence-weekly-rhythm"/>
     <w:p>
       <w:pPr>
         <w:pStyle w:val="Heading2"/>
@@ -3162,30 +3793,18 @@
                 <w:b/>
                 <w:bCs/>
               </w:rPr>
-              <w:t xml:space="preserve">Challenge Promo (Door 2)</w:t>
-            </w:r>
-          </w:p>
-        </w:tc>
-        <w:tc>
-          <w:tcPr/>
-          <w:p>
-            <w:pPr>
-              <w:pStyle w:val="Compact"/>
-            </w:pPr>
-            <w:r>
-              <w:t xml:space="preserve">the weekly Challenge invite —</w:t>
-            </w:r>
-            <w:r>
-              <w:t xml:space="preserve"> </w:t>
-            </w:r>
-            <w:r>
-              <w:t xml:space="preserve">“join the free 14-day Challenge”</w:t>
-            </w:r>
-            <w:r>
-              <w:t xml:space="preserve"> </w:t>
-            </w:r>
-            <w:r>
-              <w:t xml:space="preserve">(wave-scarcity when a wave opens)</w:t>
+              <w:t xml:space="preserve">Promo slot (Door 2, rotating)</w:t>
+            </w:r>
+          </w:p>
+        </w:tc>
+        <w:tc>
+          <w:tcPr/>
+          <w:p>
+            <w:pPr>
+              <w:pStyle w:val="Compact"/>
+            </w:pPr>
+            <w:r>
+              <w:t xml:space="preserve">the weekly promo — Challenge invite by default; rotates to Blueprint (from 27 Jul, ~1-in-3, warm audience) and soft Membership teases (mid-Aug -&gt; ~7 Sep). See 4b.</w:t>
             </w:r>
           </w:p>
         </w:tc>
@@ -3259,8 +3878,8 @@
         <w:t xml:space="preserve">mini-quiz, polls, behind-the-scenes reads.</w:t>
       </w:r>
     </w:p>
-    <w:bookmarkEnd w:id="22"/>
-    <w:bookmarkStart w:id="23" w:name="atomisation-volume-without-more-thinking"/>
+    <w:bookmarkEnd w:id="23"/>
+    <w:bookmarkStart w:id="24" w:name="atomisation-volume-without-more-thinking"/>
     <w:p>
       <w:pPr>
         <w:pStyle w:val="Heading2"/>
@@ -3357,8 +3976,8 @@
         <w:t xml:space="preserve">in the DM. Think in ideas, not posts. One strong read should feed most of a week.</w:t>
       </w:r>
     </w:p>
-    <w:bookmarkEnd w:id="23"/>
-    <w:bookmarkStart w:id="24" w:name="face-format-reach"/>
+    <w:bookmarkEnd w:id="24"/>
+    <w:bookmarkStart w:id="25" w:name="face-format-reach"/>
     <w:p>
       <w:pPr>
         <w:pStyle w:val="Heading2"/>
@@ -3420,8 +4039,8 @@
         <w:t xml:space="preserve">; static is for proof and quotes, not the whole feed.</w:t>
       </w:r>
     </w:p>
-    <w:bookmarkEnd w:id="24"/>
-    <w:bookmarkStart w:id="25" w:name="turn-engagement-into-an-ad-engine"/>
+    <w:bookmarkEnd w:id="25"/>
+    <w:bookmarkStart w:id="26" w:name="turn-engagement-into-an-ad-engine"/>
     <w:p>
       <w:pPr>
         <w:pStyle w:val="Heading2"/>
@@ -3454,8 +4073,8 @@
         <w:t xml:space="preserve">- retarget them with the Challenge. Free organic reach becomes cheap paid conversion; the organic and paid funnels feed each other.</w:t>
       </w:r>
     </w:p>
-    <w:bookmarkEnd w:id="25"/>
-    <w:bookmarkStart w:id="26" w:name="first-three-plays-to-test-next-2-3-weeks"/>
+    <w:bookmarkEnd w:id="26"/>
+    <w:bookmarkStart w:id="27" w:name="first-three-plays-to-test-next-2-3-weeks"/>
     <w:p>
       <w:pPr>
         <w:pStyle w:val="Heading2"/>
@@ -3553,9 +4172,9 @@
         </w:pict>
       </w:r>
     </w:p>
-    <w:bookmarkEnd w:id="26"/>
     <w:bookmarkEnd w:id="27"/>
-    <w:bookmarkStart w:id="32" w:name="part-iii---standards-measurement"/>
+    <w:bookmarkEnd w:id="28"/>
+    <w:bookmarkStart w:id="33" w:name="part-iii---standards-measurement"/>
     <w:p>
       <w:pPr>
         <w:pStyle w:val="Heading1"/>
@@ -3564,7 +4183,7 @@
         <w:t xml:space="preserve">PART III - STANDARDS &amp; MEASUREMENT</w:t>
       </w:r>
     </w:p>
-    <w:bookmarkStart w:id="28" w:name="voice-design-rules"/>
+    <w:bookmarkStart w:id="29" w:name="voice-design-rules"/>
     <w:p>
       <w:pPr>
         <w:pStyle w:val="Heading2"/>
@@ -3701,8 +4320,8 @@
         <w:t xml:space="preserve">).</w:t>
       </w:r>
     </w:p>
-    <w:bookmarkEnd w:id="28"/>
-    <w:bookmarkStart w:id="29" w:name="messaging-rules-do-dont"/>
+    <w:bookmarkEnd w:id="29"/>
+    <w:bookmarkStart w:id="30" w:name="messaging-rules-do-dont"/>
     <w:p>
       <w:pPr>
         <w:pStyle w:val="Heading2"/>
@@ -4094,8 +4713,8 @@
         <w:t xml:space="preserve">intelligent not complicated · confident not arrogant · direct not blunt · warm not soft · scientific not clinical · forward-thinking not abstract.</w:t>
       </w:r>
     </w:p>
-    <w:bookmarkEnd w:id="29"/>
-    <w:bookmarkStart w:id="30" w:name="what-we-measure"/>
+    <w:bookmarkEnd w:id="30"/>
+    <w:bookmarkStart w:id="31" w:name="what-we-measure"/>
     <w:p>
       <w:pPr>
         <w:pStyle w:val="Heading2"/>
@@ -4112,8 +4731,8 @@
         <w:t xml:space="preserve">Comments + saves + shares (real engagement), DM keyword captures, scorecard starts, and the earliest broken gate in the reach -&gt; save -&gt; profile -&gt; scorecard path. Not likes. We buy self-recognition and captured leads, not applause.</w:t>
       </w:r>
     </w:p>
-    <w:bookmarkEnd w:id="30"/>
-    <w:bookmarkStart w:id="31" w:name="build-dependencies"/>
+    <w:bookmarkEnd w:id="31"/>
+    <w:bookmarkStart w:id="32" w:name="build-dependencies"/>
     <w:p>
       <w:pPr>
         <w:pStyle w:val="Heading2"/>
@@ -4260,8 +4879,8 @@
         <w:t xml:space="preserve">The whole thing in one line: stop broadcasting information, start demonstrating that you can read the person the industry has given up on. That is the only thing that makes Body Recode different in the feed, so make it the entire show.</w:t>
       </w:r>
     </w:p>
-    <w:bookmarkEnd w:id="31"/>
     <w:bookmarkEnd w:id="32"/>
+    <w:bookmarkEnd w:id="33"/>
     <w:sectPr>
       <w:footnotePr>
         <w:numRestart w:val="eachSect"/>

</xml_diff>

<commit_message>
Strategy doc v2.1: cold-paid section reflects broad targeting and the real optimisation event
Section 11 said cold paid was optimised for the Lead event. The July campaign
actually ran on CompleteRegistration, which also fires from scorecard/submit,
so that count is blended. Records the broad targeting decision of 5 Aug and
leaves the Lead switch as a named open task.

Co-Authored-By: Claude Opus 5 <noreply@anthropic.com>
</commit_message>
<xml_diff>
--- a/public/docs/strategy/body-recode/body-recode-consumer-marketing-strategy-v1.docx
+++ b/public/docs/strategy/body-recode/body-recode-consumer-marketing-strategy-v1.docx
@@ -26,7 +26,7 @@
         <w:t xml:space="preserve"> </w:t>
       </w:r>
       <w:r>
-        <w:t xml:space="preserve">v2.0 - 2026-07-19. One document: the strategy (what and why) and the content engine (how) in one place.</w:t>
+        <w:t xml:space="preserve">v2.1 - 2026-08-05 (§11 cold-paid: broad targeting, optimisation event corrected). One document: the strategy (what and why) and the content engine (how) in one place.</w:t>
       </w:r>
       <w:r>
         <w:t xml:space="preserve"> </w:t>
@@ -3512,7 +3512,23 @@
         <w:t xml:space="preserve"> </w:t>
       </w:r>
       <w:r>
-        <w:t xml:space="preserve">statics only (no reels/video), optimised for the</w:t>
+        <w:t xml:space="preserve">statics only (no reels/video),</w:t>
+      </w:r>
+      <w:r>
+        <w:t xml:space="preserve"> </w:t>
+      </w:r>
+      <w:r>
+        <w:rPr>
+          <w:b/>
+          <w:bCs/>
+        </w:rPr>
+        <w:t xml:space="preserve">broad targeting</w:t>
+      </w:r>
+      <w:r>
+        <w:t xml:space="preserve"> </w:t>
+      </w:r>
+      <w:r>
+        <w:t xml:space="preserve">(AU 30-60, no interest stacking - interest sets exhausted the audience at 3,613 reach in Jul 2026), budget ramps deliberately. Optimisation event: currently</w:t>
       </w:r>
       <w:r>
         <w:t xml:space="preserve"> </w:t>
@@ -3521,13 +3537,49 @@
         <w:rPr>
           <w:rStyle w:val="VerbatimChar"/>
         </w:rPr>
+        <w:t xml:space="preserve">CompleteRegistration</w:t>
+      </w:r>
+      <w:r>
+        <w:t xml:space="preserve">, which is what the campaign actually runs on. Note it fires from both</w:t>
+      </w:r>
+      <w:r>
+        <w:t xml:space="preserve"> </w:t>
+      </w:r>
+      <w:r>
+        <w:rPr>
+          <w:rStyle w:val="VerbatimChar"/>
+        </w:rPr>
+        <w:t xml:space="preserve">challenge/enroll</w:t>
+      </w:r>
+      <w:r>
+        <w:t xml:space="preserve"> </w:t>
+      </w:r>
+      <w:r>
+        <w:t xml:space="preserve">and</w:t>
+      </w:r>
+      <w:r>
+        <w:t xml:space="preserve"> </w:t>
+      </w:r>
+      <w:r>
+        <w:rPr>
+          <w:rStyle w:val="VerbatimChar"/>
+        </w:rPr>
+        <w:t xml:space="preserve">scorecard/submit</w:t>
+      </w:r>
+      <w:r>
+        <w:t xml:space="preserve">, so the count is blended - an open task exists to switch to</w:t>
+      </w:r>
+      <w:r>
+        <w:t xml:space="preserve"> </w:t>
+      </w:r>
+      <w:r>
+        <w:rPr>
+          <w:rStyle w:val="VerbatimChar"/>
+        </w:rPr>
         <w:t xml:space="preserve">Lead</w:t>
       </w:r>
       <w:r>
-        <w:t xml:space="preserve"> </w:t>
-      </w:r>
-      <w:r>
-        <w:t xml:space="preserve">event, budget ramps deliberately.</w:t>
+        <w:t xml:space="preserve">.</w:t>
       </w:r>
       <w:r>
         <w:t xml:space="preserve"> </w:t>

</xml_diff>

<commit_message>
Reels via Captions: organic only, batched weekly, feeds the warm pool
Reels were never blocked by strategy, they were blocked by production capacity
sitting behind Amanda's availability and a HeyGen workflow never stood up.
Captions removes that for talking-head content.

The reason it matters is not more content. Video viewers are a custom audience
source, so reels are the cheapest way to fill the warm retargeting pool from
11b, which is the only narrow audience that cannot exhaust and the structural
fix for what killed July.

Strategy doc to v2.3 with 13b. Cold paid stays statics only - unchanged. Also
rescopes the Phase 2 reel cards, which said production was blocked on Amanda +
HeyGen and read as if reels were unavailable.

Co-Authored-By: Claude Opus 5 <noreply@anthropic.com>
</commit_message>
<xml_diff>
--- a/public/docs/strategy/body-recode/body-recode-consumer-marketing-strategy-v1.docx
+++ b/public/docs/strategy/body-recode/body-recode-consumer-marketing-strategy-v1.docx
@@ -26,7 +26,7 @@
         <w:t xml:space="preserve"> </w:t>
       </w:r>
       <w:r>
-        <w:t xml:space="preserve">v2.2 - 2026-08-05 (§11b campaign alignment: live ad sets the organic theme, vocabulary divergence retired, scoped routing exception). One document: the strategy (what and why) and the content engine (how) in one place.</w:t>
+        <w:t xml:space="preserve">v2.3 - 2026-08-05 (§13b reels via Captions: organic only, batch weekly, feeds the warm-audience pool). One document: the strategy (what and why) and the content engine (how) in one place.</w:t>
       </w:r>
       <w:r>
         <w:t xml:space="preserve"> </w:t>
@@ -1865,7 +1865,7 @@
     </w:p>
     <w:bookmarkEnd w:id="15"/>
     <w:bookmarkEnd w:id="16"/>
-    <w:bookmarkStart w:id="29" w:name="part-ii---the-content-engine-how"/>
+    <w:bookmarkStart w:id="30" w:name="part-ii---the-content-engine-how"/>
     <w:p>
       <w:pPr>
         <w:pStyle w:val="Heading1"/>
@@ -4630,7 +4630,7 @@
       </w:r>
     </w:p>
     <w:bookmarkEnd w:id="25"/>
-    <w:bookmarkStart w:id="26" w:name="face-format-reach"/>
+    <w:bookmarkStart w:id="27" w:name="face-format-reach"/>
     <w:p>
       <w:pPr>
         <w:pStyle w:val="Heading2"/>
@@ -4660,23 +4660,13 @@
         <w:t xml:space="preserve"> </w:t>
       </w:r>
       <w:r>
-        <w:t xml:space="preserve">- talking-head reels of you reading a situation build you as the authority, which is the real asset. Scale with</w:t>
-      </w:r>
-      <w:r>
-        <w:t xml:space="preserve"> </w:t>
-      </w:r>
-      <w:r>
-        <w:rPr>
-          <w:b/>
-          <w:bCs/>
-        </w:rPr>
-        <w:t xml:space="preserve">HeyGen</w:t>
-      </w:r>
-      <w:r>
-        <w:t xml:space="preserve"> </w:t>
-      </w:r>
-      <w:r>
-        <w:t xml:space="preserve">so filming isn’t a daily bottleneck. Lean</w:t>
+        <w:t xml:space="preserve">- talking-head reels of you reading a situation build you as the</w:t>
+      </w:r>
+      <w:r>
+        <w:t xml:space="preserve"> </w:t>
+      </w:r>
+      <w:r>
+        <w:t xml:space="preserve">authority, which is the real asset. Lean</w:t>
       </w:r>
       <w:r>
         <w:t xml:space="preserve"> </w:t>
@@ -4689,11 +4679,461 @@
         <w:t xml:space="preserve">carousels (saves) + reels (reach)</w:t>
       </w:r>
       <w:r>
-        <w:t xml:space="preserve">; static is for proof and quotes, not the whole feed.</w:t>
+        <w:t xml:space="preserve">; static is for</w:t>
+      </w:r>
+      <w:r>
+        <w:t xml:space="preserve"> </w:t>
+      </w:r>
+      <w:r>
+        <w:t xml:space="preserve">proof and quotes, not the whole feed.</w:t>
+      </w:r>
+    </w:p>
+    <w:bookmarkStart w:id="26" w:name="b.-reels-via-captions-added-5-aug-2026"/>
+    <w:p>
+      <w:pPr>
+        <w:pStyle w:val="Heading3"/>
+      </w:pPr>
+      <w:r>
+        <w:t xml:space="preserve">13b. Reels via Captions (added 5 Aug 2026)</w:t>
+      </w:r>
+    </w:p>
+    <w:p>
+      <w:pPr>
+        <w:pStyle w:val="FirstParagraph"/>
+      </w:pPr>
+      <w:r>
+        <w:t xml:space="preserve">Reels were always in the plan and were never blocked by strategy. They were blocked by</w:t>
+      </w:r>
+      <w:r>
+        <w:t xml:space="preserve"> </w:t>
+      </w:r>
+      <w:r>
+        <w:rPr>
+          <w:b/>
+          <w:bCs/>
+        </w:rPr>
+        <w:t xml:space="preserve">production capacity</w:t>
+      </w:r>
+      <w:r>
+        <w:t xml:space="preserve">, which sat behind Amanda’s availability and a HeyGen workflow that</w:t>
+      </w:r>
+      <w:r>
+        <w:t xml:space="preserve"> </w:t>
+      </w:r>
+      <w:r>
+        <w:t xml:space="preserve">was never stood up.</w:t>
+      </w:r>
+      <w:r>
+        <w:t xml:space="preserve"> </w:t>
+      </w:r>
+      <w:r>
+        <w:rPr>
+          <w:b/>
+          <w:bCs/>
+        </w:rPr>
+        <w:t xml:space="preserve">Captions removes that blocker for talking-head content</w:t>
+      </w:r>
+      <w:r>
+        <w:t xml:space="preserve">, which is the</w:t>
+      </w:r>
+      <w:r>
+        <w:t xml:space="preserve"> </w:t>
+      </w:r>
+      <w:r>
+        <w:t xml:space="preserve">only reel format this brand actually needs.</w:t>
+      </w:r>
+    </w:p>
+    <w:p>
+      <w:pPr>
+        <w:pStyle w:val="BodyText"/>
+      </w:pPr>
+      <w:r>
+        <w:rPr>
+          <w:b/>
+          <w:bCs/>
+        </w:rPr>
+        <w:t xml:space="preserve">Why this matters more than</w:t>
+      </w:r>
+      <w:r>
+        <w:rPr>
+          <w:b/>
+          <w:bCs/>
+        </w:rPr>
+        <w:t xml:space="preserve"> </w:t>
+      </w:r>
+      <w:r>
+        <w:rPr>
+          <w:b/>
+          <w:bCs/>
+        </w:rPr>
+        <w:t xml:space="preserve">“more content”</w:t>
+      </w:r>
+      <w:r>
+        <w:rPr>
+          <w:b/>
+          <w:bCs/>
+        </w:rPr>
+        <w:t xml:space="preserve">.</w:t>
+      </w:r>
+      <w:r>
+        <w:t xml:space="preserve"> </w:t>
+      </w:r>
+      <w:r>
+        <w:t xml:space="preserve">Reach is not the point.</w:t>
+      </w:r>
+      <w:r>
+        <w:t xml:space="preserve"> </w:t>
+      </w:r>
+      <w:r>
+        <w:rPr>
+          <w:b/>
+          <w:bCs/>
+        </w:rPr>
+        <w:t xml:space="preserve">Video viewers are a</w:t>
+      </w:r>
+      <w:r>
+        <w:rPr>
+          <w:b/>
+          <w:bCs/>
+        </w:rPr>
+        <w:t xml:space="preserve"> </w:t>
+      </w:r>
+      <w:r>
+        <w:rPr>
+          <w:b/>
+          <w:bCs/>
+        </w:rPr>
+        <w:t xml:space="preserve">custom audience source</w:t>
+      </w:r>
+      <w:r>
+        <w:t xml:space="preserve">, so reels are the cheapest way to fill the warm retargeting pool</w:t>
+      </w:r>
+      <w:r>
+        <w:t xml:space="preserve"> </w:t>
+      </w:r>
+      <w:r>
+        <w:t xml:space="preserve">that §11b says to start building now. That pool is the only narrow audience that cannot</w:t>
+      </w:r>
+      <w:r>
+        <w:t xml:space="preserve"> </w:t>
+      </w:r>
+      <w:r>
+        <w:t xml:space="preserve">exhaust, and it is the structural fix for what killed the July campaign. Reels are the pump.</w:t>
+      </w:r>
+    </w:p>
+    <w:p>
+      <w:pPr>
+        <w:pStyle w:val="BodyText"/>
+      </w:pPr>
+      <w:r>
+        <w:rPr>
+          <w:b/>
+          <w:bCs/>
+        </w:rPr>
+        <w:t xml:space="preserve">Scope. Organic only.</w:t>
+      </w:r>
+      <w:r>
+        <w:t xml:space="preserve"> </w:t>
+      </w:r>
+      <w:r>
+        <w:t xml:space="preserve">[[feedback_meta_ads_no_reels]] is unchanged:</w:t>
+      </w:r>
+      <w:r>
+        <w:t xml:space="preserve"> </w:t>
+      </w:r>
+      <w:r>
+        <w:rPr>
+          <w:b/>
+          <w:bCs/>
+        </w:rPr>
+        <w:t xml:space="preserve">cold paid stays</w:t>
+      </w:r>
+      <w:r>
+        <w:rPr>
+          <w:b/>
+          <w:bCs/>
+        </w:rPr>
+        <w:t xml:space="preserve"> </w:t>
+      </w:r>
+      <w:r>
+        <w:rPr>
+          <w:b/>
+          <w:bCs/>
+        </w:rPr>
+        <w:t xml:space="preserve">statics only.</w:t>
+      </w:r>
+      <w:r>
+        <w:t xml:space="preserve"> </w:t>
+      </w:r>
+      <w:r>
+        <w:t xml:space="preserve">Nothing here touches the ad account.</w:t>
+      </w:r>
+    </w:p>
+    <w:p>
+      <w:pPr>
+        <w:pStyle w:val="BodyText"/>
+      </w:pPr>
+      <w:r>
+        <w:rPr>
+          <w:b/>
+          <w:bCs/>
+        </w:rPr>
+        <w:t xml:space="preserve">The workflow.</w:t>
+      </w:r>
+      <w:r>
+        <w:t xml:space="preserve"> </w:t>
+      </w:r>
+      <w:r>
+        <w:t xml:space="preserve">-</w:t>
+      </w:r>
+      <w:r>
+        <w:t xml:space="preserve"> </w:t>
+      </w:r>
+      <w:r>
+        <w:rPr>
+          <w:b/>
+          <w:bCs/>
+        </w:rPr>
+        <w:t xml:space="preserve">Batch once a week.</w:t>
+      </w:r>
+      <w:r>
+        <w:t xml:space="preserve"> </w:t>
+      </w:r>
+      <w:r>
+        <w:t xml:space="preserve">Five scripts in one sitting, roughly 30 minutes of filming. Do not</w:t>
+      </w:r>
+      <w:r>
+        <w:t xml:space="preserve"> </w:t>
+      </w:r>
+      <w:r>
+        <w:t xml:space="preserve">film daily; that is the bottleneck that stopped this before.</w:t>
+      </w:r>
+      <w:r>
+        <w:t xml:space="preserve"> </w:t>
+      </w:r>
+      <w:r>
+        <w:t xml:space="preserve">-</w:t>
+      </w:r>
+      <w:r>
+        <w:t xml:space="preserve"> </w:t>
+      </w:r>
+      <w:r>
+        <w:rPr>
+          <w:b/>
+          <w:bCs/>
+        </w:rPr>
+        <w:t xml:space="preserve">Scripts come from the week’s spine</w:t>
+      </w:r>
+      <w:r>
+        <w:t xml:space="preserve"> </w:t>
+      </w:r>
+      <w:r>
+        <w:t xml:space="preserve">(§11b). The Monday Authority post - the live ad’s</w:t>
+      </w:r>
+      <w:r>
+        <w:t xml:space="preserve"> </w:t>
+      </w:r>
+      <w:r>
+        <w:t xml:space="preserve">claim, expanded - is the strongest reel candidate, because it is the message paid is</w:t>
+      </w:r>
+      <w:r>
+        <w:t xml:space="preserve"> </w:t>
+      </w:r>
+      <w:r>
+        <w:t xml:space="preserve">already spending money on.</w:t>
+      </w:r>
+      <w:r>
+        <w:t xml:space="preserve"> </w:t>
+      </w:r>
+      <w:r>
+        <w:t xml:space="preserve">-</w:t>
+      </w:r>
+      <w:r>
+        <w:t xml:space="preserve"> </w:t>
+      </w:r>
+      <w:r>
+        <w:rPr>
+          <w:b/>
+          <w:bCs/>
+        </w:rPr>
+        <w:t xml:space="preserve">30 to 45 seconds, one idea.</w:t>
+      </w:r>
+      <w:r>
+        <w:t xml:space="preserve"> </w:t>
+      </w:r>
+      <w:r>
+        <w:t xml:space="preserve">Vertical 9:16.</w:t>
+      </w:r>
+      <w:r>
+        <w:t xml:space="preserve"> </w:t>
+      </w:r>
+      <w:r>
+        <w:t xml:space="preserve">-</w:t>
+      </w:r>
+      <w:r>
+        <w:t xml:space="preserve"> </w:t>
+      </w:r>
+      <w:r>
+        <w:rPr>
+          <w:b/>
+          <w:bCs/>
+        </w:rPr>
+        <w:t xml:space="preserve">Existing filming rules still apply:</w:t>
+      </w:r>
+      <w:r>
+        <w:t xml:space="preserve"> </w:t>
+      </w:r>
+      <w:r>
+        <w:t xml:space="preserve">speak at 80% of normal pace, pause after the first</w:t>
+      </w:r>
+      <w:r>
+        <w:t xml:space="preserve"> </w:t>
+      </w:r>
+      <w:r>
+        <w:t xml:space="preserve">sentence, look into the lens not the screen, no music, no jump cuts every two seconds. The</w:t>
+      </w:r>
+      <w:r>
+        <w:t xml:space="preserve"> </w:t>
+      </w:r>
+      <w:r>
+        <w:t xml:space="preserve">calm-authority tone IS the differentiator for a 40+ professional audience.</w:t>
+      </w:r>
+    </w:p>
+    <w:p>
+      <w:pPr>
+        <w:pStyle w:val="BodyText"/>
+      </w:pPr>
+      <w:r>
+        <w:rPr>
+          <w:b/>
+          <w:bCs/>
+        </w:rPr>
+        <w:t xml:space="preserve">What not to use it for.</w:t>
+      </w:r>
+      <w:r>
+        <w:t xml:space="preserve"> </w:t>
+      </w:r>
+      <w:r>
+        <w:t xml:space="preserve">-</w:t>
+      </w:r>
+      <w:r>
+        <w:t xml:space="preserve"> </w:t>
+      </w:r>
+      <w:r>
+        <w:rPr>
+          <w:b/>
+          <w:bCs/>
+        </w:rPr>
+        <w:t xml:space="preserve">Do not post watermarked.</w:t>
+      </w:r>
+      <w:r>
+        <w:t xml:space="preserve"> </w:t>
+      </w:r>
+      <w:r>
+        <w:t xml:space="preserve">The free tier brands your reel with someone else’s logo. Either</w:t>
+      </w:r>
+      <w:r>
+        <w:t xml:space="preserve"> </w:t>
+      </w:r>
+      <w:r>
+        <w:t xml:space="preserve">upgrade or do not post it.</w:t>
+      </w:r>
+      <w:r>
+        <w:t xml:space="preserve"> </w:t>
+      </w:r>
+      <w:r>
+        <w:t xml:space="preserve">-</w:t>
+      </w:r>
+      <w:r>
+        <w:t xml:space="preserve"> </w:t>
+      </w:r>
+      <w:r>
+        <w:rPr>
+          <w:b/>
+          <w:bCs/>
+        </w:rPr>
+        <w:t xml:space="preserve">Do not use the AI avatar for doctrine or clinical content.</w:t>
+      </w:r>
+      <w:r>
+        <w:t xml:space="preserve"> </w:t>
+      </w:r>
+      <w:r>
+        <w:t xml:space="preserve">Your face doing the read is</w:t>
+      </w:r>
+      <w:r>
+        <w:t xml:space="preserve"> </w:t>
+      </w:r>
+      <w:r>
+        <w:t xml:space="preserve">the asset; a synthetic stand-in undermines the exact authority the reel exists to build,</w:t>
+      </w:r>
+      <w:r>
+        <w:t xml:space="preserve"> </w:t>
+      </w:r>
+      <w:r>
+        <w:t xml:space="preserve">and this audience will clock it. AI caption and framing tools are fine - they are still you.</w:t>
+      </w:r>
+      <w:r>
+        <w:t xml:space="preserve"> </w:t>
+      </w:r>
+      <w:r>
+        <w:t xml:space="preserve">-</w:t>
+      </w:r>
+      <w:r>
+        <w:t xml:space="preserve"> </w:t>
+      </w:r>
+      <w:r>
+        <w:rPr>
+          <w:b/>
+          <w:bCs/>
+        </w:rPr>
+        <w:t xml:space="preserve">Do not let reels replace carousels.</w:t>
+      </w:r>
+      <w:r>
+        <w:t xml:space="preserve"> </w:t>
+      </w:r>
+      <w:r>
+        <w:t xml:space="preserve">Reels buy reach, carousels buy saves and are what</w:t>
+      </w:r>
+      <w:r>
+        <w:t xml:space="preserve"> </w:t>
+      </w:r>
+      <w:r>
+        <w:t xml:space="preserve">people return to. §13’s split stands.</w:t>
+      </w:r>
+    </w:p>
+    <w:p>
+      <w:pPr>
+        <w:pStyle w:val="BodyText"/>
+      </w:pPr>
+      <w:r>
+        <w:rPr>
+          <w:b/>
+          <w:bCs/>
+        </w:rPr>
+        <w:t xml:space="preserve">Open question, not decided here:</w:t>
+      </w:r>
+      <w:r>
+        <w:t xml:space="preserve"> </w:t>
+      </w:r>
+      <w:r>
+        <w:t xml:space="preserve">whether Captions supersedes the HeyGen plan and what it</w:t>
+      </w:r>
+      <w:r>
+        <w:t xml:space="preserve"> </w:t>
+      </w:r>
+      <w:r>
+        <w:t xml:space="preserve">means for Amanda’s video scope under the contra deal. Both were the scaling answer when</w:t>
+      </w:r>
+      <w:r>
+        <w:t xml:space="preserve"> </w:t>
+      </w:r>
+      <w:r>
+        <w:t xml:space="preserve">filming was the constraint. Confirm with Amanda before reallocating her time.</w:t>
       </w:r>
     </w:p>
     <w:bookmarkEnd w:id="26"/>
-    <w:bookmarkStart w:id="27" w:name="turn-engagement-into-an-ad-engine"/>
+    <w:bookmarkEnd w:id="27"/>
+    <w:bookmarkStart w:id="28" w:name="turn-engagement-into-an-ad-engine"/>
     <w:p>
       <w:pPr>
         <w:pStyle w:val="Heading2"/>
@@ -4726,8 +5166,8 @@
         <w:t xml:space="preserve">- retarget them with the Challenge. Free organic reach becomes cheap paid conversion; the organic and paid funnels feed each other.</w:t>
       </w:r>
     </w:p>
-    <w:bookmarkEnd w:id="27"/>
-    <w:bookmarkStart w:id="28" w:name="first-three-plays-to-test-next-2-3-weeks"/>
+    <w:bookmarkEnd w:id="28"/>
+    <w:bookmarkStart w:id="29" w:name="first-three-plays-to-test-next-2-3-weeks"/>
     <w:p>
       <w:pPr>
         <w:pStyle w:val="Heading2"/>
@@ -4825,9 +5265,9 @@
         </w:pict>
       </w:r>
     </w:p>
-    <w:bookmarkEnd w:id="28"/>
     <w:bookmarkEnd w:id="29"/>
-    <w:bookmarkStart w:id="34" w:name="part-iii---standards-measurement"/>
+    <w:bookmarkEnd w:id="30"/>
+    <w:bookmarkStart w:id="35" w:name="part-iii---standards-measurement"/>
     <w:p>
       <w:pPr>
         <w:pStyle w:val="Heading1"/>
@@ -4836,7 +5276,7 @@
         <w:t xml:space="preserve">PART III - STANDARDS &amp; MEASUREMENT</w:t>
       </w:r>
     </w:p>
-    <w:bookmarkStart w:id="30" w:name="voice-design-rules"/>
+    <w:bookmarkStart w:id="31" w:name="voice-design-rules"/>
     <w:p>
       <w:pPr>
         <w:pStyle w:val="Heading2"/>
@@ -4973,8 +5413,8 @@
         <w:t xml:space="preserve">).</w:t>
       </w:r>
     </w:p>
-    <w:bookmarkEnd w:id="30"/>
-    <w:bookmarkStart w:id="31" w:name="messaging-rules-do-dont"/>
+    <w:bookmarkEnd w:id="31"/>
+    <w:bookmarkStart w:id="32" w:name="messaging-rules-do-dont"/>
     <w:p>
       <w:pPr>
         <w:pStyle w:val="Heading2"/>
@@ -5366,8 +5806,8 @@
         <w:t xml:space="preserve">intelligent not complicated · confident not arrogant · direct not blunt · warm not soft · scientific not clinical · forward-thinking not abstract.</w:t>
       </w:r>
     </w:p>
-    <w:bookmarkEnd w:id="31"/>
-    <w:bookmarkStart w:id="32" w:name="what-we-measure"/>
+    <w:bookmarkEnd w:id="32"/>
+    <w:bookmarkStart w:id="33" w:name="what-we-measure"/>
     <w:p>
       <w:pPr>
         <w:pStyle w:val="Heading2"/>
@@ -5384,8 +5824,8 @@
         <w:t xml:space="preserve">Comments + saves + shares (real engagement), DM keyword captures, scorecard starts, and the earliest broken gate in the reach -&gt; save -&gt; profile -&gt; scorecard path. Not likes. We buy self-recognition and captured leads, not applause.</w:t>
       </w:r>
     </w:p>
-    <w:bookmarkEnd w:id="32"/>
-    <w:bookmarkStart w:id="33" w:name="build-dependencies"/>
+    <w:bookmarkEnd w:id="33"/>
+    <w:bookmarkStart w:id="34" w:name="build-dependencies"/>
     <w:p>
       <w:pPr>
         <w:pStyle w:val="Heading2"/>
@@ -5532,8 +5972,8 @@
         <w:t xml:space="preserve">The whole thing in one line: stop broadcasting information, start demonstrating that you can read the person the industry has given up on. That is the only thing that makes Body Recode different in the feed, so make it the entire show.</w:t>
       </w:r>
     </w:p>
-    <w:bookmarkEnd w:id="33"/>
     <w:bookmarkEnd w:id="34"/>
+    <w:bookmarkEnd w:id="35"/>
     <w:sectPr>
       <w:footnotePr>
         <w:numRestart w:val="eachSect"/>

</xml_diff>

<commit_message>
Correct 13b: Amanda's contra deal is funnel video, not social
I had flagged Captions as possibly affecting Amanda's scope and framed it as
maybe superseding HeyGen. Both wrong. Her deal covers funnel-stage video (the
Challenge Day 5 session, Blueprint education lessons, landing-page assets) in
HeyGen and ElevenLabs. Social is not in it.

The tools are not competing. HeyGen produces funnel assets at Amanda's hand,
Captions produces social at Kade's. Removes the false open question and records
the division of labour so it does not get re-raised.

Co-Authored-By: Claude Opus 5 <noreply@anthropic.com>
</commit_message>
<xml_diff>
--- a/public/docs/strategy/body-recode/body-recode-consumer-marketing-strategy-v1.docx
+++ b/public/docs/strategy/body-recode/body-recode-consumer-marketing-strategy-v1.docx
@@ -26,7 +26,7 @@
         <w:t xml:space="preserve"> </w:t>
       </w:r>
       <w:r>
-        <w:t xml:space="preserve">v2.3 - 2026-08-05 (§13b reels via Captions: organic only, batch weekly, feeds the warm-audience pool). One document: the strategy (what and why) and the content engine (how) in one place.</w:t>
+        <w:t xml:space="preserve">v2.4 - 2026-08-06 (§13b: Captions is social only; Amanda’s contra deal is funnel-stage video and is untouched). One document: the strategy (what and why) and the content engine (how) in one place.</w:t>
       </w:r>
       <w:r>
         <w:t xml:space="preserve"> </w:t>
@@ -4712,35 +4712,29 @@
           <w:b/>
           <w:bCs/>
         </w:rPr>
-        <w:t xml:space="preserve">production capacity</w:t>
-      </w:r>
-      <w:r>
-        <w:t xml:space="preserve">, which sat behind Amanda’s availability and a HeyGen workflow that</w:t>
-      </w:r>
-      <w:r>
-        <w:t xml:space="preserve"> </w:t>
-      </w:r>
-      <w:r>
-        <w:t xml:space="preserve">was never stood up.</w:t>
-      </w:r>
-      <w:r>
-        <w:t xml:space="preserve"> </w:t>
-      </w:r>
-      <w:r>
-        <w:rPr>
-          <w:b/>
-          <w:bCs/>
-        </w:rPr>
-        <w:t xml:space="preserve">Captions removes that blocker for talking-head content</w:t>
-      </w:r>
-      <w:r>
-        <w:t xml:space="preserve">, which is the</w:t>
-      </w:r>
-      <w:r>
-        <w:t xml:space="preserve"> </w:t>
-      </w:r>
-      <w:r>
-        <w:t xml:space="preserve">only reel format this brand actually needs.</w:t>
+        <w:t xml:space="preserve">Kade not having a production workflow for them</w:t>
+      </w:r>
+      <w:r>
+        <w:t xml:space="preserve">.</w:t>
+      </w:r>
+      <w:r>
+        <w:t xml:space="preserve"> </w:t>
+      </w:r>
+      <w:r>
+        <w:rPr>
+          <w:b/>
+          <w:bCs/>
+        </w:rPr>
+        <w:t xml:space="preserve">Captions removes that</w:t>
+      </w:r>
+      <w:r>
+        <w:t xml:space="preserve">, for</w:t>
+      </w:r>
+      <w:r>
+        <w:t xml:space="preserve"> </w:t>
+      </w:r>
+      <w:r>
+        <w:t xml:space="preserve">talking-head content, which is the only reel format this brand actually needs.</w:t>
       </w:r>
     </w:p>
     <w:p>
@@ -4752,6 +4746,74 @@
           <w:b/>
           <w:bCs/>
         </w:rPr>
+        <w:t xml:space="preserve">Division of labour, so this does not get confused again.</w:t>
+      </w:r>
+      <w:r>
+        <w:t xml:space="preserve"> </w:t>
+      </w:r>
+      <w:r>
+        <w:t xml:space="preserve">Amanda’s contra deal covers</w:t>
+      </w:r>
+      <w:r>
+        <w:t xml:space="preserve"> </w:t>
+      </w:r>
+      <w:r>
+        <w:rPr>
+          <w:b/>
+          <w:bCs/>
+        </w:rPr>
+        <w:t xml:space="preserve">funnel-stage video</w:t>
+      </w:r>
+      <w:r>
+        <w:t xml:space="preserve"> </w:t>
+      </w:r>
+      <w:r>
+        <w:t xml:space="preserve">- the Challenge Day 5 session, the Blueprint education lessons,</w:t>
+      </w:r>
+      <w:r>
+        <w:t xml:space="preserve"> </w:t>
+      </w:r>
+      <w:r>
+        <w:t xml:space="preserve">landing-page assets - produced in HeyGen and ElevenLabs.</w:t>
+      </w:r>
+      <w:r>
+        <w:t xml:space="preserve"> </w:t>
+      </w:r>
+      <w:r>
+        <w:rPr>
+          <w:b/>
+          <w:bCs/>
+        </w:rPr>
+        <w:t xml:space="preserve">It does not cover social media.</w:t>
+      </w:r>
+      <w:r>
+        <w:t xml:space="preserve"> </w:t>
+      </w:r>
+      <w:r>
+        <w:t xml:space="preserve">Social reels are Kade on camera in Captions. The two tools are not competing: HeyGen produces</w:t>
+      </w:r>
+      <w:r>
+        <w:t xml:space="preserve"> </w:t>
+      </w:r>
+      <w:r>
+        <w:t xml:space="preserve">funnel assets at Amanda’s hand, Captions produces social at Kade’s. Nothing here touches</w:t>
+      </w:r>
+      <w:r>
+        <w:t xml:space="preserve"> </w:t>
+      </w:r>
+      <w:r>
+        <w:t xml:space="preserve">Amanda’s scope or her backlog.</w:t>
+      </w:r>
+    </w:p>
+    <w:p>
+      <w:pPr>
+        <w:pStyle w:val="BodyText"/>
+      </w:pPr>
+      <w:r>
+        <w:rPr>
+          <w:b/>
+          <w:bCs/>
+        </w:rPr>
         <w:t xml:space="preserve">Why this matters more than</w:t>
       </w:r>
       <w:r>
@@ -5099,36 +5161,6 @@
       </w:r>
       <w:r>
         <w:t xml:space="preserve">people return to. §13’s split stands.</w:t>
-      </w:r>
-    </w:p>
-    <w:p>
-      <w:pPr>
-        <w:pStyle w:val="BodyText"/>
-      </w:pPr>
-      <w:r>
-        <w:rPr>
-          <w:b/>
-          <w:bCs/>
-        </w:rPr>
-        <w:t xml:space="preserve">Open question, not decided here:</w:t>
-      </w:r>
-      <w:r>
-        <w:t xml:space="preserve"> </w:t>
-      </w:r>
-      <w:r>
-        <w:t xml:space="preserve">whether Captions supersedes the HeyGen plan and what it</w:t>
-      </w:r>
-      <w:r>
-        <w:t xml:space="preserve"> </w:t>
-      </w:r>
-      <w:r>
-        <w:t xml:space="preserve">means for Amanda’s video scope under the contra deal. Both were the scaling answer when</w:t>
-      </w:r>
-      <w:r>
-        <w:t xml:space="preserve"> </w:t>
-      </w:r>
-      <w:r>
-        <w:t xml:space="preserve">filming was the constraint. Confirm with Amanda before reallocating her time.</w:t>
       </w:r>
     </w:p>
     <w:bookmarkEnd w:id="26"/>

</xml_diff>